<commit_message>
P52: fixes from the independent check (Rival 4 verbatim, patient-link limits, Cor 2.3, OpenNCP scope, Z3 text, cross-refs) P52b: Appendix A.23/A.24 synced B-45: z3_check.py Semantics II encoded in full, F up to 120
Co-Authored-By: Claude Opus 5.5 <noreply@anthropic.com>
Claude-Session: https://claude.ai/code/session_01NcQq1nsLTRuJVxEX8DbgE6
</commit_message>
<xml_diff>
--- a/VERA-SNARK_Thesis_TRACKED_vs_4Oct.docx
+++ b/VERA-SNARK_Thesis_TRACKED_vs_4Oct.docx
@@ -15,7 +15,7 @@
         <w:pStyle w:val="BodyText"/>
       </w:pPr>
       <w:r>
-        <w:t xml:space="preserve">Every change to the front matter and Chapters 1–7 is shown as a tracked insertion or deletion (Review → Track Changes → All Markup). Appendices and the reference list are regenerated from the code and the chapter lists and are not compared here. Tables and equations are compared as text; the formatted thesis is the separate file VERA-SNARK_Thesis_SUBMISSION.docx. Paragraphs unchanged: 625; revised: 32; new: 12; removed: 4.</w:t>
+        <w:t xml:space="preserve">Every change to the front matter and Chapters 1–7 is shown as a tracked insertion or deletion (Review → Track Changes → All Markup). Appendices and the reference list are regenerated from the code and the chapter lists and are not compared here. Tables and equations are compared as text; the formatted thesis is the separate file VERA-SNARK_Thesis_SUBMISSION.docx. Paragraphs unchanged: 606; revised: 51; new: 12; removed: 4.</w:t>
       </w:r>
     </w:p>
     <w:p>
@@ -383,7 +383,20 @@
         <w:pStyle w:val="BodyText"/>
       </w:pPr>
       <w:r>
-        <w:t xml:space="preserve">3. A mechanism specification with its residue analysed against the applicable legal threshold. Crypto-Erasure by Invalidation is specified in implementable detail, with each record’s metadata partitioned into the accessor’s fields, which accountability requires and the mechanism retains, and the link to the patient, which it removes, and with entries committed to a tamper-evident log whose inclusion proofs the demonstration checks. Its surviving residue is characterised as pseudonymised rather than anonymous by the Norwegian standard, and designed to the corridor established by the European Data Protection Board’s finalised Guidelines 02/2025.</w:t>
+        <w:t xml:space="preserve">3. A mechanism specification with its residue analysed against the applicable legal threshold. Crypto-Erasure by Invalidation is specified in implementable detail, with each record’s metadata partitioned into the accessor’s fields, which accountability requires and the mechanism retains, and the link to the patient, which it </w:t>
+      </w:r>
+      <w:del w:id="35" w:author="Arshad Akhtar Abbasia" w:date="2026-10-04T12:00:00Z">
+        <w:r>
+          <w:delText xml:space="preserve">removes, </w:delText>
+        </w:r>
+      </w:del>
+      <w:ins w:id="36" w:author="Arshad Akhtar Abbasia" w:date="2026-10-04T12:00:00Z">
+        <w:r>
+          <w:t xml:space="preserve">keeps on the cross-border path where the person’s access-information right needs it and removes from Secure Processing Environment logs at the ceiling, </w:t>
+        </w:r>
+      </w:ins>
+      <w:r>
+        <w:t xml:space="preserve">and with entries committed to a tamper-evident log whose inclusion proofs the demonstration checks. Its surviving residue is characterised as pseudonymised rather than anonymous by the Norwegian standard, and designed to the corridor established by the European Data Protection Board’s finalised Guidelines 02/2025.</w:t>
       </w:r>
     </w:p>
     <w:p>
@@ -943,7 +956,28 @@
         <w:pStyle w:val="BodyText"/>
       </w:pPr>
       <w:r>
-        <w:t xml:space="preserve">An apparent resolution must be confronted at the outset. Article 17(3)(b) GDPR exempts erasure to the extent that processing is necessary for compliance with a legal obligation to which the controller is subject. It could therefore be argued that the audit-retention obligation simply disapplies Article 17 for audit records, and that no conflict exists. This thesis takes the position, defended in Sections 2.3 and 4.2, that the conflict survives the exemption in a precise form. The exemption extends only as far as retention is necessary for the legal obligation, and the data-minimisation principle of Article 5(1)(c) GDPR requires that no more personal data be retained than the obligation demands. Retaining the full plaintext personal-data payload of an audit record for the length of the floor exceeds what accountability requires, since the accountability function of the record can be preserved without continued access to that payload. Moreover, the six-month deletion ceiling under Article 68(12) EHDS admits no equivalent exemption. What may lawfully be retained is therefore the accountability skeleton of the record rather than its full personal-data content: and specifying, formalising, and demonstrating exactly that residue is the work of this thesis.</w:t>
+        <w:t xml:space="preserve">An apparent resolution must be confronted at the outset. Article 17(3)(b) GDPR exempts erasure to the extent that processing is necessary for compliance with a legal obligation to which the controller is subject. It could therefore be argued that the audit-retention obligation simply disapplies Article 17 for audit records, and that no conflict exists. This thesis takes the position, defended in Sections 2.3 and 4.2, that the conflict survives the exemption in a precise form. The exemption extends only as far as retention is necessary for the legal obligation, and the data-minimisation principle of Article 5(1)(c) GDPR requires that no more personal data be retained than the obligation demands. Retaining the full plaintext </w:t>
+      </w:r>
+      <w:del w:id="37" w:author="Arshad Akhtar Abbasia" w:date="2026-10-04T12:00:00Z">
+        <w:r>
+          <w:delText xml:space="preserve">personal-data </w:delText>
+        </w:r>
+      </w:del>
+      <w:r>
+        <w:t xml:space="preserve">payload of an audit record for the length of the floor exceeds what accountability requires, since the accountability function of the record can be preserved without continued access to that </w:t>
+      </w:r>
+      <w:del w:id="38" w:author="Arshad Akhtar Abbasia" w:date="2026-10-04T12:00:00Z">
+        <w:r>
+          <w:delText xml:space="preserve">payload. </w:delText>
+        </w:r>
+      </w:del>
+      <w:ins w:id="39" w:author="Arshad Akhtar Abbasia" w:date="2026-10-04T12:00:00Z">
+        <w:r>
+          <w:t xml:space="preserve">payload; for Secure Processing Environment logs the thesis argues this for the part of the payload auditing does not need (Chapter 4, Corollary 2.3). </w:t>
+        </w:r>
+      </w:ins>
+      <w:r>
+        <w:t xml:space="preserve">Moreover, the six-month deletion ceiling under Article 68(12) EHDS admits no equivalent exemption. What may lawfully be retained is therefore the accountability skeleton of the record rather than its full personal-data content: and specifying, formalising, and demonstrating exactly that residue is the work of this thesis.</w:t>
       </w:r>
     </w:p>
     <w:p>
@@ -953,12 +987,12 @@
       <w:r>
         <w:t xml:space="preserve">The same conflict arises in the secondary-use </w:t>
       </w:r>
-      <w:del w:id="35" w:author="Arshad Akhtar Abbasia" w:date="2026-10-04T12:00:00Z">
+      <w:del w:id="40" w:author="Arshad Akhtar Abbasia" w:date="2026-10-04T12:00:00Z">
         <w:r>
           <w:delText xml:space="preserve">pathway, </w:delText>
         </w:r>
       </w:del>
-      <w:ins w:id="36" w:author="Arshad Akhtar Abbasia" w:date="2026-10-04T12:00:00Z">
+      <w:ins w:id="41" w:author="Arshad Akhtar Abbasia" w:date="2026-10-04T12:00:00Z">
         <w:r>
           <w:t xml:space="preserve">pathway through erasure requests, </w:t>
         </w:r>
@@ -966,7 +1000,7 @@
       <w:r>
         <w:t xml:space="preserve">and </w:t>
       </w:r>
-      <w:ins w:id="37" w:author="Arshad Akhtar Abbasia" w:date="2026-10-04T12:00:00Z">
+      <w:ins w:id="42" w:author="Arshad Akhtar Abbasia" w:date="2026-10-04T12:00:00Z">
         <w:r>
           <w:t xml:space="preserve">on one reading of Article 68(12) it arises </w:t>
         </w:r>
@@ -974,12 +1008,12 @@
       <w:r>
         <w:t xml:space="preserve">there </w:t>
       </w:r>
-      <w:del w:id="38" w:author="Arshad Akhtar Abbasia" w:date="2026-10-04T12:00:00Z">
+      <w:del w:id="43" w:author="Arshad Akhtar Abbasia" w:date="2026-10-04T12:00:00Z">
         <w:r>
           <w:delText xml:space="preserve">it is at its sharpest. </w:delText>
         </w:r>
       </w:del>
-      <w:ins w:id="39" w:author="Arshad Akhtar Abbasia" w:date="2026-10-04T12:00:00Z">
+      <w:ins w:id="44" w:author="Arshad Akhtar Abbasia" w:date="2026-10-04T12:00:00Z">
         <w:r>
           <w:t xml:space="preserve">even without them. </w:t>
         </w:r>
@@ -1033,7 +1067,15 @@
         <w:pStyle w:val="BodyText"/>
       </w:pPr>
       <w:r>
-        <w:t xml:space="preserve">The analytical core of the thesis is the Tri-Lateral Retention Feasibility Model (TRF Model), a constraint-satisfaction formulation developed in Chapter 4 within the established tradition of formal legal-compliance verification (Feng, Marsso, Sabetzadeh, &amp; Chechik, 2023). The model decomposes each cross-border audit record into an event-metadata component, itself divided into the accessor’s fields and the link to the patient, and a personal-data payload bound by a cryptographic commitment, expresses the three regimes as constraints over discretised time, and examines the satisfiability of the constraint system under two competing semantics of audit verifiability. The model is tri-lateral in its structure, being floor, right, and ceiling, rather than in the number of instruments it accommodates. The retention floor is parameterised, so that the ten-year cross-border audit floor and the one-year Secure Processing Environment log floor are two instances of one constraint rather than two separate constraints. Under plaintext-verifiability semantics, in which a verifiable audit record is one whose payload remains accessible in plaintext, the system is shown to be infeasible whenever an erasure request or permit expiry falls within a record’s retention window. Under an alternative semantics, in which verifiability is defined as accountability-preservation (intact metadata, a surviving commitment, and a logged, witnessed invalidation event) the system is shown to be jointly satisfiable for every arrival pattern of erasure requests and permit expiries. The mechanism that realises this feasibility, termed Crypto-Erasure by Invalidation, applies the cryptographic-erasure technique recognised in NIST Special Publication 800-88 Revision 2 at the audit-trail boundary: the key binding a record to its payload is destroyed, while the invalidation event itself is appended to a tamper-evident audit log. The mechanism is thus the constructive witness of the model’s feasibility result, not an independently posited design. Two further results locate the conflict: a deletion ceiling collides with a retention floor exactly when it is no longer than the floor, and the event it is anchored to decides whether the collision can be read from the text (Proposition 3); and moving a record out of the regulated environment meets the ceiling but not the right to erasure (Proposition 4).</w:t>
+        <w:t xml:space="preserve">The analytical core of the thesis is the Tri-Lateral Retention Feasibility Model (TRF Model), a constraint-satisfaction formulation developed in Chapter 4 within the established tradition of formal legal-compliance verification (Feng, Marsso, Sabetzadeh, &amp; Chechik, 2023). The model decomposes each cross-border audit record into an event-metadata component, itself divided into the accessor’s fields and the link to the patient, and a </w:t>
+      </w:r>
+      <w:del w:id="45" w:author="Arshad Akhtar Abbasia" w:date="2026-10-04T12:00:00Z">
+        <w:r>
+          <w:delText xml:space="preserve">personal-data </w:delText>
+        </w:r>
+      </w:del>
+      <w:r>
+        <w:t xml:space="preserve">payload bound by a cryptographic commitment, expresses the three regimes as constraints over discretised time, and examines the satisfiability of the constraint system under two competing semantics of audit verifiability. The model is tri-lateral in its structure, being floor, right, and ceiling, rather than in the number of instruments it accommodates. The retention floor is parameterised, so that the ten-year cross-border audit floor and the one-year Secure Processing Environment log floor are two instances of one constraint rather than two separate constraints. Under plaintext-verifiability semantics, in which a verifiable audit record is one whose payload remains accessible in plaintext, the system is shown to be infeasible whenever an erasure request or permit expiry falls within a record’s retention window. Under an alternative semantics, in which verifiability is defined as accountability-preservation (intact metadata, a surviving commitment, and a logged, witnessed invalidation event) the system is shown to be jointly satisfiable for every arrival pattern of erasure requests and permit expiries. The mechanism that realises this feasibility, termed Crypto-Erasure by Invalidation, applies the cryptographic-erasure technique recognised in NIST Special Publication 800-88 Revision 2 at the audit-trail boundary: the key binding a record to its payload is destroyed, while the invalidation event itself is appended to a tamper-evident audit log. The mechanism is thus the constructive witness of the model’s feasibility result, not an independently posited design. Two further results locate the conflict: a deletion ceiling collides with a retention floor exactly when it is no longer than the floor, and the event it is anchored to decides whether the collision can be read from the text (Proposition 3); and moving a record out of the regulated environment meets the ceiling but not the right to erasure (Proposition 4).</w:t>
       </w:r>
     </w:p>
     <w:p>
@@ -1131,12 +1173,12 @@
       <w:r>
         <w:t xml:space="preserve">Third, the contribution is positioned at a level the existing literature does not occupy. The general method of formalising legal compliance as a satisfiability problem is established (Feng et al., 2023), and the cryptographic-erasure technique is recognised in standards (National Institute of Standards and Technology, 2025) and critiqued in practice. But no published work formally models the specific tri-lateral conflict of the cross-border health audit trail, and no work derives a reconciling mechanism from such a model. This holds </w:t>
       </w:r>
-      <w:del w:id="40" w:author="Arshad Akhtar Abbasia" w:date="2026-10-04T12:00:00Z">
+      <w:del w:id="46" w:author="Arshad Akhtar Abbasia" w:date="2026-10-04T12:00:00Z">
         <w:r>
           <w:delText xml:space="preserve">even </w:delText>
         </w:r>
       </w:del>
-      <w:ins w:id="41" w:author="Arshad Akhtar Abbasia" w:date="2026-10-04T12:00:00Z">
+      <w:ins w:id="47" w:author="Arshad Akhtar Abbasia" w:date="2026-10-04T12:00:00Z">
         <w:r>
           <w:t xml:space="preserve">also </w:t>
         </w:r>
@@ -1144,12 +1186,12 @@
       <w:r>
         <w:t xml:space="preserve">for the conflict’s </w:t>
       </w:r>
-      <w:del w:id="42" w:author="Arshad Akhtar Abbasia" w:date="2026-10-04T12:00:00Z">
+      <w:del w:id="48" w:author="Arshad Akhtar Abbasia" w:date="2026-10-04T12:00:00Z">
         <w:r>
           <w:delText xml:space="preserve">sharpest instance. </w:delText>
         </w:r>
       </w:del>
-      <w:ins w:id="43" w:author="Arshad Akhtar Abbasia" w:date="2026-10-04T12:00:00Z">
+      <w:ins w:id="49" w:author="Arshad Akhtar Abbasia" w:date="2026-10-04T12:00:00Z">
         <w:r>
           <w:t xml:space="preserve">conditional extension. </w:t>
         </w:r>
@@ -1291,9 +1333,22 @@
         <w:pStyle w:val="BodyText"/>
       </w:pPr>
       <w:r>
-        <w:t xml:space="preserve">Chapter 5 presents the sandbox demonstration: the executable feasibility check, the independent exhaustive cross-check, </w:t>
-      </w:r>
-      <w:ins w:id="44" w:author="Arshad Akhtar Abbasia" w:date="2026-10-04T12:00:00Z">
+        <w:t xml:space="preserve">Chapter 5 presents the sandbox demonstration: the executable feasibility check, the </w:t>
+      </w:r>
+      <w:del w:id="50" w:author="Arshad Akhtar Abbasia" w:date="2026-10-04T12:00:00Z">
+        <w:r>
+          <w:delText xml:space="preserve">independent </w:delText>
+        </w:r>
+      </w:del>
+      <w:ins w:id="51" w:author="Arshad Akhtar Abbasia" w:date="2026-10-04T12:00:00Z">
+        <w:r>
+          <w:t xml:space="preserve">separately written </w:t>
+        </w:r>
+      </w:ins>
+      <w:r>
+        <w:t xml:space="preserve">exhaustive cross-check, </w:t>
+      </w:r>
+      <w:ins w:id="52" w:author="Arshad Akhtar Abbasia" w:date="2026-10-04T12:00:00Z">
         <w:r>
           <w:t xml:space="preserve">a bounded SMT check of Propositions 1–3, </w:t>
         </w:r>
@@ -1730,12 +1785,12 @@
       <w:pPr>
         <w:pStyle w:val="BodyText"/>
         <w:rPr>
-          <w:ins w:id="45" w:author="Arshad Akhtar Abbasia" w:date="2026-10-04T12:00:00Z"/>
+          <w:ins w:id="53" w:author="Arshad Akhtar Abbasia" w:date="2026-10-04T12:00:00Z"/>
         </w:rPr>
       </w:pPr>
-      <w:ins w:id="46" w:author="Arshad Akhtar Abbasia" w:date="2026-10-04T12:00:00Z">
-        <w:r>
-          <w:t xml:space="preserve">The renumbering of these obligations between the 2022 proposal and the adopted text, from Articles 46 and 50 to Articles 68 and 73, is one reason the commentary has treated them apart (Chapter 1, Section 1.4).</w:t>
+      <w:ins w:id="54" w:author="Arshad Akhtar Abbasia" w:date="2026-10-04T12:00:00Z">
+        <w:r>
+          <w:t xml:space="preserve">The renumbering of these obligations between the 2022 proposal and the adopted text, from Articles 46 and 50 to Articles 68 and 73, may be one reason the commentary has treated them apart (Chapter 1, Section 1.4).</w:t>
         </w:r>
       </w:ins>
     </w:p>
@@ -1743,10 +1798,10 @@
       <w:pPr>
         <w:pStyle w:val="BodyText"/>
         <w:rPr>
-          <w:ins w:id="47" w:author="Arshad Akhtar Abbasia" w:date="2026-10-04T12:00:00Z"/>
+          <w:ins w:id="55" w:author="Arshad Akhtar Abbasia" w:date="2026-10-04T12:00:00Z"/>
         </w:rPr>
       </w:pPr>
-      <w:ins w:id="48" w:author="Arshad Akhtar Abbasia" w:date="2026-10-04T12:00:00Z">
+      <w:ins w:id="56" w:author="Arshad Akhtar Abbasia" w:date="2026-10-04T12:00:00Z">
         <w:r>
           <w:t xml:space="preserve">In the cross-border pathway the conflict takes the form Chapter 1, Section 1.2 describes: a granted erasure request leaves an audit record pointing at data that no longer exist, and a refused one must be justified as necessary for a specific legal obligation, as the European Data Protection Board recommended in February 2026 (Matheson, 2026). Practitioner and supervisory commentary reads the erasure obligation as extending to all storage locations of the personal data, backups and logs included (see, e.g., the Norwegian legal commentary summarised in Berngaard, 2024), which is why the audit trail cannot be carved out of the conflict.</w:t>
         </w:r>
@@ -1756,10 +1811,10 @@
       <w:pPr>
         <w:pStyle w:val="BodyText"/>
         <w:rPr>
-          <w:del w:id="49" w:author="Arshad Akhtar Abbasia" w:date="2026-10-04T12:00:00Z"/>
+          <w:del w:id="57" w:author="Arshad Akhtar Abbasia" w:date="2026-10-04T12:00:00Z"/>
         </w:rPr>
       </w:pPr>
-      <w:del w:id="50" w:author="Arshad Akhtar Abbasia" w:date="2026-10-04T12:00:00Z">
+      <w:del w:id="58" w:author="Arshad Akhtar Abbasia" w:date="2026-10-04T12:00:00Z">
         <w:r>
           <w:delText xml:space="preserve">A further explanation of why the conflict has not been addressed is procedural. In the Commission’s 2022 proposal, the six-month deletion obligation appeared in Article 46 and the Secure Processing Environment provisions in Article 50; both were renumbered on adoption in 2025 to Articles 68 and 73 respectively. A substantial part of the published commentary on EHDS secondary use was written against the proposal numbering, with the deletion obligation and the environment’s security requirements analysed in separate literatures that were never subsequently brought onto the same page.</w:delText>
         </w:r>
@@ -1769,10 +1824,10 @@
       <w:pPr>
         <w:pStyle w:val="BodyText"/>
         <w:rPr>
-          <w:del w:id="51" w:author="Arshad Akhtar Abbasia" w:date="2026-10-04T12:00:00Z"/>
+          <w:del w:id="59" w:author="Arshad Akhtar Abbasia" w:date="2026-10-04T12:00:00Z"/>
         </w:rPr>
       </w:pPr>
-      <w:del w:id="52" w:author="Arshad Akhtar Abbasia" w:date="2026-10-04T12:00:00Z">
+      <w:del w:id="60" w:author="Arshad Akhtar Abbasia" w:date="2026-10-04T12:00:00Z">
         <w:r>
           <w:delText xml:space="preserve">The conflict is structural and operational. When a Norwegian patient is treated under MyHealth@EU in another Member State, the cross-border access event is logged in the foreign NCPeH’s ATNA-compliant audit repository for the period its deployment binding sets. During that window, the patient retains the right to request erasure of personal data under Article 17. If the erasure request is granted, the audit record loses its referential integrity: it points to data that no longer exist. If the erasure request is refused on Article 17(3)(b) grounds, the controller must demonstrate that the retention is genuinely necessary for compliance with a specific legal obligation, which is the recommendation the European Data Protection Board made in February 2026 (Matheson, 2026). When the same patient’s data move through the secondary-use pathway and reach a Norwegian Secure Processing Environment under a Helsedataservice permit, the Article 68(12) deletion ceiling applies. Yet the same environment must retain identifiable access logs for at least one year under Article 73(1)(e), and the audit records of the cross-border exchange that initiated the secondary-use request remain subject to the cross-border floor. Practitioner and supervisory commentary consistently reads the erasure obligation as extending to all storage locations of the personal data, including backups and logs (see, e.g., the Norwegian legal commentary summarised in Berngaard, 2024), which is precisely why the audit trail cannot be quietly carved out of the conflict.</w:delText>
         </w:r>
@@ -1793,7 +1848,7 @@
       <w:r>
         <w:t xml:space="preserve">A direct technical solution to this tension exists in the literature on cryptographic erasure, though its application to the cross-border health audit problem has not been systematically developed. The National Institute of Standards and Technology’s Special Publication 800-88 Revision 2 recognises cryptographic erasure as a purge-grade sanitization technique, in which the encryption key used to protect the data is irreversibly destroyed while the encrypted data remain on the storage medium (National Institute of Standards and Technology, 2025). Practitioner implementation guidance asserts that cryptographic erasure is increasingly accepted as a means of satisfying Article 17 in distributed cloud environments, conditional on auditable key management and demonstrably irreversible key destruction (Dhandala, 2026). That assertion is reported here as evidence of industry practice rather than as a statement of regulatory position; the authoritative position on cryptographic unrecoverability is the European Data Protection Board’s, set out later in this section. </w:t>
       </w:r>
-      <w:del w:id="53" w:author="Arshad Akhtar Abbasia" w:date="2026-10-04T12:00:00Z">
+      <w:del w:id="61" w:author="Arshad Akhtar Abbasia" w:date="2026-10-04T12:00:00Z">
         <w:r>
           <w:delText xml:space="preserve">The technique is not without criticism. </w:delText>
         </w:r>
@@ -1801,12 +1856,12 @@
       <w:r>
         <w:t xml:space="preserve">SecuPi (2025) </w:t>
       </w:r>
-      <w:del w:id="54" w:author="Arshad Akhtar Abbasia" w:date="2026-10-04T12:00:00Z">
+      <w:del w:id="62" w:author="Arshad Akhtar Abbasia" w:date="2026-10-04T12:00:00Z">
         <w:r>
           <w:delText xml:space="preserve">argues that cryptographic erasure introduces operational complexity </w:delText>
         </w:r>
       </w:del>
-      <w:ins w:id="55" w:author="Arshad Akhtar Abbasia" w:date="2026-10-04T12:00:00Z">
+      <w:ins w:id="63" w:author="Arshad Akhtar Abbasia" w:date="2026-10-04T12:00:00Z">
         <w:r>
           <w:t xml:space="preserve">criticises it as operationally costly </w:t>
         </w:r>
@@ -1814,12 +1869,12 @@
       <w:r>
         <w:t xml:space="preserve">in row-level </w:t>
       </w:r>
-      <w:del w:id="56" w:author="Arshad Akhtar Abbasia" w:date="2026-10-04T12:00:00Z">
+      <w:del w:id="64" w:author="Arshad Akhtar Abbasia" w:date="2026-10-04T12:00:00Z">
         <w:r>
           <w:delText xml:space="preserve">encryption scenarios and that auditable key management adds rather than removes overhead, making it inappropriate as a general solution for the right to erasure in heavily distributed systems. </w:delText>
         </w:r>
       </w:del>
-      <w:ins w:id="57" w:author="Arshad Akhtar Abbasia" w:date="2026-10-04T12:00:00Z">
+      <w:ins w:id="65" w:author="Arshad Akhtar Abbasia" w:date="2026-10-04T12:00:00Z">
         <w:r>
           <w:t xml:space="preserve">encryption; </w:t>
         </w:r>
@@ -1827,12 +1882,12 @@
       <w:r>
         <w:t xml:space="preserve">Chapter 6, Section 6.4 engages </w:t>
       </w:r>
-      <w:del w:id="58" w:author="Arshad Akhtar Abbasia" w:date="2026-10-04T12:00:00Z">
+      <w:del w:id="66" w:author="Arshad Akhtar Abbasia" w:date="2026-10-04T12:00:00Z">
         <w:r>
           <w:delText xml:space="preserve">it.</w:delText>
         </w:r>
       </w:del>
-      <w:ins w:id="59" w:author="Arshad Akhtar Abbasia" w:date="2026-10-04T12:00:00Z">
+      <w:ins w:id="67" w:author="Arshad Akhtar Abbasia" w:date="2026-10-04T12:00:00Z">
         <w:r>
           <w:t xml:space="preserve">that critique.</w:t>
         </w:r>
@@ -1930,10 +1985,10 @@
       <w:pPr>
         <w:pStyle w:val="BodyText"/>
         <w:rPr>
-          <w:ins w:id="60" w:author="Arshad Akhtar Abbasia" w:date="2026-10-04T12:00:00Z"/>
+          <w:ins w:id="68" w:author="Arshad Akhtar Abbasia" w:date="2026-10-04T12:00:00Z"/>
         </w:rPr>
       </w:pPr>
-      <w:ins w:id="61" w:author="Arshad Akhtar Abbasia" w:date="2026-10-04T12:00:00Z">
+      <w:ins w:id="69" w:author="Arshad Akhtar Abbasia" w:date="2026-10-04T12:00:00Z">
         <w:r>
           <w:t xml:space="preserve">A second line of work resolves the same tension the other way, by allowing content inside an integrity-protected structure to change. Chameleon hashes are collision-resistant except for the holder of a trapdoor, who can find collisions at will (Krawczyk &amp; Rabin, 1998). Sanitizable signatures let a designated sanitizer replace marked parts of a signed message while the signature still verifies (Ateniese, Chou, de Medeiros, &amp; Tsudik, 2005), and redactable signatures let parts be removed without any key (Johnson, Molnar, Song, &amp; Wagner, 2002). Redactable blockchains link blocks with chameleon hashes so that a trapdoor holder can replace or remove a block’s content and the chain still validates, with the right to be forgotten named as a use case (Ateniese, Magri, Venturi, &amp; Andrade, 2017); later designs spread the power to rewrite across attribute-key holders (Derler, Samelin, Slamanig, &amp; Striecks, 2019) or a voting majority (Deuber, Magri, &amp; Thyagarajan, 2019), and the approaches have been surveyed with the GDPR as their main motivation (Politou, Casino, Alepis, &amp; Patsakis, 2021). Each weakens the binding: integrity comes to mean consistent with what the authorised editor allows rather than unchanged since written, and whoever holds the trapdoor, the sanitizer key, the attribute keys or the majority can rewrite history, in the trapdoor schemes invisibly to anyone without an old copy. The mechanism of this thesis takes the opposite route. Its log is never edited; erasable content is kept out of it, and destroyed by destroying keys. The trust that redaction places in an editor is placed instead in key destruction (Chapter 6, Section 6.3).</w:t>
         </w:r>
@@ -2346,7 +2401,7 @@
       <w:r>
         <w:t xml:space="preserve">The </w:t>
       </w:r>
-      <w:del w:id="62" w:author="Arshad Akhtar Abbasia" w:date="2026-10-04T12:00:00Z">
+      <w:del w:id="70" w:author="Arshad Akhtar Abbasia" w:date="2026-10-04T12:00:00Z">
         <w:r>
           <w:delText xml:space="preserve">strength of this </w:delText>
         </w:r>
@@ -2354,12 +2409,12 @@
       <w:r>
         <w:t xml:space="preserve">gap </w:t>
       </w:r>
-      <w:del w:id="63" w:author="Arshad Akhtar Abbasia" w:date="2026-10-04T12:00:00Z">
+      <w:del w:id="71" w:author="Arshad Akhtar Abbasia" w:date="2026-10-04T12:00:00Z">
         <w:r>
           <w:delText xml:space="preserve">is best demonstrated by its sharpest instance. </w:delText>
         </w:r>
       </w:del>
-      <w:ins w:id="64" w:author="Arshad Akhtar Abbasia" w:date="2026-10-04T12:00:00Z">
+      <w:ins w:id="72" w:author="Arshad Akhtar Abbasia" w:date="2026-10-04T12:00:00Z">
         <w:r>
           <w:t xml:space="preserve">holds also for the conflict’s conditional extension. </w:t>
         </w:r>
@@ -2629,23 +2684,94 @@
         <w:pStyle w:val="BodyText"/>
       </w:pPr>
       <w:r>
-        <w:t xml:space="preserve">Step 1: Decomposition of the object. Each cross-border audit record is decomposed into components that the regulatory instruments treat differently. The event metadata comprises the accountability content: which actor accessed which category of record, at what time, from which national contact point, under which legal basis and consent policy, with what outcome. Within the metadata, the accessor’s fields are separated from the link to the patient, because the two are reached by different obligations (Chapter 4, Section 4.3). The personal-data payload comprises the content of the exchanged clinical document. A cryptographic commitment binds the second to the first, so that the record can attest to what was accessed without retaining it in accessible form, and a key governs access to the payload. This decomposition is the modelling move on which everything else rests, and it is derived from the legal analysis of Chapter 2, Section 2.3 rather than assumed: it is the necessity boundary of Article 17(3)(b), read with the minimisation principle of Article 5(1)(c), that separates what must be retained from what may not be.</w:t>
-      </w:r>
-    </w:p>
-    <w:p>
-      <w:pPr>
-        <w:pStyle w:val="BodyText"/>
-      </w:pPr>
-      <w:r>
-        <w:t xml:space="preserve">Step 2: Translation of each regime into a constraint. Each regime is expressed as a constraint over discretised monthly time on the state of a record. The retention floor requires that the record remain verifiable throughout its retention window. The Article 17 erasure right requires that, following a valid erasure request, the personal-data payload cease to be accessible within the response period. The Article 68(12) deletion ceiling requires that, following permit expiry, payload accessibility cease within six months for records arising in the secondary-use pathway. The model is tri-lateral in the number of constraint types, not in the number of legal instruments it accommodates. The floor is a single parameterised constraint with two instances in the present setting: the ten-year minimum reported for cross-border audit repositories under the eHDSI deployment baseline, used as an illustrative value (Chapter 4, Section 4.3), and the one-year minimum imposed on Secure Processing Environment access logs by Article 73(1)(e) EHDS. Because the horizon is parameterised rather than hard-coded, the second instance required no structural change to the model, and jurisdiction-specific floors can be substituted on the same basis. The translation is documented claim by claim against the primary instruments, so that a reader can check each constraint against its source.</w:t>
-      </w:r>
-    </w:p>
-    <w:p>
-      <w:pPr>
-        <w:pStyle w:val="BodyText"/>
-      </w:pPr>
-      <w:r>
-        <w:t xml:space="preserve">Step 3: Definition of the competing semantics. The pivotal move is to make explicit an assumption that the operational status quo leaves implicit. Under plaintext-verifiability semantics, a record satisfies the retention constraint only while its payload remains accessible in recoverable form. Under accountability-preservation semantics, a record satisfies the retention constraint while its metadata is intact, its commitment survives, and any invalidation event is itself recorded and witnessed. Both are candidate readings of what an audit repository is for; the thesis argues that the second is the reading the instruments actually require and the first is what an audit log that keeps its payload readable assumes.</w:t>
+        <w:t xml:space="preserve">Step 1: Decomposition of the object. Each cross-border audit record is decomposed into components that the regulatory instruments treat differently. The event metadata comprises the accountability content: which actor accessed which category of record, at what time, from which national contact point, under which legal basis and consent policy, with what outcome. Within the metadata, the accessor’s fields are separated from the link to the patient, because the two are reached by different obligations (Chapter 4, Section 4.3). The </w:t>
+      </w:r>
+      <w:del w:id="73" w:author="Arshad Akhtar Abbasia" w:date="2026-10-04T12:00:00Z">
+        <w:r>
+          <w:delText xml:space="preserve">personal-data </w:delText>
+        </w:r>
+      </w:del>
+      <w:r>
+        <w:t xml:space="preserve">payload comprises </w:t>
+      </w:r>
+      <w:ins w:id="74" w:author="Arshad Akhtar Abbasia" w:date="2026-10-04T12:00:00Z">
+        <w:r>
+          <w:t xml:space="preserve">what </w:t>
+        </w:r>
+      </w:ins>
+      <w:r>
+        <w:t xml:space="preserve">the </w:t>
+      </w:r>
+      <w:del w:id="75" w:author="Arshad Akhtar Abbasia" w:date="2026-10-04T12:00:00Z">
+        <w:r>
+          <w:delText xml:space="preserve">content </w:delText>
+        </w:r>
+      </w:del>
+      <w:ins w:id="76" w:author="Arshad Akhtar Abbasia" w:date="2026-10-04T12:00:00Z">
+        <w:r>
+          <w:t xml:space="preserve">record carries about what was accessed: the demographic query </w:t>
+        </w:r>
+      </w:ins>
+      <w:r>
+        <w:t xml:space="preserve">of </w:t>
+      </w:r>
+      <w:ins w:id="77" w:author="Arshad Akhtar Abbasia" w:date="2026-10-04T12:00:00Z">
+        <w:r>
+          <w:t xml:space="preserve">a cross-border record, </w:t>
+        </w:r>
+      </w:ins>
+      <w:r>
+        <w:t xml:space="preserve">the </w:t>
+      </w:r>
+      <w:del w:id="78" w:author="Arshad Akhtar Abbasia" w:date="2026-10-04T12:00:00Z">
+        <w:r>
+          <w:delText xml:space="preserve">exchanged clinical document. </w:delText>
+        </w:r>
+      </w:del>
+      <w:ins w:id="79" w:author="Arshad Akhtar Abbasia" w:date="2026-10-04T12:00:00Z">
+        <w:r>
+          <w:t xml:space="preserve">logged activity of a Secure Processing Environment record (Chapter 4, Section 4.3). </w:t>
+        </w:r>
+      </w:ins>
+      <w:r>
+        <w:t xml:space="preserve">A cryptographic commitment binds the second to the first, so that the record can attest to what was accessed without retaining it in accessible form, and a key governs access to the payload. This decomposition is the modelling move on which everything else rests, and it is derived from the legal analysis of Chapter 2, Section 2.3 rather than assumed: it is the necessity boundary of Article 17(3)(b), read with the minimisation principle of Article 5(1)(c), that separates what must be retained from what may not be.</w:t>
+      </w:r>
+    </w:p>
+    <w:p>
+      <w:pPr>
+        <w:pStyle w:val="BodyText"/>
+      </w:pPr>
+      <w:r>
+        <w:t xml:space="preserve">Step 2: Translation of each regime into a constraint. Each regime is expressed as a constraint over discretised monthly time on the state of a record. The retention floor requires that the record remain verifiable throughout its retention window. The Article 17 erasure right requires that, following a valid erasure request, the </w:t>
+      </w:r>
+      <w:del w:id="80" w:author="Arshad Akhtar Abbasia" w:date="2026-10-04T12:00:00Z">
+        <w:r>
+          <w:delText xml:space="preserve">personal-data </w:delText>
+        </w:r>
+      </w:del>
+      <w:r>
+        <w:t xml:space="preserve">payload cease to be accessible within the response period. The Article 68(12) deletion ceiling requires that, following permit expiry, payload accessibility cease within six months for records arising in the secondary-use pathway. The model is tri-lateral in the number of constraint types, not in the number of legal instruments it accommodates. The floor is a single parameterised constraint with two instances in the present setting: the ten-year minimum reported for cross-border audit repositories under the eHDSI deployment baseline, used as an illustrative value (Chapter 4, Section 4.3), and the one-year minimum imposed on Secure Processing Environment access logs by Article 73(1)(e) EHDS. Because the horizon is parameterised rather than hard-coded, the second instance required no structural change to the model, and jurisdiction-specific floors can be substituted on the same basis. The translation is documented claim by claim against the primary instruments, so that a reader can check each constraint against its source.</w:t>
+      </w:r>
+    </w:p>
+    <w:p>
+      <w:pPr>
+        <w:pStyle w:val="BodyText"/>
+      </w:pPr>
+      <w:r>
+        <w:t xml:space="preserve">Step 3: Definition of the competing semantics. The pivotal move is to make explicit an assumption that the </w:t>
+      </w:r>
+      <w:del w:id="81" w:author="Arshad Akhtar Abbasia" w:date="2026-10-04T12:00:00Z">
+        <w:r>
+          <w:delText xml:space="preserve">operational status quo leaves </w:delText>
+        </w:r>
+      </w:del>
+      <w:ins w:id="82" w:author="Arshad Akhtar Abbasia" w:date="2026-10-04T12:00:00Z">
+        <w:r>
+          <w:t xml:space="preserve">instruments leave </w:t>
+        </w:r>
+      </w:ins>
+      <w:r>
+        <w:t xml:space="preserve">implicit. Under plaintext-verifiability semantics, a record satisfies the retention constraint only while its payload remains accessible in recoverable form. Under accountability-preservation semantics, a record satisfies the retention constraint while its metadata is intact, its commitment survives, and any invalidation event is itself recorded and witnessed. Both are candidate readings of what an audit repository is for; the thesis argues that the second is the reading the instruments actually require and the first is what an audit log that keeps its payload readable assumes.</w:t>
       </w:r>
     </w:p>
     <w:p>
@@ -2767,12 +2893,12 @@
       <w:r>
         <w:t xml:space="preserve">Cryptographic operations use standard library primitives: salted commitments constructed with a standard hash function, and simulated key destruction implemented as irreversible removal of key material from the sandbox’s state. The commitments are hiding by </w:t>
       </w:r>
-      <w:del w:id="65" w:author="Arshad Akhtar Abbasia" w:date="2026-10-04T12:00:00Z">
+      <w:del w:id="83" w:author="Arshad Akhtar Abbasia" w:date="2026-10-04T12:00:00Z">
         <w:r>
           <w:delText xml:space="preserve">construction, </w:delText>
         </w:r>
       </w:del>
-      <w:ins w:id="66" w:author="Arshad Akhtar Abbasia" w:date="2026-10-04T12:00:00Z">
+      <w:ins w:id="84" w:author="Arshad Akhtar Abbasia" w:date="2026-10-04T12:00:00Z">
         <w:r>
           <w:t xml:space="preserve">construction when salts are drawn at random (the reported run derives salts from the record identifier for reproducibility; see Appendix A, A.6), </w:t>
         </w:r>
@@ -2788,12 +2914,12 @@
       <w:r>
         <w:t xml:space="preserve">The constraint system is cross-checked on small instances by a separately written exhaustive search over every assignment of the accessibility variable, as an independent confirmation that the hand-written checker implements the constraints as stated (Chapter 5, Section 5.5). </w:t>
       </w:r>
-      <w:del w:id="67" w:author="Arshad Akhtar Abbasia" w:date="2026-10-04T12:00:00Z">
+      <w:del w:id="85" w:author="Arshad Akhtar Abbasia" w:date="2026-10-04T12:00:00Z">
         <w:r>
           <w:delText xml:space="preserve">This is </w:delText>
         </w:r>
       </w:del>
-      <w:ins w:id="68" w:author="Arshad Akhtar Abbasia" w:date="2026-10-04T12:00:00Z">
+      <w:ins w:id="86" w:author="Arshad Akhtar Abbasia" w:date="2026-10-04T12:00:00Z">
         <w:r>
           <w:t xml:space="preserve">A bounded SMT check with the Z3 solver poses each proposition as </w:t>
         </w:r>
@@ -2801,7 +2927,7 @@
       <w:r>
         <w:t xml:space="preserve">a </w:t>
       </w:r>
-      <w:ins w:id="69" w:author="Arshad Akhtar Abbasia" w:date="2026-10-04T12:00:00Z">
+      <w:ins w:id="87" w:author="Arshad Akhtar Abbasia" w:date="2026-10-04T12:00:00Z">
         <w:r>
           <w:t xml:space="preserve">request for a counterexample over every parameter combination within stated bounds (Chapter 5, Section 5.5). Both are </w:t>
         </w:r>
@@ -2809,12 +2935,12 @@
       <w:r>
         <w:t xml:space="preserve">robustness </w:t>
       </w:r>
-      <w:del w:id="70" w:author="Arshad Akhtar Abbasia" w:date="2026-10-04T12:00:00Z">
+      <w:del w:id="88" w:author="Arshad Akhtar Abbasia" w:date="2026-10-04T12:00:00Z">
         <w:r>
           <w:delText xml:space="preserve">measure </w:delText>
         </w:r>
       </w:del>
-      <w:ins w:id="71" w:author="Arshad Akhtar Abbasia" w:date="2026-10-04T12:00:00Z">
+      <w:ins w:id="89" w:author="Arshad Akhtar Abbasia" w:date="2026-10-04T12:00:00Z">
         <w:r>
           <w:t xml:space="preserve">measures </w:t>
         </w:r>
@@ -2822,12 +2948,12 @@
       <w:r>
         <w:t xml:space="preserve">rather than </w:t>
       </w:r>
-      <w:del w:id="72" w:author="Arshad Akhtar Abbasia" w:date="2026-10-04T12:00:00Z">
+      <w:del w:id="90" w:author="Arshad Akhtar Abbasia" w:date="2026-10-04T12:00:00Z">
         <w:r>
           <w:delText xml:space="preserve">a component </w:delText>
         </w:r>
       </w:del>
-      <w:ins w:id="73" w:author="Arshad Akhtar Abbasia" w:date="2026-10-04T12:00:00Z">
+      <w:ins w:id="91" w:author="Arshad Akhtar Abbasia" w:date="2026-10-04T12:00:00Z">
         <w:r>
           <w:t xml:space="preserve">components </w:t>
         </w:r>
@@ -2961,8 +3087,52 @@
         <w:pStyle w:val="BodyText"/>
       </w:pPr>
       <w:r>
-        <w:t xml:space="preserve">The eighth is that the model represents a record’s payload as a single unit that is either readable or not. Real systems often erase at field level, redacting some elements of a record while retaining others, and a single binary accessibility variable cannot represent that. The simplification is conservative with respect to the propositions, since a mechanism that satisfies the constraints for a whole payload satisfies them for any subset of it, but it means the model says nothing about partial erasure, and a mechanism designed for field-level redaction would need a richer state space than the one used here.</w:t>
-      </w:r>
+        <w:t xml:space="preserve">The eighth is that the model represents a record’s payload as a single unit that is either readable or not. Real systems often erase at field level, redacting some elements of a record while retaining others, and a single binary accessibility variable cannot represent that. The simplification is conservative with respect to the propositions, since a mechanism that satisfies the constraints for a whole payload satisfies them for any subset of it, but it means the model says nothing about partial </w:t>
+      </w:r>
+      <w:del w:id="92" w:author="Arshad Akhtar Abbasia" w:date="2026-10-04T12:00:00Z">
+        <w:r>
+          <w:delText xml:space="preserve">erasure, and </w:delText>
+        </w:r>
+      </w:del>
+      <w:ins w:id="93" w:author="Arshad Akhtar Abbasia" w:date="2026-10-04T12:00:00Z">
+        <w:r>
+          <w:t xml:space="preserve">erasure. Chapter 4, Corollary 2.3 extends the model with one variable per part of the payload for the one case where that matters, a payload part that auditing needs; </w:t>
+        </w:r>
+      </w:ins>
+      <w:r>
+        <w:t xml:space="preserve">a mechanism designed for field-level redaction </w:t>
+      </w:r>
+      <w:ins w:id="94" w:author="Arshad Akhtar Abbasia" w:date="2026-10-04T12:00:00Z">
+        <w:r>
+          <w:t xml:space="preserve">in general </w:t>
+        </w:r>
+      </w:ins>
+      <w:r>
+        <w:t xml:space="preserve">would need </w:t>
+      </w:r>
+      <w:del w:id="95" w:author="Arshad Akhtar Abbasia" w:date="2026-10-04T12:00:00Z">
+        <w:r>
+          <w:delText xml:space="preserve">a </w:delText>
+        </w:r>
+      </w:del>
+      <w:ins w:id="96" w:author="Arshad Akhtar Abbasia" w:date="2026-10-04T12:00:00Z">
+        <w:r>
+          <w:t xml:space="preserve">that </w:t>
+        </w:r>
+      </w:ins>
+      <w:r>
+        <w:t xml:space="preserve">richer state space </w:t>
+      </w:r>
+      <w:del w:id="97" w:author="Arshad Akhtar Abbasia" w:date="2026-10-04T12:00:00Z">
+        <w:r>
+          <w:delText xml:space="preserve">than the one used here.</w:delText>
+        </w:r>
+      </w:del>
+      <w:ins w:id="98" w:author="Arshad Akhtar Abbasia" w:date="2026-10-04T12:00:00Z">
+        <w:r>
+          <w:t xml:space="preserve">throughout.</w:t>
+        </w:r>
+      </w:ins>
     </w:p>
     <w:p>
       <w:pPr>
@@ -3163,12 +3333,12 @@
       <w:r>
         <w:t xml:space="preserve">This yields the central claim of the necessity analysis: the accountability function of a cross-border audit record is discharged by its metadata and by a binding commitment to its payload, and does not require the payload to remain accessible. Retention of accessible plaintext payload for </w:t>
       </w:r>
-      <w:del w:id="74" w:author="Arshad Akhtar Abbasia" w:date="2026-10-04T12:00:00Z">
+      <w:del w:id="99" w:author="Arshad Akhtar Abbasia" w:date="2026-10-04T12:00:00Z">
         <w:r>
           <w:delText xml:space="preserve">ten years </w:delText>
         </w:r>
       </w:del>
-      <w:ins w:id="75" w:author="Arshad Akhtar Abbasia" w:date="2026-10-04T12:00:00Z">
+      <w:ins w:id="100" w:author="Arshad Akhtar Abbasia" w:date="2026-10-04T12:00:00Z">
         <w:r>
           <w:t xml:space="preserve">the length of the floor </w:t>
         </w:r>
@@ -3181,10 +3351,10 @@
       <w:pPr>
         <w:pStyle w:val="BodyText"/>
         <w:rPr>
-          <w:ins w:id="76" w:author="Arshad Akhtar Abbasia" w:date="2026-10-04T12:00:00Z"/>
+          <w:ins w:id="101" w:author="Arshad Akhtar Abbasia" w:date="2026-10-04T12:00:00Z"/>
         </w:rPr>
       </w:pPr>
-      <w:ins w:id="77" w:author="Arshad Akhtar Abbasia" w:date="2026-10-04T12:00:00Z">
+      <w:ins w:id="102" w:author="Arshad Akhtar Abbasia" w:date="2026-10-04T12:00:00Z">
         <w:r>
           <w:t xml:space="preserve">Per record class. The argument has to be made for each class separately, because the payload is defined by where it comes from (Section 4.3), not by whether it is needed. For a cross-border record it is specific: the accountability question is which clinician accessed which patient’s record, under which assertion and with what outcome, and the accessor fields with the patient link answer it; the patient’s name and birth date as typed into the query add nothing to that answer. For a Secure Processing Environment record it is weaker. Article 73(1)(e) asks for logs sufficient “to verify and audit all processing operations in that environment”, and an auditor checking that an extraction stayed within its permit may need to know what was run. The thesis therefore does not assume that the whole activity content is unnecessary there; Corollary 2.3 states what follows if part of it is needed.</w:t>
         </w:r>
@@ -3194,12 +3364,12 @@
       <w:pPr>
         <w:pStyle w:val="BodyText"/>
         <w:rPr>
-          <w:ins w:id="78" w:author="Arshad Akhtar Abbasia" w:date="2026-10-04T12:00:00Z"/>
+          <w:ins w:id="103" w:author="Arshad Akhtar Abbasia" w:date="2026-10-04T12:00:00Z"/>
         </w:rPr>
       </w:pPr>
-      <w:ins w:id="79" w:author="Arshad Akhtar Abbasia" w:date="2026-10-04T12:00:00Z">
-        <w:r>
-          <w:t xml:space="preserve">The patient link. The link from an access event to the person whose data were accessed is not payload: it is the other half of the accountability question. The Regulation gives natural persons the right to obtain information on any access to their personal electronic health data through the health professional access service, including “information on the healthcare provider or other individuals who accessed the personal electronic health data”, “the date and time of access” and “which personal electronic health data were accessed”, available “for at least three years from each date of access to the data” (Article 9(1)–(2) EHDS). That information cannot be produced from a record that no longer says whose data were accessed. Retaining the link is therefore necessary for compliance with a legal obligation within the meaning of Article 17(3)(b), and an erasure request reaches the payload but not the link, at least for the period Article 9(2) fixes. Article 9 is framed around the health professional access service, and whether every cross-border access event routed through a National Contact Point falls within it is a question of how the access is made; the patient-facing audit-log interface of MyHealth@EU (Chapter 1, Section 1.2) serves the same purpose for those that do not. Beyond the Article 9(2) period the link is kept for the rest of the floor on the strength of the deployment binding, which is illustrative here (Section 4.3), and it is removed at the terminal transition (Section 4.8). In a Secure Processing Environment the position differs, because the ceiling may reach the link (Section 4.6).</w:t>
+      <w:ins w:id="104" w:author="Arshad Akhtar Abbasia" w:date="2026-10-04T12:00:00Z">
+        <w:r>
+          <w:t xml:space="preserve">The patient link. The link from an access event to the person whose data were accessed is not payload: it is the other half of the accountability question. The Regulation gives natural persons the right to obtain information on any access to their personal electronic health data through the health professional access service, including “information on the healthcare provider or other individuals who accessed the personal electronic health data”, “the date and time of access” and “which personal electronic health data were accessed”, available “for at least three years from each date of access to the data” (Article 9(1)–(2) EHDS). That information cannot be produced from a record that no longer says whose data were accessed. For the controller that must provide it, or supply the records it is produced from, retaining the link is therefore necessary for compliance with a legal obligation within the meaning of Article 17(3)(b), and an erasure request reaches the payload but not the link, at least for the period Article 9(2) fixes and once Article 9 applies. The argument has two limits. Article 9 is framed around the health professional access service, so whether it binds the controller of a foreign National Contact Point’s audit repository, and covers every cross-border access event, depends on how the access is made and how the Member States assign the duty; where it does not, the patient-facing audit-log interface of MyHealth@EU (Chapter 1, Section 1.2) gives the link a purpose but not a legal obligation, and Article 17(3)(b) does not follow. And beyond the Article 9(2) period the link is kept for the rest of the floor on the strength of the deployment binding, which is illustrative here (Section 4.3); for that stretch its retention after an erasure request is exactly as contestable as the floor itself. It is removed at the terminal transition (Section 4.8). In a Secure Processing Environment Article 9 does not apply. There the link is kept after an erasure request until the ceiling only if auditing “all processing operations” under Article 73(1)(e) needs it, which is the question Chapter 7, Section 7.4 leaves to the supervisory authority, and the ceiling may reach it in any case (Section 4.6).</w:t>
         </w:r>
       </w:ins>
     </w:p>
@@ -3258,7 +3428,7 @@
       <w:r>
         <w:t xml:space="preserve">- m(a) is the event metadata: the actor identifier, the actor’s national contact point, the patient pseudonym, the document category accessed, the legal basis and consent policy applied, the timestamp, and the outcome. Metadata contains no clinical content. It is partitioned as m(a) = m_(acc)(a) ∪ m_(subj)(a). The accessor fields m_(acc)(a) record who acted, when, under which legal basis or permit, and with what outcome. The subject fields m_(subj)(a) relate the event to a data subject: the patient pseudonym and any reference to that subject’s records. The partition does work only in the Secure Processing Environment case (Section 4.6). - p(a) is the </w:t>
       </w:r>
-      <w:del w:id="80" w:author="Arshad Akhtar Abbasia" w:date="2026-10-04T12:00:00Z">
+      <w:del w:id="105" w:author="Arshad Akhtar Abbasia" w:date="2026-10-04T12:00:00Z">
         <w:r>
           <w:delText xml:space="preserve">personal-data </w:delText>
         </w:r>
@@ -3266,12 +3436,12 @@
       <w:r>
         <w:t xml:space="preserve">payload: the </w:t>
       </w:r>
-      <w:del w:id="81" w:author="Arshad Akhtar Abbasia" w:date="2026-10-04T12:00:00Z">
+      <w:del w:id="106" w:author="Arshad Akhtar Abbasia" w:date="2026-10-04T12:00:00Z">
         <w:r>
           <w:delText xml:space="preserve">personal data </w:delText>
         </w:r>
       </w:del>
-      <w:ins w:id="82" w:author="Arshad Akhtar Abbasia" w:date="2026-10-04T12:00:00Z">
+      <w:ins w:id="107" w:author="Arshad Akhtar Abbasia" w:date="2026-10-04T12:00:00Z">
         <w:r>
           <w:t xml:space="preserve">content </w:t>
         </w:r>
@@ -3279,12 +3449,12 @@
       <w:r>
         <w:t xml:space="preserve">the record carries </w:t>
       </w:r>
-      <w:del w:id="83" w:author="Arshad Akhtar Abbasia" w:date="2026-10-04T12:00:00Z">
+      <w:del w:id="108" w:author="Arshad Akhtar Abbasia" w:date="2026-10-04T12:00:00Z">
         <w:r>
           <w:delText xml:space="preserve">beyond </w:delText>
         </w:r>
       </w:del>
-      <w:ins w:id="84" w:author="Arshad Akhtar Abbasia" w:date="2026-10-04T12:00:00Z">
+      <w:ins w:id="109" w:author="Arshad Akhtar Abbasia" w:date="2026-10-04T12:00:00Z">
         <w:r>
           <w:t xml:space="preserve">about </w:t>
         </w:r>
@@ -3292,12 +3462,12 @@
       <w:r>
         <w:t xml:space="preserve">what </w:t>
       </w:r>
-      <w:del w:id="85" w:author="Arshad Akhtar Abbasia" w:date="2026-10-04T12:00:00Z">
+      <w:del w:id="110" w:author="Arshad Akhtar Abbasia" w:date="2026-10-04T12:00:00Z">
         <w:r>
           <w:delText xml:space="preserve">accountability requires (Section 4.2). Its content </w:delText>
         </w:r>
       </w:del>
-      <w:ins w:id="86" w:author="Arshad Akhtar Abbasia" w:date="2026-10-04T12:00:00Z">
+      <w:ins w:id="111" w:author="Arshad Akhtar Abbasia" w:date="2026-10-04T12:00:00Z">
         <w:r>
           <w:t xml:space="preserve">was accessed, as distinct from who accessed it, when and under what authority. It is defined by its source, which </w:t>
         </w:r>
@@ -3305,12 +3475,12 @@
       <w:r>
         <w:t xml:space="preserve">depends on the record </w:t>
       </w:r>
-      <w:del w:id="87" w:author="Arshad Akhtar Abbasia" w:date="2026-10-04T12:00:00Z">
+      <w:del w:id="112" w:author="Arshad Akhtar Abbasia" w:date="2026-10-04T12:00:00Z">
         <w:r>
           <w:delText xml:space="preserve">class. </w:delText>
         </w:r>
       </w:del>
-      <w:ins w:id="88" w:author="Arshad Akhtar Abbasia" w:date="2026-10-04T12:00:00Z">
+      <w:ins w:id="113" w:author="Arshad Akhtar Abbasia" w:date="2026-10-04T12:00:00Z">
         <w:r>
           <w:t xml:space="preserve">class; whether accountability needs it is argued per class in Section 4.2, and Corollary 2.3 states what follows if part of it is needed. </w:t>
         </w:r>
@@ -3318,12 +3488,12 @@
       <w:r>
         <w:t xml:space="preserve">For a cross-border record it is the identifying content of the logged query. The IHE Cross Gateway Patient Discovery transaction (ITI-55), by which one country’s gateway locates a patient in another, requires the person’s name and birth time unless an identifier is supplied, and requires both gateways to record the query segment, base64-encoded, in the audit message’s ParticipantObjectQuery field (IHE International, 2024, Sections 3.55.4.1.2.1 and 3.55.5.1). The audit record therefore holds the patient’s demographic query and not only a pseudonym. This is the transaction on which the patient-identification step of the MyHealth@EU flow rests (Chapter 2, Section 2.2); the eHDSI audit specification that profiles it was not available to this thesis, so the IHE requirement is taken as the baseline any profile starts from. For a Secure Processing Environment record it is the content of the logged activity, where the environment logs at that level: the text and parameters of the query or command run against the permitted dataset, and any output retained with the entry. The Joint Action’s specification requires these logs to cover “access to electronic health data” and “data import, export, or release of outputs” and fixes no fields (TEHDAS2, 2026, Table 5.4, OPR-17, p. 51); </w:t>
       </w:r>
-      <w:del w:id="89" w:author="Arshad Akhtar Abbasia" w:date="2026-10-04T12:00:00Z">
+      <w:del w:id="114" w:author="Arshad Akhtar Abbasia" w:date="2026-10-04T12:00:00Z">
         <w:r>
           <w:delText xml:space="preserve">whatever </w:delText>
         </w:r>
       </w:del>
-      <w:ins w:id="90" w:author="Arshad Akhtar Abbasia" w:date="2026-10-04T12:00:00Z">
+      <w:ins w:id="115" w:author="Arshad Akhtar Abbasia" w:date="2026-10-04T12:00:00Z">
         <w:r>
           <w:t xml:space="preserve">what </w:t>
         </w:r>
@@ -3331,12 +3501,12 @@
       <w:r>
         <w:t xml:space="preserve">an environment records under those headings beyond the accessor fields is </w:t>
       </w:r>
-      <w:del w:id="91" w:author="Arshad Akhtar Abbasia" w:date="2026-10-04T12:00:00Z">
+      <w:del w:id="116" w:author="Arshad Akhtar Abbasia" w:date="2026-10-04T12:00:00Z">
         <w:r>
           <w:delText xml:space="preserve">p(a). </w:delText>
         </w:r>
       </w:del>
-      <w:ins w:id="92" w:author="Arshad Akhtar Abbasia" w:date="2026-10-04T12:00:00Z">
+      <w:ins w:id="117" w:author="Arshad Akhtar Abbasia" w:date="2026-10-04T12:00:00Z">
         <w:r>
           <w:t xml:space="preserve">p(a), and whether auditing “all processing operations” needs part of it is the question Corollary 2.3 answers conditionally. </w:t>
         </w:r>
@@ -3344,12 +3514,12 @@
       <w:r>
         <w:t xml:space="preserve">The model does not require p(a) to be a clinical </w:t>
       </w:r>
-      <w:del w:id="93" w:author="Arshad Akhtar Abbasia" w:date="2026-10-04T12:00:00Z">
+      <w:del w:id="118" w:author="Arshad Akhtar Abbasia" w:date="2026-10-04T12:00:00Z">
         <w:r>
           <w:delText xml:space="preserve">document, only personal data that the accountability purpose does not need. </w:delText>
         </w:r>
       </w:del>
-      <w:ins w:id="94" w:author="Arshad Akhtar Abbasia" w:date="2026-10-04T12:00:00Z">
+      <w:ins w:id="119" w:author="Arshad Akhtar Abbasia" w:date="2026-10-04T12:00:00Z">
         <w:r>
           <w:t xml:space="preserve">document. </w:t>
         </w:r>
@@ -3387,8 +3557,18 @@
         <w:pStyle w:val="BodyText"/>
       </w:pPr>
       <w:r>
-        <w:t xml:space="preserve">Finally, let α(a,t) ∈ {0, 1} be the payload-accessibility variable: α(a,t) = 1 if the controller can recover p(a) in intelligible form at month t, and 0 otherwise. This single binary variable per record per month is the entire state space of the model, and its minimality is deliberate: the conflict turns on exactly one question, which is whether the payload is readable, and a formulation that admits no other state variable cannot obscure that question behind modelling detail. The cost of that minimality is that the model cannot represent field-level redaction, where some elements of a payload are erased and others retained; Chapter 3, Section 3.7 records this as a stated abstraction.</w:t>
-      </w:r>
+        <w:t xml:space="preserve">Finally, let α(a,t) ∈ {0, 1} be the payload-accessibility variable: α(a,t) = 1 if the controller can recover p(a) in intelligible form at month t, and 0 otherwise. This single binary variable per record per month is the entire state space of the model, and its minimality is deliberate: the conflict turns on exactly one question, which is whether the payload is readable, and a formulation that admits no other state variable cannot obscure that question behind modelling detail. The cost of that minimality is that the model cannot represent field-level redaction, where some elements of a payload are erased and others retained; Chapter 3, Section 3.7 records this as a stated </w:t>
+      </w:r>
+      <w:del w:id="120" w:author="Arshad Akhtar Abbasia" w:date="2026-10-04T12:00:00Z">
+        <w:r>
+          <w:delText xml:space="preserve">abstraction.</w:delText>
+        </w:r>
+      </w:del>
+      <w:ins w:id="121" w:author="Arshad Akhtar Abbasia" w:date="2026-10-04T12:00:00Z">
+        <w:r>
+          <w:t xml:space="preserve">abstraction, and Corollary 2.3 relaxes it for one case.</w:t>
+        </w:r>
+      </w:ins>
     </w:p>
     <w:p>
       <w:pPr>
@@ -3469,12 +3649,12 @@
       <w:r>
         <w:t xml:space="preserve">The payload must cease to be accessible within the response period δ. Source: Article 17(1) GDPR, with δ determined by Article 12(3) GDPR, which requires the controller to act without undue delay and in any event within one month of receipt, extendable by two further months for complex or numerous requests provided the data subject is informed within the first month. The model takes δ = 1 as the baseline and admits δ = 3 as the extended case; results are stated for arbitrary finite δ and do not depend on which is chosen. Constraint C2 is triggered only by a valid request. The model does not represent the Article 17(3) exemptions under which a controller may lawfully refuse, and so treats every arriving request as valid; Chapter 3, Section 3.7 explains why this affects the frequencies reported in Chapter 5 but not the </w:t>
       </w:r>
-      <w:del w:id="95" w:author="Arshad Akhtar Abbasia" w:date="2026-10-04T12:00:00Z">
+      <w:del w:id="122" w:author="Arshad Akhtar Abbasia" w:date="2026-10-04T12:00:00Z">
         <w:r>
           <w:delText xml:space="preserve">propositions.</w:delText>
         </w:r>
       </w:del>
-      <w:ins w:id="96" w:author="Arshad Akhtar Abbasia" w:date="2026-10-04T12:00:00Z">
+      <w:ins w:id="123" w:author="Arshad Akhtar Abbasia" w:date="2026-10-04T12:00:00Z">
         <w:r>
           <w:t xml:space="preserve">propositions. In the secondary-use pathway two provisions narrow C2 further. Article 17(3)(d) GDPR disapplies the right where processing is necessary for “scientific or historical research purposes or statistical purposes in accordance with Article 89(1) in so far as the right referred to in paragraph 1 is likely to render impossible or seriously impair the achievement of the objectives of that processing”, and the Regulation gives natural persons instead a right to opt out of secondary use, which is reversible and does not reach processing under data permits issued before it was exercised (Article 71(1) and (3) EHDS). For the environment’s own access logs, which serve Article 73(1)(e) rather than the research, the exemption that applies within the floor is Article 17(3)(b). The effect is that fewer SPE requests reach C2 than the model assumes, and a record that no request reaches faces only the floor and the ceiling, which is the case of Corollary 1.2.</w:t>
         </w:r>
@@ -3556,12 +3736,12 @@
       <w:pPr>
         <w:pStyle w:val="BodyText"/>
         <w:rPr>
-          <w:ins w:id="97" w:author="Arshad Akhtar Abbasia" w:date="2026-10-04T12:00:00Z"/>
+          <w:ins w:id="124" w:author="Arshad Akhtar Abbasia" w:date="2026-10-04T12:00:00Z"/>
         </w:rPr>
       </w:pPr>
-      <w:ins w:id="98" w:author="Arshad Akhtar Abbasia" w:date="2026-10-04T12:00:00Z">
-        <w:r>
-          <w:t xml:space="preserve">This is the semantics of an audit log that keeps what was accessed readable for as long as it keeps the record. Under it, an audit record whose payload cannot be produced is treated as an incomplete or broken record, and audit integrity is understood as the continued producibility of what was accessed. The reference implementation of the cross-border gateway keeps such a log. OpenNCP’s audit record repository stores every received audit message whole, in a database column for the message content, with the patient identifier in a readable column and a further column for the participant-object query; it refuses to modify a stored message, and it contains no retention, purge or erasure logic, so how long the content stays readable is left to the operator (OpenNCP Project, 2017; Sundhedsdatastyrelsen, 2026). In the 2017 source inspected, the patient-discovery audit carries the patient identifier and the full SOAP security header of the request, though not the demographic query that ITI-55 asks gateways to record; the current schema, deployed with OpenNCP 9.1.0, keeps the column for it. How other deployments configure retention is not established here. No instrument states this semantics, and none states the alternative.</w:t>
+      <w:ins w:id="125" w:author="Arshad Akhtar Abbasia" w:date="2026-10-04T12:00:00Z">
+        <w:r>
+          <w:t xml:space="preserve">This is the semantics of an audit log that keeps what was accessed readable for as long as it keeps the record. Under it, an audit record whose payload cannot be produced is treated as an incomplete or broken record, and audit integrity is understood as the continued producibility of what was accessed. The reference implementation of the cross-border gateway is built as such a log: whatever an audit message carries stays readable. In the 2017 OpenNCP source, the audit record repository stored every received audit message whole, in a database column for the message content, with the patient identifier in a readable column and a further column for the participant-object query; it refused to modify a stored message, and its audit code had no scheduled retention or purge logic, so how long the content stayed readable was left to the operator (OpenNCP Project, 2017). The schema deployed with OpenNCP 9.1.0 in 2026 keeps the same columns (Sundhedsdatastyrelsen, 2026); whether they are populated in a given deployment was not inspected. In the 2017 source the patient-discovery audit carried the patient identifier and the full SOAP security header of the request, which in the model are subject and accessor fields, though not the demographic query that ITI-55 asks gateways to record. “Verification” there meant that the sending gateway signed each audit message (enveloped XML signature); the repository stored the signature but did not check it, and kept no hash chain or other tamper evidence beyond its refusal to modify. How other deployments configure retention is not established here. No instrument states this semantics, and none states the alternative.</w:t>
         </w:r>
       </w:ins>
     </w:p>
@@ -3569,10 +3749,10 @@
       <w:pPr>
         <w:pStyle w:val="BodyText"/>
         <w:rPr>
-          <w:del w:id="99" w:author="Arshad Akhtar Abbasia" w:date="2026-10-04T12:00:00Z"/>
+          <w:del w:id="126" w:author="Arshad Akhtar Abbasia" w:date="2026-10-04T12:00:00Z"/>
         </w:rPr>
       </w:pPr>
-      <w:del w:id="100" w:author="Arshad Akhtar Abbasia" w:date="2026-10-04T12:00:00Z">
+      <w:del w:id="127" w:author="Arshad Akhtar Abbasia" w:date="2026-10-04T12:00:00Z">
         <w:r>
           <w:delText xml:space="preserve">This is the semantics of an audit log that keeps what was accessed readable for as long as it keeps the record. Under it, an audit record whose payload cannot be produced is treated as an incomplete or broken record, and audit integrity is understood as the continued producibility of what was accessed. How common such logs are is not established here. What is established is that nothing in the instruments rules them out and that the cross-border profile supplies their content, since ITI-55 requires both gateways to record the patient’s demographic query (Section 4.3). No instrument states this semantics, and none states the alternative.</w:delText>
         </w:r>
@@ -3673,12 +3853,12 @@
       <w:r>
         <w:t xml:space="preserve">Where it holds, Corollary 1.2 is </w:t>
       </w:r>
-      <w:del w:id="101" w:author="Arshad Akhtar Abbasia" w:date="2026-10-04T12:00:00Z">
+      <w:del w:id="128" w:author="Arshad Akhtar Abbasia" w:date="2026-10-04T12:00:00Z">
         <w:r>
           <w:delText xml:space="preserve">the sharpest form </w:delText>
         </w:r>
       </w:del>
-      <w:ins w:id="102" w:author="Arshad Akhtar Abbasia" w:date="2026-10-04T12:00:00Z">
+      <w:ins w:id="129" w:author="Arshad Akhtar Abbasia" w:date="2026-10-04T12:00:00Z">
         <w:r>
           <w:t xml:space="preserve">a conditional extension </w:t>
         </w:r>
@@ -3686,7 +3866,7 @@
       <w:r>
         <w:t xml:space="preserve">of the </w:t>
       </w:r>
-      <w:del w:id="103" w:author="Arshad Akhtar Abbasia" w:date="2026-10-04T12:00:00Z">
+      <w:del w:id="130" w:author="Arshad Akhtar Abbasia" w:date="2026-10-04T12:00:00Z">
         <w:r>
           <w:delText xml:space="preserve">thesis’s </w:delText>
         </w:r>
@@ -3694,12 +3874,12 @@
       <w:r>
         <w:t xml:space="preserve">problem </w:t>
       </w:r>
-      <w:del w:id="104" w:author="Arshad Akhtar Abbasia" w:date="2026-10-04T12:00:00Z">
+      <w:del w:id="131" w:author="Arshad Akhtar Abbasia" w:date="2026-10-04T12:00:00Z">
         <w:r>
           <w:delText xml:space="preserve">statement. </w:delText>
         </w:r>
       </w:del>
-      <w:ins w:id="105" w:author="Arshad Akhtar Abbasia" w:date="2026-10-04T12:00:00Z">
+      <w:ins w:id="132" w:author="Arshad Akhtar Abbasia" w:date="2026-10-04T12:00:00Z">
         <w:r>
           <w:t xml:space="preserve">statement; the request-driven conflict of Corollary 1.1 does not depend on it. </w:t>
         </w:r>
@@ -3747,12 +3927,12 @@
       <w:r>
         <w:t xml:space="preserve">The narrow reading, or logs kept at dataset granularity, therefore cost the thesis its </w:t>
       </w:r>
-      <w:del w:id="106" w:author="Arshad Akhtar Abbasia" w:date="2026-10-04T12:00:00Z">
+      <w:del w:id="133" w:author="Arshad Akhtar Abbasia" w:date="2026-10-04T12:00:00Z">
         <w:r>
           <w:delText xml:space="preserve">sharpest instance </w:delText>
         </w:r>
       </w:del>
-      <w:ins w:id="107" w:author="Arshad Akhtar Abbasia" w:date="2026-10-04T12:00:00Z">
+      <w:ins w:id="134" w:author="Arshad Akhtar Abbasia" w:date="2026-10-04T12:00:00Z">
         <w:r>
           <w:t xml:space="preserve">conditional extension </w:t>
         </w:r>
@@ -3901,12 +4081,12 @@
       <w:pPr>
         <w:pStyle w:val="BodyText"/>
         <w:rPr>
-          <w:ins w:id="108" w:author="Arshad Akhtar Abbasia" w:date="2026-10-04T12:00:00Z"/>
+          <w:ins w:id="135" w:author="Arshad Akhtar Abbasia" w:date="2026-10-04T12:00:00Z"/>
         </w:rPr>
       </w:pPr>
-      <w:ins w:id="109" w:author="Arshad Akhtar Abbasia" w:date="2026-10-04T12:00:00Z">
-        <w:r>
-          <w:t xml:space="preserve">Corollary 2.3 (sensitivity to what auditing needs). Partition the payload as p(a) = p_(n)(a) ∪ p_(r)(a), where p_(n)(a) is any part that auditing turns out to need, and retain p_(n)(a) with the accessor fields. The trajectory of Proposition 2, with p_(r)(a) in place of p(a), satisfies C1 and C2, and it satisfies C3 unless p_(n)(a) is itself electronic health data within the environment on the broad reading of Article 68(12). In that case C1 and C3 collide over p_(n)(a) for exactly the records that Proposition 3(ii) identifies, and only relocation (Section 4.10, Rival 6) meets both.</w:t>
+      <w:ins w:id="136" w:author="Arshad Akhtar Abbasia" w:date="2026-10-04T12:00:00Z">
+        <w:r>
+          <w:t xml:space="preserve">Corollary 2.3 (sensitivity to what auditing needs). Extend the model with one accessibility variable per part of the payload, which the single-variable model of Section 4.3 cannot express, and partition the payload as p(a) = p_(n)(a) ∪ p_(r)(a), where p_(n)(a) is any part that auditing turns out to need, and retain p_(n)(a) with the accessor fields. The trajectory of Proposition 2, with p_(r)(a) in place of p(a), satisfies C1 and C2, and it satisfies C3 unless p_(n)(a) is itself electronic health data within the environment on the broad reading of Article 68(12). In that case C1 and C3 collide over p_(n)(a), by the argument of Proposition 3, for exactly the records it identifies under case (ii). The collision follows from keeping p_(n)(a) intact under condition (i) without the logged-removal exception that the subject fields have. Relocation (Section 4.10, Rival 6) is the exit this thesis identifies; logging at dataset granularity, the narrow reading, or anonymising p_(n)(a) are others.</w:t>
         </w:r>
       </w:ins>
     </w:p>
@@ -3914,12 +4094,12 @@
       <w:pPr>
         <w:pStyle w:val="BodyText"/>
         <w:rPr>
-          <w:ins w:id="110" w:author="Arshad Akhtar Abbasia" w:date="2026-10-04T12:00:00Z"/>
+          <w:ins w:id="137" w:author="Arshad Akhtar Abbasia" w:date="2026-10-04T12:00:00Z"/>
         </w:rPr>
       </w:pPr>
-      <w:ins w:id="111" w:author="Arshad Akhtar Abbasia" w:date="2026-10-04T12:00:00Z">
-        <w:r>
-          <w:t xml:space="preserve">Proof sketch. Replace p by p_(r) in steps 1–4 and add p_(n) to the fields that condition (i) of Semantics II keeps intact. C1 holds as before. C2 holds for p_(r) as before, and for p_(n) through Article 17(3)(b), which applies because p_(n) is by assumption necessary. C3 constrains whatever is electronic health data within the environment: if p_(n) is not, C3 is met as before; if it is, C3 requires it gone from t_(π)(a) + 6 while C1 requires it until t(a) + F(a), and Proposition 3 gives the records for which these overlap. ∎</w:t>
+      <w:ins w:id="138" w:author="Arshad Akhtar Abbasia" w:date="2026-10-04T12:00:00Z">
+        <w:r>
+          <w:t xml:space="preserve">Proof sketch. Replace p by p_(r) in steps 1–4 and add p_(n) to the fields that condition (i) of Semantics II keeps intact. C1 holds as before. C2 holds for p_(r) as before, and for p_(n) through Article 17(3)(b), which applies because p_(n) is by assumption necessary. C3 constrains whatever is electronic health data within the environment: if p_(n) is not, C3 is met as before; if it is, C3 requires it gone from t_(π)(a) + 6 while C1 requires it until t(a) + F(a), and the argument of Proposition 3 gives the records for which these overlap. ∎</w:t>
         </w:r>
       </w:ins>
     </w:p>
@@ -3927,12 +4107,12 @@
       <w:pPr>
         <w:pStyle w:val="BodyText"/>
         <w:rPr>
-          <w:ins w:id="112" w:author="Arshad Akhtar Abbasia" w:date="2026-10-04T12:00:00Z"/>
+          <w:ins w:id="139" w:author="Arshad Akhtar Abbasia" w:date="2026-10-04T12:00:00Z"/>
         </w:rPr>
       </w:pPr>
-      <w:ins w:id="113" w:author="Arshad Akhtar Abbasia" w:date="2026-10-04T12:00:00Z">
-        <w:r>
-          <w:t xml:space="preserve">Feasibility therefore survives any enlargement of what auditing needs, except an enlargement into data concerning health inside a Secure Processing Environment, where it fails exactly as Corollary 1.2 does and is answered the same way.</w:t>
+      <w:ins w:id="140" w:author="Arshad Akhtar Abbasia" w:date="2026-10-04T12:00:00Z">
+        <w:r>
+          <w:t xml:space="preserve">Feasibility therefore survives any enlargement of what auditing needs, except an enlargement into data concerning health inside a Secure Processing Environment, where it fails as Corollary 1.2 does and has the same exits.</w:t>
         </w:r>
       </w:ins>
     </w:p>
@@ -3943,12 +4123,12 @@
       <w:r>
         <w:t xml:space="preserve">A note on what kind of result this is. The results of this chapter are stated as propositions rather than theorems, because their proofs are short once the semantics are fixed. The weight of the argument lies elsewhere: in Section 4.2’s necessity analysis, which justifies Semantics II, and in Propositions 3 and 4, which say where the conflict arises and where cryptography is necessary. One objection is that Proposition 2 proves little, because Semantics II was defined in full knowledge of the trajectory that satisfies it. The objection has force and the response is to concede its premise and deny its conclusion. The mathematical content of Proposition 2 is indeed modest: once verifiability is decoupled from payload accessibility, the existence of a satisfying trajectory is close to immediate, and the proof is a verification rather than a discovery. But the substantive claim of this chapter was never that a satisfying trajectory exists under some semantics; any number of semantics would admit one, including trivial semantics under which every record counts as verifiable always. The claim is that this semantics is a defensible reading of what the retention obligations require, grounded in the necessity boundary of Article 17(3)(b), the minimisation principle of Article 5(1)(c), and the accountability purpose the obligations serve. It is also the weakest departure from plaintext verifiability that achieves feasibility, preserving every element of the audit record that the accountability purpose needs and discarding only what it does not. Proposition 1 carries the load that Proposition 2 does not: it establishes that some departure is unavoidable, because </w:t>
       </w:r>
-      <w:del w:id="114" w:author="Arshad Akhtar Abbasia" w:date="2026-10-04T12:00:00Z">
+      <w:del w:id="141" w:author="Arshad Akhtar Abbasia" w:date="2026-10-04T12:00:00Z">
         <w:r>
           <w:delText xml:space="preserve">the status quo </w:delText>
         </w:r>
       </w:del>
-      <w:ins w:id="115" w:author="Arshad Akhtar Abbasia" w:date="2026-10-04T12:00:00Z">
+      <w:ins w:id="142" w:author="Arshad Akhtar Abbasia" w:date="2026-10-04T12:00:00Z">
         <w:r>
           <w:t xml:space="preserve">plaintext verifiability </w:t>
         </w:r>
@@ -4020,12 +4200,12 @@
       <w:r>
         <w:t xml:space="preserve">Tamper evidence. An append-only registry is only as good as the means of detecting an append-only violation. Secure audit logging has addressed this since Schneier and Kelsey (1999), whose hash-chained logs make earlier entries unalterable without detection; Merkle trees (Merkle, 1988) let the same assurance be checked for a single entry with a logarithmic proof (Crosby &amp; Wallach, 2009), and Certificate Transparency standardised that construction for public logs (Laurie, Langley, &amp; Kasper, 2013). The mechanism appends every access event, invalidation and subject-link removal to such a log, with the leaf and node hashing of RFC 6962, and Semantics II condition (i) is checked as an inclusion proof against the log’s root rather than as the presence of fields (Chapter 5, Section 5.7). What enters a leaf is chosen so that the log never needs erasing: the accessor fields, the creation month and the commitment, never the payload and never the subject fields. The tension that Chapter 2, Section 2.4 found unresolved in blockchain audit logging, an immutable trail facing an erasure right, therefore does not arise: what the right and the ceiling reach is held outside the log and destroyed there, and what the log holds is what accountability </w:t>
       </w:r>
-      <w:del w:id="116" w:author="Arshad Akhtar Abbasia" w:date="2026-10-04T12:00:00Z">
+      <w:del w:id="143" w:author="Arshad Akhtar Abbasia" w:date="2026-10-04T12:00:00Z">
         <w:r>
           <w:delText xml:space="preserve">requires.</w:delText>
         </w:r>
       </w:del>
-      <w:ins w:id="117" w:author="Arshad Akhtar Abbasia" w:date="2026-10-04T12:00:00Z">
+      <w:ins w:id="144" w:author="Arshad Akhtar Abbasia" w:date="2026-10-04T12:00:00Z">
         <w:r>
           <w:t xml:space="preserve">requires. Redactable and chameleon-hash designs, reviewed in Chapter 2, Section 2.4, resolve the same tension the other way, by letting a key holder rewrite the log.</w:t>
         </w:r>
@@ -4036,7 +4216,20 @@
         <w:pStyle w:val="BodyText"/>
       </w:pPr>
       <w:r>
-        <w:t xml:space="preserve">Accumulator-based validity witnesses. The set of currently valid (non-invalidated) records is maintained in a dynamic cryptographic accumulator supporting efficient revocation (Camenisch &amp; Lysyanskaya, 2002). This provides an auditor with a succinct proof that a given record either is or is not currently valid, without the auditor enumerating the registry. The accumulator is an efficiency and verifiability layer, not a load-bearing component of the propositions: Proposition 2 holds if validity is established by linear scan of the registry, and the accumulator makes that check succinct. The accumulator is specified but not implemented in the artefact (Section 6.1). Dynamic accumulators of the Camenisch and Lysyanskaya type also require a trusted accumulator manager holding a trapdoor, which adds a trust assumption stated in Section 4.9.</w:t>
+        <w:t xml:space="preserve">Accumulator-based validity witnesses. The set of currently valid (non-invalidated) records is maintained in a dynamic cryptographic accumulator supporting efficient revocation (Camenisch &amp; Lysyanskaya, 2002). This provides an auditor with a succinct proof that a given record either is or is not currently valid, without the auditor enumerating the registry. The accumulator is an efficiency and verifiability layer, not a load-bearing component of the propositions: Proposition 2 holds if validity is established by linear scan of the registry, and the accumulator makes that check succinct. The accumulator is specified but not implemented in the artefact </w:t>
+      </w:r>
+      <w:del w:id="145" w:author="Arshad Akhtar Abbasia" w:date="2026-10-04T12:00:00Z">
+        <w:r>
+          <w:delText xml:space="preserve">(Section </w:delText>
+        </w:r>
+      </w:del>
+      <w:ins w:id="146" w:author="Arshad Akhtar Abbasia" w:date="2026-10-04T12:00:00Z">
+        <w:r>
+          <w:t xml:space="preserve">(Chapter 6, Section </w:t>
+        </w:r>
+      </w:ins>
+      <w:r>
+        <w:t xml:space="preserve">6.1). Dynamic accumulators of the Camenisch and Lysyanskaya type also require a trusted accumulator manager holding a trapdoor, which adds a trust assumption stated in Section 4.9.</w:t>
       </w:r>
     </w:p>
     <w:p>
@@ -4062,7 +4255,7 @@
       <w:r>
         <w:t xml:space="preserve">Applying the mechanism to the two cases. For the cross-border primary-use case, the mechanism operates at the audit repository of the National Contact Point, at the point where the ATNA audit record is written. </w:t>
       </w:r>
-      <w:ins w:id="118" w:author="Arshad Akhtar Abbasia" w:date="2026-10-04T12:00:00Z">
+      <w:ins w:id="147" w:author="Arshad Akhtar Abbasia" w:date="2026-10-04T12:00:00Z">
         <w:r>
           <w:t xml:space="preserve">The patient link is retained there through the floor, for the reason Section 4.2 gives, and removed at the terminal transition. </w:t>
         </w:r>
@@ -4108,7 +4301,20 @@
         <w:pStyle w:val="BodyText"/>
       </w:pPr>
       <w:r>
-        <w:t xml:space="preserve">The audit log raises the same threat one level up, and the same response answers it. A leaf hash must outlive the record’s fields, since the root depends on it, and it is computed over the accessor fields and the commitment. After the terminal transition the commitment survives and the accessor fields do not; an adversary who can enumerate candidate accessors, a small set in any one environment, could then recompute the leaf and confirm which accessor it was. The specification therefore places a per-entry random nonce in every leaf, held with the record and destroyed at the terminal transition with the identifying fields, so that a surviving leaf hash confirms nothing. The artefact does not implement the terminal transition, and its leaves omit the nonce accordingly (Section 6.1).</w:t>
+        <w:t xml:space="preserve">The audit log raises the same threat one level up, and the same response answers it. A leaf hash must outlive the record’s fields, since the root depends on it, and it is computed over the accessor fields and the commitment. After the terminal transition the commitment survives and the accessor fields do not; an adversary who can enumerate candidate accessors, a small set in any one environment, could then recompute the leaf and confirm which accessor it was. The specification therefore places a per-entry random nonce in every leaf, held with the record and destroyed at the terminal transition with the identifying fields, so that a surviving leaf hash confirms nothing. The artefact does not implement the terminal transition, and its leaves omit the nonce accordingly </w:t>
+      </w:r>
+      <w:del w:id="148" w:author="Arshad Akhtar Abbasia" w:date="2026-10-04T12:00:00Z">
+        <w:r>
+          <w:delText xml:space="preserve">(Section </w:delText>
+        </w:r>
+      </w:del>
+      <w:ins w:id="149" w:author="Arshad Akhtar Abbasia" w:date="2026-10-04T12:00:00Z">
+        <w:r>
+          <w:t xml:space="preserve">(Chapter 6, Section </w:t>
+        </w:r>
+      </w:ins>
+      <w:r>
+        <w:t xml:space="preserve">6.1).</w:t>
       </w:r>
     </w:p>
     <w:p>
@@ -4206,12 +4412,12 @@
       <w:r>
         <w:t xml:space="preserve">Rival 4: Delete the record and log the deletion. This is the closest rival and deserves the most care. Deleting the audit record while logging that a deletion occurred satisfies C2 and C3, and preserves a trace. It fails C1 under both semantics: under Semantics I trivially, and under Semantics II because condition (ii) fails: no commitment survives, so the auditor can establish that something was deleted but not that the deleted item was the payload bound to that specific access event. The distinction matters in adversarial conditions. A controller who deletes records and logs deletions can conceal the substitution of one record for </w:t>
       </w:r>
-      <w:del w:id="119" w:author="Arshad Akhtar Abbasia" w:date="2026-10-04T12:00:00Z">
+      <w:del w:id="150" w:author="Arshad Akhtar Abbasia" w:date="2026-10-04T12:00:00Z">
         <w:r>
           <w:delText xml:space="preserve">another; </w:delText>
         </w:r>
       </w:del>
-      <w:ins w:id="120" w:author="Arshad Akhtar Abbasia" w:date="2026-10-04T12:00:00Z">
+      <w:ins w:id="151" w:author="Arshad Akhtar Abbasia" w:date="2026-10-04T12:00:00Z">
         <w:r>
           <w:t xml:space="preserve">another. A commitment bound into the log at write time constrains this only for </w:t>
         </w:r>
@@ -4219,40 +4425,14 @@
       <w:r>
         <w:t xml:space="preserve">a </w:t>
       </w:r>
-      <w:del w:id="121" w:author="Arshad Akhtar Abbasia" w:date="2026-10-04T12:00:00Z">
-        <w:r>
-          <w:delText xml:space="preserve">controller bound to </w:delText>
-        </w:r>
-      </w:del>
-      <w:ins w:id="122" w:author="Arshad Akhtar Abbasia" w:date="2026-10-04T12:00:00Z">
-        <w:r>
-          <w:t xml:space="preserve">party that kept its own opening; once the salt and payload are destroyed no auditor can open it, so the commitment alone gives </w:t>
-        </w:r>
-      </w:ins>
-      <w:r>
-        <w:t xml:space="preserve">a </w:t>
-      </w:r>
-      <w:del w:id="123" w:author="Arshad Akhtar Abbasia" w:date="2026-10-04T12:00:00Z">
-        <w:r>
-          <w:delText xml:space="preserve">surviving </w:delText>
-        </w:r>
-      </w:del>
-      <w:ins w:id="124" w:author="Arshad Akhtar Abbasia" w:date="2026-10-04T12:00:00Z">
-        <w:r>
-          <w:t xml:space="preserve">narrower advantage than it may appear to. What does constrain substitution is the log: the entry written at the access event, </w:t>
-        </w:r>
-      </w:ins>
-      <w:r>
-        <w:t xml:space="preserve">commitment </w:t>
-      </w:r>
-      <w:del w:id="125" w:author="Arshad Akhtar Abbasia" w:date="2026-10-04T12:00:00Z">
-        <w:r>
-          <w:delText xml:space="preserve">cannot. </w:delText>
-        </w:r>
-      </w:del>
-      <w:ins w:id="126" w:author="Arshad Akhtar Abbasia" w:date="2026-10-04T12:00:00Z">
-        <w:r>
-          <w:t xml:space="preserve">included, cannot be altered without failing its inclusion proof (Section 4.8). </w:t>
+      <w:del w:id="152" w:author="Arshad Akhtar Abbasia" w:date="2026-10-04T12:00:00Z">
+        <w:r>
+          <w:delText xml:space="preserve">controller bound to a surviving commitment cannot. </w:delText>
+        </w:r>
+      </w:del>
+      <w:ins w:id="153" w:author="Arshad Akhtar Abbasia" w:date="2026-10-04T12:00:00Z">
+        <w:r>
+          <w:t xml:space="preserve">party that kept its own opening; once the salt and payload are destroyed no auditor can open it, so the advantage over this rival is narrower than first stated. </w:t>
         </w:r>
       </w:ins>
       <w:r>
@@ -4298,12 +4478,12 @@
       <w:r>
         <w:t xml:space="preserve">Proof. The ceiling quantifies over the location: after relocation the record is not in it, so the ceiling holds, and on the rival’s premise the floor is met at the new location. The right quantifies over the controller: Article 17(1) obliges the controller holding the data to erase them, </w:t>
       </w:r>
-      <w:del w:id="127" w:author="Arshad Akhtar Abbasia" w:date="2026-10-04T12:00:00Z">
+      <w:del w:id="154" w:author="Arshad Akhtar Abbasia" w:date="2026-10-04T12:00:00Z">
         <w:r>
           <w:delText xml:space="preserve">and </w:delText>
         </w:r>
       </w:del>
-      <w:ins w:id="128" w:author="Arshad Akhtar Abbasia" w:date="2026-10-04T12:00:00Z">
+      <w:ins w:id="155" w:author="Arshad Akhtar Abbasia" w:date="2026-10-04T12:00:00Z">
         <w:r>
           <w:t xml:space="preserve">and, as a legal premise rather than a mathematical consequence, </w:t>
         </w:r>
@@ -4551,14 +4731,14 @@
       <w:r>
         <w:t xml:space="preserve">This chapter formalised the tri-lateral retention conflict as a constraint-satisfaction problem over a single binary accessibility variable per record, with the retention floor parameterised so that the ten-year cross-border audit floor and the one-year Secure Processing Environment log floor are instances of one constraint. It proved that under plaintext-verifiability semantics the system is infeasible for any cross-border record whose erasure request arrives inside its window and, for Secure Processing Environment logs kept at patient-record granularity on the broad reading, without any erasure request at all, where two retention provisions of a single regulation collide over a single environment. It proved that under an accountability-preserving semantics the system is jointly satisfiable for every arrival pattern and every floor, and the proof exhibited the trajectory that achieves satisfaction. It showed that a ceiling collides with a floor only when it is no longer than the floor, and that the ceiling’s anchor decides whether the collision can be read from the text (Proposition 3), and that relocating a record meets the ceiling but not the right (Proposition 4). That trajectory, specified as Crypto-Erasure by Invalidation, retains metadata and a hiding commitment, and destroys the payload key at the earlier of the erasure deadline and the deletion ceiling. It appends the invalidation to a tamper-evident audit log as a first-class, witnessed event, in a log built never to hold what erasure reaches. The salt and the payload ciphertext go with the key. At floor expiry it performs a terminal transition that destroys the identifying metadata, leaving a non-identifiable statistical residue, so that the record’s whole life cycle, not merely its retention window, is accounted for under the storage-limitation </w:t>
       </w:r>
-      <w:del w:id="129" w:author="Arshad Akhtar Abbasia" w:date="2026-10-04T12:00:00Z">
+      <w:del w:id="156" w:author="Arshad Akhtar Abbasia" w:date="2026-10-04T12:00:00Z">
         <w:r>
           <w:delText xml:space="preserve">principle.</w:delText>
         </w:r>
       </w:del>
-      <w:ins w:id="130" w:author="Arshad Akhtar Abbasia" w:date="2026-10-04T12:00:00Z">
-        <w:r>
-          <w:t xml:space="preserve">principle. The terminal transition, the per-entry nonce, consistency proofs and the accumulator layer are specified but not implemented in the artefact (Chapter 6, Section 6.1).</w:t>
+      <w:ins w:id="157" w:author="Arshad Akhtar Abbasia" w:date="2026-10-04T12:00:00Z">
+        <w:r>
+          <w:t xml:space="preserve">principle. The terminal transition, the per-entry nonce, consistency proofs and the accumulator layer are specified but not implemented in the artefact (Chapter 6, Section 6.1). For Secure Processing Environment records the result assumes that auditing does not need the payload; Corollary 2.3 states what follows if it needs part of it.</w:t>
         </w:r>
       </w:ins>
     </w:p>
@@ -4615,7 +4795,72 @@
         <w:pStyle w:val="BodyText"/>
       </w:pPr>
       <w:r>
-        <w:t xml:space="preserve">The chapter demonstrates that Propositions 1 and 2 of Chapter 4 hold on the instances examined; Propositions 3 and 4 are analytic and are not executed here, although Section 5.4 computes the condition of Proposition 3. It does not verify them in the proof-assistant sense, it does not measure performance, and it does not deploy anything. Proposition 1 predicts that under plaintext-verifiability semantics the constraint system fails whenever an erasure deadline or a deletion-ceiling deadline falls inside a record’s retention window. Proposition 2 predicts that under accountability-preserving semantics the invalidation trajectory satisfies all three constraints for every arrival pattern. The demonstration’s job is to make both predictions checkable by execution rather than only by argument.</w:t>
+        <w:t xml:space="preserve">The chapter demonstrates that Propositions 1 and 2 of Chapter 4 hold on the instances examined; </w:t>
+      </w:r>
+      <w:del w:id="158" w:author="Arshad Akhtar Abbasia" w:date="2026-10-04T12:00:00Z">
+        <w:r>
+          <w:delText xml:space="preserve">Propositions 3 and </w:delText>
+        </w:r>
+      </w:del>
+      <w:ins w:id="159" w:author="Arshad Akhtar Abbasia" w:date="2026-10-04T12:00:00Z">
+        <w:r>
+          <w:t xml:space="preserve">Proposition </w:t>
+        </w:r>
+      </w:ins>
+      <w:r>
+        <w:t xml:space="preserve">4 </w:t>
+      </w:r>
+      <w:del w:id="160" w:author="Arshad Akhtar Abbasia" w:date="2026-10-04T12:00:00Z">
+        <w:r>
+          <w:delText xml:space="preserve">are </w:delText>
+        </w:r>
+      </w:del>
+      <w:ins w:id="161" w:author="Arshad Akhtar Abbasia" w:date="2026-10-04T12:00:00Z">
+        <w:r>
+          <w:t xml:space="preserve">is </w:t>
+        </w:r>
+      </w:ins>
+      <w:r>
+        <w:t xml:space="preserve">analytic and </w:t>
+      </w:r>
+      <w:del w:id="162" w:author="Arshad Akhtar Abbasia" w:date="2026-10-04T12:00:00Z">
+        <w:r>
+          <w:delText xml:space="preserve">are </w:delText>
+        </w:r>
+      </w:del>
+      <w:ins w:id="163" w:author="Arshad Akhtar Abbasia" w:date="2026-10-04T12:00:00Z">
+        <w:r>
+          <w:t xml:space="preserve">is </w:t>
+        </w:r>
+      </w:ins>
+      <w:r>
+        <w:t xml:space="preserve">not executed </w:t>
+      </w:r>
+      <w:del w:id="164" w:author="Arshad Akhtar Abbasia" w:date="2026-10-04T12:00:00Z">
+        <w:r>
+          <w:delText xml:space="preserve">here, although </w:delText>
+        </w:r>
+      </w:del>
+      <w:ins w:id="165" w:author="Arshad Akhtar Abbasia" w:date="2026-10-04T12:00:00Z">
+        <w:r>
+          <w:t xml:space="preserve">here; </w:t>
+        </w:r>
+      </w:ins>
+      <w:r>
+        <w:t xml:space="preserve">Section 5.4 computes the condition of Proposition </w:t>
+      </w:r>
+      <w:del w:id="166" w:author="Arshad Akhtar Abbasia" w:date="2026-10-04T12:00:00Z">
+        <w:r>
+          <w:delText xml:space="preserve">3. </w:delText>
+        </w:r>
+      </w:del>
+      <w:ins w:id="167" w:author="Arshad Akhtar Abbasia" w:date="2026-10-04T12:00:00Z">
+        <w:r>
+          <w:t xml:space="preserve">3 and Section 5.5 checks it. </w:t>
+        </w:r>
+      </w:ins>
+      <w:r>
+        <w:t xml:space="preserve">It does not verify them in the proof-assistant sense, it does not measure performance, and it does not deploy anything. Proposition 1 predicts that under plaintext-verifiability semantics the constraint system fails whenever an erasure deadline or a deletion-ceiling deadline falls inside a record’s retention window. Proposition 2 predicts that under accountability-preserving semantics the invalidation trajectory satisfies all three constraints for every arrival pattern. The demonstration’s job is to make both predictions checkable by execution rather than only by argument.</w:t>
       </w:r>
     </w:p>
     <w:p>
@@ -4625,12 +4870,12 @@
       <w:r>
         <w:t xml:space="preserve">A subsidiary claim is made for Corollary 1.2: that, on the broad reading of Article 68(12) and for logs kept at patient-record granularity, Secure Processing Environment access-log records become infeasible under plaintext semantics without any erasure request at all, through the collision of the Article 73(1)(e) one-year retention floor with the Article 68(12) six-month deletion ceiling. The demonstration produces thirty-nine such </w:t>
       </w:r>
-      <w:del w:id="131" w:author="Arshad Akhtar Abbasia" w:date="2026-10-04T12:00:00Z">
+      <w:del w:id="168" w:author="Arshad Akhtar Abbasia" w:date="2026-10-04T12:00:00Z">
         <w:r>
           <w:delText xml:space="preserve">witnesses.</w:delText>
         </w:r>
       </w:del>
-      <w:ins w:id="132" w:author="Arshad Akhtar Abbasia" w:date="2026-10-04T12:00:00Z">
+      <w:ins w:id="169" w:author="Arshad Akhtar Abbasia" w:date="2026-10-04T12:00:00Z">
         <w:r>
           <w:t xml:space="preserve">witnesses, a number the generator determines (Section 5.4).</w:t>
         </w:r>
@@ -4720,12 +4965,12 @@
       <w:pPr>
         <w:pStyle w:val="BodyText"/>
         <w:rPr>
-          <w:ins w:id="133" w:author="Arshad Akhtar Abbasia" w:date="2026-10-04T12:00:00Z"/>
+          <w:ins w:id="170" w:author="Arshad Akhtar Abbasia" w:date="2026-10-04T12:00:00Z"/>
         </w:rPr>
       </w:pPr>
-      <w:ins w:id="134" w:author="Arshad Akhtar Abbasia" w:date="2026-10-04T12:00:00Z">
-        <w:r>
-          <w:t xml:space="preserve">z3_check.py 135 Optional: bounded SMT check of Propositions 1–3 (needs z3-solver) No --------------------------------------------------------------------------------------------------------------------------------------------------------------------------------------------------</w:t>
+      <w:ins w:id="171" w:author="Arshad Akhtar Abbasia" w:date="2026-10-04T12:00:00Z">
+        <w:r>
+          <w:t xml:space="preserve">z3_check.py 153 Optional: bounded SMT check of Propositions 1–3 (needs z3-solver) No --------------------------------------------------------------------------------------------------------------------------------------------------------------------------------------------------</w:t>
         </w:r>
       </w:ins>
     </w:p>
@@ -5000,7 +5245,7 @@
       <w:r>
         <w:t xml:space="preserve">The fifty per cent figure follows from the generator. The collision occurs when t_(π) + 6 ≤ t_(a) + 12, the condition of Proposition 3(ii) with F = 12, L = 6 and the ceiling anchored to permit expiry, and permit lengths were drawn uniformly from one to twelve months, so half fall at or below six. </w:t>
       </w:r>
-      <w:ins w:id="135" w:author="Arshad Akhtar Abbasia" w:date="2026-10-04T12:00:00Z">
+      <w:ins w:id="172" w:author="Arshad Akhtar Abbasia" w:date="2026-10-04T12:00:00Z">
         <w:r>
           <w:t xml:space="preserve">Article 68(12) allows permits of up to ten years; with the remaining duration drawn uniformly over a five-year permit, about one log in ten would fall in the window. </w:t>
         </w:r>
@@ -5084,23 +5329,31 @@
     <w:p>
       <w:pPr>
         <w:pStyle w:val="BodyText"/>
+      </w:pPr>
+      <w:r>
+        <w:t xml:space="preserve">The cross-border floor is scaled from one hundred and twenty months to twelve for this check, because exhaustive search over 2¹²⁰ assignments is not computable. The scaling does not affect the logic: Proposition 1’s argument depends on the deadline falling inside the window, not on the window’s length, and the scaled case preserves that relation. It is the one place in the </w:t>
+      </w:r>
+      <w:ins w:id="173" w:author="Arshad Akhtar Abbasia" w:date="2026-10-04T12:00:00Z">
+        <w:r>
+          <w:t xml:space="preserve">checker’s </w:t>
+        </w:r>
+      </w:ins>
+      <w:r>
+        <w:t xml:space="preserve">demonstration where a parameter was altered for tractability.</w:t>
+      </w:r>
+    </w:p>
+    <w:p>
+      <w:pPr>
+        <w:pStyle w:val="BodyText"/>
         <w:rPr>
-          <w:ins w:id="136" w:author="Arshad Akhtar Abbasia" w:date="2026-10-04T12:00:00Z"/>
+          <w:ins w:id="174" w:author="Arshad Akhtar Abbasia" w:date="2026-10-04T12:00:00Z"/>
         </w:rPr>
       </w:pPr>
-      <w:ins w:id="137" w:author="Arshad Akhtar Abbasia" w:date="2026-10-04T12:00:00Z">
-        <w:r>
-          <w:t xml:space="preserve">A bounded check in a different formalism narrows that limitation. An optional module poses each proposition to the Z3 SMT solver as a request for a counterexample: a record with any parameter values inside stated bounds (creation month 0–12, floor 1–24 months, response period 1–3 months, request month and ceiling anchor anywhere up to a 64-month horizon, ceiling 1–24 months) that contradicts either direction of Proposition 1, the constructive trajectory of Proposition 2, or either direction of Proposition 3 and its two cases. The solver finds none in any of the nine checks. It does find counterexamples to deliberately wrong versions of Proposition 3 shifted by one month, which shows the checks can fail (Appendix A, A.23 and A.24). The check covers every parameter combination within the bounds rather than a sample, and it shares no code with the checker; it takes the constraint definitions from Section 4.4, so it checks that the propositions follow from the constraints, not that the constraints translate the law, and it is bounded rather than general.</w:t>
-        </w:r>
-      </w:ins>
-    </w:p>
-    <w:p>
-      <w:pPr>
-        <w:pStyle w:val="BodyText"/>
-      </w:pPr>
-      <w:r>
-        <w:t xml:space="preserve">The cross-border floor is scaled from one hundred and twenty months to twelve for this check, because exhaustive search over 2¹²⁰ assignments is not computable. The scaling does not affect the logic: Proposition 1’s argument depends on the deadline falling inside the window, not on the window’s length, and the scaled case preserves that relation. It is the one place in the demonstration where a parameter was altered for tractability.</w:t>
-      </w:r>
+      <w:ins w:id="175" w:author="Arshad Akhtar Abbasia" w:date="2026-10-04T12:00:00Z">
+        <w:r>
+          <w:t xml:space="preserve">A bounded check in a different formalism guards against error in the proofs. An optional module poses the propositions to the Z3 SMT solver as requests for a counterexample: a record with any parameter values inside stated bounds (creation month 0–12, floor 1–120 months, so the cross-border floor is covered, response period 1–3 months, request month and ceiling anchor anywhere up to a 140-month horizon, ceiling 1–120 months). It checks Proposition 1 and the converse Chapter 5 relies on (a record with no deadline inside its window is feasible), the constructive trajectory of Proposition 2 with the accountability state of Semantics II encoded (accessor fields, commitment, invalidation entry, subject link and its removal entry), and both directions of Proposition 3 with its two cases. The solver finds no counterexample in any of the nine checks. It does find counterexamples to deliberately broken versions: the Proposition 2 construction without its invalidation entry, without its commitment, or without the subject-link entry, and Proposition 3 shifted by one month, which shows the checks can fail (Appendix A, A.23 and A.24). The check covers every parameter combination within the bounds rather than a sample and shares no code with the checker. It was written in the same AI-assisted process and takes the constraint definitions from Section 4.4, so it checks that the propositions follow from the constraints as encoded, not that the constraints translate the law, and it is bounded rather than general.</w:t>
+        </w:r>
+      </w:ins>
     </w:p>
     <w:p>
       <w:pPr>
@@ -5221,12 +5474,12 @@
       <w:r>
         <w:t xml:space="preserve">This is the state the mechanism is designed to produce, and it is worth reading against what Semantics I would have demanded. The access event is fully established: which researcher, under which permit, with what outcome. The link to the patient was removed at the ceiling, and its removal is itself a logged </w:t>
       </w:r>
-      <w:del w:id="138" w:author="Arshad Akhtar Abbasia" w:date="2026-10-04T12:00:00Z">
+      <w:del w:id="176" w:author="Arshad Akhtar Abbasia" w:date="2026-10-04T12:00:00Z">
         <w:r>
           <w:delText xml:space="preserve">entry. </w:delText>
         </w:r>
       </w:del>
-      <w:ins w:id="139" w:author="Arshad Akhtar Abbasia" w:date="2026-10-04T12:00:00Z">
+      <w:ins w:id="177" w:author="Arshad Akhtar Abbasia" w:date="2026-10-04T12:00:00Z">
         <w:r>
           <w:t xml:space="preserve">entry; a cross-border record keeps the link through the floor (Chapter 4, Section 4.2). </w:t>
         </w:r>
@@ -5234,12 +5487,12 @@
       <w:r>
         <w:t xml:space="preserve">The binding to a specific payload survives in the commitment. The invalidation is itself a logged, grounded, attributed event rather than a silent absence. And the payload is unreadable, at month nineteen as at month sixteen. An auditor examining this record learns </w:t>
       </w:r>
-      <w:del w:id="140" w:author="Arshad Akhtar Abbasia" w:date="2026-10-04T12:00:00Z">
+      <w:del w:id="178" w:author="Arshad Akhtar Abbasia" w:date="2026-10-04T12:00:00Z">
         <w:r>
           <w:delText xml:space="preserve">everything </w:delText>
         </w:r>
       </w:del>
-      <w:ins w:id="141" w:author="Arshad Akhtar Abbasia" w:date="2026-10-04T12:00:00Z">
+      <w:ins w:id="179" w:author="Arshad Akhtar Abbasia" w:date="2026-10-04T12:00:00Z">
         <w:r>
           <w:t xml:space="preserve">what the </w:t>
         </w:r>
@@ -5247,25 +5500,25 @@
       <w:r>
         <w:t xml:space="preserve">accountability </w:t>
       </w:r>
-      <w:del w:id="142" w:author="Arshad Akhtar Abbasia" w:date="2026-10-04T12:00:00Z">
+      <w:del w:id="180" w:author="Arshad Akhtar Abbasia" w:date="2026-10-04T12:00:00Z">
         <w:r>
           <w:delText xml:space="preserve">requires and nothing </w:delText>
         </w:r>
       </w:del>
-      <w:ins w:id="143" w:author="Arshad Akhtar Abbasia" w:date="2026-10-04T12:00:00Z">
-        <w:r>
-          <w:t xml:space="preserve">purpose is argued to require (Section 4.2), while </w:t>
+      <w:ins w:id="181" w:author="Arshad Akhtar Abbasia" w:date="2026-10-04T12:00:00Z">
+        <w:r>
+          <w:t xml:space="preserve">purpose is argued to require (Chapter 4, Section 4.2), while </w:t>
         </w:r>
       </w:ins>
       <w:r>
         <w:t xml:space="preserve">the </w:t>
       </w:r>
-      <w:del w:id="144" w:author="Arshad Akhtar Abbasia" w:date="2026-10-04T12:00:00Z">
+      <w:del w:id="182" w:author="Arshad Akhtar Abbasia" w:date="2026-10-04T12:00:00Z">
         <w:r>
           <w:delText xml:space="preserve">erasure obligation forbids.</w:delText>
         </w:r>
       </w:del>
-      <w:ins w:id="145" w:author="Arshad Akhtar Abbasia" w:date="2026-10-04T12:00:00Z">
+      <w:ins w:id="183" w:author="Arshad Akhtar Abbasia" w:date="2026-10-04T12:00:00Z">
         <w:r>
           <w:t xml:space="preserve">payload is unreadable.</w:t>
         </w:r>
@@ -5294,12 +5547,12 @@
       <w:r>
         <w:t xml:space="preserve">Established. Both propositions hold on all two hundred generated instances. Proposition 1’s conditional structure is reproduced exactly, including the boundary case of the request falling outside the window. Corollary 1.2 has thirty-nine witnesses in the model: records in which two provisions of one regulation collide over one environment with no data-subject action involved. The infeasibility results survive a separately written exhaustive search that considers every possible accessibility assignment rather than only the trajectory the main checker </w:t>
       </w:r>
-      <w:del w:id="146" w:author="Arshad Akhtar Abbasia" w:date="2026-10-04T12:00:00Z">
+      <w:del w:id="184" w:author="Arshad Akhtar Abbasia" w:date="2026-10-04T12:00:00Z">
         <w:r>
           <w:delText xml:space="preserve">examines. </w:delText>
         </w:r>
       </w:del>
-      <w:ins w:id="147" w:author="Arshad Akhtar Abbasia" w:date="2026-10-04T12:00:00Z">
+      <w:ins w:id="185" w:author="Arshad Akhtar Abbasia" w:date="2026-10-04T12:00:00Z">
         <w:r>
           <w:t xml:space="preserve">examines, and Propositions 1–3 survive a bounded SMT check over every parameter combination within its bounds. </w:t>
         </w:r>
@@ -5425,19 +5678,63 @@
         <w:pStyle w:val="BodyText"/>
       </w:pPr>
       <w:r>
-        <w:t xml:space="preserve">The request-driven form of the conflict cannot be escaped by moving the record. A deletion ceiling anchored to a location yields to relocation, but the right to erasure attaches to whichever controller holds the data (Chapter 4, Section 4.10, Proposition 4). Cryptographic invalidation is therefore necessary where a data subject’s request meets a retention floor, and in the cross-border pathway that is every request arriving inside the floor, because the patient-discovery transaction puts the patient’s identifying query into the audit record by design.</w:t>
-      </w:r>
-    </w:p>
-    <w:p>
-      <w:pPr>
-        <w:pStyle w:val="BodyText"/>
-      </w:pPr>
-      <w:del w:id="148" w:author="Arshad Akhtar Abbasia" w:date="2026-10-04T12:00:00Z">
+        <w:t xml:space="preserve">The request-driven form of the conflict cannot be escaped by moving the record. A deletion ceiling anchored to a location yields to relocation, but the right to erasure attaches to whichever controller holds the data (Chapter 4, Section 4.10, Proposition 4). Cryptographic invalidation is therefore necessary where a data subject’s request meets a retention floor, and in the cross-border pathway that is every request arriving inside the floor, because the </w:t>
+      </w:r>
+      <w:ins w:id="186" w:author="Arshad Akhtar Abbasia" w:date="2026-10-04T12:00:00Z">
+        <w:r>
+          <w:t xml:space="preserve">IHE </w:t>
+        </w:r>
+      </w:ins>
+      <w:r>
+        <w:t xml:space="preserve">patient-discovery </w:t>
+      </w:r>
+      <w:del w:id="187" w:author="Arshad Akhtar Abbasia" w:date="2026-10-04T12:00:00Z">
+        <w:r>
+          <w:delText xml:space="preserve">transaction puts </w:delText>
+        </w:r>
+      </w:del>
+      <w:ins w:id="188" w:author="Arshad Akhtar Abbasia" w:date="2026-10-04T12:00:00Z">
+        <w:r>
+          <w:t xml:space="preserve">profile requires </w:t>
+        </w:r>
+      </w:ins>
+      <w:r>
+        <w:t xml:space="preserve">the patient’s identifying query </w:t>
+      </w:r>
+      <w:del w:id="189" w:author="Arshad Akhtar Abbasia" w:date="2026-10-04T12:00:00Z">
+        <w:r>
+          <w:delText xml:space="preserve">into </w:delText>
+        </w:r>
+      </w:del>
+      <w:ins w:id="190" w:author="Arshad Akhtar Abbasia" w:date="2026-10-04T12:00:00Z">
+        <w:r>
+          <w:t xml:space="preserve">to be recorded in </w:t>
+        </w:r>
+      </w:ins>
+      <w:r>
+        <w:t xml:space="preserve">the audit </w:t>
+      </w:r>
+      <w:del w:id="191" w:author="Arshad Akhtar Abbasia" w:date="2026-10-04T12:00:00Z">
+        <w:r>
+          <w:delText xml:space="preserve">record by design.</w:delText>
+        </w:r>
+      </w:del>
+      <w:ins w:id="192" w:author="Arshad Akhtar Abbasia" w:date="2026-10-04T12:00:00Z">
+        <w:r>
+          <w:t xml:space="preserve">message.</w:t>
+        </w:r>
+      </w:ins>
+    </w:p>
+    <w:p>
+      <w:pPr>
+        <w:pStyle w:val="BodyText"/>
+      </w:pPr>
+      <w:del w:id="193" w:author="Arshad Akhtar Abbasia" w:date="2026-10-04T12:00:00Z">
         <w:r>
           <w:delText xml:space="preserve">The sharpest instance is narrower, and </w:delText>
         </w:r>
       </w:del>
-      <w:ins w:id="149" w:author="Arshad Akhtar Abbasia" w:date="2026-10-04T12:00:00Z">
+      <w:ins w:id="194" w:author="Arshad Akhtar Abbasia" w:date="2026-10-04T12:00:00Z">
         <w:r>
           <w:t xml:space="preserve">A conditional extension </w:t>
         </w:r>
@@ -5445,7 +5742,7 @@
       <w:r>
         <w:t xml:space="preserve">rests on one contestable interpretive step. Article 73(1)(e) requires identifiable logs of access to and activity in a Secure Processing Environment to be kept for at least one year. Article 68(12) requires “the electronic health data within the secure processing environment” to be deleted within six months of the expiry of the data permit. Where an environment logs access at patient-record granularity, those log entries are electronic health data within the environment on the broad reading, and where the remaining permit duration at the time a log is written is six months or less, the two requirements overlap with no data subject acting. Chapter 4, Section 4.6 sets out the grounds on both sides. Chapter 5 produced </w:t>
       </w:r>
-      <w:del w:id="150" w:author="Arshad Akhtar Abbasia" w:date="2026-10-04T12:00:00Z">
+      <w:del w:id="195" w:author="Arshad Akhtar Abbasia" w:date="2026-10-04T12:00:00Z">
         <w:r>
           <w:delText xml:space="preserve">thirty-nine </w:delText>
         </w:r>
@@ -5453,12 +5750,12 @@
       <w:r>
         <w:t xml:space="preserve">witnesses of this collision in the </w:t>
       </w:r>
-      <w:del w:id="151" w:author="Arshad Akhtar Abbasia" w:date="2026-10-04T12:00:00Z">
+      <w:del w:id="196" w:author="Arshad Akhtar Abbasia" w:date="2026-10-04T12:00:00Z">
         <w:r>
           <w:delText xml:space="preserve">model, in a population </w:delText>
         </w:r>
       </w:del>
-      <w:ins w:id="152" w:author="Arshad Akhtar Abbasia" w:date="2026-10-04T12:00:00Z">
+      <w:ins w:id="197" w:author="Arshad Akhtar Abbasia" w:date="2026-10-04T12:00:00Z">
         <w:r>
           <w:t xml:space="preserve">model; how many depends on the permit lengths the generator draws, and the count is not an estimate </w:t>
         </w:r>
@@ -5466,12 +5763,12 @@
       <w:r>
         <w:t xml:space="preserve">of </w:t>
       </w:r>
-      <w:del w:id="153" w:author="Arshad Akhtar Abbasia" w:date="2026-10-04T12:00:00Z">
+      <w:del w:id="198" w:author="Arshad Akhtar Abbasia" w:date="2026-10-04T12:00:00Z">
         <w:r>
           <w:delText xml:space="preserve">one hundred Secure Processing Environment records; across the full population of two hundred, cross-border records included, ninety records were infeasible under Semantics I, most of them through erasure requests </w:delText>
         </w:r>
       </w:del>
-      <w:ins w:id="154" w:author="Arshad Akhtar Abbasia" w:date="2026-10-04T12:00:00Z">
+      <w:ins w:id="199" w:author="Arshad Akhtar Abbasia" w:date="2026-10-04T12:00:00Z">
         <w:r>
           <w:t xml:space="preserve">real frequency </w:t>
         </w:r>
@@ -5479,12 +5776,12 @@
       <w:r>
         <w:t xml:space="preserve">(Chapter 5, </w:t>
       </w:r>
-      <w:del w:id="155" w:author="Arshad Akhtar Abbasia" w:date="2026-10-04T12:00:00Z">
+      <w:del w:id="200" w:author="Arshad Akhtar Abbasia" w:date="2026-10-04T12:00:00Z">
         <w:r>
           <w:delText xml:space="preserve">Table 5.3). </w:delText>
         </w:r>
       </w:del>
-      <w:ins w:id="156" w:author="Arshad Akhtar Abbasia" w:date="2026-10-04T12:00:00Z">
+      <w:ins w:id="201" w:author="Arshad Akhtar Abbasia" w:date="2026-10-04T12:00:00Z">
         <w:r>
           <w:t xml:space="preserve">Section 5.4). </w:t>
         </w:r>
@@ -5498,7 +5795,28 @@
         <w:pStyle w:val="BodyText"/>
       </w:pPr>
       <w:r>
-        <w:t xml:space="preserve">Finally, the thesis specifies the mechanism that the feasibility proof exhibits: per-record keys under a key-encrypting key, hiding commitments, deletion of the ciphertext with the key, removal of the subject link at the ceiling, invalidation entries carrying month, legal ground, and authorising actor, a tamper-evident log built never to hold what erasure reaches, and a terminal transition at floor expiry that discharges the storage-limitation obligation on the metadata itself. The artefact executes all of these but the terminal transition, which Section 4.8 specifies and the checker does not implement; nor does it implement the per-entry nonce that keeps surviving leaf hashes from confirming guesses (Chapter 4, Section 4.9). The specification also provides for accumulator-based validity witnesses, which are an efficiency and verifiability layer rather than a component of either proposition, since Proposition 2 holds if validity is established by linear scan. They are specified but not implemented: the demonstration of Chapter 5 exercises keys, commitments, and invalidation entries, and no accumulator was built or run.</w:t>
+        <w:t xml:space="preserve">Finally, the thesis specifies the mechanism that the feasibility proof exhibits: per-record keys under a key-encrypting key, hiding commitments, deletion of the ciphertext with the key, removal of the subject link at the ceiling, invalidation entries carrying month, legal ground, and authorising actor, a tamper-evident log built never to hold what erasure reaches, and a terminal transition at floor expiry that discharges the storage-limitation obligation on the metadata itself. The artefact executes all of these but the terminal transition, which </w:t>
+      </w:r>
+      <w:ins w:id="202" w:author="Arshad Akhtar Abbasia" w:date="2026-10-04T12:00:00Z">
+        <w:r>
+          <w:t xml:space="preserve">Chapter 4, </w:t>
+        </w:r>
+      </w:ins>
+      <w:r>
+        <w:t xml:space="preserve">Section 4.8 specifies and the checker does not implement; nor does it implement the per-entry nonce that keeps surviving leaf hashes from confirming </w:t>
+      </w:r>
+      <w:del w:id="203" w:author="Arshad Akhtar Abbasia" w:date="2026-10-04T12:00:00Z">
+        <w:r>
+          <w:delText xml:space="preserve">guesses </w:delText>
+        </w:r>
+      </w:del>
+      <w:ins w:id="204" w:author="Arshad Akhtar Abbasia" w:date="2026-10-04T12:00:00Z">
+        <w:r>
+          <w:t xml:space="preserve">guesses, or the consistency proofs between successive log roots </w:t>
+        </w:r>
+      </w:ins>
+      <w:r>
+        <w:t xml:space="preserve">(Chapter 4, Section 4.9). The specification also provides for accumulator-based validity witnesses, which are an efficiency and verifiability layer rather than a component of either proposition, since Proposition 2 holds if validity is established by linear scan. They are specified but not implemented: the demonstration of Chapter 5 exercises keys, commitments, and invalidation entries, and no accumulator was built or run.</w:t>
       </w:r>
     </w:p>
     <w:p>
@@ -5578,7 +5896,15 @@
         <w:pStyle w:val="BodyText"/>
       </w:pPr>
       <w:r>
-        <w:t xml:space="preserve">A second authority question sits beside the first and is narrower. Whether Article 68(12) reaches the access logs is a question of statutory construction that a supervisory authority or, ultimately, a court will settle, and that this author cannot. The thesis states Corollary 1.2 conditionally rather than adopting the broad reading or the narrow one, on the grounds set out in Chapter 4, Section 4.6. What makes this tolerable rather than fatal is that the dependency is confined: Corollary 1.2 stands or falls with it, and nothing else in the thesis does. The same request, addressed to the authorities responsible for EHDS incorporation, could reasonably carry this one alongside it.</w:t>
+        <w:t xml:space="preserve">A second authority question sits beside the first and is narrower. Whether Article 68(12) reaches the access logs is a question of statutory construction that a supervisory authority or, ultimately, a court will settle, and that this author cannot. The thesis states Corollary 1.2 conditionally rather than adopting the broad reading or the narrow one, on the grounds set out in Chapter 4, Section 4.6. What makes this tolerable rather than fatal is that the dependency is confined: Corollary 1.2 stands or falls with it, </w:t>
+      </w:r>
+      <w:ins w:id="205" w:author="Arshad Akhtar Abbasia" w:date="2026-10-04T12:00:00Z">
+        <w:r>
+          <w:t xml:space="preserve">as does the conditional branch of Corollary 2.3, </w:t>
+        </w:r>
+      </w:ins>
+      <w:r>
+        <w:t xml:space="preserve">and nothing else in the thesis does. The same request, addressed to the authorities responsible for EHDS incorporation, could reasonably carry this one alongside it.</w:t>
       </w:r>
     </w:p>
     <w:p>
@@ -5804,12 +6130,12 @@
       <w:r>
         <w:t xml:space="preserve">The deeper limitation is that a demonstration over generated instances is not a proof over all instances. The general claims rest on the arguments in Chapter 4, and those arguments are informal rather than machine-checked. The executable </w:t>
       </w:r>
-      <w:del w:id="157" w:author="Arshad Akhtar Abbasia" w:date="2026-10-04T12:00:00Z">
+      <w:del w:id="206" w:author="Arshad Akhtar Abbasia" w:date="2026-10-04T12:00:00Z">
         <w:r>
           <w:delText xml:space="preserve">check and </w:delText>
         </w:r>
       </w:del>
-      <w:ins w:id="158" w:author="Arshad Akhtar Abbasia" w:date="2026-10-04T12:00:00Z">
+      <w:ins w:id="207" w:author="Arshad Akhtar Abbasia" w:date="2026-10-04T12:00:00Z">
         <w:r>
           <w:t xml:space="preserve">check, </w:t>
         </w:r>
@@ -5817,7 +6143,7 @@
       <w:r>
         <w:t xml:space="preserve">the exhaustive cross-check </w:t>
       </w:r>
-      <w:ins w:id="159" w:author="Arshad Akhtar Abbasia" w:date="2026-10-04T12:00:00Z">
+      <w:ins w:id="208" w:author="Arshad Akhtar Abbasia" w:date="2026-10-04T12:00:00Z">
         <w:r>
           <w:t xml:space="preserve">and the bounded SMT check </w:t>
         </w:r>
@@ -5825,12 +6151,12 @@
       <w:r>
         <w:t xml:space="preserve">reduce the probability that an error in the proofs has gone unnoticed; they do not eliminate </w:t>
       </w:r>
-      <w:del w:id="160" w:author="Arshad Akhtar Abbasia" w:date="2026-10-04T12:00:00Z">
+      <w:del w:id="209" w:author="Arshad Akhtar Abbasia" w:date="2026-10-04T12:00:00Z">
         <w:r>
           <w:delText xml:space="preserve">it.</w:delText>
         </w:r>
       </w:del>
-      <w:ins w:id="161" w:author="Arshad Akhtar Abbasia" w:date="2026-10-04T12:00:00Z">
+      <w:ins w:id="210" w:author="Arshad Akhtar Abbasia" w:date="2026-10-04T12:00:00Z">
         <w:r>
           <w:t xml:space="preserve">it, and none of them can show that the constraints translate the law.</w:t>
         </w:r>
@@ -6032,10 +6358,10 @@
       <w:pPr>
         <w:pStyle w:val="BodyText"/>
         <w:rPr>
-          <w:ins w:id="162" w:author="Arshad Akhtar Abbasia" w:date="2026-10-04T12:00:00Z"/>
+          <w:ins w:id="211" w:author="Arshad Akhtar Abbasia" w:date="2026-10-04T12:00:00Z"/>
         </w:rPr>
       </w:pPr>
-      <w:ins w:id="163" w:author="Arshad Akhtar Abbasia" w:date="2026-10-04T12:00:00Z">
+      <w:ins w:id="212" w:author="Arshad Akhtar Abbasia" w:date="2026-10-04T12:00:00Z">
         <w:r>
           <w:t xml:space="preserve">The limitations that bound the claim are stated once, in Chapter 3, Section 3.7, and engaged where they bite. None of them was claimed, so none of them reduces what was: a contribution that states its boundaries can be checked at them.</w:t>
         </w:r>
@@ -6045,10 +6371,10 @@
       <w:pPr>
         <w:pStyle w:val="BodyText"/>
         <w:rPr>
-          <w:del w:id="164" w:author="Arshad Akhtar Abbasia" w:date="2026-10-04T12:00:00Z"/>
+          <w:del w:id="213" w:author="Arshad Akhtar Abbasia" w:date="2026-10-04T12:00:00Z"/>
         </w:rPr>
       </w:pPr>
-      <w:del w:id="165" w:author="Arshad Akhtar Abbasia" w:date="2026-10-04T12:00:00Z">
+      <w:del w:id="214" w:author="Arshad Akhtar Abbasia" w:date="2026-10-04T12:00:00Z">
         <w:r>
           <w:delText xml:space="preserve">The thesis makes one bounded claim and prices every limitation into it in advance. The proofs are informal, not machine-checked. The demonstration covers generated instances under one seed, not all instances. Key destruction is simulated in program state and says nothing about deployment assurance. The synthetic records carry US Core profiles, not Norwegian ones. The cryptographic primitives are established technique, not novel construction. The closest prior art is a patent claiming key-expiry selection for retention-purge conflicts, disclosed and distinguished (Chapter 2, Section 2.4; Chapter 4, Section 4.10). The interpretive move at the centre of the thesis is an argument without authority behind it. None of these was claimed, so none of them reduces what was: a contribution that states its boundaries can be checked at them.</w:delText>
         </w:r>
@@ -6067,8 +6393,44 @@
         <w:pStyle w:val="BodyText"/>
       </w:pPr>
       <w:r>
-        <w:t xml:space="preserve">The thesis establishes that audit-retention floors, the right to erasure and the deletion ceiling conflict only under an assumption about verifiability, and not because of the obligations themselves; that, on the broad reading of Article 68(12) and for logs kept at patient-record granularity, the conflict arises inside the European Health Data Space Regulation with no data subject acting; that a ceiling collides with a floor exactly when Proposition 3 says, and that relocation escapes the ceiling but not the right (Proposition 4). It exhibits the mechanism that dissolves the conflict and demonstrates Propositions 1 and 2 executably with an independent cross-check.</w:t>
-      </w:r>
+        <w:t xml:space="preserve">The thesis establishes that audit-retention floors, the right to erasure and the deletion ceiling conflict only under an assumption about verifiability, and not because of the obligations themselves; that, on the broad reading of Article 68(12) and for logs kept at patient-record granularity, the conflict arises inside the European Health Data Space Regulation with no data subject acting; that a ceiling collides with a floor exactly when Proposition 3 says, and that relocation escapes the ceiling but not the right (Proposition 4). It exhibits the mechanism that dissolves the conflict and </w:t>
+      </w:r>
+      <w:del w:id="215" w:author="Arshad Akhtar Abbasia" w:date="2026-10-04T12:00:00Z">
+        <w:r>
+          <w:delText xml:space="preserve">demonstrates </w:delText>
+        </w:r>
+      </w:del>
+      <w:ins w:id="216" w:author="Arshad Akhtar Abbasia" w:date="2026-10-04T12:00:00Z">
+        <w:r>
+          <w:t xml:space="preserve">checks </w:t>
+        </w:r>
+      </w:ins>
+      <w:r>
+        <w:t xml:space="preserve">Propositions 1 and 2 </w:t>
+      </w:r>
+      <w:del w:id="217" w:author="Arshad Akhtar Abbasia" w:date="2026-10-04T12:00:00Z">
+        <w:r>
+          <w:delText xml:space="preserve">executably </w:delText>
+        </w:r>
+      </w:del>
+      <w:ins w:id="218" w:author="Arshad Akhtar Abbasia" w:date="2026-10-04T12:00:00Z">
+        <w:r>
+          <w:t xml:space="preserve">executably, </w:t>
+        </w:r>
+      </w:ins>
+      <w:r>
+        <w:t xml:space="preserve">with </w:t>
+      </w:r>
+      <w:del w:id="219" w:author="Arshad Akhtar Abbasia" w:date="2026-10-04T12:00:00Z">
+        <w:r>
+          <w:delText xml:space="preserve">an independent cross-check.</w:delText>
+        </w:r>
+      </w:del>
+      <w:ins w:id="220" w:author="Arshad Akhtar Abbasia" w:date="2026-10-04T12:00:00Z">
+        <w:r>
+          <w:t xml:space="preserve">a separately written cross-check and a bounded SMT check.</w:t>
+        </w:r>
+      </w:ins>
     </w:p>
     <w:p>
       <w:pPr>
@@ -6123,15 +6485,49 @@
         <w:pStyle w:val="BodyText"/>
       </w:pPr>
       <w:r>
-        <w:t xml:space="preserve">It formalised the conflict as the Tri-Lateral Retention Feasibility Model, a constraint-satisfaction problem over a single binary variable per record: the accessibility of its personal-data payload. The model has three constraint types, being a parameterised retention floor, an erasure deadline, and a deletion ceiling, and it makes the semantics of verifiability an explicit parameter rather than an unexamined assumption.</w:t>
-      </w:r>
-    </w:p>
-    <w:p>
-      <w:pPr>
-        <w:pStyle w:val="BodyText"/>
-      </w:pPr>
-      <w:r>
-        <w:t xml:space="preserve">It proved four results within that model. Under plaintext-verifiability semantics, in which a record is verifiable while its payload remains readable, the constraint system is infeasible whenever an erasure deadline or a ceiling deadline falls inside a retention window. Under accountability-preserving semantics, in which a record is verifiable while its metadata is intact, its commitment survives, and any loss of payload accessibility is itself logged and attributed, the system is jointly satisfiable for every arrival pattern of erasure requests and permit expiries and for every floor parameter. A deletion ceiling collides with a retention floor exactly when it is no longer than the floor, and its anchor decides whether the collision can be read from the text or only from each record’s history; Article 68(12), anchored to permit expiry, is of the second kind. And moving a record out of the regulated environment meets the ceiling but not the right to erasure.</w:t>
+        <w:t xml:space="preserve">It formalised the conflict as the Tri-Lateral Retention Feasibility Model, a constraint-satisfaction problem over a single binary variable per record: the accessibility of its </w:t>
+      </w:r>
+      <w:del w:id="221" w:author="Arshad Akhtar Abbasia" w:date="2026-10-04T12:00:00Z">
+        <w:r>
+          <w:delText xml:space="preserve">personal-data </w:delText>
+        </w:r>
+      </w:del>
+      <w:r>
+        <w:t xml:space="preserve">payload. The model has three constraint types, being a parameterised retention floor, an erasure deadline, and a deletion ceiling, and it makes the semantics of verifiability an explicit parameter rather than an unexamined assumption.</w:t>
+      </w:r>
+    </w:p>
+    <w:p>
+      <w:pPr>
+        <w:pStyle w:val="BodyText"/>
+      </w:pPr>
+      <w:r>
+        <w:t xml:space="preserve">It proved four results within that model. Under plaintext-verifiability semantics, in which a record is verifiable while its payload remains readable, the constraint system is infeasible whenever an erasure deadline or a ceiling deadline falls inside a retention window. Under accountability-preserving semantics, in which a record is verifiable while its metadata is intact, its commitment survives, and any loss of payload accessibility is itself logged and attributed, the system is jointly satisfiable for every arrival pattern of erasure requests and permit expiries and for every floor parameter. A deletion ceiling </w:t>
+      </w:r>
+      <w:del w:id="222" w:author="Arshad Akhtar Abbasia" w:date="2026-10-04T12:00:00Z">
+        <w:r>
+          <w:delText xml:space="preserve">collides </w:delText>
+        </w:r>
+      </w:del>
+      <w:ins w:id="223" w:author="Arshad Akhtar Abbasia" w:date="2026-10-04T12:00:00Z">
+        <w:r>
+          <w:t xml:space="preserve">can collide </w:t>
+        </w:r>
+      </w:ins>
+      <w:r>
+        <w:t xml:space="preserve">with a retention floor </w:t>
+      </w:r>
+      <w:del w:id="224" w:author="Arshad Akhtar Abbasia" w:date="2026-10-04T12:00:00Z">
+        <w:r>
+          <w:delText xml:space="preserve">exactly when </w:delText>
+        </w:r>
+      </w:del>
+      <w:ins w:id="225" w:author="Arshad Akhtar Abbasia" w:date="2026-10-04T12:00:00Z">
+        <w:r>
+          <w:t xml:space="preserve">only if </w:t>
+        </w:r>
+      </w:ins>
+      <w:r>
+        <w:t xml:space="preserve">it is no longer than the floor, and its anchor decides whether the collision can be read from the text or only from each record’s history; Article 68(12), anchored to permit expiry, is of the second kind. And moving a record out of the regulated environment meets the ceiling but not the right to erasure.</w:t>
       </w:r>
     </w:p>
     <w:p>
@@ -6141,27 +6537,27 @@
       <w:r>
         <w:t xml:space="preserve">It specified the mechanism that the second proof exhibits. Crypto-Erasure by Invalidation retains the accessor fields of each record and a hiding commitment, and destroys the per-record payload key, with the salt and the ciphertext, at the earlier of the erasure deadline and the deletion ceiling; for logs kept at patient-record granularity it removes the subject link at the </w:t>
       </w:r>
-      <w:del w:id="166" w:author="Arshad Akhtar Abbasia" w:date="2026-10-04T12:00:00Z">
+      <w:del w:id="226" w:author="Arshad Akhtar Abbasia" w:date="2026-10-04T12:00:00Z">
         <w:r>
           <w:delText xml:space="preserve">ceiling. </w:delText>
         </w:r>
       </w:del>
-      <w:ins w:id="167" w:author="Arshad Akhtar Abbasia" w:date="2026-10-04T12:00:00Z">
-        <w:r>
-          <w:t xml:space="preserve">ceiling, while cross-border records keep it through the floor, because the person’s right to learn who accessed their data needs it. </w:t>
+      <w:ins w:id="227" w:author="Arshad Akhtar Abbasia" w:date="2026-10-04T12:00:00Z">
+        <w:r>
+          <w:t xml:space="preserve">ceiling, while cross-border records keep it, for at least the period the person’s right to learn who accessed their data requires and, on the deployment binding, for the rest of the floor. </w:t>
         </w:r>
       </w:ins>
       <w:r>
         <w:t xml:space="preserve">It appends each invalidation to a tamper-evident audit log as a first-class event carrying its month, legal ground, and authorising actor, in a log whose entries never hold what erasure reaches. At floor expiry it performs a terminal transition that destroys the identifying metadata and leaves a non-identifiable statistical </w:t>
       </w:r>
-      <w:del w:id="168" w:author="Arshad Akhtar Abbasia" w:date="2026-10-04T12:00:00Z">
+      <w:del w:id="228" w:author="Arshad Akhtar Abbasia" w:date="2026-10-04T12:00:00Z">
         <w:r>
           <w:delText xml:space="preserve">residue.</w:delText>
         </w:r>
       </w:del>
-      <w:ins w:id="169" w:author="Arshad Akhtar Abbasia" w:date="2026-10-04T12:00:00Z">
-        <w:r>
-          <w:t xml:space="preserve">residue; that transition is specified, not implemented.</w:t>
+      <w:ins w:id="229" w:author="Arshad Akhtar Abbasia" w:date="2026-10-04T12:00:00Z">
+        <w:r>
+          <w:t xml:space="preserve">residue; that transition, the per-entry nonce, consistency proofs and the accumulator layer are specified, not implemented.</w:t>
         </w:r>
       </w:ins>
     </w:p>
@@ -6204,12 +6600,12 @@
       <w:r>
         <w:t xml:space="preserve">Feasibility results with an executable witness. Proposition 1 establishes infeasibility under plaintext-verifiability semantics; Proposition 2 establishes satisfiability under the alternative and exhibits the trajectory that achieves it. Proposition 3 gives the condition under which a ceiling and a floor collide, which the cross-sector test of Chapter 6, Section 6.10 </w:t>
       </w:r>
-      <w:del w:id="170" w:author="Arshad Akhtar Abbasia" w:date="2026-10-04T12:00:00Z">
+      <w:del w:id="230" w:author="Arshad Akhtar Abbasia" w:date="2026-10-04T12:00:00Z">
         <w:r>
           <w:delText xml:space="preserve">confirmed </w:delText>
         </w:r>
       </w:del>
-      <w:ins w:id="171" w:author="Arshad Akhtar Abbasia" w:date="2026-10-04T12:00:00Z">
+      <w:ins w:id="231" w:author="Arshad Akhtar Abbasia" w:date="2026-10-04T12:00:00Z">
         <w:r>
           <w:t xml:space="preserve">illustrated </w:t>
         </w:r>
@@ -6217,12 +6613,12 @@
       <w:r>
         <w:t xml:space="preserve">on a statute outside </w:t>
       </w:r>
-      <w:del w:id="172" w:author="Arshad Akhtar Abbasia" w:date="2026-10-04T12:00:00Z">
+      <w:del w:id="232" w:author="Arshad Akhtar Abbasia" w:date="2026-10-04T12:00:00Z">
         <w:r>
           <w:delText xml:space="preserve">health; </w:delText>
         </w:r>
       </w:del>
-      <w:ins w:id="173" w:author="Arshad Akhtar Abbasia" w:date="2026-10-04T12:00:00Z">
+      <w:ins w:id="233" w:author="Arshad Akhtar Abbasia" w:date="2026-10-04T12:00:00Z">
         <w:r>
           <w:t xml:space="preserve">health (an instance generated by the thesis’s own code, which checks the code rather than independently confirming the proposition); </w:t>
         </w:r>
@@ -6230,12 +6626,12 @@
       <w:r>
         <w:t xml:space="preserve">Proposition 4 shows why relocation answers the ceiling and not the right. Both were </w:t>
       </w:r>
-      <w:del w:id="174" w:author="Arshad Akhtar Abbasia" w:date="2026-10-04T12:00:00Z">
+      <w:del w:id="234" w:author="Arshad Akhtar Abbasia" w:date="2026-10-04T12:00:00Z">
         <w:r>
           <w:delText xml:space="preserve">demonstrated </w:delText>
         </w:r>
       </w:del>
-      <w:ins w:id="175" w:author="Arshad Akhtar Abbasia" w:date="2026-10-04T12:00:00Z">
+      <w:ins w:id="235" w:author="Arshad Akhtar Abbasia" w:date="2026-10-04T12:00:00Z">
         <w:r>
           <w:t xml:space="preserve">checked </w:t>
         </w:r>
@@ -6243,7 +6639,7 @@
       <w:r>
         <w:t xml:space="preserve">over two hundred </w:t>
       </w:r>
-      <w:ins w:id="176" w:author="Arshad Akhtar Abbasia" w:date="2026-10-04T12:00:00Z">
+      <w:ins w:id="236" w:author="Arshad Akhtar Abbasia" w:date="2026-10-04T12:00:00Z">
         <w:r>
           <w:t xml:space="preserve">generated </w:t>
         </w:r>
@@ -6251,12 +6647,12 @@
       <w:r>
         <w:t xml:space="preserve">records, </w:t>
       </w:r>
-      <w:del w:id="177" w:author="Arshad Akhtar Abbasia" w:date="2026-10-04T12:00:00Z">
+      <w:del w:id="237" w:author="Arshad Akhtar Abbasia" w:date="2026-10-04T12:00:00Z">
         <w:r>
           <w:delText xml:space="preserve">producing ninety infeasible records and ninety-five </w:delText>
         </w:r>
       </w:del>
-      <w:ins w:id="178" w:author="Arshad Akhtar Abbasia" w:date="2026-10-04T12:00:00Z">
+      <w:ins w:id="238" w:author="Arshad Akhtar Abbasia" w:date="2026-10-04T12:00:00Z">
         <w:r>
           <w:t xml:space="preserve">with </w:t>
         </w:r>
@@ -6264,12 +6660,12 @@
       <w:r>
         <w:t xml:space="preserve">violations under the first semantics and none under the </w:t>
       </w:r>
-      <w:del w:id="179" w:author="Arshad Akhtar Abbasia" w:date="2026-10-04T12:00:00Z">
+      <w:del w:id="239" w:author="Arshad Akhtar Abbasia" w:date="2026-10-04T12:00:00Z">
         <w:r>
           <w:delText xml:space="preserve">second, with </w:delText>
         </w:r>
       </w:del>
-      <w:ins w:id="180" w:author="Arshad Akhtar Abbasia" w:date="2026-10-04T12:00:00Z">
+      <w:ins w:id="240" w:author="Arshad Akhtar Abbasia" w:date="2026-10-04T12:00:00Z">
         <w:r>
           <w:t xml:space="preserve">second (their number is set by the generator), </w:t>
         </w:r>
@@ -6277,12 +6673,12 @@
       <w:r>
         <w:t xml:space="preserve">a separately written exhaustive search </w:t>
       </w:r>
-      <w:del w:id="181" w:author="Arshad Akhtar Abbasia" w:date="2026-10-04T12:00:00Z">
+      <w:del w:id="241" w:author="Arshad Akhtar Abbasia" w:date="2026-10-04T12:00:00Z">
         <w:r>
           <w:delText xml:space="preserve">confirming </w:delText>
         </w:r>
       </w:del>
-      <w:ins w:id="182" w:author="Arshad Akhtar Abbasia" w:date="2026-10-04T12:00:00Z">
+      <w:ins w:id="242" w:author="Arshad Akhtar Abbasia" w:date="2026-10-04T12:00:00Z">
         <w:r>
           <w:t xml:space="preserve">confirmed </w:t>
         </w:r>
@@ -6290,12 +6686,12 @@
       <w:r>
         <w:t xml:space="preserve">that under the first semantics no assignment of payload accessibility </w:t>
       </w:r>
-      <w:del w:id="183" w:author="Arshad Akhtar Abbasia" w:date="2026-10-04T12:00:00Z">
+      <w:del w:id="243" w:author="Arshad Akhtar Abbasia" w:date="2026-10-04T12:00:00Z">
         <w:r>
           <w:delText xml:space="preserve">whatsoever succeeds. </w:delText>
         </w:r>
       </w:del>
-      <w:ins w:id="184" w:author="Arshad Akhtar Abbasia" w:date="2026-10-04T12:00:00Z">
+      <w:ins w:id="244" w:author="Arshad Akhtar Abbasia" w:date="2026-10-04T12:00:00Z">
         <w:r>
           <w:t xml:space="preserve">succeeds in the cases it covers, and a bounded SMT check found no counterexample to Propositions 1–3 within its bounds. </w:t>
         </w:r>
@@ -6373,7 +6769,20 @@
         <w:pStyle w:val="BodyText"/>
       </w:pPr>
       <w:r>
-        <w:t xml:space="preserve">The second concerns scope: whether Article 68(12), which requires “the electronic health data within the secure processing environment” to be deleted within six months of permit expiry, reaches, on the broad reading, access logs kept at patient-record granularity (Chapter 4, Section 4.6). Corollary 1.2 stands or falls with this question, and nothing else in the thesis does. A related question remains open on either reading: whether auditing “all processing operations” after the ceiling needs the subject link, or only the accessor fields that the Joint Action’s specification requires every log to carry.</w:t>
+        <w:t xml:space="preserve">The second concerns scope: whether Article 68(12), which requires “the electronic health data within the secure processing environment” to be deleted within six months of permit expiry, reaches, on the broad reading, access logs kept at patient-record granularity (Chapter 4, Section 4.6). Corollary 1.2 stands or falls with this question, </w:t>
+      </w:r>
+      <w:del w:id="245" w:author="Arshad Akhtar Abbasia" w:date="2026-10-04T12:00:00Z">
+        <w:r>
+          <w:delText xml:space="preserve">and </w:delText>
+        </w:r>
+      </w:del>
+      <w:ins w:id="246" w:author="Arshad Akhtar Abbasia" w:date="2026-10-04T12:00:00Z">
+        <w:r>
+          <w:t xml:space="preserve">as does the conditional branch of Corollary 2.3; </w:t>
+        </w:r>
+      </w:ins>
+      <w:r>
+        <w:t xml:space="preserve">nothing else in the thesis does. A related question remains open on either reading: whether auditing “all processing operations” after the ceiling needs the subject link, or only the accessor fields that the Joint Action’s specification requires every log to carry.</w:t>
       </w:r>
     </w:p>
     <w:p>
@@ -6413,14 +6822,74 @@
         <w:pStyle w:val="BodyText"/>
       </w:pPr>
       <w:r>
-        <w:t xml:space="preserve">Selective disclosure of invalidation completeness. The mechanism creates a problem it does not solve. When a data subject exercises Article 17, every record relating to them is invalidated, and an auditor should be able to confirm that all of them were. But identifying which records those are reveals the subject’s cross-border care history, which is precisely what the erasure was meant to protect. Proving completeness of invalidation without revealing the invalidated set is a zero-knowledge problem, and it corresponds to the fourth of the five open problems identified by Aikebaier (2026), composition with zero-knowledge selective disclosure. This is where succinct arguments become necessary rather than decorative, and the audit log of Chapter 4, Section 4.8 gives the problem a concrete form. If each leaf also carried a hiding commitment to its record’s subject link, a circuit taking the published root as its public input could prove that every leaf committed to a given subject is matched by an invalidation leaf, while revealing neither the leaves nor their number. Pairing-based arguments give proofs of constant size (Groth, 2016), and universal-setup systems avoid a trusted setup per circuit (Gabizon, Williamson, &amp; Ciobotaru, 2019); which suits a regulator who must verify without trusting the controller is a design question for that work. The project name carried by this work originates in an earlier design that assumed zero-knowledge machinery would enforce the retention conflict; the analysis showed it unnecessary there, and </w:t>
-      </w:r>
-      <w:del w:id="185" w:author="Arshad Akhtar Abbasia" w:date="2026-10-04T12:00:00Z">
+        <w:t xml:space="preserve">Selective disclosure of invalidation completeness. The mechanism creates a problem it does not solve. When a data subject exercises Article 17, every record relating to them is invalidated, and an auditor should be able to confirm that all of them were. But identifying which records those are </w:t>
+      </w:r>
+      <w:del w:id="247" w:author="Arshad Akhtar Abbasia" w:date="2026-10-04T12:00:00Z">
+        <w:r>
+          <w:delText xml:space="preserve">reveals </w:delText>
+        </w:r>
+      </w:del>
+      <w:ins w:id="248" w:author="Arshad Akhtar Abbasia" w:date="2026-10-04T12:00:00Z">
+        <w:r>
+          <w:t xml:space="preserve">would show the auditor </w:t>
+        </w:r>
+      </w:ins>
+      <w:r>
+        <w:t xml:space="preserve">the subject’s cross-border care </w:t>
+      </w:r>
+      <w:del w:id="249" w:author="Arshad Akhtar Abbasia" w:date="2026-10-04T12:00:00Z">
+        <w:r>
+          <w:delText xml:space="preserve">history, which </w:delText>
+        </w:r>
+      </w:del>
+      <w:ins w:id="250" w:author="Arshad Akhtar Abbasia" w:date="2026-10-04T12:00:00Z">
+        <w:r>
+          <w:t xml:space="preserve">history. The controller keeps the link to those records (Chapter 4, Section 4.2); the problem </w:t>
+        </w:r>
+      </w:ins>
+      <w:r>
+        <w:t xml:space="preserve">is </w:t>
+      </w:r>
+      <w:del w:id="251" w:author="Arshad Akhtar Abbasia" w:date="2026-10-04T12:00:00Z">
+        <w:r>
+          <w:delText xml:space="preserve">precisely what the erasure was meant </w:delText>
+        </w:r>
+      </w:del>
+      <w:ins w:id="252" w:author="Arshad Akhtar Abbasia" w:date="2026-10-04T12:00:00Z">
+        <w:r>
+          <w:t xml:space="preserve">disclosing it </w:t>
+        </w:r>
+      </w:ins>
+      <w:r>
+        <w:t xml:space="preserve">to </w:t>
+      </w:r>
+      <w:del w:id="253" w:author="Arshad Akhtar Abbasia" w:date="2026-10-04T12:00:00Z">
+        <w:r>
+          <w:delText xml:space="preserve">protect. </w:delText>
+        </w:r>
+      </w:del>
+      <w:ins w:id="254" w:author="Arshad Akhtar Abbasia" w:date="2026-10-04T12:00:00Z">
+        <w:r>
+          <w:t xml:space="preserve">a third party in order to prove completeness. </w:t>
+        </w:r>
+      </w:ins>
+      <w:r>
+        <w:t xml:space="preserve">Proving completeness of invalidation without revealing the invalidated set is a zero-knowledge problem, and it corresponds to the fourth of the five open problems identified by Aikebaier (2026), composition with zero-knowledge selective disclosure. This is where succinct arguments </w:t>
+      </w:r>
+      <w:ins w:id="255" w:author="Arshad Akhtar Abbasia" w:date="2026-10-04T12:00:00Z">
+        <w:r>
+          <w:t xml:space="preserve">may </w:t>
+        </w:r>
+      </w:ins>
+      <w:r>
+        <w:t xml:space="preserve">become necessary rather than decorative, and the audit log of Chapter 4, Section 4.8 gives the problem a concrete form. If each leaf also carried a hiding commitment to its record’s subject link, a circuit taking the published root as its public input could prove that every leaf committed to a given subject is matched by an invalidation leaf, while revealing neither the leaves nor their number. Pairing-based arguments give proofs of constant size (Groth, 2016), and universal-setup systems avoid a trusted setup per circuit (Gabizon, Williamson, &amp; Ciobotaru, 2019); which suits a regulator who must verify without trusting the controller is a design question for that work. The project name carried by this work originates in an earlier design that assumed zero-knowledge machinery would enforce the retention conflict; the analysis showed it unnecessary there, and </w:t>
+      </w:r>
+      <w:del w:id="256" w:author="Arshad Akhtar Abbasia" w:date="2026-10-04T12:00:00Z">
         <w:r>
           <w:delText xml:space="preserve">shows </w:delText>
         </w:r>
       </w:del>
-      <w:ins w:id="186" w:author="Arshad Akhtar Abbasia" w:date="2026-10-04T12:00:00Z">
+      <w:ins w:id="257" w:author="Arshad Akhtar Abbasia" w:date="2026-10-04T12:00:00Z">
         <w:r>
           <w:t xml:space="preserve">suggests </w:t>
         </w:r>
@@ -6428,12 +6897,12 @@
       <w:r>
         <w:t xml:space="preserve">it </w:t>
       </w:r>
-      <w:del w:id="187" w:author="Arshad Akhtar Abbasia" w:date="2026-10-04T12:00:00Z">
+      <w:del w:id="258" w:author="Arshad Akhtar Abbasia" w:date="2026-10-04T12:00:00Z">
         <w:r>
           <w:delText xml:space="preserve">unavoidable here.</w:delText>
         </w:r>
       </w:del>
-      <w:ins w:id="188" w:author="Arshad Akhtar Abbasia" w:date="2026-10-04T12:00:00Z">
+      <w:ins w:id="259" w:author="Arshad Akhtar Abbasia" w:date="2026-10-04T12:00:00Z">
         <w:r>
           <w:t xml:space="preserve">may be necessary here, though alternatives are not excluded.</w:t>
         </w:r>

</xml_diff>

<commit_message>
P53: voice and hooks in Ch4/Ch6 (PRES-2); SPUHiN draft P13/P14/P24/P31 traced in §4.11 and Table 4.1 (M6a); tracker: R3-F10 waiting; SEL anchors in TIGER_DRAFTS
Co-Authored-By: Claude Opus 5.5 <noreply@anthropic.com>
Claude-Session: https://claude.ai/code/session_01NcQq1nsLTRuJVxEX8DbgE6
</commit_message>
<xml_diff>
--- a/VERA-SNARK_Thesis_TRACKED_vs_4Oct.docx
+++ b/VERA-SNARK_Thesis_TRACKED_vs_4Oct.docx
@@ -15,7 +15,7 @@
         <w:pStyle w:val="BodyText"/>
       </w:pPr>
       <w:r>
-        <w:t xml:space="preserve">Every change to the front matter and Chapters 1–7 is shown as a tracked insertion or deletion (Review → Track Changes → All Markup). Appendices and the reference list are regenerated from the code and the chapter lists and are not compared here. Tables and equations are compared as text; the formatted thesis is the separate file VERA-SNARK_Thesis_SUBMISSION.docx. Paragraphs unchanged: 606; revised: 51; new: 12; removed: 4.</w:t>
+        <w:t xml:space="preserve">Every change to the front matter and Chapters 1–7 is shown as a tracked insertion or deletion (Review → Track Changes → All Markup). Appendices and the reference list are regenerated from the code and the chapter lists and are not compared here. Tables and equations are compared as text; the formatted thesis is the separate file VERA-SNARK_Thesis_SUBMISSION.docx. Paragraphs unchanged: 592; revised: 64; new: 19; removed: 5.</w:t>
       </w:r>
     </w:p>
     <w:p>
@@ -3249,10 +3249,28 @@
     <w:p>
       <w:pPr>
         <w:pStyle w:val="BodyText"/>
-      </w:pPr>
-      <w:r>
-        <w:t xml:space="preserve">This chapter contains the analytical core of the thesis. It does three things in sequence, and the sequence matters because each step licenses the next.</w:t>
-      </w:r>
+        <w:rPr>
+          <w:ins w:id="99" w:author="Arshad Akhtar Abbasia" w:date="2026-10-04T12:00:00Z"/>
+        </w:rPr>
+      </w:pPr>
+      <w:ins w:id="100" w:author="Arshad Akhtar Abbasia" w:date="2026-10-04T12:00:00Z">
+        <w:r>
+          <w:t xml:space="preserve">A patient asks for her data to be erased. The audit record of who looked at them must, on the reported deployment baseline, stay verifiable for ten years. In a research environment a third rule wants the data gone six months after the permit ends. Can one record obey all three? This chapter answers: not if verifiable means readable; yes if it means accountable. It gets there in three steps, and each step licenses the next.</w:t>
+        </w:r>
+      </w:ins>
+    </w:p>
+    <w:p>
+      <w:pPr>
+        <w:pStyle w:val="BodyText"/>
+        <w:rPr>
+          <w:del w:id="101" w:author="Arshad Akhtar Abbasia" w:date="2026-10-04T12:00:00Z"/>
+        </w:rPr>
+      </w:pPr>
+      <w:del w:id="102" w:author="Arshad Akhtar Abbasia" w:date="2026-10-04T12:00:00Z">
+        <w:r>
+          <w:delText xml:space="preserve">This chapter contains the analytical core of the thesis. It does three things in sequence, and the sequence matters because each step licenses the next.</w:delText>
+        </w:r>
+      </w:del>
     </w:p>
     <w:p>
       <w:pPr>
@@ -3306,8 +3324,26 @@
       <w:pPr>
         <w:pStyle w:val="BodyText"/>
       </w:pPr>
-      <w:r>
-        <w:t xml:space="preserve">The decomposition that makes the model possible is not a modelling convenience. It is derived from the legal position established in Chapter 2, Section 2.3, and everything downstream inherits it.</w:t>
+      <w:ins w:id="103" w:author="Arshad Akhtar Abbasia" w:date="2026-10-04T12:00:00Z">
+        <w:r>
+          <w:t xml:space="preserve">Everything in this chapter rests on one split: the part of an audit record the law needs kept, and the part it does not. </w:t>
+        </w:r>
+      </w:ins>
+      <w:r>
+        <w:t xml:space="preserve">The </w:t>
+      </w:r>
+      <w:del w:id="104" w:author="Arshad Akhtar Abbasia" w:date="2026-10-04T12:00:00Z">
+        <w:r>
+          <w:delText xml:space="preserve">decomposition that makes the model possible </w:delText>
+        </w:r>
+      </w:del>
+      <w:ins w:id="105" w:author="Arshad Akhtar Abbasia" w:date="2026-10-04T12:00:00Z">
+        <w:r>
+          <w:t xml:space="preserve">split </w:t>
+        </w:r>
+      </w:ins>
+      <w:r>
+        <w:t xml:space="preserve">is not a modelling convenience. It is derived from the legal position established in Chapter 2, Section 2.3, and everything downstream inherits it.</w:t>
       </w:r>
     </w:p>
     <w:p>
@@ -3333,12 +3369,12 @@
       <w:r>
         <w:t xml:space="preserve">This yields the central claim of the necessity analysis: the accountability function of a cross-border audit record is discharged by its metadata and by a binding commitment to its payload, and does not require the payload to remain accessible. Retention of accessible plaintext payload for </w:t>
       </w:r>
-      <w:del w:id="99" w:author="Arshad Akhtar Abbasia" w:date="2026-10-04T12:00:00Z">
+      <w:del w:id="106" w:author="Arshad Akhtar Abbasia" w:date="2026-10-04T12:00:00Z">
         <w:r>
           <w:delText xml:space="preserve">ten years </w:delText>
         </w:r>
       </w:del>
-      <w:ins w:id="100" w:author="Arshad Akhtar Abbasia" w:date="2026-10-04T12:00:00Z">
+      <w:ins w:id="107" w:author="Arshad Akhtar Abbasia" w:date="2026-10-04T12:00:00Z">
         <w:r>
           <w:t xml:space="preserve">the length of the floor </w:t>
         </w:r>
@@ -3351,10 +3387,10 @@
       <w:pPr>
         <w:pStyle w:val="BodyText"/>
         <w:rPr>
-          <w:ins w:id="101" w:author="Arshad Akhtar Abbasia" w:date="2026-10-04T12:00:00Z"/>
+          <w:ins w:id="108" w:author="Arshad Akhtar Abbasia" w:date="2026-10-04T12:00:00Z"/>
         </w:rPr>
       </w:pPr>
-      <w:ins w:id="102" w:author="Arshad Akhtar Abbasia" w:date="2026-10-04T12:00:00Z">
+      <w:ins w:id="109" w:author="Arshad Akhtar Abbasia" w:date="2026-10-04T12:00:00Z">
         <w:r>
           <w:t xml:space="preserve">Per record class. The argument has to be made for each class separately, because the payload is defined by where it comes from (Section 4.3), not by whether it is needed. For a cross-border record it is specific: the accountability question is which clinician accessed which patient’s record, under which assertion and with what outcome, and the accessor fields with the patient link answer it; the patient’s name and birth date as typed into the query add nothing to that answer. For a Secure Processing Environment record it is weaker. Article 73(1)(e) asks for logs sufficient “to verify and audit all processing operations in that environment”, and an auditor checking that an extraction stayed within its permit may need to know what was run. The thesis therefore does not assume that the whole activity content is unnecessary there; Corollary 2.3 states what follows if part of it is needed.</w:t>
         </w:r>
@@ -3364,12 +3400,12 @@
       <w:pPr>
         <w:pStyle w:val="BodyText"/>
         <w:rPr>
-          <w:ins w:id="103" w:author="Arshad Akhtar Abbasia" w:date="2026-10-04T12:00:00Z"/>
+          <w:ins w:id="110" w:author="Arshad Akhtar Abbasia" w:date="2026-10-04T12:00:00Z"/>
         </w:rPr>
       </w:pPr>
-      <w:ins w:id="104" w:author="Arshad Akhtar Abbasia" w:date="2026-10-04T12:00:00Z">
-        <w:r>
-          <w:t xml:space="preserve">The patient link. The link from an access event to the person whose data were accessed is not payload: it is the other half of the accountability question. The Regulation gives natural persons the right to obtain information on any access to their personal electronic health data through the health professional access service, including “information on the healthcare provider or other individuals who accessed the personal electronic health data”, “the date and time of access” and “which personal electronic health data were accessed”, available “for at least three years from each date of access to the data” (Article 9(1)–(2) EHDS). That information cannot be produced from a record that no longer says whose data were accessed. For the controller that must provide it, or supply the records it is produced from, retaining the link is therefore necessary for compliance with a legal obligation within the meaning of Article 17(3)(b), and an erasure request reaches the payload but not the link, at least for the period Article 9(2) fixes and once Article 9 applies. The argument has two limits. Article 9 is framed around the health professional access service, so whether it binds the controller of a foreign National Contact Point’s audit repository, and covers every cross-border access event, depends on how the access is made and how the Member States assign the duty; where it does not, the patient-facing audit-log interface of MyHealth@EU (Chapter 1, Section 1.2) gives the link a purpose but not a legal obligation, and Article 17(3)(b) does not follow. And beyond the Article 9(2) period the link is kept for the rest of the floor on the strength of the deployment binding, which is illustrative here (Section 4.3); for that stretch its retention after an erasure request is exactly as contestable as the floor itself. It is removed at the terminal transition (Section 4.8). In a Secure Processing Environment Article 9 does not apply. There the link is kept after an erasure request until the ceiling only if auditing “all processing operations” under Article 73(1)(e) needs it, which is the question Chapter 7, Section 7.4 leaves to the supervisory authority, and the ceiling may reach it in any case (Section 4.6).</w:t>
+      <w:ins w:id="111" w:author="Arshad Akhtar Abbasia" w:date="2026-10-04T12:00:00Z">
+        <w:r>
+          <w:t xml:space="preserve">The patient link. The link from an access event to the person whose data were accessed is not payload: it is the other half of the accountability question. The Regulation gives natural persons the right to obtain information on any access to their personal electronic health data through the health professional access service, including “information on the healthcare provider or other individuals who accessed the personal electronic health data”, “the date and time of access” and “which personal electronic health data were accessed”, available “for at least three years from each date of access to the data” (Article 9(1)–(2) EHDS). That information cannot be produced from a record that no longer says whose data were accessed. For the controller that must provide it, or supply the records it is produced from, retaining the link is therefore necessary for compliance with a legal obligation within the meaning of Article 17(3)(b). An erasure request then reaches the payload but not the link, at least for the period Article 9(2) fixes and once Article 9 applies. The argument has two limits. Article 9 is framed around the health professional access service, so whether it binds the controller of a foreign National Contact Point’s audit repository, and covers every cross-border access event, depends on how the access is made and how the Member States assign the duty; where it does not, the patient-facing audit-log interface of MyHealth@EU (Chapter 1, Section 1.2) gives the link a purpose but not a legal obligation, and Article 17(3)(b) does not follow. And beyond the Article 9(2) period the link is kept for the rest of the floor on the strength of the deployment binding, which is illustrative here (Section 4.3); for that stretch its retention after an erasure request is exactly as contestable as the floor itself. It is removed at the terminal transition (Section 4.8). In a Secure Processing Environment Article 9 does not apply. There the link is kept after an erasure request until the ceiling only if auditing “all processing operations” under Article 73(1)(e) needs it, which is the question Chapter 7, Section 7.4 leaves to the supervisory authority, and the ceiling may reach it in any case (Section 4.6).</w:t>
         </w:r>
       </w:ins>
     </w:p>
@@ -3392,6 +3428,19 @@
     <w:p>
       <w:pPr>
         <w:pStyle w:val="BodyText"/>
+        <w:rPr>
+          <w:ins w:id="112" w:author="Arshad Akhtar Abbasia" w:date="2026-10-04T12:00:00Z"/>
+        </w:rPr>
+      </w:pPr>
+      <w:ins w:id="113" w:author="Arshad Akhtar Abbasia" w:date="2026-10-04T12:00:00Z">
+        <w:r>
+          <w:t xml:space="preserve">The model is deliberately small: one record, one clock, and one question asked every month: can the payload still be read?</w:t>
+        </w:r>
+      </w:ins>
+    </w:p>
+    <w:p>
+      <w:pPr>
+        <w:pStyle w:val="BodyText"/>
       </w:pPr>
       <w:r>
         <w:t xml:space="preserve">Let the time domain be discretised into months, indexed by t ∈ ℕ, with t = 0 the month in which the system begins operation. Monthly granularity is chosen because every obligation in the system is expressed in months or years, and because the shortest deadline in the system, the erasure response period, is one month.</w:t>
@@ -3428,7 +3477,7 @@
       <w:r>
         <w:t xml:space="preserve">- m(a) is the event metadata: the actor identifier, the actor’s national contact point, the patient pseudonym, the document category accessed, the legal basis and consent policy applied, the timestamp, and the outcome. Metadata contains no clinical content. It is partitioned as m(a) = m_(acc)(a) ∪ m_(subj)(a). The accessor fields m_(acc)(a) record who acted, when, under which legal basis or permit, and with what outcome. The subject fields m_(subj)(a) relate the event to a data subject: the patient pseudonym and any reference to that subject’s records. The partition does work only in the Secure Processing Environment case (Section 4.6). - p(a) is the </w:t>
       </w:r>
-      <w:del w:id="105" w:author="Arshad Akhtar Abbasia" w:date="2026-10-04T12:00:00Z">
+      <w:del w:id="114" w:author="Arshad Akhtar Abbasia" w:date="2026-10-04T12:00:00Z">
         <w:r>
           <w:delText xml:space="preserve">personal-data </w:delText>
         </w:r>
@@ -3436,12 +3485,12 @@
       <w:r>
         <w:t xml:space="preserve">payload: the </w:t>
       </w:r>
-      <w:del w:id="106" w:author="Arshad Akhtar Abbasia" w:date="2026-10-04T12:00:00Z">
+      <w:del w:id="115" w:author="Arshad Akhtar Abbasia" w:date="2026-10-04T12:00:00Z">
         <w:r>
           <w:delText xml:space="preserve">personal data </w:delText>
         </w:r>
       </w:del>
-      <w:ins w:id="107" w:author="Arshad Akhtar Abbasia" w:date="2026-10-04T12:00:00Z">
+      <w:ins w:id="116" w:author="Arshad Akhtar Abbasia" w:date="2026-10-04T12:00:00Z">
         <w:r>
           <w:t xml:space="preserve">content </w:t>
         </w:r>
@@ -3449,12 +3498,12 @@
       <w:r>
         <w:t xml:space="preserve">the record carries </w:t>
       </w:r>
-      <w:del w:id="108" w:author="Arshad Akhtar Abbasia" w:date="2026-10-04T12:00:00Z">
+      <w:del w:id="117" w:author="Arshad Akhtar Abbasia" w:date="2026-10-04T12:00:00Z">
         <w:r>
           <w:delText xml:space="preserve">beyond </w:delText>
         </w:r>
       </w:del>
-      <w:ins w:id="109" w:author="Arshad Akhtar Abbasia" w:date="2026-10-04T12:00:00Z">
+      <w:ins w:id="118" w:author="Arshad Akhtar Abbasia" w:date="2026-10-04T12:00:00Z">
         <w:r>
           <w:t xml:space="preserve">about </w:t>
         </w:r>
@@ -3462,12 +3511,12 @@
       <w:r>
         <w:t xml:space="preserve">what </w:t>
       </w:r>
-      <w:del w:id="110" w:author="Arshad Akhtar Abbasia" w:date="2026-10-04T12:00:00Z">
+      <w:del w:id="119" w:author="Arshad Akhtar Abbasia" w:date="2026-10-04T12:00:00Z">
         <w:r>
           <w:delText xml:space="preserve">accountability requires (Section 4.2). Its content </w:delText>
         </w:r>
       </w:del>
-      <w:ins w:id="111" w:author="Arshad Akhtar Abbasia" w:date="2026-10-04T12:00:00Z">
+      <w:ins w:id="120" w:author="Arshad Akhtar Abbasia" w:date="2026-10-04T12:00:00Z">
         <w:r>
           <w:t xml:space="preserve">was accessed, as distinct from who accessed it, when and under what authority. It is defined by its source, which </w:t>
         </w:r>
@@ -3475,12 +3524,12 @@
       <w:r>
         <w:t xml:space="preserve">depends on the record </w:t>
       </w:r>
-      <w:del w:id="112" w:author="Arshad Akhtar Abbasia" w:date="2026-10-04T12:00:00Z">
+      <w:del w:id="121" w:author="Arshad Akhtar Abbasia" w:date="2026-10-04T12:00:00Z">
         <w:r>
           <w:delText xml:space="preserve">class. </w:delText>
         </w:r>
       </w:del>
-      <w:ins w:id="113" w:author="Arshad Akhtar Abbasia" w:date="2026-10-04T12:00:00Z">
+      <w:ins w:id="122" w:author="Arshad Akhtar Abbasia" w:date="2026-10-04T12:00:00Z">
         <w:r>
           <w:t xml:space="preserve">class; whether accountability needs it is argued per class in Section 4.2, and Corollary 2.3 states what follows if part of it is needed. </w:t>
         </w:r>
@@ -3488,12 +3537,12 @@
       <w:r>
         <w:t xml:space="preserve">For a cross-border record it is the identifying content of the logged query. The IHE Cross Gateway Patient Discovery transaction (ITI-55), by which one country’s gateway locates a patient in another, requires the person’s name and birth time unless an identifier is supplied, and requires both gateways to record the query segment, base64-encoded, in the audit message’s ParticipantObjectQuery field (IHE International, 2024, Sections 3.55.4.1.2.1 and 3.55.5.1). The audit record therefore holds the patient’s demographic query and not only a pseudonym. This is the transaction on which the patient-identification step of the MyHealth@EU flow rests (Chapter 2, Section 2.2); the eHDSI audit specification that profiles it was not available to this thesis, so the IHE requirement is taken as the baseline any profile starts from. For a Secure Processing Environment record it is the content of the logged activity, where the environment logs at that level: the text and parameters of the query or command run against the permitted dataset, and any output retained with the entry. The Joint Action’s specification requires these logs to cover “access to electronic health data” and “data import, export, or release of outputs” and fixes no fields (TEHDAS2, 2026, Table 5.4, OPR-17, p. 51); </w:t>
       </w:r>
-      <w:del w:id="114" w:author="Arshad Akhtar Abbasia" w:date="2026-10-04T12:00:00Z">
+      <w:del w:id="123" w:author="Arshad Akhtar Abbasia" w:date="2026-10-04T12:00:00Z">
         <w:r>
           <w:delText xml:space="preserve">whatever </w:delText>
         </w:r>
       </w:del>
-      <w:ins w:id="115" w:author="Arshad Akhtar Abbasia" w:date="2026-10-04T12:00:00Z">
+      <w:ins w:id="124" w:author="Arshad Akhtar Abbasia" w:date="2026-10-04T12:00:00Z">
         <w:r>
           <w:t xml:space="preserve">what </w:t>
         </w:r>
@@ -3501,12 +3550,12 @@
       <w:r>
         <w:t xml:space="preserve">an environment records under those headings beyond the accessor fields is </w:t>
       </w:r>
-      <w:del w:id="116" w:author="Arshad Akhtar Abbasia" w:date="2026-10-04T12:00:00Z">
+      <w:del w:id="125" w:author="Arshad Akhtar Abbasia" w:date="2026-10-04T12:00:00Z">
         <w:r>
           <w:delText xml:space="preserve">p(a). </w:delText>
         </w:r>
       </w:del>
-      <w:ins w:id="117" w:author="Arshad Akhtar Abbasia" w:date="2026-10-04T12:00:00Z">
+      <w:ins w:id="126" w:author="Arshad Akhtar Abbasia" w:date="2026-10-04T12:00:00Z">
         <w:r>
           <w:t xml:space="preserve">p(a), and whether auditing “all processing operations” needs part of it is the question Corollary 2.3 answers conditionally. </w:t>
         </w:r>
@@ -3514,12 +3563,12 @@
       <w:r>
         <w:t xml:space="preserve">The model does not require p(a) to be a clinical </w:t>
       </w:r>
-      <w:del w:id="118" w:author="Arshad Akhtar Abbasia" w:date="2026-10-04T12:00:00Z">
+      <w:del w:id="127" w:author="Arshad Akhtar Abbasia" w:date="2026-10-04T12:00:00Z">
         <w:r>
           <w:delText xml:space="preserve">document, only personal data that the accountability purpose does not need. </w:delText>
         </w:r>
       </w:del>
-      <w:ins w:id="119" w:author="Arshad Akhtar Abbasia" w:date="2026-10-04T12:00:00Z">
+      <w:ins w:id="128" w:author="Arshad Akhtar Abbasia" w:date="2026-10-04T12:00:00Z">
         <w:r>
           <w:t xml:space="preserve">document. </w:t>
         </w:r>
@@ -3559,12 +3608,12 @@
       <w:r>
         <w:t xml:space="preserve">Finally, let α(a,t) ∈ {0, 1} be the payload-accessibility variable: α(a,t) = 1 if the controller can recover p(a) in intelligible form at month t, and 0 otherwise. This single binary variable per record per month is the entire state space of the model, and its minimality is deliberate: the conflict turns on exactly one question, which is whether the payload is readable, and a formulation that admits no other state variable cannot obscure that question behind modelling detail. The cost of that minimality is that the model cannot represent field-level redaction, where some elements of a payload are erased and others retained; Chapter 3, Section 3.7 records this as a stated </w:t>
       </w:r>
-      <w:del w:id="120" w:author="Arshad Akhtar Abbasia" w:date="2026-10-04T12:00:00Z">
+      <w:del w:id="129" w:author="Arshad Akhtar Abbasia" w:date="2026-10-04T12:00:00Z">
         <w:r>
           <w:delText xml:space="preserve">abstraction.</w:delText>
         </w:r>
       </w:del>
-      <w:ins w:id="121" w:author="Arshad Akhtar Abbasia" w:date="2026-10-04T12:00:00Z">
+      <w:ins w:id="130" w:author="Arshad Akhtar Abbasia" w:date="2026-10-04T12:00:00Z">
         <w:r>
           <w:t xml:space="preserve">abstraction, and Corollary 2.3 relaxes it for one case.</w:t>
         </w:r>
@@ -3599,8 +3648,39 @@
         <w:pStyle w:val="BodyText"/>
       </w:pPr>
       <w:r>
-        <w:t xml:space="preserve">Each regime is now expressed as a constraint on the trajectory of α and V.</w:t>
-      </w:r>
+        <w:t xml:space="preserve">Each regime </w:t>
+      </w:r>
+      <w:del w:id="131" w:author="Arshad Akhtar Abbasia" w:date="2026-10-04T12:00:00Z">
+        <w:r>
+          <w:delText xml:space="preserve">is </w:delText>
+        </w:r>
+      </w:del>
+      <w:r>
+        <w:t xml:space="preserve">now </w:t>
+      </w:r>
+      <w:del w:id="132" w:author="Arshad Akhtar Abbasia" w:date="2026-10-04T12:00:00Z">
+        <w:r>
+          <w:delText xml:space="preserve">expressed as </w:delText>
+        </w:r>
+      </w:del>
+      <w:ins w:id="133" w:author="Arshad Akhtar Abbasia" w:date="2026-10-04T12:00:00Z">
+        <w:r>
+          <w:t xml:space="preserve">becomes </w:t>
+        </w:r>
+      </w:ins>
+      <w:r>
+        <w:t xml:space="preserve">a constraint on the trajectory of α and </w:t>
+      </w:r>
+      <w:del w:id="134" w:author="Arshad Akhtar Abbasia" w:date="2026-10-04T12:00:00Z">
+        <w:r>
+          <w:delText xml:space="preserve">V.</w:delText>
+        </w:r>
+      </w:del>
+      <w:ins w:id="135" w:author="Arshad Akhtar Abbasia" w:date="2026-10-04T12:00:00Z">
+        <w:r>
+          <w:t xml:space="preserve">V: one floor that says how long a record must last, and two limits that say how soon its payload must go.</w:t>
+        </w:r>
+      </w:ins>
     </w:p>
     <w:p>
       <w:pPr>
@@ -3649,12 +3729,12 @@
       <w:r>
         <w:t xml:space="preserve">The payload must cease to be accessible within the response period δ. Source: Article 17(1) GDPR, with δ determined by Article 12(3) GDPR, which requires the controller to act without undue delay and in any event within one month of receipt, extendable by two further months for complex or numerous requests provided the data subject is informed within the first month. The model takes δ = 1 as the baseline and admits δ = 3 as the extended case; results are stated for arbitrary finite δ and do not depend on which is chosen. Constraint C2 is triggered only by a valid request. The model does not represent the Article 17(3) exemptions under which a controller may lawfully refuse, and so treats every arriving request as valid; Chapter 3, Section 3.7 explains why this affects the frequencies reported in Chapter 5 but not the </w:t>
       </w:r>
-      <w:del w:id="122" w:author="Arshad Akhtar Abbasia" w:date="2026-10-04T12:00:00Z">
+      <w:del w:id="136" w:author="Arshad Akhtar Abbasia" w:date="2026-10-04T12:00:00Z">
         <w:r>
           <w:delText xml:space="preserve">propositions.</w:delText>
         </w:r>
       </w:del>
-      <w:ins w:id="123" w:author="Arshad Akhtar Abbasia" w:date="2026-10-04T12:00:00Z">
+      <w:ins w:id="137" w:author="Arshad Akhtar Abbasia" w:date="2026-10-04T12:00:00Z">
         <w:r>
           <w:t xml:space="preserve">propositions. In the secondary-use pathway two provisions narrow C2 further. Article 17(3)(d) GDPR disapplies the right where processing is necessary for “scientific or historical research purposes or statistical purposes in accordance with Article 89(1) in so far as the right referred to in paragraph 1 is likely to render impossible or seriously impair the achievement of the objectives of that processing”, and the Regulation gives natural persons instead a right to opt out of secondary use, which is reversible and does not reach processing under data permits issued before it was exercised (Article 71(1) and (3) EHDS). For the environment’s own access logs, which serve Article 73(1)(e) rather than the research, the exemption that applies within the floor is Article 17(3)(b). The effect is that fewer SPE requests reach C2 than the model assumes, and a record that no request reaches faces only the floor and the ceiling, which is the case of Corollary 1.2.</w:t>
         </w:r>
@@ -3719,6 +3799,19 @@
     <w:p>
       <w:pPr>
         <w:pStyle w:val="BodyText"/>
+        <w:rPr>
+          <w:ins w:id="138" w:author="Arshad Akhtar Abbasia" w:date="2026-10-04T12:00:00Z"/>
+        </w:rPr>
+      </w:pPr>
+      <w:ins w:id="139" w:author="Arshad Akhtar Abbasia" w:date="2026-10-04T12:00:00Z">
+        <w:r>
+          <w:t xml:space="preserve">Everything now turns on one undefined word: verifiable. Two definitions are available, and the propositions show that they lead to opposite answers.</w:t>
+        </w:r>
+      </w:ins>
+    </w:p>
+    <w:p>
+      <w:pPr>
+        <w:pStyle w:val="BodyText"/>
       </w:pPr>
       <w:r>
         <w:t xml:space="preserve">Semantics I: plaintext verifiability. A record counts as verifiable exactly when its payload is accessible:</w:t>
@@ -3736,12 +3829,12 @@
       <w:pPr>
         <w:pStyle w:val="BodyText"/>
         <w:rPr>
-          <w:ins w:id="124" w:author="Arshad Akhtar Abbasia" w:date="2026-10-04T12:00:00Z"/>
+          <w:ins w:id="140" w:author="Arshad Akhtar Abbasia" w:date="2026-10-04T12:00:00Z"/>
         </w:rPr>
       </w:pPr>
-      <w:ins w:id="125" w:author="Arshad Akhtar Abbasia" w:date="2026-10-04T12:00:00Z">
-        <w:r>
-          <w:t xml:space="preserve">This is the semantics of an audit log that keeps what was accessed readable for as long as it keeps the record. Under it, an audit record whose payload cannot be produced is treated as an incomplete or broken record, and audit integrity is understood as the continued producibility of what was accessed. The reference implementation of the cross-border gateway is built as such a log: whatever an audit message carries stays readable. In the 2017 OpenNCP source, the audit record repository stored every received audit message whole, in a database column for the message content, with the patient identifier in a readable column and a further column for the participant-object query; it refused to modify a stored message, and its audit code had no scheduled retention or purge logic, so how long the content stayed readable was left to the operator (OpenNCP Project, 2017). The schema deployed with OpenNCP 9.1.0 in 2026 keeps the same columns (Sundhedsdatastyrelsen, 2026); whether they are populated in a given deployment was not inspected. In the 2017 source the patient-discovery audit carried the patient identifier and the full SOAP security header of the request, which in the model are subject and accessor fields, though not the demographic query that ITI-55 asks gateways to record. “Verification” there meant that the sending gateway signed each audit message (enveloped XML signature); the repository stored the signature but did not check it, and kept no hash chain or other tamper evidence beyond its refusal to modify. How other deployments configure retention is not established here. No instrument states this semantics, and none states the alternative.</w:t>
+      <w:ins w:id="141" w:author="Arshad Akhtar Abbasia" w:date="2026-10-04T12:00:00Z">
+        <w:r>
+          <w:t xml:space="preserve">This is the semantics of an audit log that keeps what was accessed readable for as long as it keeps the record. Under it, an audit record whose payload cannot be produced is treated as an incomplete or broken record, and audit integrity is understood as the continued producibility of what was accessed. The reference implementation of the cross-border gateway is built as such a log: whatever an audit message carries stays readable. In the 2017 OpenNCP source, the audit record repository stored every received audit message whole, in a database column for the message content. The patient identifier sat in a readable column, and a further column held the participant-object query. The repository refused to modify a stored message, and its audit code had no scheduled retention or purge logic, so how long the content stayed readable was left to the operator (OpenNCP Project, 2017). The schema deployed with OpenNCP 9.1.0 in 2026 keeps the same columns (Sundhedsdatastyrelsen, 2026); whether they are populated in a given deployment was not inspected. In the 2017 source the patient-discovery audit carried the patient identifier and the full SOAP security header of the request, which in the model are subject and accessor fields, though not the demographic query that ITI-55 asks gateways to record. “Verification” there meant that the sending gateway signed each audit message (enveloped XML signature); the repository stored the signature but did not check it, and kept no hash chain or other tamper evidence beyond its refusal to modify. How other deployments configure retention is not established here. No instrument states this semantics, and none states the alternative.</w:t>
         </w:r>
       </w:ins>
     </w:p>
@@ -3749,10 +3842,10 @@
       <w:pPr>
         <w:pStyle w:val="BodyText"/>
         <w:rPr>
-          <w:del w:id="126" w:author="Arshad Akhtar Abbasia" w:date="2026-10-04T12:00:00Z"/>
+          <w:del w:id="142" w:author="Arshad Akhtar Abbasia" w:date="2026-10-04T12:00:00Z"/>
         </w:rPr>
       </w:pPr>
-      <w:del w:id="127" w:author="Arshad Akhtar Abbasia" w:date="2026-10-04T12:00:00Z">
+      <w:del w:id="143" w:author="Arshad Akhtar Abbasia" w:date="2026-10-04T12:00:00Z">
         <w:r>
           <w:delText xml:space="preserve">This is the semantics of an audit log that keeps what was accessed readable for as long as it keeps the record. Under it, an audit record whose payload cannot be produced is treated as an incomplete or broken record, and audit integrity is understood as the continued producibility of what was accessed. How common such logs are is not established here. What is established is that nothing in the instruments rules them out and that the cross-border profile supplies their content, since ITI-55 requires both gateways to record the patient’s demographic query (Section 4.3). No instrument states this semantics, and none states the alternative.</w:delText>
         </w:r>
@@ -3809,6 +3902,19 @@
     <w:p>
       <w:pPr>
         <w:pStyle w:val="BodyText"/>
+        <w:rPr>
+          <w:ins w:id="144" w:author="Arshad Akhtar Abbasia" w:date="2026-10-04T12:00:00Z"/>
+        </w:rPr>
+      </w:pPr>
+      <w:ins w:id="145" w:author="Arshad Akhtar Abbasia" w:date="2026-10-04T12:00:00Z">
+        <w:r>
+          <w:t xml:space="preserve">Under Semantics I the conflict is not bad luck or rare timing. It is a contradiction, and it can be located to the month.</w:t>
+        </w:r>
+      </w:ins>
+    </w:p>
+    <w:p>
+      <w:pPr>
+        <w:pStyle w:val="BodyText"/>
       </w:pPr>
       <w:r>
         <w:t xml:space="preserve">Proposition 1. Under Semantics I, the constraint system {C1, C2, C3} is infeasible for any record a such that</w:t>
@@ -3853,12 +3959,12 @@
       <w:r>
         <w:t xml:space="preserve">Where it holds, Corollary 1.2 is </w:t>
       </w:r>
-      <w:del w:id="128" w:author="Arshad Akhtar Abbasia" w:date="2026-10-04T12:00:00Z">
+      <w:del w:id="146" w:author="Arshad Akhtar Abbasia" w:date="2026-10-04T12:00:00Z">
         <w:r>
           <w:delText xml:space="preserve">the sharpest form </w:delText>
         </w:r>
       </w:del>
-      <w:ins w:id="129" w:author="Arshad Akhtar Abbasia" w:date="2026-10-04T12:00:00Z">
+      <w:ins w:id="147" w:author="Arshad Akhtar Abbasia" w:date="2026-10-04T12:00:00Z">
         <w:r>
           <w:t xml:space="preserve">a conditional extension </w:t>
         </w:r>
@@ -3866,7 +3972,7 @@
       <w:r>
         <w:t xml:space="preserve">of the </w:t>
       </w:r>
-      <w:del w:id="130" w:author="Arshad Akhtar Abbasia" w:date="2026-10-04T12:00:00Z">
+      <w:del w:id="148" w:author="Arshad Akhtar Abbasia" w:date="2026-10-04T12:00:00Z">
         <w:r>
           <w:delText xml:space="preserve">thesis’s </w:delText>
         </w:r>
@@ -3874,12 +3980,12 @@
       <w:r>
         <w:t xml:space="preserve">problem </w:t>
       </w:r>
-      <w:del w:id="131" w:author="Arshad Akhtar Abbasia" w:date="2026-10-04T12:00:00Z">
+      <w:del w:id="149" w:author="Arshad Akhtar Abbasia" w:date="2026-10-04T12:00:00Z">
         <w:r>
           <w:delText xml:space="preserve">statement. </w:delText>
         </w:r>
       </w:del>
-      <w:ins w:id="132" w:author="Arshad Akhtar Abbasia" w:date="2026-10-04T12:00:00Z">
+      <w:ins w:id="150" w:author="Arshad Akhtar Abbasia" w:date="2026-10-04T12:00:00Z">
         <w:r>
           <w:t xml:space="preserve">statement; the request-driven conflict of Corollary 1.1 does not depend on it. </w:t>
         </w:r>
@@ -3927,12 +4033,12 @@
       <w:r>
         <w:t xml:space="preserve">The narrow reading, or logs kept at dataset granularity, therefore cost the thesis its </w:t>
       </w:r>
-      <w:del w:id="133" w:author="Arshad Akhtar Abbasia" w:date="2026-10-04T12:00:00Z">
+      <w:del w:id="151" w:author="Arshad Akhtar Abbasia" w:date="2026-10-04T12:00:00Z">
         <w:r>
           <w:delText xml:space="preserve">sharpest instance </w:delText>
         </w:r>
       </w:del>
-      <w:ins w:id="134" w:author="Arshad Akhtar Abbasia" w:date="2026-10-04T12:00:00Z">
+      <w:ins w:id="152" w:author="Arshad Akhtar Abbasia" w:date="2026-10-04T12:00:00Z">
         <w:r>
           <w:t xml:space="preserve">conditional extension </w:t>
         </w:r>
@@ -3984,6 +4090,19 @@
     <w:p>
       <w:pPr>
         <w:pStyle w:val="BodyText"/>
+        <w:rPr>
+          <w:ins w:id="153" w:author="Arshad Akhtar Abbasia" w:date="2026-10-04T12:00:00Z"/>
+        </w:rPr>
+      </w:pPr>
+      <w:ins w:id="154" w:author="Arshad Akhtar Abbasia" w:date="2026-10-04T12:00:00Z">
+        <w:r>
+          <w:t xml:space="preserve">Change what verifiable means and the contradiction disappears, for every record, every pattern of requests and every floor. The proof builds the trajectory that does it, and that trajectory is the mechanism.</w:t>
+        </w:r>
+      </w:ins>
+    </w:p>
+    <w:p>
+      <w:pPr>
+        <w:pStyle w:val="BodyText"/>
       </w:pPr>
       <w:r>
         <w:t xml:space="preserve">Proposition 2. Under Semantics II, the constraint system {C1, C2, C3} is jointly satisfiable for every record a ∈ A, for every arrival pattern of erasure requests {t_(r)(a)} and permit expiries {t_(π)(a)}, and for every floor parameter F(a) ∈ ℕ.</w:t>
@@ -4081,10 +4200,10 @@
       <w:pPr>
         <w:pStyle w:val="BodyText"/>
         <w:rPr>
-          <w:ins w:id="135" w:author="Arshad Akhtar Abbasia" w:date="2026-10-04T12:00:00Z"/>
+          <w:ins w:id="155" w:author="Arshad Akhtar Abbasia" w:date="2026-10-04T12:00:00Z"/>
         </w:rPr>
       </w:pPr>
-      <w:ins w:id="136" w:author="Arshad Akhtar Abbasia" w:date="2026-10-04T12:00:00Z">
+      <w:ins w:id="156" w:author="Arshad Akhtar Abbasia" w:date="2026-10-04T12:00:00Z">
         <w:r>
           <w:t xml:space="preserve">Corollary 2.3 (sensitivity to what auditing needs). Extend the model with one accessibility variable per part of the payload, which the single-variable model of Section 4.3 cannot express, and partition the payload as p(a) = p_(n)(a) ∪ p_(r)(a), where p_(n)(a) is any part that auditing turns out to need, and retain p_(n)(a) with the accessor fields. The trajectory of Proposition 2, with p_(r)(a) in place of p(a), satisfies C1 and C2, and it satisfies C3 unless p_(n)(a) is itself electronic health data within the environment on the broad reading of Article 68(12). In that case C1 and C3 collide over p_(n)(a), by the argument of Proposition 3, for exactly the records it identifies under case (ii). The collision follows from keeping p_(n)(a) intact under condition (i) without the logged-removal exception that the subject fields have. Relocation (Section 4.10, Rival 6) is the exit this thesis identifies; logging at dataset granularity, the narrow reading, or anonymising p_(n)(a) are others.</w:t>
         </w:r>
@@ -4094,10 +4213,10 @@
       <w:pPr>
         <w:pStyle w:val="BodyText"/>
         <w:rPr>
-          <w:ins w:id="137" w:author="Arshad Akhtar Abbasia" w:date="2026-10-04T12:00:00Z"/>
+          <w:ins w:id="157" w:author="Arshad Akhtar Abbasia" w:date="2026-10-04T12:00:00Z"/>
         </w:rPr>
       </w:pPr>
-      <w:ins w:id="138" w:author="Arshad Akhtar Abbasia" w:date="2026-10-04T12:00:00Z">
+      <w:ins w:id="158" w:author="Arshad Akhtar Abbasia" w:date="2026-10-04T12:00:00Z">
         <w:r>
           <w:t xml:space="preserve">Proof sketch. Replace p by p_(r) in steps 1–4 and add p_(n) to the fields that condition (i) of Semantics II keeps intact. C1 holds as before. C2 holds for p_(r) as before, and for p_(n) through Article 17(3)(b), which applies because p_(n) is by assumption necessary. C3 constrains whatever is electronic health data within the environment: if p_(n) is not, C3 is met as before; if it is, C3 requires it gone from t_(π)(a) + 6 while C1 requires it until t(a) + F(a), and the argument of Proposition 3 gives the records for which these overlap. ∎</w:t>
         </w:r>
@@ -4107,10 +4226,10 @@
       <w:pPr>
         <w:pStyle w:val="BodyText"/>
         <w:rPr>
-          <w:ins w:id="139" w:author="Arshad Akhtar Abbasia" w:date="2026-10-04T12:00:00Z"/>
+          <w:ins w:id="159" w:author="Arshad Akhtar Abbasia" w:date="2026-10-04T12:00:00Z"/>
         </w:rPr>
       </w:pPr>
-      <w:ins w:id="140" w:author="Arshad Akhtar Abbasia" w:date="2026-10-04T12:00:00Z">
+      <w:ins w:id="160" w:author="Arshad Akhtar Abbasia" w:date="2026-10-04T12:00:00Z">
         <w:r>
           <w:t xml:space="preserve">Feasibility therefore survives any enlargement of what auditing needs, except an enlargement into data concerning health inside a Secure Processing Environment, where it fails as Corollary 1.2 does and has the same exits.</w:t>
         </w:r>
@@ -4121,14 +4240,53 @@
         <w:pStyle w:val="BodyText"/>
       </w:pPr>
       <w:r>
-        <w:t xml:space="preserve">A note on what kind of result this is. The results of this chapter are stated as propositions rather than theorems, because their proofs are short once the semantics are fixed. The weight of the argument lies elsewhere: in Section 4.2’s necessity analysis, which justifies Semantics II, and in Propositions 3 and 4, which say where the conflict arises and where cryptography is necessary. One objection is that Proposition 2 proves little, because Semantics II was defined in full knowledge of the trajectory that satisfies it. The objection has force and the response is to concede its premise and deny its conclusion. The mathematical content of Proposition 2 is indeed modest: once verifiability is decoupled from payload accessibility, the existence of a satisfying trajectory is close to immediate, and the proof is a verification rather than a discovery. But the substantive claim of this chapter was never that a satisfying trajectory exists under some semantics; any number of semantics would admit one, including trivial semantics under which every record counts as verifiable always. The claim is that this semantics is a defensible reading of what the retention obligations require, grounded in the necessity boundary of Article 17(3)(b), the minimisation principle of Article 5(1)(c), and the accountability purpose the obligations serve. It is also the weakest departure from plaintext verifiability that achieves feasibility, preserving every element of the audit record that the accountability purpose needs and discarding only what it does not. Proposition 1 carries the load that Proposition 2 does not: it establishes that some departure is unavoidable, because </w:t>
-      </w:r>
-      <w:del w:id="141" w:author="Arshad Akhtar Abbasia" w:date="2026-10-04T12:00:00Z">
+        <w:t xml:space="preserve">A note on what kind of result this is. The results of this chapter are stated as propositions rather than theorems, because their proofs are short once the semantics are fixed. The weight of the argument lies elsewhere: in Section 4.2’s necessity analysis, which justifies Semantics II, and in Propositions 3 and 4, which say where the conflict arises and where cryptography is necessary. One objection is that Proposition 2 proves little, because Semantics II was defined in full knowledge of the trajectory that satisfies it. The objection has </w:t>
+      </w:r>
+      <w:del w:id="161" w:author="Arshad Akhtar Abbasia" w:date="2026-10-04T12:00:00Z">
+        <w:r>
+          <w:delText xml:space="preserve">force and the </w:delText>
+        </w:r>
+      </w:del>
+      <w:ins w:id="162" w:author="Arshad Akhtar Abbasia" w:date="2026-10-04T12:00:00Z">
+        <w:r>
+          <w:t xml:space="preserve">force. The </w:t>
+        </w:r>
+      </w:ins>
+      <w:r>
+        <w:t xml:space="preserve">response </w:t>
+      </w:r>
+      <w:del w:id="163" w:author="Arshad Akhtar Abbasia" w:date="2026-10-04T12:00:00Z">
+        <w:r>
+          <w:delText xml:space="preserve">is to concede </w:delText>
+        </w:r>
+      </w:del>
+      <w:ins w:id="164" w:author="Arshad Akhtar Abbasia" w:date="2026-10-04T12:00:00Z">
+        <w:r>
+          <w:t xml:space="preserve">concedes </w:t>
+        </w:r>
+      </w:ins>
+      <w:r>
+        <w:t xml:space="preserve">its premise and </w:t>
+      </w:r>
+      <w:del w:id="165" w:author="Arshad Akhtar Abbasia" w:date="2026-10-04T12:00:00Z">
+        <w:r>
+          <w:delText xml:space="preserve">deny </w:delText>
+        </w:r>
+      </w:del>
+      <w:ins w:id="166" w:author="Arshad Akhtar Abbasia" w:date="2026-10-04T12:00:00Z">
+        <w:r>
+          <w:t xml:space="preserve">denies </w:t>
+        </w:r>
+      </w:ins>
+      <w:r>
+        <w:t xml:space="preserve">its conclusion. The mathematical content of Proposition 2 is indeed modest: once verifiability is decoupled from payload accessibility, the existence of a satisfying trajectory is close to immediate, and the proof is a verification rather than a discovery. But the substantive claim of this chapter was never that a satisfying trajectory exists under some semantics; any number of semantics would admit one, including trivial semantics under which every record counts as verifiable always. The claim is that this semantics is a defensible reading of what the retention obligations require, grounded in the necessity boundary of Article 17(3)(b), the minimisation principle of Article 5(1)(c), and the accountability purpose the obligations serve. It is also the weakest departure from plaintext verifiability that achieves feasibility, preserving every element of the audit record that the accountability purpose needs and discarding only what it does not. Proposition 1 carries the load that Proposition 2 does not: it establishes that some departure is unavoidable, because </w:t>
+      </w:r>
+      <w:del w:id="167" w:author="Arshad Akhtar Abbasia" w:date="2026-10-04T12:00:00Z">
         <w:r>
           <w:delText xml:space="preserve">the status quo </w:delText>
         </w:r>
       </w:del>
-      <w:ins w:id="142" w:author="Arshad Akhtar Abbasia" w:date="2026-10-04T12:00:00Z">
+      <w:ins w:id="168" w:author="Arshad Akhtar Abbasia" w:date="2026-10-04T12:00:00Z">
         <w:r>
           <w:t xml:space="preserve">plaintext verifiability </w:t>
         </w:r>
@@ -4158,8 +4316,34 @@
         <w:pStyle w:val="BodyText"/>
       </w:pPr>
       <w:r>
-        <w:t xml:space="preserve">The trajectory constructed in the proof of Proposition 2 is the specification of the mechanism. This section states it as an implementable design.</w:t>
-      </w:r>
+        <w:t xml:space="preserve">The </w:t>
+      </w:r>
+      <w:del w:id="169" w:author="Arshad Akhtar Abbasia" w:date="2026-10-04T12:00:00Z">
+        <w:r>
+          <w:delText xml:space="preserve">trajectory constructed in the </w:delText>
+        </w:r>
+      </w:del>
+      <w:r>
+        <w:t xml:space="preserve">proof of Proposition 2 </w:t>
+      </w:r>
+      <w:ins w:id="170" w:author="Arshad Akhtar Abbasia" w:date="2026-10-04T12:00:00Z">
+        <w:r>
+          <w:t xml:space="preserve">is also a build sheet: the trajectory it constructs </w:t>
+        </w:r>
+      </w:ins>
+      <w:r>
+        <w:t xml:space="preserve">is the specification of the mechanism. This section states it as an implementable </w:t>
+      </w:r>
+      <w:del w:id="171" w:author="Arshad Akhtar Abbasia" w:date="2026-10-04T12:00:00Z">
+        <w:r>
+          <w:delText xml:space="preserve">design.</w:delText>
+        </w:r>
+      </w:del>
+      <w:ins w:id="172" w:author="Arshad Akhtar Abbasia" w:date="2026-10-04T12:00:00Z">
+        <w:r>
+          <w:t xml:space="preserve">design: what is encrypted, what is committed, what is destroyed, and what is logged when it is.</w:t>
+        </w:r>
+      </w:ins>
     </w:p>
     <w:p>
       <w:pPr>
@@ -4200,12 +4384,12 @@
       <w:r>
         <w:t xml:space="preserve">Tamper evidence. An append-only registry is only as good as the means of detecting an append-only violation. Secure audit logging has addressed this since Schneier and Kelsey (1999), whose hash-chained logs make earlier entries unalterable without detection; Merkle trees (Merkle, 1988) let the same assurance be checked for a single entry with a logarithmic proof (Crosby &amp; Wallach, 2009), and Certificate Transparency standardised that construction for public logs (Laurie, Langley, &amp; Kasper, 2013). The mechanism appends every access event, invalidation and subject-link removal to such a log, with the leaf and node hashing of RFC 6962, and Semantics II condition (i) is checked as an inclusion proof against the log’s root rather than as the presence of fields (Chapter 5, Section 5.7). What enters a leaf is chosen so that the log never needs erasing: the accessor fields, the creation month and the commitment, never the payload and never the subject fields. The tension that Chapter 2, Section 2.4 found unresolved in blockchain audit logging, an immutable trail facing an erasure right, therefore does not arise: what the right and the ceiling reach is held outside the log and destroyed there, and what the log holds is what accountability </w:t>
       </w:r>
-      <w:del w:id="143" w:author="Arshad Akhtar Abbasia" w:date="2026-10-04T12:00:00Z">
+      <w:del w:id="173" w:author="Arshad Akhtar Abbasia" w:date="2026-10-04T12:00:00Z">
         <w:r>
           <w:delText xml:space="preserve">requires.</w:delText>
         </w:r>
       </w:del>
-      <w:ins w:id="144" w:author="Arshad Akhtar Abbasia" w:date="2026-10-04T12:00:00Z">
+      <w:ins w:id="174" w:author="Arshad Akhtar Abbasia" w:date="2026-10-04T12:00:00Z">
         <w:r>
           <w:t xml:space="preserve">requires. Redactable and chameleon-hash designs, reviewed in Chapter 2, Section 2.4, resolve the same tension the other way, by letting a key holder rewrite the log.</w:t>
         </w:r>
@@ -4218,12 +4402,12 @@
       <w:r>
         <w:t xml:space="preserve">Accumulator-based validity witnesses. The set of currently valid (non-invalidated) records is maintained in a dynamic cryptographic accumulator supporting efficient revocation (Camenisch &amp; Lysyanskaya, 2002). This provides an auditor with a succinct proof that a given record either is or is not currently valid, without the auditor enumerating the registry. The accumulator is an efficiency and verifiability layer, not a load-bearing component of the propositions: Proposition 2 holds if validity is established by linear scan of the registry, and the accumulator makes that check succinct. The accumulator is specified but not implemented in the artefact </w:t>
       </w:r>
-      <w:del w:id="145" w:author="Arshad Akhtar Abbasia" w:date="2026-10-04T12:00:00Z">
+      <w:del w:id="175" w:author="Arshad Akhtar Abbasia" w:date="2026-10-04T12:00:00Z">
         <w:r>
           <w:delText xml:space="preserve">(Section </w:delText>
         </w:r>
       </w:del>
-      <w:ins w:id="146" w:author="Arshad Akhtar Abbasia" w:date="2026-10-04T12:00:00Z">
+      <w:ins w:id="176" w:author="Arshad Akhtar Abbasia" w:date="2026-10-04T12:00:00Z">
         <w:r>
           <w:t xml:space="preserve">(Chapter 6, Section </w:t>
         </w:r>
@@ -4255,7 +4439,7 @@
       <w:r>
         <w:t xml:space="preserve">Applying the mechanism to the two cases. For the cross-border primary-use case, the mechanism operates at the audit repository of the National Contact Point, at the point where the ATNA audit record is written. </w:t>
       </w:r>
-      <w:ins w:id="147" w:author="Arshad Akhtar Abbasia" w:date="2026-10-04T12:00:00Z">
+      <w:ins w:id="177" w:author="Arshad Akhtar Abbasia" w:date="2026-10-04T12:00:00Z">
         <w:r>
           <w:t xml:space="preserve">The patient link is retained there through the floor, for the reason Section 4.2 gives, and removed at the terminal transition. </w:t>
         </w:r>
@@ -4276,6 +4460,11 @@
       <w:pPr>
         <w:pStyle w:val="BodyText"/>
       </w:pPr>
+      <w:ins w:id="178" w:author="Arshad Akhtar Abbasia" w:date="2026-10-04T12:00:00Z">
+        <w:r>
+          <w:t xml:space="preserve">A mechanism that erases by destroying keys is only as good as what it leaves behind. </w:t>
+        </w:r>
+      </w:ins>
       <w:r>
         <w:t xml:space="preserve">Proposition 2 leaves a residue: m(a), c(a), ι(a), the leaf hashes of the audit log and, where the optional layer is used, the accumulator state. The salt r(a), the key k(a) and the ciphertext of p(a) are destroyed at invalidation (Section 4.8). Whether the mechanism is lawful depends on whether this residue sits on the correct side of the threshold at which data cease to be personal. This section performs that analysis, and it is included because Chapter 2 identified its absence as the fourth gap in the literature.</w:t>
       </w:r>
@@ -4303,12 +4492,12 @@
       <w:r>
         <w:t xml:space="preserve">The audit log raises the same threat one level up, and the same response answers it. A leaf hash must outlive the record’s fields, since the root depends on it, and it is computed over the accessor fields and the commitment. After the terminal transition the commitment survives and the accessor fields do not; an adversary who can enumerate candidate accessors, a small set in any one environment, could then recompute the leaf and confirm which accessor it was. The specification therefore places a per-entry random nonce in every leaf, held with the record and destroyed at the terminal transition with the identifying fields, so that a surviving leaf hash confirms nothing. The artefact does not implement the terminal transition, and its leaves omit the nonce accordingly </w:t>
       </w:r>
-      <w:del w:id="148" w:author="Arshad Akhtar Abbasia" w:date="2026-10-04T12:00:00Z">
+      <w:del w:id="179" w:author="Arshad Akhtar Abbasia" w:date="2026-10-04T12:00:00Z">
         <w:r>
           <w:delText xml:space="preserve">(Section </w:delText>
         </w:r>
       </w:del>
-      <w:ins w:id="149" w:author="Arshad Akhtar Abbasia" w:date="2026-10-04T12:00:00Z">
+      <w:ins w:id="180" w:author="Arshad Akhtar Abbasia" w:date="2026-10-04T12:00:00Z">
         <w:r>
           <w:t xml:space="preserve">(Chapter 6, Section </w:t>
         </w:r>
@@ -4377,8 +4566,26 @@
       <w:pPr>
         <w:pStyle w:val="BodyText"/>
       </w:pPr>
-      <w:r>
-        <w:t xml:space="preserve">Six alternative designs are considered. Five are rejected for stated reasons; the sixth is accepted for the ceiling alone and bounded by Proposition 4.</w:t>
+      <w:ins w:id="181" w:author="Arshad Akhtar Abbasia" w:date="2026-10-04T12:00:00Z">
+        <w:r>
+          <w:t xml:space="preserve">If a simpler design solved the problem, this mechanism would be unnecessary. </w:t>
+        </w:r>
+      </w:ins>
+      <w:r>
+        <w:t xml:space="preserve">Six alternative designs are </w:t>
+      </w:r>
+      <w:del w:id="182" w:author="Arshad Akhtar Abbasia" w:date="2026-10-04T12:00:00Z">
+        <w:r>
+          <w:delText xml:space="preserve">considered. </w:delText>
+        </w:r>
+      </w:del>
+      <w:ins w:id="183" w:author="Arshad Akhtar Abbasia" w:date="2026-10-04T12:00:00Z">
+        <w:r>
+          <w:t xml:space="preserve">therefore tested against it. </w:t>
+        </w:r>
+      </w:ins>
+      <w:r>
+        <w:t xml:space="preserve">Five are rejected for stated reasons; the sixth is accepted for the ceiling alone and bounded by Proposition 4.</w:t>
       </w:r>
     </w:p>
     <w:p>
@@ -4412,12 +4619,12 @@
       <w:r>
         <w:t xml:space="preserve">Rival 4: Delete the record and log the deletion. This is the closest rival and deserves the most care. Deleting the audit record while logging that a deletion occurred satisfies C2 and C3, and preserves a trace. It fails C1 under both semantics: under Semantics I trivially, and under Semantics II because condition (ii) fails: no commitment survives, so the auditor can establish that something was deleted but not that the deleted item was the payload bound to that specific access event. The distinction matters in adversarial conditions. A controller who deletes records and logs deletions can conceal the substitution of one record for </w:t>
       </w:r>
-      <w:del w:id="150" w:author="Arshad Akhtar Abbasia" w:date="2026-10-04T12:00:00Z">
+      <w:del w:id="184" w:author="Arshad Akhtar Abbasia" w:date="2026-10-04T12:00:00Z">
         <w:r>
           <w:delText xml:space="preserve">another; </w:delText>
         </w:r>
       </w:del>
-      <w:ins w:id="151" w:author="Arshad Akhtar Abbasia" w:date="2026-10-04T12:00:00Z">
+      <w:ins w:id="185" w:author="Arshad Akhtar Abbasia" w:date="2026-10-04T12:00:00Z">
         <w:r>
           <w:t xml:space="preserve">another. A commitment bound into the log at write time constrains this only for </w:t>
         </w:r>
@@ -4425,12 +4632,12 @@
       <w:r>
         <w:t xml:space="preserve">a </w:t>
       </w:r>
-      <w:del w:id="152" w:author="Arshad Akhtar Abbasia" w:date="2026-10-04T12:00:00Z">
+      <w:del w:id="186" w:author="Arshad Akhtar Abbasia" w:date="2026-10-04T12:00:00Z">
         <w:r>
           <w:delText xml:space="preserve">controller bound to a surviving commitment cannot. </w:delText>
         </w:r>
       </w:del>
-      <w:ins w:id="153" w:author="Arshad Akhtar Abbasia" w:date="2026-10-04T12:00:00Z">
+      <w:ins w:id="187" w:author="Arshad Akhtar Abbasia" w:date="2026-10-04T12:00:00Z">
         <w:r>
           <w:t xml:space="preserve">party that kept its own opening; once the salt and payload are destroyed no auditor can open it, so the advantage over this rival is narrower than first stated. </w:t>
         </w:r>
@@ -4478,12 +4685,12 @@
       <w:r>
         <w:t xml:space="preserve">Proof. The ceiling quantifies over the location: after relocation the record is not in it, so the ceiling holds, and on the rival’s premise the floor is met at the new location. The right quantifies over the controller: Article 17(1) obliges the controller holding the data to erase them, </w:t>
       </w:r>
-      <w:del w:id="154" w:author="Arshad Akhtar Abbasia" w:date="2026-10-04T12:00:00Z">
+      <w:del w:id="188" w:author="Arshad Akhtar Abbasia" w:date="2026-10-04T12:00:00Z">
         <w:r>
           <w:delText xml:space="preserve">and </w:delText>
         </w:r>
       </w:del>
-      <w:ins w:id="155" w:author="Arshad Akhtar Abbasia" w:date="2026-10-04T12:00:00Z">
+      <w:ins w:id="189" w:author="Arshad Akhtar Abbasia" w:date="2026-10-04T12:00:00Z">
         <w:r>
           <w:t xml:space="preserve">and, as a legal premise rather than a mathematical consequence, </w:t>
         </w:r>
@@ -4520,8 +4727,26 @@
       <w:pPr>
         <w:pStyle w:val="BodyText"/>
       </w:pPr>
-      <w:r>
-        <w:t xml:space="preserve">The mechanism is specified against the Norwegian infrastructure as verified in Chapter 2, Section 2.6, not against an idealisation of it.</w:t>
+      <w:del w:id="190" w:author="Arshad Akhtar Abbasia" w:date="2026-10-04T12:00:00Z">
+        <w:r>
+          <w:delText xml:space="preserve">The </w:delText>
+        </w:r>
+      </w:del>
+      <w:ins w:id="191" w:author="Arshad Akhtar Abbasia" w:date="2026-10-04T12:00:00Z">
+        <w:r>
+          <w:t xml:space="preserve">A </w:t>
+        </w:r>
+      </w:ins>
+      <w:r>
+        <w:t xml:space="preserve">mechanism </w:t>
+      </w:r>
+      <w:ins w:id="192" w:author="Arshad Akhtar Abbasia" w:date="2026-10-04T12:00:00Z">
+        <w:r>
+          <w:t xml:space="preserve">is only as useful as the point at which it can be installed. This one </w:t>
+        </w:r>
+      </w:ins>
+      <w:r>
+        <w:t xml:space="preserve">is specified against the Norwegian infrastructure as verified in Chapter 2, Section 2.6, not against an idealisation of it.</w:t>
       </w:r>
     </w:p>
     <w:p>
@@ -4545,7 +4770,15 @@
         <w:pStyle w:val="BodyText"/>
       </w:pPr>
       <w:r>
-        <w:t xml:space="preserve">Compatibility with the national criteria. The Norwegian criteria for Secure Processing Environments, in the version put to hearing, require an information-security management system as mandatory, recommend ISO 27001 certification, and require eID-based authentication at defined assurance levels (SPUHiN, 2025). The mechanism requires nothing beyond these: key custody within a documented boundary is an information-security-management concern of exactly the kind the mandatory requirement already covers. It adds no requirement that the criteria do not already impose, which was the design constraint derived from Chapter 2’s third gap.</w:t>
+        <w:t xml:space="preserve">Compatibility with the national criteria. The Norwegian criteria for Secure Processing Environments, in the version put to hearing, require an information-security management system as mandatory, recommend ISO 27001 certification, and require eID-based authentication at defined assurance levels (SPUHiN, 2025). </w:t>
+      </w:r>
+      <w:ins w:id="193" w:author="Arshad Akhtar Abbasia" w:date="2026-10-04T12:00:00Z">
+        <w:r>
+          <w:t xml:space="preserve">The November 2024 draft is specific on logging. It makes tamper-proof, identifiable logs of access to the environment mandatory “for at least one year” (P13), and likewise logs of when files are extracted and by whom, kept for one year (P24); it recommends tamper-proof, identifiable logs of activities inside the environment (P14); and it lists back-up and log files among the matters a termination procedure must cover (P31) (SPUHiN, 2024; requirement numbers as in the draft). That is the one-year floor of Article 73(1)(e) in national form. None of the requirements inspected says how those logs are to be reconciled with deletion. </w:t>
+        </w:r>
+      </w:ins>
+      <w:r>
+        <w:t xml:space="preserve">The mechanism requires nothing beyond these: key custody within a documented boundary is an information-security-management concern of exactly the kind the mandatory requirement already covers. It adds no requirement that the criteria do not already impose, which was the design constraint derived from Chapter 2’s third gap.</w:t>
       </w:r>
     </w:p>
     <w:p>
@@ -4703,6 +4936,32 @@
     <w:p>
       <w:pPr>
         <w:pStyle w:val="BodyText"/>
+        <w:rPr>
+          <w:ins w:id="194" w:author="Arshad Akhtar Abbasia" w:date="2026-10-04T12:00:00Z"/>
+        </w:rPr>
+      </w:pPr>
+      <w:ins w:id="195" w:author="Arshad Akhtar Abbasia" w:date="2026-10-04T12:00:00Z">
+        <w:r>
+          <w:t xml:space="preserve">Tamper-proof, identifiable logs of access to the SPE, at least one year (mandatory); of file extraction, one year (mandatory); of activities (recommended) SPUHiN (2024), draft, P13, P24, P14 Accessor fields kept identifiable for the floor; every access event in the append-only Merkle log §4.3, §4.8; MerkleLog Met in the artefact (F = 12; both tamper tests fail V^(II))</w:t>
+        </w:r>
+      </w:ins>
+    </w:p>
+    <w:p>
+      <w:pPr>
+        <w:pStyle w:val="BodyText"/>
+        <w:rPr>
+          <w:ins w:id="196" w:author="Arshad Akhtar Abbasia" w:date="2026-10-04T12:00:00Z"/>
+        </w:rPr>
+      </w:pPr>
+      <w:ins w:id="197" w:author="Arshad Akhtar Abbasia" w:date="2026-10-04T12:00:00Z">
+        <w:r>
+          <w:t xml:space="preserve">Termination procedure covering deletion of files, back-ups and log files (mandatory) SPUHiN (2024), draft, P31 Supplies the rule for the log files: invalidation at the ceiling, terminal transition after the floor §4.8 Met by specification; the terminal transition is not implemented (§6.1)</w:t>
+        </w:r>
+      </w:ins>
+    </w:p>
+    <w:p>
+      <w:pPr>
+        <w:pStyle w:val="BodyText"/>
       </w:pPr>
       <w:r>
         <w:t xml:space="preserve">Reconciliation of log retention with deletion SPUHiN (2025), hearing version Not addressed by the criteria at any grade; the mechanism supplies one §2.6, §4.11 Gap the thesis addresses ------------------------------------------------------------------------------------------------------------------------------------------------------------------------------------------------------------------------------------------------------------------------------------------------------------------------------------------------------------------------------------------------------------------------------------------------------------------------------------------------------------------------------------------------------------------------</w:t>
@@ -4731,12 +4990,12 @@
       <w:r>
         <w:t xml:space="preserve">This chapter formalised the tri-lateral retention conflict as a constraint-satisfaction problem over a single binary accessibility variable per record, with the retention floor parameterised so that the ten-year cross-border audit floor and the one-year Secure Processing Environment log floor are instances of one constraint. It proved that under plaintext-verifiability semantics the system is infeasible for any cross-border record whose erasure request arrives inside its window and, for Secure Processing Environment logs kept at patient-record granularity on the broad reading, without any erasure request at all, where two retention provisions of a single regulation collide over a single environment. It proved that under an accountability-preserving semantics the system is jointly satisfiable for every arrival pattern and every floor, and the proof exhibited the trajectory that achieves satisfaction. It showed that a ceiling collides with a floor only when it is no longer than the floor, and that the ceiling’s anchor decides whether the collision can be read from the text (Proposition 3), and that relocating a record meets the ceiling but not the right (Proposition 4). That trajectory, specified as Crypto-Erasure by Invalidation, retains metadata and a hiding commitment, and destroys the payload key at the earlier of the erasure deadline and the deletion ceiling. It appends the invalidation to a tamper-evident audit log as a first-class, witnessed event, in a log built never to hold what erasure reaches. The salt and the payload ciphertext go with the key. At floor expiry it performs a terminal transition that destroys the identifying metadata, leaving a non-identifiable statistical residue, so that the record’s whole life cycle, not merely its retention window, is accounted for under the storage-limitation </w:t>
       </w:r>
-      <w:del w:id="156" w:author="Arshad Akhtar Abbasia" w:date="2026-10-04T12:00:00Z">
+      <w:del w:id="198" w:author="Arshad Akhtar Abbasia" w:date="2026-10-04T12:00:00Z">
         <w:r>
           <w:delText xml:space="preserve">principle.</w:delText>
         </w:r>
       </w:del>
-      <w:ins w:id="157" w:author="Arshad Akhtar Abbasia" w:date="2026-10-04T12:00:00Z">
+      <w:ins w:id="199" w:author="Arshad Akhtar Abbasia" w:date="2026-10-04T12:00:00Z">
         <w:r>
           <w:t xml:space="preserve">principle. The terminal transition, the per-entry nonce, consistency proofs and the accumulator layer are specified but not implemented in the artefact (Chapter 6, Section 6.1). For Secure Processing Environment records the result assumes that auditing does not need the payload; Corollary 2.3 states what follows if it needs part of it.</w:t>
         </w:r>
@@ -4797,12 +5056,12 @@
       <w:r>
         <w:t xml:space="preserve">The chapter demonstrates that Propositions 1 and 2 of Chapter 4 hold on the instances examined; </w:t>
       </w:r>
-      <w:del w:id="158" w:author="Arshad Akhtar Abbasia" w:date="2026-10-04T12:00:00Z">
+      <w:del w:id="200" w:author="Arshad Akhtar Abbasia" w:date="2026-10-04T12:00:00Z">
         <w:r>
           <w:delText xml:space="preserve">Propositions 3 and </w:delText>
         </w:r>
       </w:del>
-      <w:ins w:id="159" w:author="Arshad Akhtar Abbasia" w:date="2026-10-04T12:00:00Z">
+      <w:ins w:id="201" w:author="Arshad Akhtar Abbasia" w:date="2026-10-04T12:00:00Z">
         <w:r>
           <w:t xml:space="preserve">Proposition </w:t>
         </w:r>
@@ -4810,12 +5069,12 @@
       <w:r>
         <w:t xml:space="preserve">4 </w:t>
       </w:r>
-      <w:del w:id="160" w:author="Arshad Akhtar Abbasia" w:date="2026-10-04T12:00:00Z">
+      <w:del w:id="202" w:author="Arshad Akhtar Abbasia" w:date="2026-10-04T12:00:00Z">
         <w:r>
           <w:delText xml:space="preserve">are </w:delText>
         </w:r>
       </w:del>
-      <w:ins w:id="161" w:author="Arshad Akhtar Abbasia" w:date="2026-10-04T12:00:00Z">
+      <w:ins w:id="203" w:author="Arshad Akhtar Abbasia" w:date="2026-10-04T12:00:00Z">
         <w:r>
           <w:t xml:space="preserve">is </w:t>
         </w:r>
@@ -4823,12 +5082,12 @@
       <w:r>
         <w:t xml:space="preserve">analytic and </w:t>
       </w:r>
-      <w:del w:id="162" w:author="Arshad Akhtar Abbasia" w:date="2026-10-04T12:00:00Z">
+      <w:del w:id="204" w:author="Arshad Akhtar Abbasia" w:date="2026-10-04T12:00:00Z">
         <w:r>
           <w:delText xml:space="preserve">are </w:delText>
         </w:r>
       </w:del>
-      <w:ins w:id="163" w:author="Arshad Akhtar Abbasia" w:date="2026-10-04T12:00:00Z">
+      <w:ins w:id="205" w:author="Arshad Akhtar Abbasia" w:date="2026-10-04T12:00:00Z">
         <w:r>
           <w:t xml:space="preserve">is </w:t>
         </w:r>
@@ -4836,12 +5095,12 @@
       <w:r>
         <w:t xml:space="preserve">not executed </w:t>
       </w:r>
-      <w:del w:id="164" w:author="Arshad Akhtar Abbasia" w:date="2026-10-04T12:00:00Z">
+      <w:del w:id="206" w:author="Arshad Akhtar Abbasia" w:date="2026-10-04T12:00:00Z">
         <w:r>
           <w:delText xml:space="preserve">here, although </w:delText>
         </w:r>
       </w:del>
-      <w:ins w:id="165" w:author="Arshad Akhtar Abbasia" w:date="2026-10-04T12:00:00Z">
+      <w:ins w:id="207" w:author="Arshad Akhtar Abbasia" w:date="2026-10-04T12:00:00Z">
         <w:r>
           <w:t xml:space="preserve">here; </w:t>
         </w:r>
@@ -4849,12 +5108,12 @@
       <w:r>
         <w:t xml:space="preserve">Section 5.4 computes the condition of Proposition </w:t>
       </w:r>
-      <w:del w:id="166" w:author="Arshad Akhtar Abbasia" w:date="2026-10-04T12:00:00Z">
+      <w:del w:id="208" w:author="Arshad Akhtar Abbasia" w:date="2026-10-04T12:00:00Z">
         <w:r>
           <w:delText xml:space="preserve">3. </w:delText>
         </w:r>
       </w:del>
-      <w:ins w:id="167" w:author="Arshad Akhtar Abbasia" w:date="2026-10-04T12:00:00Z">
+      <w:ins w:id="209" w:author="Arshad Akhtar Abbasia" w:date="2026-10-04T12:00:00Z">
         <w:r>
           <w:t xml:space="preserve">3 and Section 5.5 checks it. </w:t>
         </w:r>
@@ -4870,12 +5129,12 @@
       <w:r>
         <w:t xml:space="preserve">A subsidiary claim is made for Corollary 1.2: that, on the broad reading of Article 68(12) and for logs kept at patient-record granularity, Secure Processing Environment access-log records become infeasible under plaintext semantics without any erasure request at all, through the collision of the Article 73(1)(e) one-year retention floor with the Article 68(12) six-month deletion ceiling. The demonstration produces thirty-nine such </w:t>
       </w:r>
-      <w:del w:id="168" w:author="Arshad Akhtar Abbasia" w:date="2026-10-04T12:00:00Z">
+      <w:del w:id="210" w:author="Arshad Akhtar Abbasia" w:date="2026-10-04T12:00:00Z">
         <w:r>
           <w:delText xml:space="preserve">witnesses.</w:delText>
         </w:r>
       </w:del>
-      <w:ins w:id="169" w:author="Arshad Akhtar Abbasia" w:date="2026-10-04T12:00:00Z">
+      <w:ins w:id="211" w:author="Arshad Akhtar Abbasia" w:date="2026-10-04T12:00:00Z">
         <w:r>
           <w:t xml:space="preserve">witnesses, a number the generator determines (Section 5.4).</w:t>
         </w:r>
@@ -4965,10 +5224,10 @@
       <w:pPr>
         <w:pStyle w:val="BodyText"/>
         <w:rPr>
-          <w:ins w:id="170" w:author="Arshad Akhtar Abbasia" w:date="2026-10-04T12:00:00Z"/>
+          <w:ins w:id="212" w:author="Arshad Akhtar Abbasia" w:date="2026-10-04T12:00:00Z"/>
         </w:rPr>
       </w:pPr>
-      <w:ins w:id="171" w:author="Arshad Akhtar Abbasia" w:date="2026-10-04T12:00:00Z">
+      <w:ins w:id="213" w:author="Arshad Akhtar Abbasia" w:date="2026-10-04T12:00:00Z">
         <w:r>
           <w:t xml:space="preserve">z3_check.py 153 Optional: bounded SMT check of Propositions 1–3 (needs z3-solver) No --------------------------------------------------------------------------------------------------------------------------------------------------------------------------------------------------</w:t>
         </w:r>
@@ -5245,7 +5504,7 @@
       <w:r>
         <w:t xml:space="preserve">The fifty per cent figure follows from the generator. The collision occurs when t_(π) + 6 ≤ t_(a) + 12, the condition of Proposition 3(ii) with F = 12, L = 6 and the ceiling anchored to permit expiry, and permit lengths were drawn uniformly from one to twelve months, so half fall at or below six. </w:t>
       </w:r>
-      <w:ins w:id="172" w:author="Arshad Akhtar Abbasia" w:date="2026-10-04T12:00:00Z">
+      <w:ins w:id="214" w:author="Arshad Akhtar Abbasia" w:date="2026-10-04T12:00:00Z">
         <w:r>
           <w:t xml:space="preserve">Article 68(12) allows permits of up to ten years; with the remaining duration drawn uniformly over a five-year permit, about one log in ten would fall in the window. </w:t>
         </w:r>
@@ -5333,7 +5592,7 @@
       <w:r>
         <w:t xml:space="preserve">The cross-border floor is scaled from one hundred and twenty months to twelve for this check, because exhaustive search over 2¹²⁰ assignments is not computable. The scaling does not affect the logic: Proposition 1’s argument depends on the deadline falling inside the window, not on the window’s length, and the scaled case preserves that relation. It is the one place in the </w:t>
       </w:r>
-      <w:ins w:id="173" w:author="Arshad Akhtar Abbasia" w:date="2026-10-04T12:00:00Z">
+      <w:ins w:id="215" w:author="Arshad Akhtar Abbasia" w:date="2026-10-04T12:00:00Z">
         <w:r>
           <w:t xml:space="preserve">checker’s </w:t>
         </w:r>
@@ -5346,10 +5605,10 @@
       <w:pPr>
         <w:pStyle w:val="BodyText"/>
         <w:rPr>
-          <w:ins w:id="174" w:author="Arshad Akhtar Abbasia" w:date="2026-10-04T12:00:00Z"/>
+          <w:ins w:id="216" w:author="Arshad Akhtar Abbasia" w:date="2026-10-04T12:00:00Z"/>
         </w:rPr>
       </w:pPr>
-      <w:ins w:id="175" w:author="Arshad Akhtar Abbasia" w:date="2026-10-04T12:00:00Z">
+      <w:ins w:id="217" w:author="Arshad Akhtar Abbasia" w:date="2026-10-04T12:00:00Z">
         <w:r>
           <w:t xml:space="preserve">A bounded check in a different formalism guards against error in the proofs. An optional module poses the propositions to the Z3 SMT solver as requests for a counterexample: a record with any parameter values inside stated bounds (creation month 0–12, floor 1–120 months, so the cross-border floor is covered, response period 1–3 months, request month and ceiling anchor anywhere up to a 140-month horizon, ceiling 1–120 months). It checks Proposition 1 and the converse Chapter 5 relies on (a record with no deadline inside its window is feasible), the constructive trajectory of Proposition 2 with the accountability state of Semantics II encoded (accessor fields, commitment, invalidation entry, subject link and its removal entry), and both directions of Proposition 3 with its two cases. The solver finds no counterexample in any of the nine checks. It does find counterexamples to deliberately broken versions: the Proposition 2 construction without its invalidation entry, without its commitment, or without the subject-link entry, and Proposition 3 shifted by one month, which shows the checks can fail (Appendix A, A.23 and A.24). The check covers every parameter combination within the bounds rather than a sample and shares no code with the checker. It was written in the same AI-assisted process and takes the constraint definitions from Section 4.4, so it checks that the propositions follow from the constraints as encoded, not that the constraints translate the law, and it is bounded rather than general.</w:t>
         </w:r>
@@ -5474,12 +5733,12 @@
       <w:r>
         <w:t xml:space="preserve">This is the state the mechanism is designed to produce, and it is worth reading against what Semantics I would have demanded. The access event is fully established: which researcher, under which permit, with what outcome. The link to the patient was removed at the ceiling, and its removal is itself a logged </w:t>
       </w:r>
-      <w:del w:id="176" w:author="Arshad Akhtar Abbasia" w:date="2026-10-04T12:00:00Z">
+      <w:del w:id="218" w:author="Arshad Akhtar Abbasia" w:date="2026-10-04T12:00:00Z">
         <w:r>
           <w:delText xml:space="preserve">entry. </w:delText>
         </w:r>
       </w:del>
-      <w:ins w:id="177" w:author="Arshad Akhtar Abbasia" w:date="2026-10-04T12:00:00Z">
+      <w:ins w:id="219" w:author="Arshad Akhtar Abbasia" w:date="2026-10-04T12:00:00Z">
         <w:r>
           <w:t xml:space="preserve">entry; a cross-border record keeps the link through the floor (Chapter 4, Section 4.2). </w:t>
         </w:r>
@@ -5487,12 +5746,12 @@
       <w:r>
         <w:t xml:space="preserve">The binding to a specific payload survives in the commitment. The invalidation is itself a logged, grounded, attributed event rather than a silent absence. And the payload is unreadable, at month nineteen as at month sixteen. An auditor examining this record learns </w:t>
       </w:r>
-      <w:del w:id="178" w:author="Arshad Akhtar Abbasia" w:date="2026-10-04T12:00:00Z">
+      <w:del w:id="220" w:author="Arshad Akhtar Abbasia" w:date="2026-10-04T12:00:00Z">
         <w:r>
           <w:delText xml:space="preserve">everything </w:delText>
         </w:r>
       </w:del>
-      <w:ins w:id="179" w:author="Arshad Akhtar Abbasia" w:date="2026-10-04T12:00:00Z">
+      <w:ins w:id="221" w:author="Arshad Akhtar Abbasia" w:date="2026-10-04T12:00:00Z">
         <w:r>
           <w:t xml:space="preserve">what the </w:t>
         </w:r>
@@ -5500,12 +5759,12 @@
       <w:r>
         <w:t xml:space="preserve">accountability </w:t>
       </w:r>
-      <w:del w:id="180" w:author="Arshad Akhtar Abbasia" w:date="2026-10-04T12:00:00Z">
+      <w:del w:id="222" w:author="Arshad Akhtar Abbasia" w:date="2026-10-04T12:00:00Z">
         <w:r>
           <w:delText xml:space="preserve">requires and nothing </w:delText>
         </w:r>
       </w:del>
-      <w:ins w:id="181" w:author="Arshad Akhtar Abbasia" w:date="2026-10-04T12:00:00Z">
+      <w:ins w:id="223" w:author="Arshad Akhtar Abbasia" w:date="2026-10-04T12:00:00Z">
         <w:r>
           <w:t xml:space="preserve">purpose is argued to require (Chapter 4, Section 4.2), while </w:t>
         </w:r>
@@ -5513,12 +5772,12 @@
       <w:r>
         <w:t xml:space="preserve">the </w:t>
       </w:r>
-      <w:del w:id="182" w:author="Arshad Akhtar Abbasia" w:date="2026-10-04T12:00:00Z">
+      <w:del w:id="224" w:author="Arshad Akhtar Abbasia" w:date="2026-10-04T12:00:00Z">
         <w:r>
           <w:delText xml:space="preserve">erasure obligation forbids.</w:delText>
         </w:r>
       </w:del>
-      <w:ins w:id="183" w:author="Arshad Akhtar Abbasia" w:date="2026-10-04T12:00:00Z">
+      <w:ins w:id="225" w:author="Arshad Akhtar Abbasia" w:date="2026-10-04T12:00:00Z">
         <w:r>
           <w:t xml:space="preserve">payload is unreadable.</w:t>
         </w:r>
@@ -5547,12 +5806,12 @@
       <w:r>
         <w:t xml:space="preserve">Established. Both propositions hold on all two hundred generated instances. Proposition 1’s conditional structure is reproduced exactly, including the boundary case of the request falling outside the window. Corollary 1.2 has thirty-nine witnesses in the model: records in which two provisions of one regulation collide over one environment with no data-subject action involved. The infeasibility results survive a separately written exhaustive search that considers every possible accessibility assignment rather than only the trajectory the main checker </w:t>
       </w:r>
-      <w:del w:id="184" w:author="Arshad Akhtar Abbasia" w:date="2026-10-04T12:00:00Z">
+      <w:del w:id="226" w:author="Arshad Akhtar Abbasia" w:date="2026-10-04T12:00:00Z">
         <w:r>
           <w:delText xml:space="preserve">examines. </w:delText>
         </w:r>
       </w:del>
-      <w:ins w:id="185" w:author="Arshad Akhtar Abbasia" w:date="2026-10-04T12:00:00Z">
+      <w:ins w:id="227" w:author="Arshad Akhtar Abbasia" w:date="2026-10-04T12:00:00Z">
         <w:r>
           <w:t xml:space="preserve">examines, and Propositions 1–3 survive a bounded SMT check over every parameter combination within its bounds. </w:t>
         </w:r>
@@ -5669,6 +5928,11 @@
       <w:pPr>
         <w:pStyle w:val="BodyText"/>
       </w:pPr>
+      <w:ins w:id="228" w:author="Arshad Akhtar Abbasia" w:date="2026-10-04T12:00:00Z">
+        <w:r>
+          <w:t xml:space="preserve">Read one way, three obligations cannot be met together. Read another, they can. </w:t>
+        </w:r>
+      </w:ins>
       <w:r>
         <w:t xml:space="preserve">The thesis establishes that the conflict between audit-retention floors and the obligations to erase is not a property of the obligations but of an assumption about what satisfies them. Under plaintext-verifiability semantics, a record is verifiable while its payload is readable, and the constraint system has no solution for any record whose erasure deadline falls inside its retention window. Under a semantics in which a record is verifiable while its accountability content is intact and any loss of payload accessibility is itself logged, grounded, and attributed, the system is satisfiable for every arrival pattern of erasure requests and permit expiries, and for every retention floor. Chapter 4 proves both results; Chapter 5 witnesses them executably, and a separately written exhaustive search confirms that under the first semantics no assignment of payload accessibility whatsoever could succeed.</w:t>
       </w:r>
@@ -5680,7 +5944,7 @@
       <w:r>
         <w:t xml:space="preserve">The request-driven form of the conflict cannot be escaped by moving the record. A deletion ceiling anchored to a location yields to relocation, but the right to erasure attaches to whichever controller holds the data (Chapter 4, Section 4.10, Proposition 4). Cryptographic invalidation is therefore necessary where a data subject’s request meets a retention floor, and in the cross-border pathway that is every request arriving inside the floor, because the </w:t>
       </w:r>
-      <w:ins w:id="186" w:author="Arshad Akhtar Abbasia" w:date="2026-10-04T12:00:00Z">
+      <w:ins w:id="229" w:author="Arshad Akhtar Abbasia" w:date="2026-10-04T12:00:00Z">
         <w:r>
           <w:t xml:space="preserve">IHE </w:t>
         </w:r>
@@ -5688,12 +5952,12 @@
       <w:r>
         <w:t xml:space="preserve">patient-discovery </w:t>
       </w:r>
-      <w:del w:id="187" w:author="Arshad Akhtar Abbasia" w:date="2026-10-04T12:00:00Z">
+      <w:del w:id="230" w:author="Arshad Akhtar Abbasia" w:date="2026-10-04T12:00:00Z">
         <w:r>
           <w:delText xml:space="preserve">transaction puts </w:delText>
         </w:r>
       </w:del>
-      <w:ins w:id="188" w:author="Arshad Akhtar Abbasia" w:date="2026-10-04T12:00:00Z">
+      <w:ins w:id="231" w:author="Arshad Akhtar Abbasia" w:date="2026-10-04T12:00:00Z">
         <w:r>
           <w:t xml:space="preserve">profile requires </w:t>
         </w:r>
@@ -5701,12 +5965,12 @@
       <w:r>
         <w:t xml:space="preserve">the patient’s identifying query </w:t>
       </w:r>
-      <w:del w:id="189" w:author="Arshad Akhtar Abbasia" w:date="2026-10-04T12:00:00Z">
+      <w:del w:id="232" w:author="Arshad Akhtar Abbasia" w:date="2026-10-04T12:00:00Z">
         <w:r>
           <w:delText xml:space="preserve">into </w:delText>
         </w:r>
       </w:del>
-      <w:ins w:id="190" w:author="Arshad Akhtar Abbasia" w:date="2026-10-04T12:00:00Z">
+      <w:ins w:id="233" w:author="Arshad Akhtar Abbasia" w:date="2026-10-04T12:00:00Z">
         <w:r>
           <w:t xml:space="preserve">to be recorded in </w:t>
         </w:r>
@@ -5714,12 +5978,12 @@
       <w:r>
         <w:t xml:space="preserve">the audit </w:t>
       </w:r>
-      <w:del w:id="191" w:author="Arshad Akhtar Abbasia" w:date="2026-10-04T12:00:00Z">
+      <w:del w:id="234" w:author="Arshad Akhtar Abbasia" w:date="2026-10-04T12:00:00Z">
         <w:r>
           <w:delText xml:space="preserve">record by design.</w:delText>
         </w:r>
       </w:del>
-      <w:ins w:id="192" w:author="Arshad Akhtar Abbasia" w:date="2026-10-04T12:00:00Z">
+      <w:ins w:id="235" w:author="Arshad Akhtar Abbasia" w:date="2026-10-04T12:00:00Z">
         <w:r>
           <w:t xml:space="preserve">message.</w:t>
         </w:r>
@@ -5729,12 +5993,12 @@
       <w:pPr>
         <w:pStyle w:val="BodyText"/>
       </w:pPr>
-      <w:del w:id="193" w:author="Arshad Akhtar Abbasia" w:date="2026-10-04T12:00:00Z">
+      <w:del w:id="236" w:author="Arshad Akhtar Abbasia" w:date="2026-10-04T12:00:00Z">
         <w:r>
           <w:delText xml:space="preserve">The sharpest instance is narrower, and </w:delText>
         </w:r>
       </w:del>
-      <w:ins w:id="194" w:author="Arshad Akhtar Abbasia" w:date="2026-10-04T12:00:00Z">
+      <w:ins w:id="237" w:author="Arshad Akhtar Abbasia" w:date="2026-10-04T12:00:00Z">
         <w:r>
           <w:t xml:space="preserve">A conditional extension </w:t>
         </w:r>
@@ -5742,7 +6006,7 @@
       <w:r>
         <w:t xml:space="preserve">rests on one contestable interpretive step. Article 73(1)(e) requires identifiable logs of access to and activity in a Secure Processing Environment to be kept for at least one year. Article 68(12) requires “the electronic health data within the secure processing environment” to be deleted within six months of the expiry of the data permit. Where an environment logs access at patient-record granularity, those log entries are electronic health data within the environment on the broad reading, and where the remaining permit duration at the time a log is written is six months or less, the two requirements overlap with no data subject acting. Chapter 4, Section 4.6 sets out the grounds on both sides. Chapter 5 produced </w:t>
       </w:r>
-      <w:del w:id="195" w:author="Arshad Akhtar Abbasia" w:date="2026-10-04T12:00:00Z">
+      <w:del w:id="238" w:author="Arshad Akhtar Abbasia" w:date="2026-10-04T12:00:00Z">
         <w:r>
           <w:delText xml:space="preserve">thirty-nine </w:delText>
         </w:r>
@@ -5750,12 +6014,12 @@
       <w:r>
         <w:t xml:space="preserve">witnesses of this collision in the </w:t>
       </w:r>
-      <w:del w:id="196" w:author="Arshad Akhtar Abbasia" w:date="2026-10-04T12:00:00Z">
+      <w:del w:id="239" w:author="Arshad Akhtar Abbasia" w:date="2026-10-04T12:00:00Z">
         <w:r>
           <w:delText xml:space="preserve">model, in a population </w:delText>
         </w:r>
       </w:del>
-      <w:ins w:id="197" w:author="Arshad Akhtar Abbasia" w:date="2026-10-04T12:00:00Z">
+      <w:ins w:id="240" w:author="Arshad Akhtar Abbasia" w:date="2026-10-04T12:00:00Z">
         <w:r>
           <w:t xml:space="preserve">model; how many depends on the permit lengths the generator draws, and the count is not an estimate </w:t>
         </w:r>
@@ -5763,12 +6027,12 @@
       <w:r>
         <w:t xml:space="preserve">of </w:t>
       </w:r>
-      <w:del w:id="198" w:author="Arshad Akhtar Abbasia" w:date="2026-10-04T12:00:00Z">
+      <w:del w:id="241" w:author="Arshad Akhtar Abbasia" w:date="2026-10-04T12:00:00Z">
         <w:r>
           <w:delText xml:space="preserve">one hundred Secure Processing Environment records; across the full population of two hundred, cross-border records included, ninety records were infeasible under Semantics I, most of them through erasure requests </w:delText>
         </w:r>
       </w:del>
-      <w:ins w:id="199" w:author="Arshad Akhtar Abbasia" w:date="2026-10-04T12:00:00Z">
+      <w:ins w:id="242" w:author="Arshad Akhtar Abbasia" w:date="2026-10-04T12:00:00Z">
         <w:r>
           <w:t xml:space="preserve">real frequency </w:t>
         </w:r>
@@ -5776,12 +6040,12 @@
       <w:r>
         <w:t xml:space="preserve">(Chapter 5, </w:t>
       </w:r>
-      <w:del w:id="200" w:author="Arshad Akhtar Abbasia" w:date="2026-10-04T12:00:00Z">
+      <w:del w:id="243" w:author="Arshad Akhtar Abbasia" w:date="2026-10-04T12:00:00Z">
         <w:r>
           <w:delText xml:space="preserve">Table 5.3). </w:delText>
         </w:r>
       </w:del>
-      <w:ins w:id="201" w:author="Arshad Akhtar Abbasia" w:date="2026-10-04T12:00:00Z">
+      <w:ins w:id="244" w:author="Arshad Akhtar Abbasia" w:date="2026-10-04T12:00:00Z">
         <w:r>
           <w:t xml:space="preserve">Section 5.4). </w:t>
         </w:r>
@@ -5797,7 +6061,7 @@
       <w:r>
         <w:t xml:space="preserve">Finally, the thesis specifies the mechanism that the feasibility proof exhibits: per-record keys under a key-encrypting key, hiding commitments, deletion of the ciphertext with the key, removal of the subject link at the ceiling, invalidation entries carrying month, legal ground, and authorising actor, a tamper-evident log built never to hold what erasure reaches, and a terminal transition at floor expiry that discharges the storage-limitation obligation on the metadata itself. The artefact executes all of these but the terminal transition, which </w:t>
       </w:r>
-      <w:ins w:id="202" w:author="Arshad Akhtar Abbasia" w:date="2026-10-04T12:00:00Z">
+      <w:ins w:id="245" w:author="Arshad Akhtar Abbasia" w:date="2026-10-04T12:00:00Z">
         <w:r>
           <w:t xml:space="preserve">Chapter 4, </w:t>
         </w:r>
@@ -5805,12 +6069,12 @@
       <w:r>
         <w:t xml:space="preserve">Section 4.8 specifies and the checker does not implement; nor does it implement the per-entry nonce that keeps surviving leaf hashes from confirming </w:t>
       </w:r>
-      <w:del w:id="203" w:author="Arshad Akhtar Abbasia" w:date="2026-10-04T12:00:00Z">
+      <w:del w:id="246" w:author="Arshad Akhtar Abbasia" w:date="2026-10-04T12:00:00Z">
         <w:r>
           <w:delText xml:space="preserve">guesses </w:delText>
         </w:r>
       </w:del>
-      <w:ins w:id="204" w:author="Arshad Akhtar Abbasia" w:date="2026-10-04T12:00:00Z">
+      <w:ins w:id="247" w:author="Arshad Akhtar Abbasia" w:date="2026-10-04T12:00:00Z">
         <w:r>
           <w:t xml:space="preserve">guesses, or the consistency proofs between successive log roots </w:t>
         </w:r>
@@ -5898,7 +6162,7 @@
       <w:r>
         <w:t xml:space="preserve">A second authority question sits beside the first and is narrower. Whether Article 68(12) reaches the access logs is a question of statutory construction that a supervisory authority or, ultimately, a court will settle, and that this author cannot. The thesis states Corollary 1.2 conditionally rather than adopting the broad reading or the narrow one, on the grounds set out in Chapter 4, Section 4.6. What makes this tolerable rather than fatal is that the dependency is confined: Corollary 1.2 stands or falls with it, </w:t>
       </w:r>
-      <w:ins w:id="205" w:author="Arshad Akhtar Abbasia" w:date="2026-10-04T12:00:00Z">
+      <w:ins w:id="248" w:author="Arshad Akhtar Abbasia" w:date="2026-10-04T12:00:00Z">
         <w:r>
           <w:t xml:space="preserve">as does the conditional branch of Corollary 2.3, </w:t>
         </w:r>
@@ -5919,8 +6183,31 @@
       <w:pPr>
         <w:pStyle w:val="BodyText"/>
       </w:pPr>
-      <w:r>
-        <w:t xml:space="preserve">The second objection is the one the thesis has carried since Chapter 2, and it is the ceiling of the contribution.</w:t>
+      <w:del w:id="249" w:author="Arshad Akhtar Abbasia" w:date="2026-10-04T12:00:00Z">
+        <w:r>
+          <w:delText xml:space="preserve">The </w:delText>
+        </w:r>
+      </w:del>
+      <w:ins w:id="250" w:author="Arshad Akhtar Abbasia" w:date="2026-10-04T12:00:00Z">
+        <w:r>
+          <w:t xml:space="preserve">Nobody can watch a key being destroyed. That is the </w:t>
+        </w:r>
+      </w:ins>
+      <w:r>
+        <w:t xml:space="preserve">second </w:t>
+      </w:r>
+      <w:del w:id="251" w:author="Arshad Akhtar Abbasia" w:date="2026-10-04T12:00:00Z">
+        <w:r>
+          <w:delText xml:space="preserve">objection is </w:delText>
+        </w:r>
+      </w:del>
+      <w:ins w:id="252" w:author="Arshad Akhtar Abbasia" w:date="2026-10-04T12:00:00Z">
+        <w:r>
+          <w:t xml:space="preserve">objection, </w:t>
+        </w:r>
+      </w:ins>
+      <w:r>
+        <w:t xml:space="preserve">the one the thesis has carried since Chapter 2, and it is the ceiling of the contribution.</w:t>
       </w:r>
     </w:p>
     <w:p>
@@ -5967,6 +6254,11 @@
       <w:pPr>
         <w:pStyle w:val="BodyText"/>
       </w:pPr>
+      <w:ins w:id="253" w:author="Arshad Akhtar Abbasia" w:date="2026-10-04T12:00:00Z">
+        <w:r>
+          <w:t xml:space="preserve">Per-record keys cost something, and the question is whether the cost is worth paying. </w:t>
+        </w:r>
+      </w:ins>
       <w:r>
         <w:t xml:space="preserve">SecuPi (2025) argues that cryptographic erasure introduces operational complexity in row-level encryption scenarios, that auditable key management adds rather than removes overhead, and that policy-based access control is a better answer to the right to erasure in heavily distributed systems. This critique is substantially correct on its own terms and must be engaged rather than dismissed.</w:t>
       </w:r>
@@ -6071,6 +6363,11 @@
       <w:pPr>
         <w:pStyle w:val="BodyText"/>
       </w:pPr>
+      <w:ins w:id="254" w:author="Arshad Akhtar Abbasia" w:date="2026-10-04T12:00:00Z">
+        <w:r>
+          <w:t xml:space="preserve">A model can be right and still be refused by the people who would have to run it. </w:t>
+        </w:r>
+      </w:ins>
       <w:r>
         <w:t xml:space="preserve">The evaluation reported in this thesis is analytical, and Section 3.7 states its criteria. That evaluation assesses whether the artefact is internally coherent, whether it fits the infrastructure it was designed against, and whether its results reproduce. It does not assess whether the people who would have to deploy it find it defensible, implementable, or trustworthy, and those are different questions that analytical evaluation cannot answer.</w:t>
       </w:r>
@@ -6111,6 +6408,11 @@
       <w:pPr>
         <w:pStyle w:val="BodyText"/>
       </w:pPr>
+      <w:ins w:id="255" w:author="Arshad Akhtar Abbasia" w:date="2026-10-04T12:00:00Z">
+        <w:r>
+          <w:t xml:space="preserve">The patients in this thesis do not exist, and no result depends on who they are. </w:t>
+        </w:r>
+      </w:ins>
       <w:r>
         <w:t xml:space="preserve">Substituting real FHIR R4 resources for constructed payload strings changed all two hundred commitments and no reported figure (Chapter 5, Section 5.8, Table 5.7), as it must, since no constraint in the TRF Model reads payload content.</w:t>
       </w:r>
@@ -6130,12 +6432,12 @@
       <w:r>
         <w:t xml:space="preserve">The deeper limitation is that a demonstration over generated instances is not a proof over all instances. The general claims rest on the arguments in Chapter 4, and those arguments are informal rather than machine-checked. The executable </w:t>
       </w:r>
-      <w:del w:id="206" w:author="Arshad Akhtar Abbasia" w:date="2026-10-04T12:00:00Z">
+      <w:del w:id="256" w:author="Arshad Akhtar Abbasia" w:date="2026-10-04T12:00:00Z">
         <w:r>
           <w:delText xml:space="preserve">check and </w:delText>
         </w:r>
       </w:del>
-      <w:ins w:id="207" w:author="Arshad Akhtar Abbasia" w:date="2026-10-04T12:00:00Z">
+      <w:ins w:id="257" w:author="Arshad Akhtar Abbasia" w:date="2026-10-04T12:00:00Z">
         <w:r>
           <w:t xml:space="preserve">check, </w:t>
         </w:r>
@@ -6143,7 +6445,7 @@
       <w:r>
         <w:t xml:space="preserve">the exhaustive cross-check </w:t>
       </w:r>
-      <w:ins w:id="208" w:author="Arshad Akhtar Abbasia" w:date="2026-10-04T12:00:00Z">
+      <w:ins w:id="258" w:author="Arshad Akhtar Abbasia" w:date="2026-10-04T12:00:00Z">
         <w:r>
           <w:t xml:space="preserve">and the bounded SMT check </w:t>
         </w:r>
@@ -6151,12 +6453,12 @@
       <w:r>
         <w:t xml:space="preserve">reduce the probability that an error in the proofs has gone unnoticed; they do not eliminate </w:t>
       </w:r>
-      <w:del w:id="209" w:author="Arshad Akhtar Abbasia" w:date="2026-10-04T12:00:00Z">
+      <w:del w:id="259" w:author="Arshad Akhtar Abbasia" w:date="2026-10-04T12:00:00Z">
         <w:r>
           <w:delText xml:space="preserve">it.</w:delText>
         </w:r>
       </w:del>
-      <w:ins w:id="210" w:author="Arshad Akhtar Abbasia" w:date="2026-10-04T12:00:00Z">
+      <w:ins w:id="260" w:author="Arshad Akhtar Abbasia" w:date="2026-10-04T12:00:00Z">
         <w:r>
           <w:t xml:space="preserve">it, and none of them can show that the constraints translate the law.</w:t>
         </w:r>
@@ -6174,6 +6476,11 @@
       <w:pPr>
         <w:pStyle w:val="BodyText"/>
       </w:pPr>
+      <w:ins w:id="261" w:author="Arshad Akhtar Abbasia" w:date="2026-10-04T12:00:00Z">
+        <w:r>
+          <w:t xml:space="preserve">The provisions that create this collision do not yet apply, and that is the opportunity. </w:t>
+        </w:r>
+      </w:ins>
       <w:r>
         <w:t xml:space="preserve">The timing argument is the strongest claim to practical relevance this thesis makes.</w:t>
       </w:r>
@@ -6358,10 +6665,10 @@
       <w:pPr>
         <w:pStyle w:val="BodyText"/>
         <w:rPr>
-          <w:ins w:id="211" w:author="Arshad Akhtar Abbasia" w:date="2026-10-04T12:00:00Z"/>
+          <w:ins w:id="262" w:author="Arshad Akhtar Abbasia" w:date="2026-10-04T12:00:00Z"/>
         </w:rPr>
       </w:pPr>
-      <w:ins w:id="212" w:author="Arshad Akhtar Abbasia" w:date="2026-10-04T12:00:00Z">
+      <w:ins w:id="263" w:author="Arshad Akhtar Abbasia" w:date="2026-10-04T12:00:00Z">
         <w:r>
           <w:t xml:space="preserve">The limitations that bound the claim are stated once, in Chapter 3, Section 3.7, and engaged where they bite. None of them was claimed, so none of them reduces what was: a contribution that states its boundaries can be checked at them.</w:t>
         </w:r>
@@ -6371,10 +6678,10 @@
       <w:pPr>
         <w:pStyle w:val="BodyText"/>
         <w:rPr>
-          <w:del w:id="213" w:author="Arshad Akhtar Abbasia" w:date="2026-10-04T12:00:00Z"/>
+          <w:del w:id="264" w:author="Arshad Akhtar Abbasia" w:date="2026-10-04T12:00:00Z"/>
         </w:rPr>
       </w:pPr>
-      <w:del w:id="214" w:author="Arshad Akhtar Abbasia" w:date="2026-10-04T12:00:00Z">
+      <w:del w:id="265" w:author="Arshad Akhtar Abbasia" w:date="2026-10-04T12:00:00Z">
         <w:r>
           <w:delText xml:space="preserve">The thesis makes one bounded claim and prices every limitation into it in advance. The proofs are informal, not machine-checked. The demonstration covers generated instances under one seed, not all instances. Key destruction is simulated in program state and says nothing about deployment assurance. The synthetic records carry US Core profiles, not Norwegian ones. The cryptographic primitives are established technique, not novel construction. The closest prior art is a patent claiming key-expiry selection for retention-purge conflicts, disclosed and distinguished (Chapter 2, Section 2.4; Chapter 4, Section 4.10). The interpretive move at the centre of the thesis is an argument without authority behind it. None of these was claimed, so none of them reduces what was: a contribution that states its boundaries can be checked at them.</w:delText>
         </w:r>
@@ -6393,14 +6700,66 @@
         <w:pStyle w:val="BodyText"/>
       </w:pPr>
       <w:r>
-        <w:t xml:space="preserve">The thesis establishes that audit-retention floors, the right to erasure and the deletion ceiling conflict only under an assumption about verifiability, and not because of the obligations themselves; that, on the broad reading of Article 68(12) and for logs kept at patient-record granularity, the conflict arises inside the European Health Data Space Regulation with no data subject acting; that a ceiling collides with a floor exactly when Proposition 3 says, and that relocation escapes the ceiling but not the right (Proposition 4). It exhibits the mechanism that dissolves the conflict and </w:t>
-      </w:r>
-      <w:del w:id="215" w:author="Arshad Akhtar Abbasia" w:date="2026-10-04T12:00:00Z">
+        <w:t xml:space="preserve">The thesis establishes </w:t>
+      </w:r>
+      <w:del w:id="266" w:author="Arshad Akhtar Abbasia" w:date="2026-10-04T12:00:00Z">
+        <w:r>
+          <w:delText xml:space="preserve">that audit-retention </w:delText>
+        </w:r>
+      </w:del>
+      <w:ins w:id="267" w:author="Arshad Akhtar Abbasia" w:date="2026-10-04T12:00:00Z">
+        <w:r>
+          <w:t xml:space="preserve">four things. Audit-retention </w:t>
+        </w:r>
+      </w:ins>
+      <w:r>
+        <w:t xml:space="preserve">floors, the right to erasure and the deletion ceiling conflict only under an assumption about verifiability, and not because of the obligations </w:t>
+      </w:r>
+      <w:del w:id="268" w:author="Arshad Akhtar Abbasia" w:date="2026-10-04T12:00:00Z">
+        <w:r>
+          <w:delText xml:space="preserve">themselves; that, on </w:delText>
+        </w:r>
+      </w:del>
+      <w:ins w:id="269" w:author="Arshad Akhtar Abbasia" w:date="2026-10-04T12:00:00Z">
+        <w:r>
+          <w:t xml:space="preserve">themselves. On </w:t>
+        </w:r>
+      </w:ins>
+      <w:r>
+        <w:t xml:space="preserve">the broad reading of Article 68(12) and for logs kept at patient-record granularity, the conflict arises inside the European Health Data Space Regulation with no data subject </w:t>
+      </w:r>
+      <w:del w:id="270" w:author="Arshad Akhtar Abbasia" w:date="2026-10-04T12:00:00Z">
+        <w:r>
+          <w:delText xml:space="preserve">acting; that a </w:delText>
+        </w:r>
+      </w:del>
+      <w:ins w:id="271" w:author="Arshad Akhtar Abbasia" w:date="2026-10-04T12:00:00Z">
+        <w:r>
+          <w:t xml:space="preserve">acting. A </w:t>
+        </w:r>
+      </w:ins>
+      <w:r>
+        <w:t xml:space="preserve">ceiling collides with a floor exactly when Proposition 3 </w:t>
+      </w:r>
+      <w:del w:id="272" w:author="Arshad Akhtar Abbasia" w:date="2026-10-04T12:00:00Z">
+        <w:r>
+          <w:delText xml:space="preserve">says, and that </w:delText>
+        </w:r>
+      </w:del>
+      <w:ins w:id="273" w:author="Arshad Akhtar Abbasia" w:date="2026-10-04T12:00:00Z">
+        <w:r>
+          <w:t xml:space="preserve">says. And </w:t>
+        </w:r>
+      </w:ins>
+      <w:r>
+        <w:t xml:space="preserve">relocation escapes the ceiling but not the right (Proposition 4). It exhibits the mechanism that dissolves the conflict and </w:t>
+      </w:r>
+      <w:del w:id="274" w:author="Arshad Akhtar Abbasia" w:date="2026-10-04T12:00:00Z">
         <w:r>
           <w:delText xml:space="preserve">demonstrates </w:delText>
         </w:r>
       </w:del>
-      <w:ins w:id="216" w:author="Arshad Akhtar Abbasia" w:date="2026-10-04T12:00:00Z">
+      <w:ins w:id="275" w:author="Arshad Akhtar Abbasia" w:date="2026-10-04T12:00:00Z">
         <w:r>
           <w:t xml:space="preserve">checks </w:t>
         </w:r>
@@ -6408,12 +6767,12 @@
       <w:r>
         <w:t xml:space="preserve">Propositions 1 and 2 </w:t>
       </w:r>
-      <w:del w:id="217" w:author="Arshad Akhtar Abbasia" w:date="2026-10-04T12:00:00Z">
+      <w:del w:id="276" w:author="Arshad Akhtar Abbasia" w:date="2026-10-04T12:00:00Z">
         <w:r>
           <w:delText xml:space="preserve">executably </w:delText>
         </w:r>
       </w:del>
-      <w:ins w:id="218" w:author="Arshad Akhtar Abbasia" w:date="2026-10-04T12:00:00Z">
+      <w:ins w:id="277" w:author="Arshad Akhtar Abbasia" w:date="2026-10-04T12:00:00Z">
         <w:r>
           <w:t xml:space="preserve">executably, </w:t>
         </w:r>
@@ -6421,12 +6780,12 @@
       <w:r>
         <w:t xml:space="preserve">with </w:t>
       </w:r>
-      <w:del w:id="219" w:author="Arshad Akhtar Abbasia" w:date="2026-10-04T12:00:00Z">
+      <w:del w:id="278" w:author="Arshad Akhtar Abbasia" w:date="2026-10-04T12:00:00Z">
         <w:r>
           <w:delText xml:space="preserve">an independent cross-check.</w:delText>
         </w:r>
       </w:del>
-      <w:ins w:id="220" w:author="Arshad Akhtar Abbasia" w:date="2026-10-04T12:00:00Z">
+      <w:ins w:id="279" w:author="Arshad Akhtar Abbasia" w:date="2026-10-04T12:00:00Z">
         <w:r>
           <w:t xml:space="preserve">a separately written cross-check and a bounded SMT check.</w:t>
         </w:r>
@@ -6487,7 +6846,7 @@
       <w:r>
         <w:t xml:space="preserve">It formalised the conflict as the Tri-Lateral Retention Feasibility Model, a constraint-satisfaction problem over a single binary variable per record: the accessibility of its </w:t>
       </w:r>
-      <w:del w:id="221" w:author="Arshad Akhtar Abbasia" w:date="2026-10-04T12:00:00Z">
+      <w:del w:id="280" w:author="Arshad Akhtar Abbasia" w:date="2026-10-04T12:00:00Z">
         <w:r>
           <w:delText xml:space="preserve">personal-data </w:delText>
         </w:r>
@@ -6503,12 +6862,12 @@
       <w:r>
         <w:t xml:space="preserve">It proved four results within that model. Under plaintext-verifiability semantics, in which a record is verifiable while its payload remains readable, the constraint system is infeasible whenever an erasure deadline or a ceiling deadline falls inside a retention window. Under accountability-preserving semantics, in which a record is verifiable while its metadata is intact, its commitment survives, and any loss of payload accessibility is itself logged and attributed, the system is jointly satisfiable for every arrival pattern of erasure requests and permit expiries and for every floor parameter. A deletion ceiling </w:t>
       </w:r>
-      <w:del w:id="222" w:author="Arshad Akhtar Abbasia" w:date="2026-10-04T12:00:00Z">
+      <w:del w:id="281" w:author="Arshad Akhtar Abbasia" w:date="2026-10-04T12:00:00Z">
         <w:r>
           <w:delText xml:space="preserve">collides </w:delText>
         </w:r>
       </w:del>
-      <w:ins w:id="223" w:author="Arshad Akhtar Abbasia" w:date="2026-10-04T12:00:00Z">
+      <w:ins w:id="282" w:author="Arshad Akhtar Abbasia" w:date="2026-10-04T12:00:00Z">
         <w:r>
           <w:t xml:space="preserve">can collide </w:t>
         </w:r>
@@ -6516,12 +6875,12 @@
       <w:r>
         <w:t xml:space="preserve">with a retention floor </w:t>
       </w:r>
-      <w:del w:id="224" w:author="Arshad Akhtar Abbasia" w:date="2026-10-04T12:00:00Z">
+      <w:del w:id="283" w:author="Arshad Akhtar Abbasia" w:date="2026-10-04T12:00:00Z">
         <w:r>
           <w:delText xml:space="preserve">exactly when </w:delText>
         </w:r>
       </w:del>
-      <w:ins w:id="225" w:author="Arshad Akhtar Abbasia" w:date="2026-10-04T12:00:00Z">
+      <w:ins w:id="284" w:author="Arshad Akhtar Abbasia" w:date="2026-10-04T12:00:00Z">
         <w:r>
           <w:t xml:space="preserve">only if </w:t>
         </w:r>
@@ -6537,12 +6896,12 @@
       <w:r>
         <w:t xml:space="preserve">It specified the mechanism that the second proof exhibits. Crypto-Erasure by Invalidation retains the accessor fields of each record and a hiding commitment, and destroys the per-record payload key, with the salt and the ciphertext, at the earlier of the erasure deadline and the deletion ceiling; for logs kept at patient-record granularity it removes the subject link at the </w:t>
       </w:r>
-      <w:del w:id="226" w:author="Arshad Akhtar Abbasia" w:date="2026-10-04T12:00:00Z">
+      <w:del w:id="285" w:author="Arshad Akhtar Abbasia" w:date="2026-10-04T12:00:00Z">
         <w:r>
           <w:delText xml:space="preserve">ceiling. </w:delText>
         </w:r>
       </w:del>
-      <w:ins w:id="227" w:author="Arshad Akhtar Abbasia" w:date="2026-10-04T12:00:00Z">
+      <w:ins w:id="286" w:author="Arshad Akhtar Abbasia" w:date="2026-10-04T12:00:00Z">
         <w:r>
           <w:t xml:space="preserve">ceiling, while cross-border records keep it, for at least the period the person’s right to learn who accessed their data requires and, on the deployment binding, for the rest of the floor. </w:t>
         </w:r>
@@ -6550,12 +6909,12 @@
       <w:r>
         <w:t xml:space="preserve">It appends each invalidation to a tamper-evident audit log as a first-class event carrying its month, legal ground, and authorising actor, in a log whose entries never hold what erasure reaches. At floor expiry it performs a terminal transition that destroys the identifying metadata and leaves a non-identifiable statistical </w:t>
       </w:r>
-      <w:del w:id="228" w:author="Arshad Akhtar Abbasia" w:date="2026-10-04T12:00:00Z">
+      <w:del w:id="287" w:author="Arshad Akhtar Abbasia" w:date="2026-10-04T12:00:00Z">
         <w:r>
           <w:delText xml:space="preserve">residue.</w:delText>
         </w:r>
       </w:del>
-      <w:ins w:id="229" w:author="Arshad Akhtar Abbasia" w:date="2026-10-04T12:00:00Z">
+      <w:ins w:id="288" w:author="Arshad Akhtar Abbasia" w:date="2026-10-04T12:00:00Z">
         <w:r>
           <w:t xml:space="preserve">residue; that transition, the per-entry nonce, consistency proofs and the accumulator layer are specified, not implemented.</w:t>
         </w:r>
@@ -6600,12 +6959,12 @@
       <w:r>
         <w:t xml:space="preserve">Feasibility results with an executable witness. Proposition 1 establishes infeasibility under plaintext-verifiability semantics; Proposition 2 establishes satisfiability under the alternative and exhibits the trajectory that achieves it. Proposition 3 gives the condition under which a ceiling and a floor collide, which the cross-sector test of Chapter 6, Section 6.10 </w:t>
       </w:r>
-      <w:del w:id="230" w:author="Arshad Akhtar Abbasia" w:date="2026-10-04T12:00:00Z">
+      <w:del w:id="289" w:author="Arshad Akhtar Abbasia" w:date="2026-10-04T12:00:00Z">
         <w:r>
           <w:delText xml:space="preserve">confirmed </w:delText>
         </w:r>
       </w:del>
-      <w:ins w:id="231" w:author="Arshad Akhtar Abbasia" w:date="2026-10-04T12:00:00Z">
+      <w:ins w:id="290" w:author="Arshad Akhtar Abbasia" w:date="2026-10-04T12:00:00Z">
         <w:r>
           <w:t xml:space="preserve">illustrated </w:t>
         </w:r>
@@ -6613,12 +6972,12 @@
       <w:r>
         <w:t xml:space="preserve">on a statute outside </w:t>
       </w:r>
-      <w:del w:id="232" w:author="Arshad Akhtar Abbasia" w:date="2026-10-04T12:00:00Z">
+      <w:del w:id="291" w:author="Arshad Akhtar Abbasia" w:date="2026-10-04T12:00:00Z">
         <w:r>
           <w:delText xml:space="preserve">health; </w:delText>
         </w:r>
       </w:del>
-      <w:ins w:id="233" w:author="Arshad Akhtar Abbasia" w:date="2026-10-04T12:00:00Z">
+      <w:ins w:id="292" w:author="Arshad Akhtar Abbasia" w:date="2026-10-04T12:00:00Z">
         <w:r>
           <w:t xml:space="preserve">health (an instance generated by the thesis’s own code, which checks the code rather than independently confirming the proposition); </w:t>
         </w:r>
@@ -6626,12 +6985,12 @@
       <w:r>
         <w:t xml:space="preserve">Proposition 4 shows why relocation answers the ceiling and not the right. Both were </w:t>
       </w:r>
-      <w:del w:id="234" w:author="Arshad Akhtar Abbasia" w:date="2026-10-04T12:00:00Z">
+      <w:del w:id="293" w:author="Arshad Akhtar Abbasia" w:date="2026-10-04T12:00:00Z">
         <w:r>
           <w:delText xml:space="preserve">demonstrated </w:delText>
         </w:r>
       </w:del>
-      <w:ins w:id="235" w:author="Arshad Akhtar Abbasia" w:date="2026-10-04T12:00:00Z">
+      <w:ins w:id="294" w:author="Arshad Akhtar Abbasia" w:date="2026-10-04T12:00:00Z">
         <w:r>
           <w:t xml:space="preserve">checked </w:t>
         </w:r>
@@ -6639,7 +6998,7 @@
       <w:r>
         <w:t xml:space="preserve">over two hundred </w:t>
       </w:r>
-      <w:ins w:id="236" w:author="Arshad Akhtar Abbasia" w:date="2026-10-04T12:00:00Z">
+      <w:ins w:id="295" w:author="Arshad Akhtar Abbasia" w:date="2026-10-04T12:00:00Z">
         <w:r>
           <w:t xml:space="preserve">generated </w:t>
         </w:r>
@@ -6647,12 +7006,12 @@
       <w:r>
         <w:t xml:space="preserve">records, </w:t>
       </w:r>
-      <w:del w:id="237" w:author="Arshad Akhtar Abbasia" w:date="2026-10-04T12:00:00Z">
+      <w:del w:id="296" w:author="Arshad Akhtar Abbasia" w:date="2026-10-04T12:00:00Z">
         <w:r>
           <w:delText xml:space="preserve">producing ninety infeasible records and ninety-five </w:delText>
         </w:r>
       </w:del>
-      <w:ins w:id="238" w:author="Arshad Akhtar Abbasia" w:date="2026-10-04T12:00:00Z">
+      <w:ins w:id="297" w:author="Arshad Akhtar Abbasia" w:date="2026-10-04T12:00:00Z">
         <w:r>
           <w:t xml:space="preserve">with </w:t>
         </w:r>
@@ -6660,12 +7019,12 @@
       <w:r>
         <w:t xml:space="preserve">violations under the first semantics and none under the </w:t>
       </w:r>
-      <w:del w:id="239" w:author="Arshad Akhtar Abbasia" w:date="2026-10-04T12:00:00Z">
+      <w:del w:id="298" w:author="Arshad Akhtar Abbasia" w:date="2026-10-04T12:00:00Z">
         <w:r>
           <w:delText xml:space="preserve">second, with </w:delText>
         </w:r>
       </w:del>
-      <w:ins w:id="240" w:author="Arshad Akhtar Abbasia" w:date="2026-10-04T12:00:00Z">
+      <w:ins w:id="299" w:author="Arshad Akhtar Abbasia" w:date="2026-10-04T12:00:00Z">
         <w:r>
           <w:t xml:space="preserve">second (their number is set by the generator), </w:t>
         </w:r>
@@ -6673,12 +7032,12 @@
       <w:r>
         <w:t xml:space="preserve">a separately written exhaustive search </w:t>
       </w:r>
-      <w:del w:id="241" w:author="Arshad Akhtar Abbasia" w:date="2026-10-04T12:00:00Z">
+      <w:del w:id="300" w:author="Arshad Akhtar Abbasia" w:date="2026-10-04T12:00:00Z">
         <w:r>
           <w:delText xml:space="preserve">confirming </w:delText>
         </w:r>
       </w:del>
-      <w:ins w:id="242" w:author="Arshad Akhtar Abbasia" w:date="2026-10-04T12:00:00Z">
+      <w:ins w:id="301" w:author="Arshad Akhtar Abbasia" w:date="2026-10-04T12:00:00Z">
         <w:r>
           <w:t xml:space="preserve">confirmed </w:t>
         </w:r>
@@ -6686,12 +7045,12 @@
       <w:r>
         <w:t xml:space="preserve">that under the first semantics no assignment of payload accessibility </w:t>
       </w:r>
-      <w:del w:id="243" w:author="Arshad Akhtar Abbasia" w:date="2026-10-04T12:00:00Z">
+      <w:del w:id="302" w:author="Arshad Akhtar Abbasia" w:date="2026-10-04T12:00:00Z">
         <w:r>
           <w:delText xml:space="preserve">whatsoever succeeds. </w:delText>
         </w:r>
       </w:del>
-      <w:ins w:id="244" w:author="Arshad Akhtar Abbasia" w:date="2026-10-04T12:00:00Z">
+      <w:ins w:id="303" w:author="Arshad Akhtar Abbasia" w:date="2026-10-04T12:00:00Z">
         <w:r>
           <w:t xml:space="preserve">succeeds in the cases it covers, and a bounded SMT check found no counterexample to Propositions 1–3 within its bounds. </w:t>
         </w:r>
@@ -6771,12 +7130,12 @@
       <w:r>
         <w:t xml:space="preserve">The second concerns scope: whether Article 68(12), which requires “the electronic health data within the secure processing environment” to be deleted within six months of permit expiry, reaches, on the broad reading, access logs kept at patient-record granularity (Chapter 4, Section 4.6). Corollary 1.2 stands or falls with this question, </w:t>
       </w:r>
-      <w:del w:id="245" w:author="Arshad Akhtar Abbasia" w:date="2026-10-04T12:00:00Z">
+      <w:del w:id="304" w:author="Arshad Akhtar Abbasia" w:date="2026-10-04T12:00:00Z">
         <w:r>
           <w:delText xml:space="preserve">and </w:delText>
         </w:r>
       </w:del>
-      <w:ins w:id="246" w:author="Arshad Akhtar Abbasia" w:date="2026-10-04T12:00:00Z">
+      <w:ins w:id="305" w:author="Arshad Akhtar Abbasia" w:date="2026-10-04T12:00:00Z">
         <w:r>
           <w:t xml:space="preserve">as does the conditional branch of Corollary 2.3; </w:t>
         </w:r>
@@ -6824,12 +7183,12 @@
       <w:r>
         <w:t xml:space="preserve">Selective disclosure of invalidation completeness. The mechanism creates a problem it does not solve. When a data subject exercises Article 17, every record relating to them is invalidated, and an auditor should be able to confirm that all of them were. But identifying which records those are </w:t>
       </w:r>
-      <w:del w:id="247" w:author="Arshad Akhtar Abbasia" w:date="2026-10-04T12:00:00Z">
+      <w:del w:id="306" w:author="Arshad Akhtar Abbasia" w:date="2026-10-04T12:00:00Z">
         <w:r>
           <w:delText xml:space="preserve">reveals </w:delText>
         </w:r>
       </w:del>
-      <w:ins w:id="248" w:author="Arshad Akhtar Abbasia" w:date="2026-10-04T12:00:00Z">
+      <w:ins w:id="307" w:author="Arshad Akhtar Abbasia" w:date="2026-10-04T12:00:00Z">
         <w:r>
           <w:t xml:space="preserve">would show the auditor </w:t>
         </w:r>
@@ -6837,12 +7196,12 @@
       <w:r>
         <w:t xml:space="preserve">the subject’s cross-border care </w:t>
       </w:r>
-      <w:del w:id="249" w:author="Arshad Akhtar Abbasia" w:date="2026-10-04T12:00:00Z">
+      <w:del w:id="308" w:author="Arshad Akhtar Abbasia" w:date="2026-10-04T12:00:00Z">
         <w:r>
           <w:delText xml:space="preserve">history, which </w:delText>
         </w:r>
       </w:del>
-      <w:ins w:id="250" w:author="Arshad Akhtar Abbasia" w:date="2026-10-04T12:00:00Z">
+      <w:ins w:id="309" w:author="Arshad Akhtar Abbasia" w:date="2026-10-04T12:00:00Z">
         <w:r>
           <w:t xml:space="preserve">history. The controller keeps the link to those records (Chapter 4, Section 4.2); the problem </w:t>
         </w:r>
@@ -6850,12 +7209,12 @@
       <w:r>
         <w:t xml:space="preserve">is </w:t>
       </w:r>
-      <w:del w:id="251" w:author="Arshad Akhtar Abbasia" w:date="2026-10-04T12:00:00Z">
+      <w:del w:id="310" w:author="Arshad Akhtar Abbasia" w:date="2026-10-04T12:00:00Z">
         <w:r>
           <w:delText xml:space="preserve">precisely what the erasure was meant </w:delText>
         </w:r>
       </w:del>
-      <w:ins w:id="252" w:author="Arshad Akhtar Abbasia" w:date="2026-10-04T12:00:00Z">
+      <w:ins w:id="311" w:author="Arshad Akhtar Abbasia" w:date="2026-10-04T12:00:00Z">
         <w:r>
           <w:t xml:space="preserve">disclosing it </w:t>
         </w:r>
@@ -6863,12 +7222,12 @@
       <w:r>
         <w:t xml:space="preserve">to </w:t>
       </w:r>
-      <w:del w:id="253" w:author="Arshad Akhtar Abbasia" w:date="2026-10-04T12:00:00Z">
+      <w:del w:id="312" w:author="Arshad Akhtar Abbasia" w:date="2026-10-04T12:00:00Z">
         <w:r>
           <w:delText xml:space="preserve">protect. </w:delText>
         </w:r>
       </w:del>
-      <w:ins w:id="254" w:author="Arshad Akhtar Abbasia" w:date="2026-10-04T12:00:00Z">
+      <w:ins w:id="313" w:author="Arshad Akhtar Abbasia" w:date="2026-10-04T12:00:00Z">
         <w:r>
           <w:t xml:space="preserve">a third party in order to prove completeness. </w:t>
         </w:r>
@@ -6876,7 +7235,7 @@
       <w:r>
         <w:t xml:space="preserve">Proving completeness of invalidation without revealing the invalidated set is a zero-knowledge problem, and it corresponds to the fourth of the five open problems identified by Aikebaier (2026), composition with zero-knowledge selective disclosure. This is where succinct arguments </w:t>
       </w:r>
-      <w:ins w:id="255" w:author="Arshad Akhtar Abbasia" w:date="2026-10-04T12:00:00Z">
+      <w:ins w:id="314" w:author="Arshad Akhtar Abbasia" w:date="2026-10-04T12:00:00Z">
         <w:r>
           <w:t xml:space="preserve">may </w:t>
         </w:r>
@@ -6884,12 +7243,12 @@
       <w:r>
         <w:t xml:space="preserve">become necessary rather than decorative, and the audit log of Chapter 4, Section 4.8 gives the problem a concrete form. If each leaf also carried a hiding commitment to its record’s subject link, a circuit taking the published root as its public input could prove that every leaf committed to a given subject is matched by an invalidation leaf, while revealing neither the leaves nor their number. Pairing-based arguments give proofs of constant size (Groth, 2016), and universal-setup systems avoid a trusted setup per circuit (Gabizon, Williamson, &amp; Ciobotaru, 2019); which suits a regulator who must verify without trusting the controller is a design question for that work. The project name carried by this work originates in an earlier design that assumed zero-knowledge machinery would enforce the retention conflict; the analysis showed it unnecessary there, and </w:t>
       </w:r>
-      <w:del w:id="256" w:author="Arshad Akhtar Abbasia" w:date="2026-10-04T12:00:00Z">
+      <w:del w:id="315" w:author="Arshad Akhtar Abbasia" w:date="2026-10-04T12:00:00Z">
         <w:r>
           <w:delText xml:space="preserve">shows </w:delText>
         </w:r>
       </w:del>
-      <w:ins w:id="257" w:author="Arshad Akhtar Abbasia" w:date="2026-10-04T12:00:00Z">
+      <w:ins w:id="316" w:author="Arshad Akhtar Abbasia" w:date="2026-10-04T12:00:00Z">
         <w:r>
           <w:t xml:space="preserve">suggests </w:t>
         </w:r>
@@ -6897,12 +7256,12 @@
       <w:r>
         <w:t xml:space="preserve">it </w:t>
       </w:r>
-      <w:del w:id="258" w:author="Arshad Akhtar Abbasia" w:date="2026-10-04T12:00:00Z">
+      <w:del w:id="317" w:author="Arshad Akhtar Abbasia" w:date="2026-10-04T12:00:00Z">
         <w:r>
           <w:delText xml:space="preserve">unavoidable here.</w:delText>
         </w:r>
       </w:del>
-      <w:ins w:id="259" w:author="Arshad Akhtar Abbasia" w:date="2026-10-04T12:00:00Z">
+      <w:ins w:id="318" w:author="Arshad Akhtar Abbasia" w:date="2026-10-04T12:00:00Z">
         <w:r>
           <w:t xml:space="preserve">may be necessary here, though alternatives are not excluded.</w:t>
         </w:r>

</xml_diff>

<commit_message>
B-49: public repo R-28 pushed; CHECKSUMS regenerated; documents rebuilt
Co-Authored-By: Claude Opus 5.5 <noreply@anthropic.com>
Claude-Session: https://claude.ai/code/session_01NcQq1nsLTRuJVxEX8DbgE6
</commit_message>
<xml_diff>
--- a/VERA-SNARK_Thesis_TRACKED_vs_4Oct.docx
+++ b/VERA-SNARK_Thesis_TRACKED_vs_4Oct.docx
@@ -15,7 +15,7 @@
         <w:pStyle w:val="BodyText"/>
       </w:pPr>
       <w:r>
-        <w:t xml:space="preserve">Every change to the front matter and Chapters 1–7 is shown as a tracked insertion or deletion (Review → Track Changes → All Markup). Appendices and the reference list are regenerated from the code and the chapter lists and are not compared here. Tables and equations are compared as text; the formatted thesis is the separate file VERA-SNARK_Thesis_SUBMISSION.docx. Paragraphs unchanged: 592; revised: 64; new: 19; removed: 5.</w:t>
+        <w:t xml:space="preserve">Every change to the front matter and Chapters 1–7 is shown as a tracked insertion or deletion (Review → Track Changes → All Markup). Appendices and the reference list are regenerated from the code and the chapter lists and are not compared here. Tables and equations are compared as text; the formatted thesis is the separate file VERA-SNARK_Thesis_SUBMISSION.docx. Paragraphs unchanged: 583; revised: 72; new: 27; removed: 6.</w:t>
       </w:r>
     </w:p>
     <w:p>
@@ -989,33 +989,38 @@
       </w:r>
       <w:del w:id="40" w:author="Arshad Akhtar Abbasia" w:date="2026-10-04T12:00:00Z">
         <w:r>
-          <w:delText xml:space="preserve">pathway, </w:delText>
+          <w:delText xml:space="preserve">pathway, and </w:delText>
         </w:r>
       </w:del>
       <w:ins w:id="41" w:author="Arshad Akhtar Abbasia" w:date="2026-10-04T12:00:00Z">
         <w:r>
-          <w:t xml:space="preserve">pathway through erasure requests, </w:t>
-        </w:r>
-      </w:ins>
-      <w:r>
-        <w:t xml:space="preserve">and </w:t>
-      </w:r>
-      <w:ins w:id="42" w:author="Arshad Akhtar Abbasia" w:date="2026-10-04T12:00:00Z">
-        <w:r>
-          <w:t xml:space="preserve">on one reading of Article 68(12) it arises </w:t>
+          <w:t xml:space="preserve">pathway through erasure requests, and, as a conditional extension, it arises </w:t>
         </w:r>
       </w:ins>
       <w:r>
         <w:t xml:space="preserve">there </w:t>
       </w:r>
-      <w:del w:id="43" w:author="Arshad Akhtar Abbasia" w:date="2026-10-04T12:00:00Z">
-        <w:r>
-          <w:delText xml:space="preserve">it is at its sharpest. </w:delText>
-        </w:r>
-      </w:del>
-      <w:ins w:id="44" w:author="Arshad Akhtar Abbasia" w:date="2026-10-04T12:00:00Z">
-        <w:r>
-          <w:t xml:space="preserve">even without them. </w:t>
+      <w:del w:id="42" w:author="Arshad Akhtar Abbasia" w:date="2026-10-04T12:00:00Z">
+        <w:r>
+          <w:delText xml:space="preserve">it is </w:delText>
+        </w:r>
+      </w:del>
+      <w:ins w:id="43" w:author="Arshad Akhtar Abbasia" w:date="2026-10-04T12:00:00Z">
+        <w:r>
+          <w:t xml:space="preserve">even without them: on the broad reading of Article 68(12), for logs kept </w:t>
+        </w:r>
+      </w:ins>
+      <w:r>
+        <w:t xml:space="preserve">at </w:t>
+      </w:r>
+      <w:del w:id="44" w:author="Arshad Akhtar Abbasia" w:date="2026-10-04T12:00:00Z">
+        <w:r>
+          <w:delText xml:space="preserve">its sharpest. </w:delText>
+        </w:r>
+      </w:del>
+      <w:ins w:id="45" w:author="Arshad Akhtar Abbasia" w:date="2026-10-04T12:00:00Z">
+        <w:r>
+          <w:t xml:space="preserve">patient-record granularity (Chapter 4, Section 4.6). </w:t>
         </w:r>
       </w:ins>
       <w:r>
@@ -1069,7 +1074,7 @@
       <w:r>
         <w:t xml:space="preserve">The analytical core of the thesis is the Tri-Lateral Retention Feasibility Model (TRF Model), a constraint-satisfaction formulation developed in Chapter 4 within the established tradition of formal legal-compliance verification (Feng, Marsso, Sabetzadeh, &amp; Chechik, 2023). The model decomposes each cross-border audit record into an event-metadata component, itself divided into the accessor’s fields and the link to the patient, and a </w:t>
       </w:r>
-      <w:del w:id="45" w:author="Arshad Akhtar Abbasia" w:date="2026-10-04T12:00:00Z">
+      <w:del w:id="46" w:author="Arshad Akhtar Abbasia" w:date="2026-10-04T12:00:00Z">
         <w:r>
           <w:delText xml:space="preserve">personal-data </w:delText>
         </w:r>
@@ -1173,12 +1178,12 @@
       <w:r>
         <w:t xml:space="preserve">Third, the contribution is positioned at a level the existing literature does not occupy. The general method of formalising legal compliance as a satisfiability problem is established (Feng et al., 2023), and the cryptographic-erasure technique is recognised in standards (National Institute of Standards and Technology, 2025) and critiqued in practice. But no published work formally models the specific tri-lateral conflict of the cross-border health audit trail, and no work derives a reconciling mechanism from such a model. This holds </w:t>
       </w:r>
-      <w:del w:id="46" w:author="Arshad Akhtar Abbasia" w:date="2026-10-04T12:00:00Z">
+      <w:del w:id="47" w:author="Arshad Akhtar Abbasia" w:date="2026-10-04T12:00:00Z">
         <w:r>
           <w:delText xml:space="preserve">even </w:delText>
         </w:r>
       </w:del>
-      <w:ins w:id="47" w:author="Arshad Akhtar Abbasia" w:date="2026-10-04T12:00:00Z">
+      <w:ins w:id="48" w:author="Arshad Akhtar Abbasia" w:date="2026-10-04T12:00:00Z">
         <w:r>
           <w:t xml:space="preserve">also </w:t>
         </w:r>
@@ -1186,12 +1191,12 @@
       <w:r>
         <w:t xml:space="preserve">for the conflict’s </w:t>
       </w:r>
-      <w:del w:id="48" w:author="Arshad Akhtar Abbasia" w:date="2026-10-04T12:00:00Z">
+      <w:del w:id="49" w:author="Arshad Akhtar Abbasia" w:date="2026-10-04T12:00:00Z">
         <w:r>
           <w:delText xml:space="preserve">sharpest instance. </w:delText>
         </w:r>
       </w:del>
-      <w:ins w:id="49" w:author="Arshad Akhtar Abbasia" w:date="2026-10-04T12:00:00Z">
+      <w:ins w:id="50" w:author="Arshad Akhtar Abbasia" w:date="2026-10-04T12:00:00Z">
         <w:r>
           <w:t xml:space="preserve">conditional extension. </w:t>
         </w:r>
@@ -1237,7 +1242,15 @@
         <w:pStyle w:val="BodyText"/>
       </w:pPr>
       <w:r>
-        <w:t xml:space="preserve">The thesis explicitly does not include the following. First, it does not build a working zero-knowledge SNARK circuit; no component of the mechanism requires one, and the cryptographic machinery that an earlier design iteration envisaged is treated as future work, at the one point where it becomes necessary (Chapter 7, Section 7.5). Second, it does not deploy to a real National Contact Point for eHealth; integration with Norwegian NCPeH operations remains an architectural mapping rather than a runtime test. Third, it does not conduct human-subject interviews, and no qualitative empirical data are reported. Fourth, it does not measure hardware energy consumption, and no sustainability metrics are claimed beyond conceptual framing. Its place in a programme in Sustainable Energy Logistics is therefore in the logistics of information rather than of energy: it treats a regulated cross-border record as a consignment whose custody, retention and destruction are governed by the regimes it crosses. Fifth, it does not use real patient data; all sandbox data are synthetic and contain no information about real individuals. Sixth, it does not implement healthcare-professional authentication or consent-propagation protocols beyond the invalidation mechanism itself. Seventh, it does not provide machine-checked formal proofs; the four propositions are proved informally at the level of rigour standard for design-science work, and their executable check in the sandbox is a demonstration, not a verification in the proof-assistant sense. Eighth, it does not prove destruction of cryptographic keys; the mechanism’s guarantees are conditional on honest key destruction, a limitation examined in Chapter 6. Ninth, it does not model the national retention laws of receiving jurisdictions beyond the Union-level instruments; the time horizon of the model is parameterised so that jurisdiction-specific floors can be substituted. Tenth, it does not address non-EU and non-EEA jurisdictions.</w:t>
+        <w:t xml:space="preserve">The thesis explicitly does not include the following. First, it does not build a working zero-knowledge SNARK circuit; no component of the mechanism requires one, and the cryptographic machinery that an earlier design iteration envisaged is treated as future work, at the one point where it becomes necessary (Chapter 7, Section 7.5). Second, it does not deploy to a real National Contact Point for eHealth; integration with Norwegian NCPeH operations remains an architectural mapping rather than a runtime test. Third, it does not conduct human-subject interviews, and no qualitative empirical data are reported. Fourth, it does not measure hardware energy consumption, and no sustainability metrics are claimed beyond conceptual framing. </w:t>
+      </w:r>
+      <w:ins w:id="51" w:author="Arshad Akhtar Abbasia" w:date="2026-10-04T12:00:00Z">
+        <w:r>
+          <w:t xml:space="preserve">Storage has an energy cost at system scale: data centres used “around 1.5% of the world’s electricity consumption in 2024, or 415 terawatt-hours” (International Energy Agency, 2025). The thesis does not estimate what share retained audit records account for, and claims no energy saving for the mechanism. </w:t>
+        </w:r>
+      </w:ins>
+      <w:r>
+        <w:t xml:space="preserve">Its place in a programme in Sustainable Energy Logistics is therefore in the logistics of information rather than of energy: it treats a regulated cross-border record as a consignment whose custody, retention and destruction are governed by the regimes it crosses. Fifth, it does not use real patient data; all sandbox data are synthetic and contain no information about real individuals. Sixth, it does not implement healthcare-professional authentication or consent-propagation protocols beyond the invalidation mechanism itself. Seventh, it does not provide machine-checked formal proofs; the four propositions are proved informally at the level of rigour standard for design-science work, and their executable check in the sandbox is a demonstration, not a verification in the proof-assistant sense. Eighth, it does not prove destruction of cryptographic keys; the mechanism’s guarantees are conditional on honest key destruction, a limitation examined in Chapter 6. Ninth, it does not model the national retention laws of receiving jurisdictions beyond the Union-level instruments; the time horizon of the model is parameterised so that jurisdiction-specific floors can be substituted. Tenth, it does not address non-EU and non-EEA jurisdictions.</w:t>
       </w:r>
     </w:p>
     <w:p>
@@ -1335,12 +1348,12 @@
       <w:r>
         <w:t xml:space="preserve">Chapter 5 presents the sandbox demonstration: the executable feasibility check, the </w:t>
       </w:r>
-      <w:del w:id="50" w:author="Arshad Akhtar Abbasia" w:date="2026-10-04T12:00:00Z">
+      <w:del w:id="52" w:author="Arshad Akhtar Abbasia" w:date="2026-10-04T12:00:00Z">
         <w:r>
           <w:delText xml:space="preserve">independent </w:delText>
         </w:r>
       </w:del>
-      <w:ins w:id="51" w:author="Arshad Akhtar Abbasia" w:date="2026-10-04T12:00:00Z">
+      <w:ins w:id="53" w:author="Arshad Akhtar Abbasia" w:date="2026-10-04T12:00:00Z">
         <w:r>
           <w:t xml:space="preserve">separately written </w:t>
         </w:r>
@@ -1348,7 +1361,7 @@
       <w:r>
         <w:t xml:space="preserve">exhaustive cross-check, </w:t>
       </w:r>
-      <w:ins w:id="52" w:author="Arshad Akhtar Abbasia" w:date="2026-10-04T12:00:00Z">
+      <w:ins w:id="54" w:author="Arshad Akhtar Abbasia" w:date="2026-10-04T12:00:00Z">
         <w:r>
           <w:t xml:space="preserve">a bounded SMT check of Propositions 1–3, </w:t>
         </w:r>
@@ -1780,19 +1793,6 @@
       <w:r>
         <w:t xml:space="preserve">The standard practitioner heuristic for conflicting retention obligations cannot resolve this. Guidance for multi-framework environments routinely advises applying the longest applicable retention period across all frameworks: a rule that works when every obligation is a floor, and fails entirely when one obligation is a ceiling, since extending retention to satisfy the longer floor is precisely what the ceiling forbids. The absence of an applicable heuristic is one reason the conflict has remained open in practice as well as in the literature.</w:t>
       </w:r>
-    </w:p>
-    <w:p>
-      <w:pPr>
-        <w:pStyle w:val="BodyText"/>
-        <w:rPr>
-          <w:ins w:id="53" w:author="Arshad Akhtar Abbasia" w:date="2026-10-04T12:00:00Z"/>
-        </w:rPr>
-      </w:pPr>
-      <w:ins w:id="54" w:author="Arshad Akhtar Abbasia" w:date="2026-10-04T12:00:00Z">
-        <w:r>
-          <w:t xml:space="preserve">The renumbering of these obligations between the 2022 proposal and the adopted text, from Articles 46 and 50 to Articles 68 and 73, may be one reason the commentary has treated them apart (Chapter 1, Section 1.4).</w:t>
-        </w:r>
-      </w:ins>
     </w:p>
     <w:p>
       <w:pPr>
@@ -1803,22 +1803,22 @@
       </w:pPr>
       <w:ins w:id="56" w:author="Arshad Akhtar Abbasia" w:date="2026-10-04T12:00:00Z">
         <w:r>
+          <w:t xml:space="preserve">The renumbering of these obligations between the 2022 proposal and the adopted text, from Articles 46 and 50 to Articles 68 and 73, may be one reason the commentary has treated them apart (Chapter 1, Section 1.4).</w:t>
+        </w:r>
+      </w:ins>
+    </w:p>
+    <w:p>
+      <w:pPr>
+        <w:pStyle w:val="BodyText"/>
+        <w:rPr>
+          <w:ins w:id="57" w:author="Arshad Akhtar Abbasia" w:date="2026-10-04T12:00:00Z"/>
+        </w:rPr>
+      </w:pPr>
+      <w:ins w:id="58" w:author="Arshad Akhtar Abbasia" w:date="2026-10-04T12:00:00Z">
+        <w:r>
           <w:t xml:space="preserve">In the cross-border pathway the conflict takes the form Chapter 1, Section 1.2 describes: a granted erasure request leaves an audit record pointing at data that no longer exist, and a refused one must be justified as necessary for a specific legal obligation, as the European Data Protection Board recommended in February 2026 (Matheson, 2026). Practitioner and supervisory commentary reads the erasure obligation as extending to all storage locations of the personal data, backups and logs included (see, e.g., the Norwegian legal commentary summarised in Berngaard, 2024), which is why the audit trail cannot be carved out of the conflict.</w:t>
         </w:r>
       </w:ins>
-    </w:p>
-    <w:p>
-      <w:pPr>
-        <w:pStyle w:val="BodyText"/>
-        <w:rPr>
-          <w:del w:id="57" w:author="Arshad Akhtar Abbasia" w:date="2026-10-04T12:00:00Z"/>
-        </w:rPr>
-      </w:pPr>
-      <w:del w:id="58" w:author="Arshad Akhtar Abbasia" w:date="2026-10-04T12:00:00Z">
-        <w:r>
-          <w:delText xml:space="preserve">A further explanation of why the conflict has not been addressed is procedural. In the Commission’s 2022 proposal, the six-month deletion obligation appeared in Article 46 and the Secure Processing Environment provisions in Article 50; both were renumbered on adoption in 2025 to Articles 68 and 73 respectively. A substantial part of the published commentary on EHDS secondary use was written against the proposal numbering, with the deletion obligation and the environment’s security requirements analysed in separate literatures that were never subsequently brought onto the same page.</w:delText>
-        </w:r>
-      </w:del>
     </w:p>
     <w:p>
       <w:pPr>
@@ -1829,6 +1829,19 @@
       </w:pPr>
       <w:del w:id="60" w:author="Arshad Akhtar Abbasia" w:date="2026-10-04T12:00:00Z">
         <w:r>
+          <w:delText xml:space="preserve">A further explanation of why the conflict has not been addressed is procedural. In the Commission’s 2022 proposal, the six-month deletion obligation appeared in Article 46 and the Secure Processing Environment provisions in Article 50; both were renumbered on adoption in 2025 to Articles 68 and 73 respectively. A substantial part of the published commentary on EHDS secondary use was written against the proposal numbering, with the deletion obligation and the environment’s security requirements analysed in separate literatures that were never subsequently brought onto the same page.</w:delText>
+        </w:r>
+      </w:del>
+    </w:p>
+    <w:p>
+      <w:pPr>
+        <w:pStyle w:val="BodyText"/>
+        <w:rPr>
+          <w:del w:id="61" w:author="Arshad Akhtar Abbasia" w:date="2026-10-04T12:00:00Z"/>
+        </w:rPr>
+      </w:pPr>
+      <w:del w:id="62" w:author="Arshad Akhtar Abbasia" w:date="2026-10-04T12:00:00Z">
+        <w:r>
           <w:delText xml:space="preserve">The conflict is structural and operational. When a Norwegian patient is treated under MyHealth@EU in another Member State, the cross-border access event is logged in the foreign NCPeH’s ATNA-compliant audit repository for the period its deployment binding sets. During that window, the patient retains the right to request erasure of personal data under Article 17. If the erasure request is granted, the audit record loses its referential integrity: it points to data that no longer exist. If the erasure request is refused on Article 17(3)(b) grounds, the controller must demonstrate that the retention is genuinely necessary for compliance with a specific legal obligation, which is the recommendation the European Data Protection Board made in February 2026 (Matheson, 2026). When the same patient’s data move through the secondary-use pathway and reach a Norwegian Secure Processing Environment under a Helsedataservice permit, the Article 68(12) deletion ceiling applies. Yet the same environment must retain identifiable access logs for at least one year under Article 73(1)(e), and the audit records of the cross-border exchange that initiated the secondary-use request remain subject to the cross-border floor. Practitioner and supervisory commentary consistently reads the erasure obligation as extending to all storage locations of the personal data, including backups and logs (see, e.g., the Norwegian legal commentary summarised in Berngaard, 2024), which is precisely why the audit trail cannot be quietly carved out of the conflict.</w:delText>
         </w:r>
       </w:del>
@@ -1848,7 +1861,7 @@
       <w:r>
         <w:t xml:space="preserve">A direct technical solution to this tension exists in the literature on cryptographic erasure, though its application to the cross-border health audit problem has not been systematically developed. The National Institute of Standards and Technology’s Special Publication 800-88 Revision 2 recognises cryptographic erasure as a purge-grade sanitization technique, in which the encryption key used to protect the data is irreversibly destroyed while the encrypted data remain on the storage medium (National Institute of Standards and Technology, 2025). Practitioner implementation guidance asserts that cryptographic erasure is increasingly accepted as a means of satisfying Article 17 in distributed cloud environments, conditional on auditable key management and demonstrably irreversible key destruction (Dhandala, 2026). That assertion is reported here as evidence of industry practice rather than as a statement of regulatory position; the authoritative position on cryptographic unrecoverability is the European Data Protection Board’s, set out later in this section. </w:t>
       </w:r>
-      <w:del w:id="61" w:author="Arshad Akhtar Abbasia" w:date="2026-10-04T12:00:00Z">
+      <w:del w:id="63" w:author="Arshad Akhtar Abbasia" w:date="2026-10-04T12:00:00Z">
         <w:r>
           <w:delText xml:space="preserve">The technique is not without criticism. </w:delText>
         </w:r>
@@ -1856,12 +1869,12 @@
       <w:r>
         <w:t xml:space="preserve">SecuPi (2025) </w:t>
       </w:r>
-      <w:del w:id="62" w:author="Arshad Akhtar Abbasia" w:date="2026-10-04T12:00:00Z">
+      <w:del w:id="64" w:author="Arshad Akhtar Abbasia" w:date="2026-10-04T12:00:00Z">
         <w:r>
           <w:delText xml:space="preserve">argues that cryptographic erasure introduces operational complexity </w:delText>
         </w:r>
       </w:del>
-      <w:ins w:id="63" w:author="Arshad Akhtar Abbasia" w:date="2026-10-04T12:00:00Z">
+      <w:ins w:id="65" w:author="Arshad Akhtar Abbasia" w:date="2026-10-04T12:00:00Z">
         <w:r>
           <w:t xml:space="preserve">criticises it as operationally costly </w:t>
         </w:r>
@@ -1869,12 +1882,12 @@
       <w:r>
         <w:t xml:space="preserve">in row-level </w:t>
       </w:r>
-      <w:del w:id="64" w:author="Arshad Akhtar Abbasia" w:date="2026-10-04T12:00:00Z">
+      <w:del w:id="66" w:author="Arshad Akhtar Abbasia" w:date="2026-10-04T12:00:00Z">
         <w:r>
           <w:delText xml:space="preserve">encryption scenarios and that auditable key management adds rather than removes overhead, making it inappropriate as a general solution for the right to erasure in heavily distributed systems. </w:delText>
         </w:r>
       </w:del>
-      <w:ins w:id="65" w:author="Arshad Akhtar Abbasia" w:date="2026-10-04T12:00:00Z">
+      <w:ins w:id="67" w:author="Arshad Akhtar Abbasia" w:date="2026-10-04T12:00:00Z">
         <w:r>
           <w:t xml:space="preserve">encryption; </w:t>
         </w:r>
@@ -1882,12 +1895,12 @@
       <w:r>
         <w:t xml:space="preserve">Chapter 6, Section 6.4 engages </w:t>
       </w:r>
-      <w:del w:id="66" w:author="Arshad Akhtar Abbasia" w:date="2026-10-04T12:00:00Z">
+      <w:del w:id="68" w:author="Arshad Akhtar Abbasia" w:date="2026-10-04T12:00:00Z">
         <w:r>
           <w:delText xml:space="preserve">it.</w:delText>
         </w:r>
       </w:del>
-      <w:ins w:id="67" w:author="Arshad Akhtar Abbasia" w:date="2026-10-04T12:00:00Z">
+      <w:ins w:id="69" w:author="Arshad Akhtar Abbasia" w:date="2026-10-04T12:00:00Z">
         <w:r>
           <w:t xml:space="preserve">that critique.</w:t>
         </w:r>
@@ -1985,10 +1998,10 @@
       <w:pPr>
         <w:pStyle w:val="BodyText"/>
         <w:rPr>
-          <w:ins w:id="68" w:author="Arshad Akhtar Abbasia" w:date="2026-10-04T12:00:00Z"/>
+          <w:ins w:id="70" w:author="Arshad Akhtar Abbasia" w:date="2026-10-04T12:00:00Z"/>
         </w:rPr>
       </w:pPr>
-      <w:ins w:id="69" w:author="Arshad Akhtar Abbasia" w:date="2026-10-04T12:00:00Z">
+      <w:ins w:id="71" w:author="Arshad Akhtar Abbasia" w:date="2026-10-04T12:00:00Z">
         <w:r>
           <w:t xml:space="preserve">A second line of work resolves the same tension the other way, by allowing content inside an integrity-protected structure to change. Chameleon hashes are collision-resistant except for the holder of a trapdoor, who can find collisions at will (Krawczyk &amp; Rabin, 1998). Sanitizable signatures let a designated sanitizer replace marked parts of a signed message while the signature still verifies (Ateniese, Chou, de Medeiros, &amp; Tsudik, 2005), and redactable signatures let parts be removed without any key (Johnson, Molnar, Song, &amp; Wagner, 2002). Redactable blockchains link blocks with chameleon hashes so that a trapdoor holder can replace or remove a block’s content and the chain still validates, with the right to be forgotten named as a use case (Ateniese, Magri, Venturi, &amp; Andrade, 2017); later designs spread the power to rewrite across attribute-key holders (Derler, Samelin, Slamanig, &amp; Striecks, 2019) or a voting majority (Deuber, Magri, &amp; Thyagarajan, 2019), and the approaches have been surveyed with the GDPR as their main motivation (Politou, Casino, Alepis, &amp; Patsakis, 2021). Each weakens the binding: integrity comes to mean consistent with what the authorised editor allows rather than unchanged since written, and whoever holds the trapdoor, the sanitizer key, the attribute keys or the majority can rewrite history, in the trapdoor schemes invisibly to anyone without an old copy. The mechanism of this thesis takes the opposite route. Its log is never edited; erasable content is kept out of it, and destroyed by destroying keys. The trust that redaction places in an editor is placed instead in key destruction (Chapter 6, Section 6.3).</w:t>
         </w:r>
@@ -2167,7 +2180,20 @@
         <w:pStyle w:val="BodyText"/>
       </w:pPr>
       <w:r>
-        <w:t xml:space="preserve">Following a public hearing conducted between July and October 2025, the criteria were, by the Directorate’s account, included in SPUHiN deliverable D5.2, Recommendations for minimum requirements for Secure Processing Environments in Norway. The deliverable comprises separate compliance checklists for SPE providers and SPE user organisations, with each requirement graded as mandatory or recommended. It was developed in collaboration with researchers, data custodians, technology suppliers, and authorities, and is positioned as a national reference basis for actors preparing for the coming EHDS requirements pending the Union implementing act (Helsedirektoratet, 2025; SPUHiN, 2025). Inspection of the checklists in the hearing version shows their scope to be information-security management, identity assurance, and access governance. They grade an ISMS requirement as mandatory and ISO 27001 certification as recommended, require eID-based login with defined assurance levels, and set personnel-security controls. Several recommended requirements are explicitly anticipated to harden into expectations as EHDS is implemented (SPUHiN, 2025). What those criteria do not contain, at any grade, is a requirement or mechanism addressing the reconciliation of audit-retention obligations with erasure and deletion obligations on the records the SPE generates. The gap identified by this thesis therefore survives the hearing version, not only the 2024 draft: Norway now has national SPE criteria that govern how the environment is secured and who may enter it, while leaving unaddressed what happens when the retention regimes on its records collide.</w:t>
+        <w:t xml:space="preserve">Following a public hearing conducted between July and October 2025, the criteria were, by the Directorate’s account, included in SPUHiN deliverable D5.2, Recommendations for minimum requirements for Secure Processing Environments in Norway. The deliverable comprises separate compliance checklists for SPE providers and SPE user organisations, with each requirement graded as mandatory or recommended. It was developed in collaboration with researchers, data custodians, technology suppliers, and authorities, and is positioned as a national reference basis for actors preparing for the coming EHDS requirements pending the Union implementing act (Helsedirektoratet, 2025; SPUHiN, 2025). Inspection of the checklists in the hearing version shows their scope to be information-security management, identity assurance, and access </w:t>
+      </w:r>
+      <w:del w:id="72" w:author="Arshad Akhtar Abbasia" w:date="2026-10-04T12:00:00Z">
+        <w:r>
+          <w:delText xml:space="preserve">governance. </w:delText>
+        </w:r>
+      </w:del>
+      <w:ins w:id="73" w:author="Arshad Akhtar Abbasia" w:date="2026-10-04T12:00:00Z">
+        <w:r>
+          <w:t xml:space="preserve">governance, with identifiable access logs kept for at least one year (P13 and P24 in the 2024 draft; Chapter 4, Section 4.11). </w:t>
+        </w:r>
+      </w:ins>
+      <w:r>
+        <w:t xml:space="preserve">They grade an ISMS requirement as mandatory and ISO 27001 certification as recommended, require eID-based login with defined assurance levels, and set personnel-security controls. Several recommended requirements are explicitly anticipated to harden into expectations as EHDS is implemented (SPUHiN, 2025). What those criteria do not contain, at any grade, is a requirement or mechanism addressing the reconciliation of audit-retention obligations with erasure and deletion obligations on the records the SPE generates. The gap identified by this thesis therefore survives the hearing version, not only the 2024 draft: Norway now has national SPE criteria that govern how the environment is secured and who may enter it, while leaving unaddressed what happens when the retention regimes on its records collide.</w:t>
       </w:r>
     </w:p>
     <w:p>
@@ -2205,6 +2231,45 @@
     <w:p>
       <w:pPr>
         <w:pStyle w:val="BodyText"/>
+        <w:rPr>
+          <w:ins w:id="74" w:author="Arshad Akhtar Abbasia" w:date="2026-10-04T12:00:00Z"/>
+        </w:rPr>
+      </w:pPr>
+      <w:ins w:id="75" w:author="Arshad Akhtar Abbasia" w:date="2026-10-04T12:00:00Z">
+        <w:r>
+          <w:t xml:space="preserve">The framing rests on the discipline’s own definitions, not on analogy alone. The Council of Supply Chain Management Professionals defines logistics management as the part of supply chain management that “plans, implements, and controls the efficient, effective forward and reverse flow and storage of goods, services and related information between the point of origin and the point of consumption” (Council of Supply Chain Management Professionals, n.d.). An audit record is related information in exactly this sense. The thesis concerns its storage and its planned exit: the reverse end of the flow, where a record is retained, reduced or disposed of.</w:t>
+        </w:r>
+      </w:ins>
+    </w:p>
+    <w:p>
+      <w:pPr>
+        <w:pStyle w:val="BodyText"/>
+        <w:rPr>
+          <w:ins w:id="76" w:author="Arshad Akhtar Abbasia" w:date="2026-10-04T12:00:00Z"/>
+        </w:rPr>
+      </w:pPr>
+      <w:ins w:id="77" w:author="Arshad Akhtar Abbasia" w:date="2026-10-04T12:00:00Z">
+        <w:r>
+          <w:t xml:space="preserve">Operations research supplies the closest formal relative. Perishable inventory theory studies stock that must be held to meet demand but expires after a fixed or random lifetime (Nahmias, 1982). A record under a retention floor and a deletion ceiling is perishable stock with two clocks. Proposition 3 (Chapter 4, Section 4.6) can be read in that idiom: when the expiry period is no longer than the holding period and its clock starts at a different event from the holding clock, whether an item can be held as long as it must depends on each item’s history, not on the rule book.</w:t>
+        </w:r>
+      </w:ins>
+    </w:p>
+    <w:p>
+      <w:pPr>
+        <w:pStyle w:val="BodyText"/>
+        <w:rPr>
+          <w:ins w:id="78" w:author="Arshad Akhtar Abbasia" w:date="2026-10-04T12:00:00Z"/>
+        </w:rPr>
+      </w:pPr>
+      <w:ins w:id="79" w:author="Arshad Akhtar Abbasia" w:date="2026-10-04T12:00:00Z">
+        <w:r>
+          <w:t xml:space="preserve">The energy sector’s own data infrastructure schedules retention in the same terms. Elhub, the Norwegian electricity data hub, keeps a customer’s personal data for a further three years and 41 days after both the supply and the grid contract end, “for eventuell feilretting og mulighet for å korrigere økonomiske oppgjør” [for any correction of errors and to allow financial settlements to be corrected], and keeps metering values for ten years only where the customer asks (Elhub, 2026). That is a retention period per data category, anchored to an event: the form of the floor parameter in Chapter 4, Section 4.3, in a different sector. The extension the data subject controls has no counterpart in the model.</w:t>
+        </w:r>
+      </w:ins>
+    </w:p>
+    <w:p>
+      <w:pPr>
+        <w:pStyle w:val="BodyText"/>
       </w:pPr>
       <w:r>
         <w:t xml:space="preserve">The International Chamber of Commerce (2025) policy brief on data flows in supply chains documents that cross-border data flows are functionally equivalent to material flows in their structural role within global supply chain operations. They enable real-time coordination, traceability, customs clearance, and the deployment of digital tools across jurisdictional boundaries. They are also subject to the same kind of fragmented regulatory landscape that has historically constrained physical cross-border logistics through divergent national rules. Restrictive and fragmented data policies act as non-tariff barriers in the same operational sense that documentation requirements, retention obligations, and audit rules act as non-tariff barriers in physical logistics.</w:t>
@@ -2401,7 +2466,7 @@
       <w:r>
         <w:t xml:space="preserve">The </w:t>
       </w:r>
-      <w:del w:id="70" w:author="Arshad Akhtar Abbasia" w:date="2026-10-04T12:00:00Z">
+      <w:del w:id="80" w:author="Arshad Akhtar Abbasia" w:date="2026-10-04T12:00:00Z">
         <w:r>
           <w:delText xml:space="preserve">strength of this </w:delText>
         </w:r>
@@ -2409,12 +2474,12 @@
       <w:r>
         <w:t xml:space="preserve">gap </w:t>
       </w:r>
-      <w:del w:id="71" w:author="Arshad Akhtar Abbasia" w:date="2026-10-04T12:00:00Z">
+      <w:del w:id="81" w:author="Arshad Akhtar Abbasia" w:date="2026-10-04T12:00:00Z">
         <w:r>
           <w:delText xml:space="preserve">is best demonstrated by its sharpest instance. </w:delText>
         </w:r>
       </w:del>
-      <w:ins w:id="72" w:author="Arshad Akhtar Abbasia" w:date="2026-10-04T12:00:00Z">
+      <w:ins w:id="82" w:author="Arshad Akhtar Abbasia" w:date="2026-10-04T12:00:00Z">
         <w:r>
           <w:t xml:space="preserve">holds also for the conflict’s conditional extension. </w:t>
         </w:r>
@@ -2686,7 +2751,7 @@
       <w:r>
         <w:t xml:space="preserve">Step 1: Decomposition of the object. Each cross-border audit record is decomposed into components that the regulatory instruments treat differently. The event metadata comprises the accountability content: which actor accessed which category of record, at what time, from which national contact point, under which legal basis and consent policy, with what outcome. Within the metadata, the accessor’s fields are separated from the link to the patient, because the two are reached by different obligations (Chapter 4, Section 4.3). The </w:t>
       </w:r>
-      <w:del w:id="73" w:author="Arshad Akhtar Abbasia" w:date="2026-10-04T12:00:00Z">
+      <w:del w:id="83" w:author="Arshad Akhtar Abbasia" w:date="2026-10-04T12:00:00Z">
         <w:r>
           <w:delText xml:space="preserve">personal-data </w:delText>
         </w:r>
@@ -2694,7 +2759,7 @@
       <w:r>
         <w:t xml:space="preserve">payload comprises </w:t>
       </w:r>
-      <w:ins w:id="74" w:author="Arshad Akhtar Abbasia" w:date="2026-10-04T12:00:00Z">
+      <w:ins w:id="84" w:author="Arshad Akhtar Abbasia" w:date="2026-10-04T12:00:00Z">
         <w:r>
           <w:t xml:space="preserve">what </w:t>
         </w:r>
@@ -2702,12 +2767,12 @@
       <w:r>
         <w:t xml:space="preserve">the </w:t>
       </w:r>
-      <w:del w:id="75" w:author="Arshad Akhtar Abbasia" w:date="2026-10-04T12:00:00Z">
+      <w:del w:id="85" w:author="Arshad Akhtar Abbasia" w:date="2026-10-04T12:00:00Z">
         <w:r>
           <w:delText xml:space="preserve">content </w:delText>
         </w:r>
       </w:del>
-      <w:ins w:id="76" w:author="Arshad Akhtar Abbasia" w:date="2026-10-04T12:00:00Z">
+      <w:ins w:id="86" w:author="Arshad Akhtar Abbasia" w:date="2026-10-04T12:00:00Z">
         <w:r>
           <w:t xml:space="preserve">record carries about what was accessed: the demographic query </w:t>
         </w:r>
@@ -2715,7 +2780,7 @@
       <w:r>
         <w:t xml:space="preserve">of </w:t>
       </w:r>
-      <w:ins w:id="77" w:author="Arshad Akhtar Abbasia" w:date="2026-10-04T12:00:00Z">
+      <w:ins w:id="87" w:author="Arshad Akhtar Abbasia" w:date="2026-10-04T12:00:00Z">
         <w:r>
           <w:t xml:space="preserve">a cross-border record, </w:t>
         </w:r>
@@ -2723,12 +2788,12 @@
       <w:r>
         <w:t xml:space="preserve">the </w:t>
       </w:r>
-      <w:del w:id="78" w:author="Arshad Akhtar Abbasia" w:date="2026-10-04T12:00:00Z">
+      <w:del w:id="88" w:author="Arshad Akhtar Abbasia" w:date="2026-10-04T12:00:00Z">
         <w:r>
           <w:delText xml:space="preserve">exchanged clinical document. </w:delText>
         </w:r>
       </w:del>
-      <w:ins w:id="79" w:author="Arshad Akhtar Abbasia" w:date="2026-10-04T12:00:00Z">
+      <w:ins w:id="89" w:author="Arshad Akhtar Abbasia" w:date="2026-10-04T12:00:00Z">
         <w:r>
           <w:t xml:space="preserve">logged activity of a Secure Processing Environment record (Chapter 4, Section 4.3). </w:t>
         </w:r>
@@ -2744,7 +2809,7 @@
       <w:r>
         <w:t xml:space="preserve">Step 2: Translation of each regime into a constraint. Each regime is expressed as a constraint over discretised monthly time on the state of a record. The retention floor requires that the record remain verifiable throughout its retention window. The Article 17 erasure right requires that, following a valid erasure request, the </w:t>
       </w:r>
-      <w:del w:id="80" w:author="Arshad Akhtar Abbasia" w:date="2026-10-04T12:00:00Z">
+      <w:del w:id="90" w:author="Arshad Akhtar Abbasia" w:date="2026-10-04T12:00:00Z">
         <w:r>
           <w:delText xml:space="preserve">personal-data </w:delText>
         </w:r>
@@ -2760,12 +2825,12 @@
       <w:r>
         <w:t xml:space="preserve">Step 3: Definition of the competing semantics. The pivotal move is to make explicit an assumption that the </w:t>
       </w:r>
-      <w:del w:id="81" w:author="Arshad Akhtar Abbasia" w:date="2026-10-04T12:00:00Z">
+      <w:del w:id="91" w:author="Arshad Akhtar Abbasia" w:date="2026-10-04T12:00:00Z">
         <w:r>
           <w:delText xml:space="preserve">operational status quo leaves </w:delText>
         </w:r>
       </w:del>
-      <w:ins w:id="82" w:author="Arshad Akhtar Abbasia" w:date="2026-10-04T12:00:00Z">
+      <w:ins w:id="92" w:author="Arshad Akhtar Abbasia" w:date="2026-10-04T12:00:00Z">
         <w:r>
           <w:t xml:space="preserve">instruments leave </w:t>
         </w:r>
@@ -2893,12 +2958,12 @@
       <w:r>
         <w:t xml:space="preserve">Cryptographic operations use standard library primitives: salted commitments constructed with a standard hash function, and simulated key destruction implemented as irreversible removal of key material from the sandbox’s state. The commitments are hiding by </w:t>
       </w:r>
-      <w:del w:id="83" w:author="Arshad Akhtar Abbasia" w:date="2026-10-04T12:00:00Z">
+      <w:del w:id="93" w:author="Arshad Akhtar Abbasia" w:date="2026-10-04T12:00:00Z">
         <w:r>
           <w:delText xml:space="preserve">construction, </w:delText>
         </w:r>
       </w:del>
-      <w:ins w:id="84" w:author="Arshad Akhtar Abbasia" w:date="2026-10-04T12:00:00Z">
+      <w:ins w:id="94" w:author="Arshad Akhtar Abbasia" w:date="2026-10-04T12:00:00Z">
         <w:r>
           <w:t xml:space="preserve">construction when salts are drawn at random (the reported run derives salts from the record identifier for reproducibility; see Appendix A, A.6), </w:t>
         </w:r>
@@ -2914,12 +2979,12 @@
       <w:r>
         <w:t xml:space="preserve">The constraint system is cross-checked on small instances by a separately written exhaustive search over every assignment of the accessibility variable, as an independent confirmation that the hand-written checker implements the constraints as stated (Chapter 5, Section 5.5). </w:t>
       </w:r>
-      <w:del w:id="85" w:author="Arshad Akhtar Abbasia" w:date="2026-10-04T12:00:00Z">
+      <w:del w:id="95" w:author="Arshad Akhtar Abbasia" w:date="2026-10-04T12:00:00Z">
         <w:r>
           <w:delText xml:space="preserve">This is </w:delText>
         </w:r>
       </w:del>
-      <w:ins w:id="86" w:author="Arshad Akhtar Abbasia" w:date="2026-10-04T12:00:00Z">
+      <w:ins w:id="96" w:author="Arshad Akhtar Abbasia" w:date="2026-10-04T12:00:00Z">
         <w:r>
           <w:t xml:space="preserve">A bounded SMT check with the Z3 solver poses each proposition as </w:t>
         </w:r>
@@ -2927,7 +2992,7 @@
       <w:r>
         <w:t xml:space="preserve">a </w:t>
       </w:r>
-      <w:ins w:id="87" w:author="Arshad Akhtar Abbasia" w:date="2026-10-04T12:00:00Z">
+      <w:ins w:id="97" w:author="Arshad Akhtar Abbasia" w:date="2026-10-04T12:00:00Z">
         <w:r>
           <w:t xml:space="preserve">request for a counterexample over every parameter combination within stated bounds (Chapter 5, Section 5.5). Both are </w:t>
         </w:r>
@@ -2935,12 +3000,12 @@
       <w:r>
         <w:t xml:space="preserve">robustness </w:t>
       </w:r>
-      <w:del w:id="88" w:author="Arshad Akhtar Abbasia" w:date="2026-10-04T12:00:00Z">
+      <w:del w:id="98" w:author="Arshad Akhtar Abbasia" w:date="2026-10-04T12:00:00Z">
         <w:r>
           <w:delText xml:space="preserve">measure </w:delText>
         </w:r>
       </w:del>
-      <w:ins w:id="89" w:author="Arshad Akhtar Abbasia" w:date="2026-10-04T12:00:00Z">
+      <w:ins w:id="99" w:author="Arshad Akhtar Abbasia" w:date="2026-10-04T12:00:00Z">
         <w:r>
           <w:t xml:space="preserve">measures </w:t>
         </w:r>
@@ -2948,12 +3013,12 @@
       <w:r>
         <w:t xml:space="preserve">rather than </w:t>
       </w:r>
-      <w:del w:id="90" w:author="Arshad Akhtar Abbasia" w:date="2026-10-04T12:00:00Z">
+      <w:del w:id="100" w:author="Arshad Akhtar Abbasia" w:date="2026-10-04T12:00:00Z">
         <w:r>
           <w:delText xml:space="preserve">a component </w:delText>
         </w:r>
       </w:del>
-      <w:ins w:id="91" w:author="Arshad Akhtar Abbasia" w:date="2026-10-04T12:00:00Z">
+      <w:ins w:id="101" w:author="Arshad Akhtar Abbasia" w:date="2026-10-04T12:00:00Z">
         <w:r>
           <w:t xml:space="preserve">components </w:t>
         </w:r>
@@ -3089,12 +3154,12 @@
       <w:r>
         <w:t xml:space="preserve">The eighth is that the model represents a record’s payload as a single unit that is either readable or not. Real systems often erase at field level, redacting some elements of a record while retaining others, and a single binary accessibility variable cannot represent that. The simplification is conservative with respect to the propositions, since a mechanism that satisfies the constraints for a whole payload satisfies them for any subset of it, but it means the model says nothing about partial </w:t>
       </w:r>
-      <w:del w:id="92" w:author="Arshad Akhtar Abbasia" w:date="2026-10-04T12:00:00Z">
+      <w:del w:id="102" w:author="Arshad Akhtar Abbasia" w:date="2026-10-04T12:00:00Z">
         <w:r>
           <w:delText xml:space="preserve">erasure, and </w:delText>
         </w:r>
       </w:del>
-      <w:ins w:id="93" w:author="Arshad Akhtar Abbasia" w:date="2026-10-04T12:00:00Z">
+      <w:ins w:id="103" w:author="Arshad Akhtar Abbasia" w:date="2026-10-04T12:00:00Z">
         <w:r>
           <w:t xml:space="preserve">erasure. Chapter 4, Corollary 2.3 extends the model with one variable per part of the payload for the one case where that matters, a payload part that auditing needs; </w:t>
         </w:r>
@@ -3102,7 +3167,7 @@
       <w:r>
         <w:t xml:space="preserve">a mechanism designed for field-level redaction </w:t>
       </w:r>
-      <w:ins w:id="94" w:author="Arshad Akhtar Abbasia" w:date="2026-10-04T12:00:00Z">
+      <w:ins w:id="104" w:author="Arshad Akhtar Abbasia" w:date="2026-10-04T12:00:00Z">
         <w:r>
           <w:t xml:space="preserve">in general </w:t>
         </w:r>
@@ -3110,12 +3175,12 @@
       <w:r>
         <w:t xml:space="preserve">would need </w:t>
       </w:r>
-      <w:del w:id="95" w:author="Arshad Akhtar Abbasia" w:date="2026-10-04T12:00:00Z">
+      <w:del w:id="105" w:author="Arshad Akhtar Abbasia" w:date="2026-10-04T12:00:00Z">
         <w:r>
           <w:delText xml:space="preserve">a </w:delText>
         </w:r>
       </w:del>
-      <w:ins w:id="96" w:author="Arshad Akhtar Abbasia" w:date="2026-10-04T12:00:00Z">
+      <w:ins w:id="106" w:author="Arshad Akhtar Abbasia" w:date="2026-10-04T12:00:00Z">
         <w:r>
           <w:t xml:space="preserve">that </w:t>
         </w:r>
@@ -3123,12 +3188,12 @@
       <w:r>
         <w:t xml:space="preserve">richer state space </w:t>
       </w:r>
-      <w:del w:id="97" w:author="Arshad Akhtar Abbasia" w:date="2026-10-04T12:00:00Z">
+      <w:del w:id="107" w:author="Arshad Akhtar Abbasia" w:date="2026-10-04T12:00:00Z">
         <w:r>
           <w:delText xml:space="preserve">than the one used here.</w:delText>
         </w:r>
       </w:del>
-      <w:ins w:id="98" w:author="Arshad Akhtar Abbasia" w:date="2026-10-04T12:00:00Z">
+      <w:ins w:id="108" w:author="Arshad Akhtar Abbasia" w:date="2026-10-04T12:00:00Z">
         <w:r>
           <w:t xml:space="preserve">throughout.</w:t>
         </w:r>
@@ -3250,12 +3315,12 @@
       <w:pPr>
         <w:pStyle w:val="BodyText"/>
         <w:rPr>
-          <w:ins w:id="99" w:author="Arshad Akhtar Abbasia" w:date="2026-10-04T12:00:00Z"/>
+          <w:ins w:id="109" w:author="Arshad Akhtar Abbasia" w:date="2026-10-04T12:00:00Z"/>
         </w:rPr>
       </w:pPr>
-      <w:ins w:id="100" w:author="Arshad Akhtar Abbasia" w:date="2026-10-04T12:00:00Z">
-        <w:r>
-          <w:t xml:space="preserve">A patient asks for her data to be erased. The audit record of who looked at them must, on the reported deployment baseline, stay verifiable for ten years. In a research environment a third rule wants the data gone six months after the permit ends. Can one record obey all three? This chapter answers: not if verifiable means readable; yes if it means accountable. It gets there in three steps, and each step licenses the next.</w:t>
+      <w:ins w:id="110" w:author="Arshad Akhtar Abbasia" w:date="2026-10-04T12:00:00Z">
+        <w:r>
+          <w:t xml:space="preserve">A patient asks for her data to be erased. The audit record of who looked at them must stay verifiable for years: ten, on the reported cross-border baseline; one, in a research environment, where a third rule wants health data gone six months after the permit ends. Can an audit record obey all three? This chapter answers: not if verifiable means readable; yes if it means accountable. It gets there in three steps, and each step licenses the next.</w:t>
         </w:r>
       </w:ins>
     </w:p>
@@ -3263,10 +3328,10 @@
       <w:pPr>
         <w:pStyle w:val="BodyText"/>
         <w:rPr>
-          <w:del w:id="101" w:author="Arshad Akhtar Abbasia" w:date="2026-10-04T12:00:00Z"/>
+          <w:del w:id="111" w:author="Arshad Akhtar Abbasia" w:date="2026-10-04T12:00:00Z"/>
         </w:rPr>
       </w:pPr>
-      <w:del w:id="102" w:author="Arshad Akhtar Abbasia" w:date="2026-10-04T12:00:00Z">
+      <w:del w:id="112" w:author="Arshad Akhtar Abbasia" w:date="2026-10-04T12:00:00Z">
         <w:r>
           <w:delText xml:space="preserve">This chapter contains the analytical core of the thesis. It does three things in sequence, and the sequence matters because each step licenses the next.</w:delText>
         </w:r>
@@ -3324,7 +3389,7 @@
       <w:pPr>
         <w:pStyle w:val="BodyText"/>
       </w:pPr>
-      <w:ins w:id="103" w:author="Arshad Akhtar Abbasia" w:date="2026-10-04T12:00:00Z">
+      <w:ins w:id="113" w:author="Arshad Akhtar Abbasia" w:date="2026-10-04T12:00:00Z">
         <w:r>
           <w:t xml:space="preserve">Everything in this chapter rests on one split: the part of an audit record the law needs kept, and the part it does not. </w:t>
         </w:r>
@@ -3332,12 +3397,12 @@
       <w:r>
         <w:t xml:space="preserve">The </w:t>
       </w:r>
-      <w:del w:id="104" w:author="Arshad Akhtar Abbasia" w:date="2026-10-04T12:00:00Z">
+      <w:del w:id="114" w:author="Arshad Akhtar Abbasia" w:date="2026-10-04T12:00:00Z">
         <w:r>
           <w:delText xml:space="preserve">decomposition that makes the model possible </w:delText>
         </w:r>
       </w:del>
-      <w:ins w:id="105" w:author="Arshad Akhtar Abbasia" w:date="2026-10-04T12:00:00Z">
+      <w:ins w:id="115" w:author="Arshad Akhtar Abbasia" w:date="2026-10-04T12:00:00Z">
         <w:r>
           <w:t xml:space="preserve">split </w:t>
         </w:r>
@@ -3369,12 +3434,12 @@
       <w:r>
         <w:t xml:space="preserve">This yields the central claim of the necessity analysis: the accountability function of a cross-border audit record is discharged by its metadata and by a binding commitment to its payload, and does not require the payload to remain accessible. Retention of accessible plaintext payload for </w:t>
       </w:r>
-      <w:del w:id="106" w:author="Arshad Akhtar Abbasia" w:date="2026-10-04T12:00:00Z">
+      <w:del w:id="116" w:author="Arshad Akhtar Abbasia" w:date="2026-10-04T12:00:00Z">
         <w:r>
           <w:delText xml:space="preserve">ten years </w:delText>
         </w:r>
       </w:del>
-      <w:ins w:id="107" w:author="Arshad Akhtar Abbasia" w:date="2026-10-04T12:00:00Z">
+      <w:ins w:id="117" w:author="Arshad Akhtar Abbasia" w:date="2026-10-04T12:00:00Z">
         <w:r>
           <w:t xml:space="preserve">the length of the floor </w:t>
         </w:r>
@@ -3387,10 +3452,10 @@
       <w:pPr>
         <w:pStyle w:val="BodyText"/>
         <w:rPr>
-          <w:ins w:id="108" w:author="Arshad Akhtar Abbasia" w:date="2026-10-04T12:00:00Z"/>
+          <w:ins w:id="118" w:author="Arshad Akhtar Abbasia" w:date="2026-10-04T12:00:00Z"/>
         </w:rPr>
       </w:pPr>
-      <w:ins w:id="109" w:author="Arshad Akhtar Abbasia" w:date="2026-10-04T12:00:00Z">
+      <w:ins w:id="119" w:author="Arshad Akhtar Abbasia" w:date="2026-10-04T12:00:00Z">
         <w:r>
           <w:t xml:space="preserve">Per record class. The argument has to be made for each class separately, because the payload is defined by where it comes from (Section 4.3), not by whether it is needed. For a cross-border record it is specific: the accountability question is which clinician accessed which patient’s record, under which assertion and with what outcome, and the accessor fields with the patient link answer it; the patient’s name and birth date as typed into the query add nothing to that answer. For a Secure Processing Environment record it is weaker. Article 73(1)(e) asks for logs sufficient “to verify and audit all processing operations in that environment”, and an auditor checking that an extraction stayed within its permit may need to know what was run. The thesis therefore does not assume that the whole activity content is unnecessary there; Corollary 2.3 states what follows if part of it is needed.</w:t>
         </w:r>
@@ -3400,10 +3465,10 @@
       <w:pPr>
         <w:pStyle w:val="BodyText"/>
         <w:rPr>
-          <w:ins w:id="110" w:author="Arshad Akhtar Abbasia" w:date="2026-10-04T12:00:00Z"/>
+          <w:ins w:id="120" w:author="Arshad Akhtar Abbasia" w:date="2026-10-04T12:00:00Z"/>
         </w:rPr>
       </w:pPr>
-      <w:ins w:id="111" w:author="Arshad Akhtar Abbasia" w:date="2026-10-04T12:00:00Z">
+      <w:ins w:id="121" w:author="Arshad Akhtar Abbasia" w:date="2026-10-04T12:00:00Z">
         <w:r>
           <w:t xml:space="preserve">The patient link. The link from an access event to the person whose data were accessed is not payload: it is the other half of the accountability question. The Regulation gives natural persons the right to obtain information on any access to their personal electronic health data through the health professional access service, including “information on the healthcare provider or other individuals who accessed the personal electronic health data”, “the date and time of access” and “which personal electronic health data were accessed”, available “for at least three years from each date of access to the data” (Article 9(1)–(2) EHDS). That information cannot be produced from a record that no longer says whose data were accessed. For the controller that must provide it, or supply the records it is produced from, retaining the link is therefore necessary for compliance with a legal obligation within the meaning of Article 17(3)(b). An erasure request then reaches the payload but not the link, at least for the period Article 9(2) fixes and once Article 9 applies. The argument has two limits. Article 9 is framed around the health professional access service, so whether it binds the controller of a foreign National Contact Point’s audit repository, and covers every cross-border access event, depends on how the access is made and how the Member States assign the duty; where it does not, the patient-facing audit-log interface of MyHealth@EU (Chapter 1, Section 1.2) gives the link a purpose but not a legal obligation, and Article 17(3)(b) does not follow. And beyond the Article 9(2) period the link is kept for the rest of the floor on the strength of the deployment binding, which is illustrative here (Section 4.3); for that stretch its retention after an erasure request is exactly as contestable as the floor itself. It is removed at the terminal transition (Section 4.8). In a Secure Processing Environment Article 9 does not apply. There the link is kept after an erasure request until the ceiling only if auditing “all processing operations” under Article 73(1)(e) needs it, which is the question Chapter 7, Section 7.4 leaves to the supervisory authority, and the ceiling may reach it in any case (Section 4.6).</w:t>
         </w:r>
@@ -3429,12 +3494,12 @@
       <w:pPr>
         <w:pStyle w:val="BodyText"/>
         <w:rPr>
-          <w:ins w:id="112" w:author="Arshad Akhtar Abbasia" w:date="2026-10-04T12:00:00Z"/>
+          <w:ins w:id="122" w:author="Arshad Akhtar Abbasia" w:date="2026-10-04T12:00:00Z"/>
         </w:rPr>
       </w:pPr>
-      <w:ins w:id="113" w:author="Arshad Akhtar Abbasia" w:date="2026-10-04T12:00:00Z">
-        <w:r>
-          <w:t xml:space="preserve">The model is deliberately small: one record, one clock, and one question asked every month: can the payload still be read?</w:t>
+      <w:ins w:id="123" w:author="Arshad Akhtar Abbasia" w:date="2026-10-04T12:00:00Z">
+        <w:r>
+          <w:t xml:space="preserve">The model is deliberately small: one record, one clock, and one main question asked every month. Can the payload still be read?</w:t>
         </w:r>
       </w:ins>
     </w:p>
@@ -3477,7 +3542,7 @@
       <w:r>
         <w:t xml:space="preserve">- m(a) is the event metadata: the actor identifier, the actor’s national contact point, the patient pseudonym, the document category accessed, the legal basis and consent policy applied, the timestamp, and the outcome. Metadata contains no clinical content. It is partitioned as m(a) = m_(acc)(a) ∪ m_(subj)(a). The accessor fields m_(acc)(a) record who acted, when, under which legal basis or permit, and with what outcome. The subject fields m_(subj)(a) relate the event to a data subject: the patient pseudonym and any reference to that subject’s records. The partition does work only in the Secure Processing Environment case (Section 4.6). - p(a) is the </w:t>
       </w:r>
-      <w:del w:id="114" w:author="Arshad Akhtar Abbasia" w:date="2026-10-04T12:00:00Z">
+      <w:del w:id="124" w:author="Arshad Akhtar Abbasia" w:date="2026-10-04T12:00:00Z">
         <w:r>
           <w:delText xml:space="preserve">personal-data </w:delText>
         </w:r>
@@ -3485,12 +3550,12 @@
       <w:r>
         <w:t xml:space="preserve">payload: the </w:t>
       </w:r>
-      <w:del w:id="115" w:author="Arshad Akhtar Abbasia" w:date="2026-10-04T12:00:00Z">
+      <w:del w:id="125" w:author="Arshad Akhtar Abbasia" w:date="2026-10-04T12:00:00Z">
         <w:r>
           <w:delText xml:space="preserve">personal data </w:delText>
         </w:r>
       </w:del>
-      <w:ins w:id="116" w:author="Arshad Akhtar Abbasia" w:date="2026-10-04T12:00:00Z">
+      <w:ins w:id="126" w:author="Arshad Akhtar Abbasia" w:date="2026-10-04T12:00:00Z">
         <w:r>
           <w:t xml:space="preserve">content </w:t>
         </w:r>
@@ -3498,12 +3563,12 @@
       <w:r>
         <w:t xml:space="preserve">the record carries </w:t>
       </w:r>
-      <w:del w:id="117" w:author="Arshad Akhtar Abbasia" w:date="2026-10-04T12:00:00Z">
+      <w:del w:id="127" w:author="Arshad Akhtar Abbasia" w:date="2026-10-04T12:00:00Z">
         <w:r>
           <w:delText xml:space="preserve">beyond </w:delText>
         </w:r>
       </w:del>
-      <w:ins w:id="118" w:author="Arshad Akhtar Abbasia" w:date="2026-10-04T12:00:00Z">
+      <w:ins w:id="128" w:author="Arshad Akhtar Abbasia" w:date="2026-10-04T12:00:00Z">
         <w:r>
           <w:t xml:space="preserve">about </w:t>
         </w:r>
@@ -3511,12 +3576,12 @@
       <w:r>
         <w:t xml:space="preserve">what </w:t>
       </w:r>
-      <w:del w:id="119" w:author="Arshad Akhtar Abbasia" w:date="2026-10-04T12:00:00Z">
+      <w:del w:id="129" w:author="Arshad Akhtar Abbasia" w:date="2026-10-04T12:00:00Z">
         <w:r>
           <w:delText xml:space="preserve">accountability requires (Section 4.2). Its content </w:delText>
         </w:r>
       </w:del>
-      <w:ins w:id="120" w:author="Arshad Akhtar Abbasia" w:date="2026-10-04T12:00:00Z">
+      <w:ins w:id="130" w:author="Arshad Akhtar Abbasia" w:date="2026-10-04T12:00:00Z">
         <w:r>
           <w:t xml:space="preserve">was accessed, as distinct from who accessed it, when and under what authority. It is defined by its source, which </w:t>
         </w:r>
@@ -3524,12 +3589,12 @@
       <w:r>
         <w:t xml:space="preserve">depends on the record </w:t>
       </w:r>
-      <w:del w:id="121" w:author="Arshad Akhtar Abbasia" w:date="2026-10-04T12:00:00Z">
+      <w:del w:id="131" w:author="Arshad Akhtar Abbasia" w:date="2026-10-04T12:00:00Z">
         <w:r>
           <w:delText xml:space="preserve">class. </w:delText>
         </w:r>
       </w:del>
-      <w:ins w:id="122" w:author="Arshad Akhtar Abbasia" w:date="2026-10-04T12:00:00Z">
+      <w:ins w:id="132" w:author="Arshad Akhtar Abbasia" w:date="2026-10-04T12:00:00Z">
         <w:r>
           <w:t xml:space="preserve">class; whether accountability needs it is argued per class in Section 4.2, and Corollary 2.3 states what follows if part of it is needed. </w:t>
         </w:r>
@@ -3537,12 +3602,12 @@
       <w:r>
         <w:t xml:space="preserve">For a cross-border record it is the identifying content of the logged query. The IHE Cross Gateway Patient Discovery transaction (ITI-55), by which one country’s gateway locates a patient in another, requires the person’s name and birth time unless an identifier is supplied, and requires both gateways to record the query segment, base64-encoded, in the audit message’s ParticipantObjectQuery field (IHE International, 2024, Sections 3.55.4.1.2.1 and 3.55.5.1). The audit record therefore holds the patient’s demographic query and not only a pseudonym. This is the transaction on which the patient-identification step of the MyHealth@EU flow rests (Chapter 2, Section 2.2); the eHDSI audit specification that profiles it was not available to this thesis, so the IHE requirement is taken as the baseline any profile starts from. For a Secure Processing Environment record it is the content of the logged activity, where the environment logs at that level: the text and parameters of the query or command run against the permitted dataset, and any output retained with the entry. The Joint Action’s specification requires these logs to cover “access to electronic health data” and “data import, export, or release of outputs” and fixes no fields (TEHDAS2, 2026, Table 5.4, OPR-17, p. 51); </w:t>
       </w:r>
-      <w:del w:id="123" w:author="Arshad Akhtar Abbasia" w:date="2026-10-04T12:00:00Z">
+      <w:del w:id="133" w:author="Arshad Akhtar Abbasia" w:date="2026-10-04T12:00:00Z">
         <w:r>
           <w:delText xml:space="preserve">whatever </w:delText>
         </w:r>
       </w:del>
-      <w:ins w:id="124" w:author="Arshad Akhtar Abbasia" w:date="2026-10-04T12:00:00Z">
+      <w:ins w:id="134" w:author="Arshad Akhtar Abbasia" w:date="2026-10-04T12:00:00Z">
         <w:r>
           <w:t xml:space="preserve">what </w:t>
         </w:r>
@@ -3550,12 +3615,12 @@
       <w:r>
         <w:t xml:space="preserve">an environment records under those headings beyond the accessor fields is </w:t>
       </w:r>
-      <w:del w:id="125" w:author="Arshad Akhtar Abbasia" w:date="2026-10-04T12:00:00Z">
+      <w:del w:id="135" w:author="Arshad Akhtar Abbasia" w:date="2026-10-04T12:00:00Z">
         <w:r>
           <w:delText xml:space="preserve">p(a). </w:delText>
         </w:r>
       </w:del>
-      <w:ins w:id="126" w:author="Arshad Akhtar Abbasia" w:date="2026-10-04T12:00:00Z">
+      <w:ins w:id="136" w:author="Arshad Akhtar Abbasia" w:date="2026-10-04T12:00:00Z">
         <w:r>
           <w:t xml:space="preserve">p(a), and whether auditing “all processing operations” needs part of it is the question Corollary 2.3 answers conditionally. </w:t>
         </w:r>
@@ -3563,18 +3628,31 @@
       <w:r>
         <w:t xml:space="preserve">The model does not require p(a) to be a clinical </w:t>
       </w:r>
-      <w:del w:id="127" w:author="Arshad Akhtar Abbasia" w:date="2026-10-04T12:00:00Z">
+      <w:del w:id="137" w:author="Arshad Akhtar Abbasia" w:date="2026-10-04T12:00:00Z">
         <w:r>
           <w:delText xml:space="preserve">document, only personal data that the accountability purpose does not need. </w:delText>
         </w:r>
       </w:del>
-      <w:ins w:id="128" w:author="Arshad Akhtar Abbasia" w:date="2026-10-04T12:00:00Z">
+      <w:ins w:id="138" w:author="Arshad Akhtar Abbasia" w:date="2026-10-04T12:00:00Z">
         <w:r>
           <w:t xml:space="preserve">document. </w:t>
         </w:r>
       </w:ins>
       <w:r>
-        <w:t xml:space="preserve">- c(a) is a commitment to the payload, c(a) = Commit(p(a), r(a)), where r(a) is a per-record random salt. The commitment scheme is required to be hiding (the commitment reveals nothing about the payload to an adversary without the salt) and binding (no second payload can be opened against the same commitment). The requirement that it be hiding rather than a bare hash is a consequence of Section 4.9 and is not optional. - k(a) is the payload key: the key material under which p(a) is stored. - t(a) is the month in which the access event occurred. - F(a) ∈ ℕ is the retention floor applying to the record, expressed in months. - σ(a) ∈ {primary, secondary} is the pathway in which the record arose.</w:t>
+        <w:t xml:space="preserve">- c(a) is a commitment to the payload, c(a) = </w:t>
+      </w:r>
+      <w:del w:id="139" w:author="Arshad Akhtar Abbasia" w:date="2026-10-04T12:00:00Z">
+        <w:r>
+          <w:delText xml:space="preserve">Commit(p(a), r(a)), </w:delText>
+        </w:r>
+      </w:del>
+      <w:ins w:id="140" w:author="Arshad Akhtar Abbasia" w:date="2026-10-04T12:00:00Z">
+        <w:r>
+          <w:t xml:space="preserve">Commit(p(a),r(a)), </w:t>
+        </w:r>
+      </w:ins>
+      <w:r>
+        <w:t xml:space="preserve">where r(a) is a per-record random salt. The commitment scheme is required to be hiding (the commitment reveals nothing about the payload to an adversary without the salt) and binding (no second payload can be opened against the same commitment). The requirement that it be hiding rather than a bare hash is a consequence of Section 4.9 and is not optional. - k(a) is the payload key: the key material under which p(a) is stored. - t(a) is the month in which the access event occurred. - F(a) ∈ ℕ is the retention floor applying to the record, expressed in months. - σ(a) ∈ {primary, secondary} is the pathway in which the record arose.</w:t>
       </w:r>
     </w:p>
     <w:p>
@@ -3608,12 +3686,12 @@
       <w:r>
         <w:t xml:space="preserve">Finally, let α(a,t) ∈ {0, 1} be the payload-accessibility variable: α(a,t) = 1 if the controller can recover p(a) in intelligible form at month t, and 0 otherwise. This single binary variable per record per month is the entire state space of the model, and its minimality is deliberate: the conflict turns on exactly one question, which is whether the payload is readable, and a formulation that admits no other state variable cannot obscure that question behind modelling detail. The cost of that minimality is that the model cannot represent field-level redaction, where some elements of a payload are erased and others retained; Chapter 3, Section 3.7 records this as a stated </w:t>
       </w:r>
-      <w:del w:id="129" w:author="Arshad Akhtar Abbasia" w:date="2026-10-04T12:00:00Z">
+      <w:del w:id="141" w:author="Arshad Akhtar Abbasia" w:date="2026-10-04T12:00:00Z">
         <w:r>
           <w:delText xml:space="preserve">abstraction.</w:delText>
         </w:r>
       </w:del>
-      <w:ins w:id="130" w:author="Arshad Akhtar Abbasia" w:date="2026-10-04T12:00:00Z">
+      <w:ins w:id="142" w:author="Arshad Akhtar Abbasia" w:date="2026-10-04T12:00:00Z">
         <w:r>
           <w:t xml:space="preserve">abstraction, and Corollary 2.3 relaxes it for one case.</w:t>
         </w:r>
@@ -3650,7 +3728,7 @@
       <w:r>
         <w:t xml:space="preserve">Each regime </w:t>
       </w:r>
-      <w:del w:id="131" w:author="Arshad Akhtar Abbasia" w:date="2026-10-04T12:00:00Z">
+      <w:del w:id="143" w:author="Arshad Akhtar Abbasia" w:date="2026-10-04T12:00:00Z">
         <w:r>
           <w:delText xml:space="preserve">is </w:delText>
         </w:r>
@@ -3658,12 +3736,12 @@
       <w:r>
         <w:t xml:space="preserve">now </w:t>
       </w:r>
-      <w:del w:id="132" w:author="Arshad Akhtar Abbasia" w:date="2026-10-04T12:00:00Z">
+      <w:del w:id="144" w:author="Arshad Akhtar Abbasia" w:date="2026-10-04T12:00:00Z">
         <w:r>
           <w:delText xml:space="preserve">expressed as </w:delText>
         </w:r>
       </w:del>
-      <w:ins w:id="133" w:author="Arshad Akhtar Abbasia" w:date="2026-10-04T12:00:00Z">
+      <w:ins w:id="145" w:author="Arshad Akhtar Abbasia" w:date="2026-10-04T12:00:00Z">
         <w:r>
           <w:t xml:space="preserve">becomes </w:t>
         </w:r>
@@ -3671,12 +3749,12 @@
       <w:r>
         <w:t xml:space="preserve">a constraint on the trajectory of α and </w:t>
       </w:r>
-      <w:del w:id="134" w:author="Arshad Akhtar Abbasia" w:date="2026-10-04T12:00:00Z">
+      <w:del w:id="146" w:author="Arshad Akhtar Abbasia" w:date="2026-10-04T12:00:00Z">
         <w:r>
           <w:delText xml:space="preserve">V.</w:delText>
         </w:r>
       </w:del>
-      <w:ins w:id="135" w:author="Arshad Akhtar Abbasia" w:date="2026-10-04T12:00:00Z">
+      <w:ins w:id="147" w:author="Arshad Akhtar Abbasia" w:date="2026-10-04T12:00:00Z">
         <w:r>
           <w:t xml:space="preserve">V: one floor that says how long a record must last, and two limits that say how soon its payload must go.</w:t>
         </w:r>
@@ -3729,12 +3807,12 @@
       <w:r>
         <w:t xml:space="preserve">The payload must cease to be accessible within the response period δ. Source: Article 17(1) GDPR, with δ determined by Article 12(3) GDPR, which requires the controller to act without undue delay and in any event within one month of receipt, extendable by two further months for complex or numerous requests provided the data subject is informed within the first month. The model takes δ = 1 as the baseline and admits δ = 3 as the extended case; results are stated for arbitrary finite δ and do not depend on which is chosen. Constraint C2 is triggered only by a valid request. The model does not represent the Article 17(3) exemptions under which a controller may lawfully refuse, and so treats every arriving request as valid; Chapter 3, Section 3.7 explains why this affects the frequencies reported in Chapter 5 but not the </w:t>
       </w:r>
-      <w:del w:id="136" w:author="Arshad Akhtar Abbasia" w:date="2026-10-04T12:00:00Z">
+      <w:del w:id="148" w:author="Arshad Akhtar Abbasia" w:date="2026-10-04T12:00:00Z">
         <w:r>
           <w:delText xml:space="preserve">propositions.</w:delText>
         </w:r>
       </w:del>
-      <w:ins w:id="137" w:author="Arshad Akhtar Abbasia" w:date="2026-10-04T12:00:00Z">
+      <w:ins w:id="149" w:author="Arshad Akhtar Abbasia" w:date="2026-10-04T12:00:00Z">
         <w:r>
           <w:t xml:space="preserve">propositions. In the secondary-use pathway two provisions narrow C2 further. Article 17(3)(d) GDPR disapplies the right where processing is necessary for “scientific or historical research purposes or statistical purposes in accordance with Article 89(1) in so far as the right referred to in paragraph 1 is likely to render impossible or seriously impair the achievement of the objectives of that processing”, and the Regulation gives natural persons instead a right to opt out of secondary use, which is reversible and does not reach processing under data permits issued before it was exercised (Article 71(1) and (3) EHDS). For the environment’s own access logs, which serve Article 73(1)(e) rather than the research, the exemption that applies within the floor is Article 17(3)(b). The effect is that fewer SPE requests reach C2 than the model assumes, and a record that no request reaches faces only the floor and the ceiling, which is the case of Corollary 1.2.</w:t>
         </w:r>
@@ -3800,10 +3878,10 @@
       <w:pPr>
         <w:pStyle w:val="BodyText"/>
         <w:rPr>
-          <w:ins w:id="138" w:author="Arshad Akhtar Abbasia" w:date="2026-10-04T12:00:00Z"/>
+          <w:ins w:id="150" w:author="Arshad Akhtar Abbasia" w:date="2026-10-04T12:00:00Z"/>
         </w:rPr>
       </w:pPr>
-      <w:ins w:id="139" w:author="Arshad Akhtar Abbasia" w:date="2026-10-04T12:00:00Z">
+      <w:ins w:id="151" w:author="Arshad Akhtar Abbasia" w:date="2026-10-04T12:00:00Z">
         <w:r>
           <w:t xml:space="preserve">Everything now turns on one undefined word: verifiable. Two definitions are available, and the propositions show that they lead to opposite answers.</w:t>
         </w:r>
@@ -3829,10 +3907,10 @@
       <w:pPr>
         <w:pStyle w:val="BodyText"/>
         <w:rPr>
-          <w:ins w:id="140" w:author="Arshad Akhtar Abbasia" w:date="2026-10-04T12:00:00Z"/>
+          <w:ins w:id="152" w:author="Arshad Akhtar Abbasia" w:date="2026-10-04T12:00:00Z"/>
         </w:rPr>
       </w:pPr>
-      <w:ins w:id="141" w:author="Arshad Akhtar Abbasia" w:date="2026-10-04T12:00:00Z">
+      <w:ins w:id="153" w:author="Arshad Akhtar Abbasia" w:date="2026-10-04T12:00:00Z">
         <w:r>
           <w:t xml:space="preserve">This is the semantics of an audit log that keeps what was accessed readable for as long as it keeps the record. Under it, an audit record whose payload cannot be produced is treated as an incomplete or broken record, and audit integrity is understood as the continued producibility of what was accessed. The reference implementation of the cross-border gateway is built as such a log: whatever an audit message carries stays readable. In the 2017 OpenNCP source, the audit record repository stored every received audit message whole, in a database column for the message content. The patient identifier sat in a readable column, and a further column held the participant-object query. The repository refused to modify a stored message, and its audit code had no scheduled retention or purge logic, so how long the content stayed readable was left to the operator (OpenNCP Project, 2017). The schema deployed with OpenNCP 9.1.0 in 2026 keeps the same columns (Sundhedsdatastyrelsen, 2026); whether they are populated in a given deployment was not inspected. In the 2017 source the patient-discovery audit carried the patient identifier and the full SOAP security header of the request, which in the model are subject and accessor fields, though not the demographic query that ITI-55 asks gateways to record. “Verification” there meant that the sending gateway signed each audit message (enveloped XML signature); the repository stored the signature but did not check it, and kept no hash chain or other tamper evidence beyond its refusal to modify. How other deployments configure retention is not established here. No instrument states this semantics, and none states the alternative.</w:t>
         </w:r>
@@ -3842,10 +3920,10 @@
       <w:pPr>
         <w:pStyle w:val="BodyText"/>
         <w:rPr>
-          <w:del w:id="142" w:author="Arshad Akhtar Abbasia" w:date="2026-10-04T12:00:00Z"/>
+          <w:del w:id="154" w:author="Arshad Akhtar Abbasia" w:date="2026-10-04T12:00:00Z"/>
         </w:rPr>
       </w:pPr>
-      <w:del w:id="143" w:author="Arshad Akhtar Abbasia" w:date="2026-10-04T12:00:00Z">
+      <w:del w:id="155" w:author="Arshad Akhtar Abbasia" w:date="2026-10-04T12:00:00Z">
         <w:r>
           <w:delText xml:space="preserve">This is the semantics of an audit log that keeps what was accessed readable for as long as it keeps the record. Under it, an audit record whose payload cannot be produced is treated as an incomplete or broken record, and audit integrity is understood as the continued producibility of what was accessed. How common such logs are is not established here. What is established is that nothing in the instruments rules them out and that the cross-border profile supplies their content, since ITI-55 requires both gateways to record the patient’s demographic query (Section 4.3). No instrument states this semantics, and none states the alternative.</w:delText>
         </w:r>
@@ -3903,10 +3981,10 @@
       <w:pPr>
         <w:pStyle w:val="BodyText"/>
         <w:rPr>
-          <w:ins w:id="144" w:author="Arshad Akhtar Abbasia" w:date="2026-10-04T12:00:00Z"/>
+          <w:ins w:id="156" w:author="Arshad Akhtar Abbasia" w:date="2026-10-04T12:00:00Z"/>
         </w:rPr>
       </w:pPr>
-      <w:ins w:id="145" w:author="Arshad Akhtar Abbasia" w:date="2026-10-04T12:00:00Z">
+      <w:ins w:id="157" w:author="Arshad Akhtar Abbasia" w:date="2026-10-04T12:00:00Z">
         <w:r>
           <w:t xml:space="preserve">Under Semantics I the conflict is not bad luck or rare timing. It is a contradiction, and it can be located to the month.</w:t>
         </w:r>
@@ -3959,12 +4037,12 @@
       <w:r>
         <w:t xml:space="preserve">Where it holds, Corollary 1.2 is </w:t>
       </w:r>
-      <w:del w:id="146" w:author="Arshad Akhtar Abbasia" w:date="2026-10-04T12:00:00Z">
+      <w:del w:id="158" w:author="Arshad Akhtar Abbasia" w:date="2026-10-04T12:00:00Z">
         <w:r>
           <w:delText xml:space="preserve">the sharpest form </w:delText>
         </w:r>
       </w:del>
-      <w:ins w:id="147" w:author="Arshad Akhtar Abbasia" w:date="2026-10-04T12:00:00Z">
+      <w:ins w:id="159" w:author="Arshad Akhtar Abbasia" w:date="2026-10-04T12:00:00Z">
         <w:r>
           <w:t xml:space="preserve">a conditional extension </w:t>
         </w:r>
@@ -3972,7 +4050,7 @@
       <w:r>
         <w:t xml:space="preserve">of the </w:t>
       </w:r>
-      <w:del w:id="148" w:author="Arshad Akhtar Abbasia" w:date="2026-10-04T12:00:00Z">
+      <w:del w:id="160" w:author="Arshad Akhtar Abbasia" w:date="2026-10-04T12:00:00Z">
         <w:r>
           <w:delText xml:space="preserve">thesis’s </w:delText>
         </w:r>
@@ -3980,12 +4058,12 @@
       <w:r>
         <w:t xml:space="preserve">problem </w:t>
       </w:r>
-      <w:del w:id="149" w:author="Arshad Akhtar Abbasia" w:date="2026-10-04T12:00:00Z">
+      <w:del w:id="161" w:author="Arshad Akhtar Abbasia" w:date="2026-10-04T12:00:00Z">
         <w:r>
           <w:delText xml:space="preserve">statement. </w:delText>
         </w:r>
       </w:del>
-      <w:ins w:id="150" w:author="Arshad Akhtar Abbasia" w:date="2026-10-04T12:00:00Z">
+      <w:ins w:id="162" w:author="Arshad Akhtar Abbasia" w:date="2026-10-04T12:00:00Z">
         <w:r>
           <w:t xml:space="preserve">statement; the request-driven conflict of Corollary 1.1 does not depend on it. </w:t>
         </w:r>
@@ -4033,12 +4111,12 @@
       <w:r>
         <w:t xml:space="preserve">The narrow reading, or logs kept at dataset granularity, therefore cost the thesis its </w:t>
       </w:r>
-      <w:del w:id="151" w:author="Arshad Akhtar Abbasia" w:date="2026-10-04T12:00:00Z">
+      <w:del w:id="163" w:author="Arshad Akhtar Abbasia" w:date="2026-10-04T12:00:00Z">
         <w:r>
           <w:delText xml:space="preserve">sharpest instance </w:delText>
         </w:r>
       </w:del>
-      <w:ins w:id="152" w:author="Arshad Akhtar Abbasia" w:date="2026-10-04T12:00:00Z">
+      <w:ins w:id="164" w:author="Arshad Akhtar Abbasia" w:date="2026-10-04T12:00:00Z">
         <w:r>
           <w:t xml:space="preserve">conditional extension </w:t>
         </w:r>
@@ -4091,12 +4169,12 @@
       <w:pPr>
         <w:pStyle w:val="BodyText"/>
         <w:rPr>
-          <w:ins w:id="153" w:author="Arshad Akhtar Abbasia" w:date="2026-10-04T12:00:00Z"/>
+          <w:ins w:id="165" w:author="Arshad Akhtar Abbasia" w:date="2026-10-04T12:00:00Z"/>
         </w:rPr>
       </w:pPr>
-      <w:ins w:id="154" w:author="Arshad Akhtar Abbasia" w:date="2026-10-04T12:00:00Z">
-        <w:r>
-          <w:t xml:space="preserve">Change what verifiable means and the contradiction disappears, for every record, every pattern of requests and every floor. The proof builds the trajectory that does it, and that trajectory is the mechanism.</w:t>
+      <w:ins w:id="166" w:author="Arshad Akhtar Abbasia" w:date="2026-10-04T12:00:00Z">
+        <w:r>
+          <w:t xml:space="preserve">Change what verifiable means and, in the model as formalised, the contradiction disappears for every record, every pattern of requests and every floor. The proof builds the trajectory that does it, and that trajectory is the mechanism.</w:t>
         </w:r>
       </w:ins>
     </w:p>
@@ -4129,7 +4207,7 @@
         <w:pStyle w:val="BodyText"/>
       </w:pPr>
       <w:r>
-        <w:t xml:space="preserve">be the invalidation month, with the convention min(∞, ∞) = ∞. Construct the trajectory:</w:t>
+        <w:t xml:space="preserve">be the invalidation month, with the convention min (∞,∞) = ∞. Construct the trajectory:</w:t>
       </w:r>
     </w:p>
     <w:p>
@@ -4200,10 +4278,10 @@
       <w:pPr>
         <w:pStyle w:val="BodyText"/>
         <w:rPr>
-          <w:ins w:id="155" w:author="Arshad Akhtar Abbasia" w:date="2026-10-04T12:00:00Z"/>
+          <w:ins w:id="167" w:author="Arshad Akhtar Abbasia" w:date="2026-10-04T12:00:00Z"/>
         </w:rPr>
       </w:pPr>
-      <w:ins w:id="156" w:author="Arshad Akhtar Abbasia" w:date="2026-10-04T12:00:00Z">
+      <w:ins w:id="168" w:author="Arshad Akhtar Abbasia" w:date="2026-10-04T12:00:00Z">
         <w:r>
           <w:t xml:space="preserve">Corollary 2.3 (sensitivity to what auditing needs). Extend the model with one accessibility variable per part of the payload, which the single-variable model of Section 4.3 cannot express, and partition the payload as p(a) = p_(n)(a) ∪ p_(r)(a), where p_(n)(a) is any part that auditing turns out to need, and retain p_(n)(a) with the accessor fields. The trajectory of Proposition 2, with p_(r)(a) in place of p(a), satisfies C1 and C2, and it satisfies C3 unless p_(n)(a) is itself electronic health data within the environment on the broad reading of Article 68(12). In that case C1 and C3 collide over p_(n)(a), by the argument of Proposition 3, for exactly the records it identifies under case (ii). The collision follows from keeping p_(n)(a) intact under condition (i) without the logged-removal exception that the subject fields have. Relocation (Section 4.10, Rival 6) is the exit this thesis identifies; logging at dataset granularity, the narrow reading, or anonymising p_(n)(a) are others.</w:t>
         </w:r>
@@ -4213,10 +4291,10 @@
       <w:pPr>
         <w:pStyle w:val="BodyText"/>
         <w:rPr>
-          <w:ins w:id="157" w:author="Arshad Akhtar Abbasia" w:date="2026-10-04T12:00:00Z"/>
+          <w:ins w:id="169" w:author="Arshad Akhtar Abbasia" w:date="2026-10-04T12:00:00Z"/>
         </w:rPr>
       </w:pPr>
-      <w:ins w:id="158" w:author="Arshad Akhtar Abbasia" w:date="2026-10-04T12:00:00Z">
+      <w:ins w:id="170" w:author="Arshad Akhtar Abbasia" w:date="2026-10-04T12:00:00Z">
         <w:r>
           <w:t xml:space="preserve">Proof sketch. Replace p by p_(r) in steps 1–4 and add p_(n) to the fields that condition (i) of Semantics II keeps intact. C1 holds as before. C2 holds for p_(r) as before, and for p_(n) through Article 17(3)(b), which applies because p_(n) is by assumption necessary. C3 constrains whatever is electronic health data within the environment: if p_(n) is not, C3 is met as before; if it is, C3 requires it gone from t_(π)(a) + 6 while C1 requires it until t(a) + F(a), and the argument of Proposition 3 gives the records for which these overlap. ∎</w:t>
         </w:r>
@@ -4226,10 +4304,10 @@
       <w:pPr>
         <w:pStyle w:val="BodyText"/>
         <w:rPr>
-          <w:ins w:id="159" w:author="Arshad Akhtar Abbasia" w:date="2026-10-04T12:00:00Z"/>
+          <w:ins w:id="171" w:author="Arshad Akhtar Abbasia" w:date="2026-10-04T12:00:00Z"/>
         </w:rPr>
       </w:pPr>
-      <w:ins w:id="160" w:author="Arshad Akhtar Abbasia" w:date="2026-10-04T12:00:00Z">
+      <w:ins w:id="172" w:author="Arshad Akhtar Abbasia" w:date="2026-10-04T12:00:00Z">
         <w:r>
           <w:t xml:space="preserve">Feasibility therefore survives any enlargement of what auditing needs, except an enlargement into data concerning health inside a Secure Processing Environment, where it fails as Corollary 1.2 does and has the same exits.</w:t>
         </w:r>
@@ -4242,12 +4320,12 @@
       <w:r>
         <w:t xml:space="preserve">A note on what kind of result this is. The results of this chapter are stated as propositions rather than theorems, because their proofs are short once the semantics are fixed. The weight of the argument lies elsewhere: in Section 4.2’s necessity analysis, which justifies Semantics II, and in Propositions 3 and 4, which say where the conflict arises and where cryptography is necessary. One objection is that Proposition 2 proves little, because Semantics II was defined in full knowledge of the trajectory that satisfies it. The objection has </w:t>
       </w:r>
-      <w:del w:id="161" w:author="Arshad Akhtar Abbasia" w:date="2026-10-04T12:00:00Z">
+      <w:del w:id="173" w:author="Arshad Akhtar Abbasia" w:date="2026-10-04T12:00:00Z">
         <w:r>
           <w:delText xml:space="preserve">force and the </w:delText>
         </w:r>
       </w:del>
-      <w:ins w:id="162" w:author="Arshad Akhtar Abbasia" w:date="2026-10-04T12:00:00Z">
+      <w:ins w:id="174" w:author="Arshad Akhtar Abbasia" w:date="2026-10-04T12:00:00Z">
         <w:r>
           <w:t xml:space="preserve">force. The </w:t>
         </w:r>
@@ -4255,12 +4333,12 @@
       <w:r>
         <w:t xml:space="preserve">response </w:t>
       </w:r>
-      <w:del w:id="163" w:author="Arshad Akhtar Abbasia" w:date="2026-10-04T12:00:00Z">
+      <w:del w:id="175" w:author="Arshad Akhtar Abbasia" w:date="2026-10-04T12:00:00Z">
         <w:r>
           <w:delText xml:space="preserve">is to concede </w:delText>
         </w:r>
       </w:del>
-      <w:ins w:id="164" w:author="Arshad Akhtar Abbasia" w:date="2026-10-04T12:00:00Z">
+      <w:ins w:id="176" w:author="Arshad Akhtar Abbasia" w:date="2026-10-04T12:00:00Z">
         <w:r>
           <w:t xml:space="preserve">concedes </w:t>
         </w:r>
@@ -4268,12 +4346,12 @@
       <w:r>
         <w:t xml:space="preserve">its premise and </w:t>
       </w:r>
-      <w:del w:id="165" w:author="Arshad Akhtar Abbasia" w:date="2026-10-04T12:00:00Z">
+      <w:del w:id="177" w:author="Arshad Akhtar Abbasia" w:date="2026-10-04T12:00:00Z">
         <w:r>
           <w:delText xml:space="preserve">deny </w:delText>
         </w:r>
       </w:del>
-      <w:ins w:id="166" w:author="Arshad Akhtar Abbasia" w:date="2026-10-04T12:00:00Z">
+      <w:ins w:id="178" w:author="Arshad Akhtar Abbasia" w:date="2026-10-04T12:00:00Z">
         <w:r>
           <w:t xml:space="preserve">denies </w:t>
         </w:r>
@@ -4281,12 +4359,12 @@
       <w:r>
         <w:t xml:space="preserve">its conclusion. The mathematical content of Proposition 2 is indeed modest: once verifiability is decoupled from payload accessibility, the existence of a satisfying trajectory is close to immediate, and the proof is a verification rather than a discovery. But the substantive claim of this chapter was never that a satisfying trajectory exists under some semantics; any number of semantics would admit one, including trivial semantics under which every record counts as verifiable always. The claim is that this semantics is a defensible reading of what the retention obligations require, grounded in the necessity boundary of Article 17(3)(b), the minimisation principle of Article 5(1)(c), and the accountability purpose the obligations serve. It is also the weakest departure from plaintext verifiability that achieves feasibility, preserving every element of the audit record that the accountability purpose needs and discarding only what it does not. Proposition 1 carries the load that Proposition 2 does not: it establishes that some departure is unavoidable, because </w:t>
       </w:r>
-      <w:del w:id="167" w:author="Arshad Akhtar Abbasia" w:date="2026-10-04T12:00:00Z">
+      <w:del w:id="179" w:author="Arshad Akhtar Abbasia" w:date="2026-10-04T12:00:00Z">
         <w:r>
           <w:delText xml:space="preserve">the status quo </w:delText>
         </w:r>
       </w:del>
-      <w:ins w:id="168" w:author="Arshad Akhtar Abbasia" w:date="2026-10-04T12:00:00Z">
+      <w:ins w:id="180" w:author="Arshad Akhtar Abbasia" w:date="2026-10-04T12:00:00Z">
         <w:r>
           <w:t xml:space="preserve">plaintext verifiability </w:t>
         </w:r>
@@ -4300,7 +4378,20 @@
         <w:pStyle w:val="BodyText"/>
       </w:pPr>
       <w:r>
-        <w:t xml:space="preserve">What the proposition does and does not establish. It establishes that the constraint system as formalised admits a solution, and exhibits one. It does not establish that the exhibited solution is lawful (that depends on whether the residue it leaves clears the legal threshold, which Section 4.9 addresses) nor that key destruction can be verified by an external party, which Section 4.10 concedes it cannot. The invalidation entry specified in Section 4.8 is an attested record of destruction, not a proof of it; the proof-of-secure-erasure and certified-deletion literatures reviewed in Chapter 2, Section 2.4 mark that boundary, and Chapter 6 treats it as the outer limit of the contribution. Proposition 2 is a mathematical result about a model, and its value is that it converts a question that has been debated qualitatively into one with a definite answer under stated assumptions.</w:t>
+        <w:t xml:space="preserve">What the proposition does and does not establish. It establishes that the constraint system as formalised admits a solution, and exhibits one. It does not establish that the exhibited solution is lawful (that depends on whether the residue it leaves clears the legal threshold, which Section 4.9 addresses) nor that key destruction can be verified by an external party, which Section </w:t>
+      </w:r>
+      <w:del w:id="181" w:author="Arshad Akhtar Abbasia" w:date="2026-10-04T12:00:00Z">
+        <w:r>
+          <w:delText xml:space="preserve">4.10 concedes </w:delText>
+        </w:r>
+      </w:del>
+      <w:ins w:id="182" w:author="Arshad Akhtar Abbasia" w:date="2026-10-04T12:00:00Z">
+        <w:r>
+          <w:t xml:space="preserve">4.9 and Chapter 6, Section 6.3 concede </w:t>
+        </w:r>
+      </w:ins>
+      <w:r>
+        <w:t xml:space="preserve">it cannot. The invalidation entry specified in Section 4.8 is an attested record of destruction, not a proof of it; the proof-of-secure-erasure and certified-deletion literatures reviewed in Chapter 2, Section 2.4 mark that boundary, and Chapter 6 treats it as the outer limit of the contribution. Proposition 2 is a mathematical result about a model, and its value is that it converts a question that has been debated qualitatively into one with a definite answer under stated assumptions.</w:t>
       </w:r>
     </w:p>
     <w:p>
@@ -4318,7 +4409,7 @@
       <w:r>
         <w:t xml:space="preserve">The </w:t>
       </w:r>
-      <w:del w:id="169" w:author="Arshad Akhtar Abbasia" w:date="2026-10-04T12:00:00Z">
+      <w:del w:id="183" w:author="Arshad Akhtar Abbasia" w:date="2026-10-04T12:00:00Z">
         <w:r>
           <w:delText xml:space="preserve">trajectory constructed in the </w:delText>
         </w:r>
@@ -4326,7 +4417,7 @@
       <w:r>
         <w:t xml:space="preserve">proof of Proposition 2 </w:t>
       </w:r>
-      <w:ins w:id="170" w:author="Arshad Akhtar Abbasia" w:date="2026-10-04T12:00:00Z">
+      <w:ins w:id="184" w:author="Arshad Akhtar Abbasia" w:date="2026-10-04T12:00:00Z">
         <w:r>
           <w:t xml:space="preserve">is also a build sheet: the trajectory it constructs </w:t>
         </w:r>
@@ -4334,14 +4425,40 @@
       <w:r>
         <w:t xml:space="preserve">is the specification of the mechanism. This section states it as an implementable </w:t>
       </w:r>
-      <w:del w:id="171" w:author="Arshad Akhtar Abbasia" w:date="2026-10-04T12:00:00Z">
+      <w:del w:id="185" w:author="Arshad Akhtar Abbasia" w:date="2026-10-04T12:00:00Z">
         <w:r>
           <w:delText xml:space="preserve">design.</w:delText>
         </w:r>
       </w:del>
-      <w:ins w:id="172" w:author="Arshad Akhtar Abbasia" w:date="2026-10-04T12:00:00Z">
-        <w:r>
-          <w:t xml:space="preserve">design: what is encrypted, what is committed, what is destroyed, and what is logged when it is.</w:t>
+      <w:ins w:id="186" w:author="Arshad Akhtar Abbasia" w:date="2026-10-04T12:00:00Z">
+        <w:r>
+          <w:t xml:space="preserve">design: what is encrypted, what is committed, what is destroyed, and what is logged when it is. Figure 4.1 shows the whole of it on one page.</w:t>
+        </w:r>
+      </w:ins>
+    </w:p>
+    <w:p>
+      <w:pPr>
+        <w:pStyle w:val="BodyText"/>
+        <w:rPr>
+          <w:ins w:id="187" w:author="Arshad Akhtar Abbasia" w:date="2026-10-04T12:00:00Z"/>
+        </w:rPr>
+      </w:pPr>
+      <w:ins w:id="188" w:author="Arshad Akhtar Abbasia" w:date="2026-10-04T12:00:00Z">
+        <w:r>
+          <w:t xml:space="preserve">[Figure 4.1. Crypto-Erasure by Invalidation at the audit boundary. Green arrows are writes at access time; purple dashed arrows are the two triggers; red dashed arrows are the destruction at the earlier of the erasure deadline and the deletion ceiling, which the invalidation entry then records in the registry and the log. The subject fields are removed only for patient-level Secure Processing Environment logs, at the ceiling. The Merkle log holds accessor fields, commitments and invalidation entries, never the payload or the subject fields.]</w:t>
+        </w:r>
+      </w:ins>
+    </w:p>
+    <w:p>
+      <w:pPr>
+        <w:pStyle w:val="BodyText"/>
+        <w:rPr>
+          <w:ins w:id="189" w:author="Arshad Akhtar Abbasia" w:date="2026-10-04T12:00:00Z"/>
+        </w:rPr>
+      </w:pPr>
+      <w:ins w:id="190" w:author="Arshad Akhtar Abbasia" w:date="2026-10-04T12:00:00Z">
+        <w:r>
+          <w:t xml:space="preserve">Figure 4.1. Crypto-Erasure by Invalidation at the audit boundary. Green arrows are writes at access time; purple dashed arrows are the two triggers; red dashed arrows are the destruction at the earlier of the erasure deadline and the deletion ceiling, which the invalidation entry then records in the registry and the log. The subject fields are removed only for patient-level Secure Processing Environment logs, at the ceiling. The Merkle log holds accessor fields, commitments and invalidation entries, never the payload or the subject fields.</w:t>
         </w:r>
       </w:ins>
     </w:p>
@@ -4366,7 +4483,7 @@
         <w:pStyle w:val="BodyText"/>
       </w:pPr>
       <w:r>
-        <w:t xml:space="preserve">Commitment. c(a) = Commit(p(a), r(a)) with a per-record salt r(a). The salt is stored with the metadata until invalidation and is destroyed together with k(a) at t^(I)(a). Before invalidation it lets an auditor open the commitment against the payload. After invalidation no opening can be checked, because the payload is no longer readable, while a retained salt would let anyone holding a candidate payload confirm a guess against c(a) (Section 4.9). Destroying the salt does not weaken binding, which is a property of the commitment value: no second payload can be opened against c(a), and after t^(I)(a) no payload can be opened against it at all. A party that holds its own copy of the payload and must later prove that it corresponds to c(a) has to obtain and keep the opening before invalidation; the audit store does not keep one for it. The scheme must be hiding: an adversary holding c(a) and lacking r(a) must learn nothing about p(a). A bare unsalted hash of the payload does not satisfy this and must not be used, for the reason given in Section 4.9.</w:t>
+        <w:t xml:space="preserve">Commitment. c(a) = Commit(p(a),r(a)) with a per-record salt r(a). The salt is stored with the metadata until invalidation and is destroyed together with k(a) at t^(I)(a). Before invalidation it lets an auditor open the commitment against the payload. After invalidation no opening can be checked, because the payload is no longer readable, while a retained salt would let anyone holding a candidate payload confirm a guess against c(a) (Section 4.9). Destroying the salt does not weaken binding, which is a property of the commitment value: no second payload can be opened against c(a), and after t^(I)(a) no payload can be opened against it at all. A party that holds its own copy of the payload and must later prove that it corresponds to c(a) has to obtain and keep the opening before invalidation; the audit store does not keep one for it. The scheme must be hiding: an adversary holding c(a) and lacking r(a) must learn nothing about p(a). A bare unsalted hash of the payload does not satisfy this and must not be used, for the reason given in Section 4.9.</w:t>
       </w:r>
     </w:p>
     <w:p>
@@ -4384,12 +4501,12 @@
       <w:r>
         <w:t xml:space="preserve">Tamper evidence. An append-only registry is only as good as the means of detecting an append-only violation. Secure audit logging has addressed this since Schneier and Kelsey (1999), whose hash-chained logs make earlier entries unalterable without detection; Merkle trees (Merkle, 1988) let the same assurance be checked for a single entry with a logarithmic proof (Crosby &amp; Wallach, 2009), and Certificate Transparency standardised that construction for public logs (Laurie, Langley, &amp; Kasper, 2013). The mechanism appends every access event, invalidation and subject-link removal to such a log, with the leaf and node hashing of RFC 6962, and Semantics II condition (i) is checked as an inclusion proof against the log’s root rather than as the presence of fields (Chapter 5, Section 5.7). What enters a leaf is chosen so that the log never needs erasing: the accessor fields, the creation month and the commitment, never the payload and never the subject fields. The tension that Chapter 2, Section 2.4 found unresolved in blockchain audit logging, an immutable trail facing an erasure right, therefore does not arise: what the right and the ceiling reach is held outside the log and destroyed there, and what the log holds is what accountability </w:t>
       </w:r>
-      <w:del w:id="173" w:author="Arshad Akhtar Abbasia" w:date="2026-10-04T12:00:00Z">
+      <w:del w:id="191" w:author="Arshad Akhtar Abbasia" w:date="2026-10-04T12:00:00Z">
         <w:r>
           <w:delText xml:space="preserve">requires.</w:delText>
         </w:r>
       </w:del>
-      <w:ins w:id="174" w:author="Arshad Akhtar Abbasia" w:date="2026-10-04T12:00:00Z">
+      <w:ins w:id="192" w:author="Arshad Akhtar Abbasia" w:date="2026-10-04T12:00:00Z">
         <w:r>
           <w:t xml:space="preserve">requires. Redactable and chameleon-hash designs, reviewed in Chapter 2, Section 2.4, resolve the same tension the other way, by letting a key holder rewrite the log.</w:t>
         </w:r>
@@ -4402,12 +4519,12 @@
       <w:r>
         <w:t xml:space="preserve">Accumulator-based validity witnesses. The set of currently valid (non-invalidated) records is maintained in a dynamic cryptographic accumulator supporting efficient revocation (Camenisch &amp; Lysyanskaya, 2002). This provides an auditor with a succinct proof that a given record either is or is not currently valid, without the auditor enumerating the registry. The accumulator is an efficiency and verifiability layer, not a load-bearing component of the propositions: Proposition 2 holds if validity is established by linear scan of the registry, and the accumulator makes that check succinct. The accumulator is specified but not implemented in the artefact </w:t>
       </w:r>
-      <w:del w:id="175" w:author="Arshad Akhtar Abbasia" w:date="2026-10-04T12:00:00Z">
+      <w:del w:id="193" w:author="Arshad Akhtar Abbasia" w:date="2026-10-04T12:00:00Z">
         <w:r>
           <w:delText xml:space="preserve">(Section </w:delText>
         </w:r>
       </w:del>
-      <w:ins w:id="176" w:author="Arshad Akhtar Abbasia" w:date="2026-10-04T12:00:00Z">
+      <w:ins w:id="194" w:author="Arshad Akhtar Abbasia" w:date="2026-10-04T12:00:00Z">
         <w:r>
           <w:t xml:space="preserve">(Chapter 6, Section </w:t>
         </w:r>
@@ -4439,7 +4556,7 @@
       <w:r>
         <w:t xml:space="preserve">Applying the mechanism to the two cases. For the cross-border primary-use case, the mechanism operates at the audit repository of the National Contact Point, at the point where the ATNA audit record is written. </w:t>
       </w:r>
-      <w:ins w:id="177" w:author="Arshad Akhtar Abbasia" w:date="2026-10-04T12:00:00Z">
+      <w:ins w:id="195" w:author="Arshad Akhtar Abbasia" w:date="2026-10-04T12:00:00Z">
         <w:r>
           <w:t xml:space="preserve">The patient link is retained there through the floor, for the reason Section 4.2 gives, and removed at the terminal transition. </w:t>
         </w:r>
@@ -4460,7 +4577,7 @@
       <w:pPr>
         <w:pStyle w:val="BodyText"/>
       </w:pPr>
-      <w:ins w:id="178" w:author="Arshad Akhtar Abbasia" w:date="2026-10-04T12:00:00Z">
+      <w:ins w:id="196" w:author="Arshad Akhtar Abbasia" w:date="2026-10-04T12:00:00Z">
         <w:r>
           <w:t xml:space="preserve">A mechanism that erases by destroying keys is only as good as what it leaves behind. </w:t>
         </w:r>
@@ -4492,12 +4609,12 @@
       <w:r>
         <w:t xml:space="preserve">The audit log raises the same threat one level up, and the same response answers it. A leaf hash must outlive the record’s fields, since the root depends on it, and it is computed over the accessor fields and the commitment. After the terminal transition the commitment survives and the accessor fields do not; an adversary who can enumerate candidate accessors, a small set in any one environment, could then recompute the leaf and confirm which accessor it was. The specification therefore places a per-entry random nonce in every leaf, held with the record and destroyed at the terminal transition with the identifying fields, so that a surviving leaf hash confirms nothing. The artefact does not implement the terminal transition, and its leaves omit the nonce accordingly </w:t>
       </w:r>
-      <w:del w:id="179" w:author="Arshad Akhtar Abbasia" w:date="2026-10-04T12:00:00Z">
+      <w:del w:id="197" w:author="Arshad Akhtar Abbasia" w:date="2026-10-04T12:00:00Z">
         <w:r>
           <w:delText xml:space="preserve">(Section </w:delText>
         </w:r>
       </w:del>
-      <w:ins w:id="180" w:author="Arshad Akhtar Abbasia" w:date="2026-10-04T12:00:00Z">
+      <w:ins w:id="198" w:author="Arshad Akhtar Abbasia" w:date="2026-10-04T12:00:00Z">
         <w:r>
           <w:t xml:space="preserve">(Chapter 6, Section </w:t>
         </w:r>
@@ -4566,7 +4683,7 @@
       <w:pPr>
         <w:pStyle w:val="BodyText"/>
       </w:pPr>
-      <w:ins w:id="181" w:author="Arshad Akhtar Abbasia" w:date="2026-10-04T12:00:00Z">
+      <w:ins w:id="199" w:author="Arshad Akhtar Abbasia" w:date="2026-10-04T12:00:00Z">
         <w:r>
           <w:t xml:space="preserve">If a simpler design solved the problem, this mechanism would be unnecessary. </w:t>
         </w:r>
@@ -4574,12 +4691,12 @@
       <w:r>
         <w:t xml:space="preserve">Six alternative designs are </w:t>
       </w:r>
-      <w:del w:id="182" w:author="Arshad Akhtar Abbasia" w:date="2026-10-04T12:00:00Z">
+      <w:del w:id="200" w:author="Arshad Akhtar Abbasia" w:date="2026-10-04T12:00:00Z">
         <w:r>
           <w:delText xml:space="preserve">considered. </w:delText>
         </w:r>
       </w:del>
-      <w:ins w:id="183" w:author="Arshad Akhtar Abbasia" w:date="2026-10-04T12:00:00Z">
+      <w:ins w:id="201" w:author="Arshad Akhtar Abbasia" w:date="2026-10-04T12:00:00Z">
         <w:r>
           <w:t xml:space="preserve">therefore tested against it. </w:t>
         </w:r>
@@ -4619,12 +4736,12 @@
       <w:r>
         <w:t xml:space="preserve">Rival 4: Delete the record and log the deletion. This is the closest rival and deserves the most care. Deleting the audit record while logging that a deletion occurred satisfies C2 and C3, and preserves a trace. It fails C1 under both semantics: under Semantics I trivially, and under Semantics II because condition (ii) fails: no commitment survives, so the auditor can establish that something was deleted but not that the deleted item was the payload bound to that specific access event. The distinction matters in adversarial conditions. A controller who deletes records and logs deletions can conceal the substitution of one record for </w:t>
       </w:r>
-      <w:del w:id="184" w:author="Arshad Akhtar Abbasia" w:date="2026-10-04T12:00:00Z">
+      <w:del w:id="202" w:author="Arshad Akhtar Abbasia" w:date="2026-10-04T12:00:00Z">
         <w:r>
           <w:delText xml:space="preserve">another; </w:delText>
         </w:r>
       </w:del>
-      <w:ins w:id="185" w:author="Arshad Akhtar Abbasia" w:date="2026-10-04T12:00:00Z">
+      <w:ins w:id="203" w:author="Arshad Akhtar Abbasia" w:date="2026-10-04T12:00:00Z">
         <w:r>
           <w:t xml:space="preserve">another. A commitment bound into the log at write time constrains this only for </w:t>
         </w:r>
@@ -4632,12 +4749,12 @@
       <w:r>
         <w:t xml:space="preserve">a </w:t>
       </w:r>
-      <w:del w:id="186" w:author="Arshad Akhtar Abbasia" w:date="2026-10-04T12:00:00Z">
+      <w:del w:id="204" w:author="Arshad Akhtar Abbasia" w:date="2026-10-04T12:00:00Z">
         <w:r>
           <w:delText xml:space="preserve">controller bound to a surviving commitment cannot. </w:delText>
         </w:r>
       </w:del>
-      <w:ins w:id="187" w:author="Arshad Akhtar Abbasia" w:date="2026-10-04T12:00:00Z">
+      <w:ins w:id="205" w:author="Arshad Akhtar Abbasia" w:date="2026-10-04T12:00:00Z">
         <w:r>
           <w:t xml:space="preserve">party that kept its own opening; once the salt and payload are destroyed no auditor can open it, so the advantage over this rival is narrower than first stated. </w:t>
         </w:r>
@@ -4685,12 +4802,12 @@
       <w:r>
         <w:t xml:space="preserve">Proof. The ceiling quantifies over the location: after relocation the record is not in it, so the ceiling holds, and on the rival’s premise the floor is met at the new location. The right quantifies over the controller: Article 17(1) obliges the controller holding the data to erase them, </w:t>
       </w:r>
-      <w:del w:id="188" w:author="Arshad Akhtar Abbasia" w:date="2026-10-04T12:00:00Z">
+      <w:del w:id="206" w:author="Arshad Akhtar Abbasia" w:date="2026-10-04T12:00:00Z">
         <w:r>
           <w:delText xml:space="preserve">and </w:delText>
         </w:r>
       </w:del>
-      <w:ins w:id="189" w:author="Arshad Akhtar Abbasia" w:date="2026-10-04T12:00:00Z">
+      <w:ins w:id="207" w:author="Arshad Akhtar Abbasia" w:date="2026-10-04T12:00:00Z">
         <w:r>
           <w:t xml:space="preserve">and, as a legal premise rather than a mathematical consequence, </w:t>
         </w:r>
@@ -4727,12 +4844,12 @@
       <w:pPr>
         <w:pStyle w:val="BodyText"/>
       </w:pPr>
-      <w:del w:id="190" w:author="Arshad Akhtar Abbasia" w:date="2026-10-04T12:00:00Z">
+      <w:del w:id="208" w:author="Arshad Akhtar Abbasia" w:date="2026-10-04T12:00:00Z">
         <w:r>
           <w:delText xml:space="preserve">The </w:delText>
         </w:r>
       </w:del>
-      <w:ins w:id="191" w:author="Arshad Akhtar Abbasia" w:date="2026-10-04T12:00:00Z">
+      <w:ins w:id="209" w:author="Arshad Akhtar Abbasia" w:date="2026-10-04T12:00:00Z">
         <w:r>
           <w:t xml:space="preserve">A </w:t>
         </w:r>
@@ -4740,7 +4857,7 @@
       <w:r>
         <w:t xml:space="preserve">mechanism </w:t>
       </w:r>
-      <w:ins w:id="192" w:author="Arshad Akhtar Abbasia" w:date="2026-10-04T12:00:00Z">
+      <w:ins w:id="210" w:author="Arshad Akhtar Abbasia" w:date="2026-10-04T12:00:00Z">
         <w:r>
           <w:t xml:space="preserve">is only as useful as the point at which it can be installed. This one </w:t>
         </w:r>
@@ -4772,9 +4889,9 @@
       <w:r>
         <w:t xml:space="preserve">Compatibility with the national criteria. The Norwegian criteria for Secure Processing Environments, in the version put to hearing, require an information-security management system as mandatory, recommend ISO 27001 certification, and require eID-based authentication at defined assurance levels (SPUHiN, 2025). </w:t>
       </w:r>
-      <w:ins w:id="193" w:author="Arshad Akhtar Abbasia" w:date="2026-10-04T12:00:00Z">
-        <w:r>
-          <w:t xml:space="preserve">The November 2024 draft is specific on logging. It makes tamper-proof, identifiable logs of access to the environment mandatory “for at least one year” (P13), and likewise logs of when files are extracted and by whom, kept for one year (P24); it recommends tamper-proof, identifiable logs of activities inside the environment (P14); and it lists back-up and log files among the matters a termination procedure must cover (P31) (SPUHiN, 2024; requirement numbers as in the draft). That is the one-year floor of Article 73(1)(e) in national form. None of the requirements inspected says how those logs are to be reconciled with deletion. </w:t>
+      <w:ins w:id="211" w:author="Arshad Akhtar Abbasia" w:date="2026-10-04T12:00:00Z">
+        <w:r>
+          <w:t xml:space="preserve">The November 2024 draft is specific on logging (SPUHiN, 2024; requirement numbers as in the draft). Tamper-proof, identifiable logs of access to the environment are mandatory “for at least one year” (P13). Logs of when files are extracted and by whom are mandatory, kept for one year (P24). Logs of activities inside the environment are recommended (P14). A defined termination procedure is mandatory (P31), and its implementation examples include the handling of back-ups and log files. That is the one-year floor of Article 73(1)(e) in national form. None of the requirements inspected says how those logs are to be reconciled with deletion. </w:t>
         </w:r>
       </w:ins>
       <w:r>
@@ -4810,7 +4927,7 @@
         <w:pStyle w:val="BodyText"/>
       </w:pPr>
       <w:r>
-        <w:t xml:space="preserve">------------------------------------------------------------------------------------------------------------------------------------------------------------------------------------------------------------------------------------------------------------------------------------------------------------------------------------------------------------------------------------------------------------------------------------------------------------------------------------------------------------------------------------------------------------------------ Requirement Source What the mechanism does Where Status ------------------------------------------------------------------------------------------------------------------------------------------------------------------------------------------- ------------------------------------------------------------------------- ------------------------------------------------------------------------------------------------------------------------- -------------------------------------- --------------------------------------------------------------------------------------------------------------------------------- Electronic health data within the SPE deleted within six months of permit expiry EHDS Art. 68(12) Payload key, salt and ciphertext destroyed at t_(π) + 6; subject fields of patient-level logs removed at the same month §4.7 steps 2–4; apply_invalidation() Met in the artefact (C3 over α and β: 0 violations)</w:t>
+        <w:t xml:space="preserve">----------------------------------------------------------------------------------------------------------------------------------------------------------------------------------------------------------------------------------------------------------------------------------------------------------------------------------------------------------------------------------------------------------------------------------------------------------------------------------------------------------------------------------------------------------------------------------------------------- Requirement Source What the mechanism does Where Status ------------------------------------------------------------------------------------------------------------------------------------------------------------------------------------------- ------------------------------------------------------------------------- ------------------------------------------------------------------------------------------------------------------------- -------------------------------------- -------------------------------------------------------------------------------------------------------------------------------------------------------------- Electronic health data within the SPE deleted within six months of permit expiry EHDS Art. 68(12) Payload key, salt and ciphertext destroyed at t_(π) + 6; subject fields of patient-level logs removed at the same month §4.7 steps 2–4; apply_invalidation() Met in the artefact (C3 over α and β: 0 violations)</w:t>
       </w:r>
     </w:p>
     <w:p>
@@ -4931,293 +5048,6 @@
       </w:pPr>
       <w:r>
         <w:t xml:space="preserve">Information-security management system (mandatory); ISO 27001 (recommended); eID login at defined assurance levels; personnel security SPUHiN (2025), hearing version Requires none of these to change; operates at the logging boundary §4.11 No conflict</w:t>
-      </w:r>
-    </w:p>
-    <w:p>
-      <w:pPr>
-        <w:pStyle w:val="BodyText"/>
-        <w:rPr>
-          <w:ins w:id="194" w:author="Arshad Akhtar Abbasia" w:date="2026-10-04T12:00:00Z"/>
-        </w:rPr>
-      </w:pPr>
-      <w:ins w:id="195" w:author="Arshad Akhtar Abbasia" w:date="2026-10-04T12:00:00Z">
-        <w:r>
-          <w:t xml:space="preserve">Tamper-proof, identifiable logs of access to the SPE, at least one year (mandatory); of file extraction, one year (mandatory); of activities (recommended) SPUHiN (2024), draft, P13, P24, P14 Accessor fields kept identifiable for the floor; every access event in the append-only Merkle log §4.3, §4.8; MerkleLog Met in the artefact (F = 12; both tamper tests fail V^(II))</w:t>
-        </w:r>
-      </w:ins>
-    </w:p>
-    <w:p>
-      <w:pPr>
-        <w:pStyle w:val="BodyText"/>
-        <w:rPr>
-          <w:ins w:id="196" w:author="Arshad Akhtar Abbasia" w:date="2026-10-04T12:00:00Z"/>
-        </w:rPr>
-      </w:pPr>
-      <w:ins w:id="197" w:author="Arshad Akhtar Abbasia" w:date="2026-10-04T12:00:00Z">
-        <w:r>
-          <w:t xml:space="preserve">Termination procedure covering deletion of files, back-ups and log files (mandatory) SPUHiN (2024), draft, P31 Supplies the rule for the log files: invalidation at the ceiling, terminal transition after the floor §4.8 Met by specification; the terminal transition is not implemented (§6.1)</w:t>
-        </w:r>
-      </w:ins>
-    </w:p>
-    <w:p>
-      <w:pPr>
-        <w:pStyle w:val="BodyText"/>
-      </w:pPr>
-      <w:r>
-        <w:t xml:space="preserve">Reconciliation of log retention with deletion SPUHiN (2025), hearing version Not addressed by the criteria at any grade; the mechanism supplies one §2.6, §4.11 Gap the thesis addresses ------------------------------------------------------------------------------------------------------------------------------------------------------------------------------------------------------------------------------------------------------------------------------------------------------------------------------------------------------------------------------------------------------------------------------------------------------------------------------------------------------------------------------------------------------------------------</w:t>
-      </w:r>
-    </w:p>
-    <w:p>
-      <w:pPr>
-        <w:pStyle w:val="BodyText"/>
-      </w:pPr>
-      <w:r>
-        <w:t xml:space="preserve">Three things follow from the table. Every requirement the artefact can execute is met in the run; the requirements met only by specification are hardware key custody, the terminal transition and the legal necessity argument, none of which a sandbox can demonstrate; and one row is open, which no artefact can close. The rows met by specification are those the expert evaluation of Chapter 3, Section 3.8 is designed to test with practitioners.</w:t>
-      </w:r>
-    </w:p>
-    <w:p>
-      <w:pPr>
-        <w:pStyle w:val="Heading2"/>
-      </w:pPr>
-      <w:r>
-        <w:t xml:space="preserve">4.12 Summary</w:t>
-      </w:r>
-    </w:p>
-    <w:p>
-      <w:pPr>
-        <w:pStyle w:val="BodyText"/>
-      </w:pPr>
-      <w:r>
-        <w:t xml:space="preserve">This chapter formalised the tri-lateral retention conflict as a constraint-satisfaction problem over a single binary accessibility variable per record, with the retention floor parameterised so that the ten-year cross-border audit floor and the one-year Secure Processing Environment log floor are instances of one constraint. It proved that under plaintext-verifiability semantics the system is infeasible for any cross-border record whose erasure request arrives inside its window and, for Secure Processing Environment logs kept at patient-record granularity on the broad reading, without any erasure request at all, where two retention provisions of a single regulation collide over a single environment. It proved that under an accountability-preserving semantics the system is jointly satisfiable for every arrival pattern and every floor, and the proof exhibited the trajectory that achieves satisfaction. It showed that a ceiling collides with a floor only when it is no longer than the floor, and that the ceiling’s anchor decides whether the collision can be read from the text (Proposition 3), and that relocating a record meets the ceiling but not the right (Proposition 4). That trajectory, specified as Crypto-Erasure by Invalidation, retains metadata and a hiding commitment, and destroys the payload key at the earlier of the erasure deadline and the deletion ceiling. It appends the invalidation to a tamper-evident audit log as a first-class, witnessed event, in a log built never to hold what erasure reaches. The salt and the payload ciphertext go with the key. At floor expiry it performs a terminal transition that destroys the identifying metadata, leaving a non-identifiable statistical residue, so that the record’s whole life cycle, not merely its retention window, is accounted for under the storage-limitation </w:t>
-      </w:r>
-      <w:del w:id="198" w:author="Arshad Akhtar Abbasia" w:date="2026-10-04T12:00:00Z">
-        <w:r>
-          <w:delText xml:space="preserve">principle.</w:delText>
-        </w:r>
-      </w:del>
-      <w:ins w:id="199" w:author="Arshad Akhtar Abbasia" w:date="2026-10-04T12:00:00Z">
-        <w:r>
-          <w:t xml:space="preserve">principle. The terminal transition, the per-entry nonce, consistency proofs and the accumulator layer are specified but not implemented in the artefact (Chapter 6, Section 6.1). For Secure Processing Environment records the result assumes that auditing does not need the payload; Corollary 2.3 states what follows if it needs part of it.</w:t>
-        </w:r>
-      </w:ins>
-    </w:p>
-    <w:p>
-      <w:pPr>
-        <w:pStyle w:val="BodyText"/>
-      </w:pPr>
-      <w:r>
-        <w:t xml:space="preserve">The mechanism’s residue is pseudonymised rather than anonymous by the strict Norwegian standard, it is defensible under the erasure test the European Data Protection Board has articulated provided the threat model is documented, and its long-horizon cryptographic risk is real and recorded. The limitations bearing on this chapter, the informal proof standard and the conditionality on honest key destruction among them, are those stated canonically in Chapter 3, Section 3.7 and are not restated here. Six rival designs were considered: five were rejected on stated grounds and one, relocation, was accepted for the ceiling alone. The principal cost objection was acknowledged rather than dismissed. The integration analysis placed the mechanism at the two narrowest points of the Norwegian infrastructure at which it achieves its purpose, requiring nothing of the substrate that the national criteria do not already require.</w:t>
-      </w:r>
-    </w:p>
-    <w:p>
-      <w:pPr>
-        <w:pStyle w:val="BodyText"/>
-      </w:pPr>
-      <w:r>
-        <w:t xml:space="preserve">Chapter 5 demonstrates Propositions 1 and 2 executably, over synthetic records generated as described in Chapter 3.</w:t>
-      </w:r>
-    </w:p>
-    <w:p>
-      <w:pPr>
-        <w:pStyle w:val="Heading1"/>
-      </w:pPr>
-      <w:r>
-        <w:t xml:space="preserve">Chapter 5. Demonstration</w:t>
-      </w:r>
-    </w:p>
-    <w:p>
-      <w:pPr>
-        <w:pStyle w:val="BodyText"/>
-      </w:pPr>
-      <w:r>
-        <w:t xml:space="preserve">Every figure reported in this chapter was produced by the code listed in Appendix A, executed under seed 20260915. The full-cohort comparison of Table 5.7 was recorded on 28 September with the code of that date; the committed-subset run (Appendix A, A.21) repeats it with the current code and gives the same figures.</w:t>
-      </w:r>
-    </w:p>
-    <w:p>
-      <w:pPr>
-        <w:pStyle w:val="Heading2"/>
-      </w:pPr>
-      <w:r>
-        <w:t xml:space="preserve">5.1 Purpose and Claim</w:t>
-      </w:r>
-    </w:p>
-    <w:p>
-      <w:pPr>
-        <w:pStyle w:val="BodyText"/>
-      </w:pPr>
-      <w:r>
-        <w:t xml:space="preserve">This chapter discharges Activity 4 of the design science cycle set out in Chapter 3, Section 3.2: demonstration. Its function is narrow.</w:t>
-      </w:r>
-    </w:p>
-    <w:p>
-      <w:pPr>
-        <w:pStyle w:val="BodyText"/>
-      </w:pPr>
-      <w:r>
-        <w:t xml:space="preserve">The chapter demonstrates that Propositions 1 and 2 of Chapter 4 hold on the instances examined; </w:t>
-      </w:r>
-      <w:del w:id="200" w:author="Arshad Akhtar Abbasia" w:date="2026-10-04T12:00:00Z">
-        <w:r>
-          <w:delText xml:space="preserve">Propositions 3 and </w:delText>
-        </w:r>
-      </w:del>
-      <w:ins w:id="201" w:author="Arshad Akhtar Abbasia" w:date="2026-10-04T12:00:00Z">
-        <w:r>
-          <w:t xml:space="preserve">Proposition </w:t>
-        </w:r>
-      </w:ins>
-      <w:r>
-        <w:t xml:space="preserve">4 </w:t>
-      </w:r>
-      <w:del w:id="202" w:author="Arshad Akhtar Abbasia" w:date="2026-10-04T12:00:00Z">
-        <w:r>
-          <w:delText xml:space="preserve">are </w:delText>
-        </w:r>
-      </w:del>
-      <w:ins w:id="203" w:author="Arshad Akhtar Abbasia" w:date="2026-10-04T12:00:00Z">
-        <w:r>
-          <w:t xml:space="preserve">is </w:t>
-        </w:r>
-      </w:ins>
-      <w:r>
-        <w:t xml:space="preserve">analytic and </w:t>
-      </w:r>
-      <w:del w:id="204" w:author="Arshad Akhtar Abbasia" w:date="2026-10-04T12:00:00Z">
-        <w:r>
-          <w:delText xml:space="preserve">are </w:delText>
-        </w:r>
-      </w:del>
-      <w:ins w:id="205" w:author="Arshad Akhtar Abbasia" w:date="2026-10-04T12:00:00Z">
-        <w:r>
-          <w:t xml:space="preserve">is </w:t>
-        </w:r>
-      </w:ins>
-      <w:r>
-        <w:t xml:space="preserve">not executed </w:t>
-      </w:r>
-      <w:del w:id="206" w:author="Arshad Akhtar Abbasia" w:date="2026-10-04T12:00:00Z">
-        <w:r>
-          <w:delText xml:space="preserve">here, although </w:delText>
-        </w:r>
-      </w:del>
-      <w:ins w:id="207" w:author="Arshad Akhtar Abbasia" w:date="2026-10-04T12:00:00Z">
-        <w:r>
-          <w:t xml:space="preserve">here; </w:t>
-        </w:r>
-      </w:ins>
-      <w:r>
-        <w:t xml:space="preserve">Section 5.4 computes the condition of Proposition </w:t>
-      </w:r>
-      <w:del w:id="208" w:author="Arshad Akhtar Abbasia" w:date="2026-10-04T12:00:00Z">
-        <w:r>
-          <w:delText xml:space="preserve">3. </w:delText>
-        </w:r>
-      </w:del>
-      <w:ins w:id="209" w:author="Arshad Akhtar Abbasia" w:date="2026-10-04T12:00:00Z">
-        <w:r>
-          <w:t xml:space="preserve">3 and Section 5.5 checks it. </w:t>
-        </w:r>
-      </w:ins>
-      <w:r>
-        <w:t xml:space="preserve">It does not verify them in the proof-assistant sense, it does not measure performance, and it does not deploy anything. Proposition 1 predicts that under plaintext-verifiability semantics the constraint system fails whenever an erasure deadline or a deletion-ceiling deadline falls inside a record’s retention window. Proposition 2 predicts that under accountability-preserving semantics the invalidation trajectory satisfies all three constraints for every arrival pattern. The demonstration’s job is to make both predictions checkable by execution rather than only by argument.</w:t>
-      </w:r>
-    </w:p>
-    <w:p>
-      <w:pPr>
-        <w:pStyle w:val="BodyText"/>
-      </w:pPr>
-      <w:r>
-        <w:t xml:space="preserve">A subsidiary claim is made for Corollary 1.2: that, on the broad reading of Article 68(12) and for logs kept at patient-record granularity, Secure Processing Environment access-log records become infeasible under plaintext semantics without any erasure request at all, through the collision of the Article 73(1)(e) one-year retention floor with the Article 68(12) six-month deletion ceiling. The demonstration produces thirty-nine such </w:t>
-      </w:r>
-      <w:del w:id="210" w:author="Arshad Akhtar Abbasia" w:date="2026-10-04T12:00:00Z">
-        <w:r>
-          <w:delText xml:space="preserve">witnesses.</w:delText>
-        </w:r>
-      </w:del>
-      <w:ins w:id="211" w:author="Arshad Akhtar Abbasia" w:date="2026-10-04T12:00:00Z">
-        <w:r>
-          <w:t xml:space="preserve">witnesses, a number the generator determines (Section 5.4).</w:t>
-        </w:r>
-      </w:ins>
-    </w:p>
-    <w:p>
-      <w:pPr>
-        <w:pStyle w:val="Heading2"/>
-      </w:pPr>
-      <w:r>
-        <w:t xml:space="preserve">5.2 Implementation</w:t>
-      </w:r>
-    </w:p>
-    <w:p>
-      <w:pPr>
-        <w:pStyle w:val="BodyText"/>
-      </w:pPr>
-      <w:r>
-        <w:t xml:space="preserve">The checker is a single Python module of 533 lines including documentation, the independent cross-check and the audit-log integrity check, of which 413 are non-blank, non-comment lines and the constraint-evaluation logic proper occupies approximately one hundred. It depends only on the Python standard library: hashlib for commitments and the audit log, json for log entries, random for seeded generation, and itertools for the exhaustive cross-check. The checker uses no cryptographic library, no solver, and no zero-knowledge proof system, consistent with the scope commitments of Chapter 1, Section 1.5; the optional envelope-encryption module below is the only component that imports one.</w:t>
-      </w:r>
-    </w:p>
-    <w:p>
-      <w:pPr>
-        <w:pStyle w:val="BodyText"/>
-      </w:pPr>
-      <w:r>
-        <w:t xml:space="preserve">Four further modules accompany it, none of which alters anything the checker reports. Their line counts, and the full source of each, are given in Appendix A.</w:t>
-      </w:r>
-    </w:p>
-    <w:p>
-      <w:pPr>
-        <w:pStyle w:val="BodyText"/>
-      </w:pPr>
-      <w:r>
-        <w:t xml:space="preserve">Table 5.1. The artefact as published</w:t>
-      </w:r>
-    </w:p>
-    <w:p>
-      <w:pPr>
-        <w:pStyle w:val="BodyText"/>
-      </w:pPr>
-      <w:r>
-        <w:t xml:space="preserve">-------------------------------------------------------------------------------------------------------------------------------------------------------------------------------------------------- Module Lines What it does Reports a thesis figure? ----------------------- ----------------- --------------------------------------------------------------------------------------------------------------------------- ---------------------------- trf_checker.py 533 Constraint evaluation under both semantics, plus the independent exhaustive cross-check and the audit-log integrity check Yes — Tables 5.3, 5.5, 5.6</w:t>
-      </w:r>
-    </w:p>
-    <w:p>
-      <w:pPr>
-        <w:pStyle w:val="BodyText"/>
-      </w:pPr>
-      <w:r>
-        <w:t xml:space="preserve">synthea_layer.py 152 Substitutes real FHIR R4 payloads and compares every figure against the constructed-payload run Yes — Table 5.7</w:t>
-      </w:r>
-    </w:p>
-    <w:p>
-      <w:pPr>
-        <w:pStyle w:val="BodyText"/>
-      </w:pPr>
-      <w:r>
-        <w:t xml:space="preserve">norwegian_layer.py 135 Three Norwegian record classes, varying only the floor, the pathway and the arrival of requests No</w:t>
-      </w:r>
-    </w:p>
-    <w:p>
-      <w:pPr>
-        <w:pStyle w:val="BodyText"/>
-      </w:pPr>
-      <w:r>
-        <w:t xml:space="preserve">cross_sector_check.py 110 The politiregisterloven § 17 instance discussed in Chapter 6, Section 6.10 No</w:t>
-      </w:r>
-    </w:p>
-    <w:p>
-      <w:pPr>
-        <w:pStyle w:val="BodyText"/>
-      </w:pPr>
-      <w:r>
-        <w:t xml:space="preserve">app.py 671 Six-tab viewer over the artefact; never a source of results No</w:t>
-      </w:r>
-    </w:p>
-    <w:p>
-      <w:pPr>
-        <w:pStyle w:val="BodyText"/>
-      </w:pPr>
-      <w:r>
-        <w:t xml:space="preserve">crypto_envelope.py 118 Optional: the same lifecycle with real AES-256-GCM envelope encryption (needs cryptography) No</w:t>
       </w:r>
     </w:p>
     <w:p>
@@ -5229,7 +5059,443 @@
       </w:pPr>
       <w:ins w:id="213" w:author="Arshad Akhtar Abbasia" w:date="2026-10-04T12:00:00Z">
         <w:r>
-          <w:t xml:space="preserve">z3_check.py 153 Optional: bounded SMT check of Propositions 1–3 (needs z3-solver) No --------------------------------------------------------------------------------------------------------------------------------------------------------------------------------------------------</w:t>
+          <w:t xml:space="preserve">Tamper-proof, identifiable logs of access to the SPE, at least one year (mandatory); of file extraction, one year (mandatory); of activities (recommended) SPUHiN (2024), draft, P13, P24, P14 Accessor fields kept identifiable for the floor; every access event in the append-only Merkle log §4.3, §4.8; MerkleLog Access logs met in the artefact (F = 12; both tamper tests fail V^(II)); extraction and activity logs covered by the same mechanism, not modelled separately</w:t>
+        </w:r>
+      </w:ins>
+    </w:p>
+    <w:p>
+      <w:pPr>
+        <w:pStyle w:val="BodyText"/>
+        <w:rPr>
+          <w:ins w:id="214" w:author="Arshad Akhtar Abbasia" w:date="2026-10-04T12:00:00Z"/>
+        </w:rPr>
+      </w:pPr>
+      <w:ins w:id="215" w:author="Arshad Akhtar Abbasia" w:date="2026-10-04T12:00:00Z">
+        <w:r>
+          <w:t xml:space="preserve">Defined termination procedure (mandatory); implementation examples include back-ups and log files SPUHiN (2024), draft, P31 Supplies the rule for the log files: invalidation at the ceiling, terminal transition after the floor §4.8 Met by specification; the terminal transition is not implemented (§6.1)</w:t>
+        </w:r>
+      </w:ins>
+    </w:p>
+    <w:p>
+      <w:pPr>
+        <w:pStyle w:val="BodyText"/>
+      </w:pPr>
+      <w:r>
+        <w:t xml:space="preserve">Reconciliation of log retention with deletion SPUHiN (2025), hearing version Not addressed by the criteria at any grade; the mechanism supplies one §2.6, §4.11 Gap the thesis addresses -----------------------------------------------------------------------------------------------------------------------------------------------------------------------------------------------------------------------------------------------------------------------------------------------------------------------------------------------------------------------------------------------------------------------------------------------------------------------------------------------------------------------------------------------------------------------------------------------------</w:t>
+      </w:r>
+    </w:p>
+    <w:p>
+      <w:pPr>
+        <w:pStyle w:val="BodyText"/>
+      </w:pPr>
+      <w:r>
+        <w:t xml:space="preserve">Three things follow from the table. Every requirement the artefact can execute is met in the run; the requirements met only by specification are hardware key custody, the terminal transition and the legal necessity argument, none of which a sandbox can demonstrate; and one row is open, which no artefact can close. The rows met by specification are those the expert evaluation of Chapter 3, Section 3.8 is designed to test with practitioners.</w:t>
+      </w:r>
+    </w:p>
+    <w:p>
+      <w:pPr>
+        <w:pStyle w:val="Heading2"/>
+      </w:pPr>
+      <w:r>
+        <w:t xml:space="preserve">4.12 Summary</w:t>
+      </w:r>
+    </w:p>
+    <w:p>
+      <w:pPr>
+        <w:pStyle w:val="BodyText"/>
+      </w:pPr>
+      <w:r>
+        <w:t xml:space="preserve">This chapter formalised the tri-lateral retention conflict as a constraint-satisfaction problem over a single binary accessibility variable per record, with the retention floor parameterised so that the ten-year cross-border audit floor and the one-year Secure Processing Environment log floor are instances of one constraint. It proved that under plaintext-verifiability semantics the system is infeasible for any cross-border record whose erasure request arrives inside its window and, for Secure Processing Environment logs kept at patient-record granularity on the broad reading, without any erasure request at all, where two retention provisions of a single regulation collide over a single environment. It proved that under an accountability-preserving semantics the system is jointly satisfiable for every arrival pattern and every floor, and the proof exhibited the trajectory that achieves satisfaction. It showed that a ceiling collides with a floor only when it is no longer than the floor, and that the ceiling’s anchor decides whether the collision can be read from the text (Proposition 3), and that relocating a record meets the ceiling but not the right (Proposition 4). That trajectory, specified as Crypto-Erasure by Invalidation, retains metadata and a hiding commitment, and destroys the payload key at the earlier of the erasure deadline and the deletion ceiling. It appends the invalidation to a tamper-evident audit log as a first-class, witnessed event, in a log built never to hold what erasure reaches. The salt and the payload ciphertext go with the key. At floor expiry it performs a terminal transition that destroys the identifying metadata, leaving a non-identifiable statistical residue, so that the record’s whole life cycle, not merely its retention window, is accounted for under the storage-limitation </w:t>
+      </w:r>
+      <w:del w:id="216" w:author="Arshad Akhtar Abbasia" w:date="2026-10-04T12:00:00Z">
+        <w:r>
+          <w:delText xml:space="preserve">principle.</w:delText>
+        </w:r>
+      </w:del>
+      <w:ins w:id="217" w:author="Arshad Akhtar Abbasia" w:date="2026-10-04T12:00:00Z">
+        <w:r>
+          <w:t xml:space="preserve">principle. The terminal transition, the per-entry nonce, consistency proofs and the accumulator layer are specified but not implemented in the artefact (Chapter 6, Section 6.1). For Secure Processing Environment records the result assumes that auditing does not need the payload; Corollary 2.3 states what follows if it needs part of it.</w:t>
+        </w:r>
+      </w:ins>
+    </w:p>
+    <w:p>
+      <w:pPr>
+        <w:pStyle w:val="BodyText"/>
+      </w:pPr>
+      <w:r>
+        <w:t xml:space="preserve">The mechanism’s residue is pseudonymised rather than anonymous by the strict Norwegian standard, it is defensible under the erasure test the European Data Protection Board has articulated </w:t>
+      </w:r>
+      <w:ins w:id="218" w:author="Arshad Akhtar Abbasia" w:date="2026-10-04T12:00:00Z">
+        <w:r>
+          <w:t xml:space="preserve">and, on Aikebaier’s (2026) reading, </w:t>
+        </w:r>
+      </w:ins>
+      <w:r>
+        <w:t xml:space="preserve">provided the threat model is documented, and its long-horizon cryptographic risk is real and recorded. The limitations bearing on this chapter, the informal proof standard and the conditionality on honest key destruction among them, are those stated canonically in Chapter 3, Section 3.7 and are not restated here. Six rival designs were considered: five were rejected on stated grounds and one, relocation, was accepted for the ceiling alone. The principal cost objection was acknowledged rather than dismissed. The integration analysis placed the mechanism at the two narrowest points of the Norwegian infrastructure at which it achieves its purpose, requiring nothing of the substrate that the national criteria do not already require.</w:t>
+      </w:r>
+    </w:p>
+    <w:p>
+      <w:pPr>
+        <w:pStyle w:val="BodyText"/>
+      </w:pPr>
+      <w:r>
+        <w:t xml:space="preserve">Chapter 5 demonstrates Propositions 1 and 2 executably, over synthetic records generated as described in Chapter 3.</w:t>
+      </w:r>
+    </w:p>
+    <w:p>
+      <w:pPr>
+        <w:pStyle w:val="Heading1"/>
+      </w:pPr>
+      <w:r>
+        <w:t xml:space="preserve">Chapter 5. Demonstration</w:t>
+      </w:r>
+    </w:p>
+    <w:p>
+      <w:pPr>
+        <w:pStyle w:val="BodyText"/>
+      </w:pPr>
+      <w:r>
+        <w:t xml:space="preserve">Every figure reported in this chapter was produced by the code listed in Appendix A, executed under seed 20260915. The full-cohort comparison of Table 5.7 was recorded on 28 September with the code of that date; the committed-subset run (Appendix A, A.21) repeats it with the current code and gives the same figures.</w:t>
+      </w:r>
+    </w:p>
+    <w:p>
+      <w:pPr>
+        <w:pStyle w:val="Heading2"/>
+      </w:pPr>
+      <w:r>
+        <w:t xml:space="preserve">5.1 Purpose and Claim</w:t>
+      </w:r>
+    </w:p>
+    <w:p>
+      <w:pPr>
+        <w:pStyle w:val="BodyText"/>
+      </w:pPr>
+      <w:r>
+        <w:t xml:space="preserve">This chapter discharges Activity 4 of the design science cycle set out in Chapter 3, Section 3.2: demonstration. Its function is narrow.</w:t>
+      </w:r>
+    </w:p>
+    <w:p>
+      <w:pPr>
+        <w:pStyle w:val="BodyText"/>
+      </w:pPr>
+      <w:r>
+        <w:t xml:space="preserve">The chapter demonstrates that Propositions 1 and 2 of Chapter 4 hold on the instances examined; </w:t>
+      </w:r>
+      <w:del w:id="219" w:author="Arshad Akhtar Abbasia" w:date="2026-10-04T12:00:00Z">
+        <w:r>
+          <w:delText xml:space="preserve">Propositions 3 and </w:delText>
+        </w:r>
+      </w:del>
+      <w:ins w:id="220" w:author="Arshad Akhtar Abbasia" w:date="2026-10-04T12:00:00Z">
+        <w:r>
+          <w:t xml:space="preserve">Proposition </w:t>
+        </w:r>
+      </w:ins>
+      <w:r>
+        <w:t xml:space="preserve">4 </w:t>
+      </w:r>
+      <w:del w:id="221" w:author="Arshad Akhtar Abbasia" w:date="2026-10-04T12:00:00Z">
+        <w:r>
+          <w:delText xml:space="preserve">are </w:delText>
+        </w:r>
+      </w:del>
+      <w:ins w:id="222" w:author="Arshad Akhtar Abbasia" w:date="2026-10-04T12:00:00Z">
+        <w:r>
+          <w:t xml:space="preserve">is </w:t>
+        </w:r>
+      </w:ins>
+      <w:r>
+        <w:t xml:space="preserve">analytic and </w:t>
+      </w:r>
+      <w:del w:id="223" w:author="Arshad Akhtar Abbasia" w:date="2026-10-04T12:00:00Z">
+        <w:r>
+          <w:delText xml:space="preserve">are </w:delText>
+        </w:r>
+      </w:del>
+      <w:ins w:id="224" w:author="Arshad Akhtar Abbasia" w:date="2026-10-04T12:00:00Z">
+        <w:r>
+          <w:t xml:space="preserve">is </w:t>
+        </w:r>
+      </w:ins>
+      <w:r>
+        <w:t xml:space="preserve">not executed </w:t>
+      </w:r>
+      <w:del w:id="225" w:author="Arshad Akhtar Abbasia" w:date="2026-10-04T12:00:00Z">
+        <w:r>
+          <w:delText xml:space="preserve">here, although </w:delText>
+        </w:r>
+      </w:del>
+      <w:ins w:id="226" w:author="Arshad Akhtar Abbasia" w:date="2026-10-04T12:00:00Z">
+        <w:r>
+          <w:t xml:space="preserve">here; </w:t>
+        </w:r>
+      </w:ins>
+      <w:r>
+        <w:t xml:space="preserve">Section 5.4 computes the condition of Proposition </w:t>
+      </w:r>
+      <w:del w:id="227" w:author="Arshad Akhtar Abbasia" w:date="2026-10-04T12:00:00Z">
+        <w:r>
+          <w:delText xml:space="preserve">3. </w:delText>
+        </w:r>
+      </w:del>
+      <w:ins w:id="228" w:author="Arshad Akhtar Abbasia" w:date="2026-10-04T12:00:00Z">
+        <w:r>
+          <w:t xml:space="preserve">3 and Section 5.5 checks it. </w:t>
+        </w:r>
+      </w:ins>
+      <w:r>
+        <w:t xml:space="preserve">It does not verify them in the proof-assistant sense, it does not measure performance, and it does not deploy anything. Proposition 1 predicts that under plaintext-verifiability semantics the constraint system fails whenever an erasure deadline or a deletion-ceiling deadline falls inside a record’s retention window. Proposition 2 predicts that under accountability-preserving semantics the invalidation trajectory satisfies all three constraints for every arrival pattern. The demonstration’s job is to make both predictions checkable by execution rather than only by argument.</w:t>
+      </w:r>
+    </w:p>
+    <w:p>
+      <w:pPr>
+        <w:pStyle w:val="BodyText"/>
+      </w:pPr>
+      <w:r>
+        <w:t xml:space="preserve">A subsidiary claim is made for Corollary 1.2: that, on the broad reading of Article 68(12) and for logs kept at patient-record granularity, Secure Processing Environment access-log records become infeasible under plaintext semantics without any erasure request at all, through the collision of the Article 73(1)(e) one-year retention floor with the Article 68(12) six-month deletion ceiling. The demonstration produces thirty-nine such </w:t>
+      </w:r>
+      <w:del w:id="229" w:author="Arshad Akhtar Abbasia" w:date="2026-10-04T12:00:00Z">
+        <w:r>
+          <w:delText xml:space="preserve">witnesses.</w:delText>
+        </w:r>
+      </w:del>
+      <w:ins w:id="230" w:author="Arshad Akhtar Abbasia" w:date="2026-10-04T12:00:00Z">
+        <w:r>
+          <w:t xml:space="preserve">witnesses, a number the generator determines (Section 5.4).</w:t>
+        </w:r>
+      </w:ins>
+    </w:p>
+    <w:p>
+      <w:pPr>
+        <w:pStyle w:val="Heading2"/>
+      </w:pPr>
+      <w:r>
+        <w:t xml:space="preserve">5.2 Implementation</w:t>
+      </w:r>
+    </w:p>
+    <w:p>
+      <w:pPr>
+        <w:pStyle w:val="BodyText"/>
+      </w:pPr>
+      <w:r>
+        <w:t xml:space="preserve">The checker is a single Python module of </w:t>
+      </w:r>
+      <w:del w:id="231" w:author="Arshad Akhtar Abbasia" w:date="2026-10-04T12:00:00Z">
+        <w:r>
+          <w:delText xml:space="preserve">533 </w:delText>
+        </w:r>
+      </w:del>
+      <w:ins w:id="232" w:author="Arshad Akhtar Abbasia" w:date="2026-10-04T12:00:00Z">
+        <w:r>
+          <w:t xml:space="preserve">534 </w:t>
+        </w:r>
+      </w:ins>
+      <w:r>
+        <w:t xml:space="preserve">lines including documentation, the independent cross-check and the audit-log integrity check, of which </w:t>
+      </w:r>
+      <w:del w:id="233" w:author="Arshad Akhtar Abbasia" w:date="2026-10-04T12:00:00Z">
+        <w:r>
+          <w:delText xml:space="preserve">413 </w:delText>
+        </w:r>
+      </w:del>
+      <w:ins w:id="234" w:author="Arshad Akhtar Abbasia" w:date="2026-10-04T12:00:00Z">
+        <w:r>
+          <w:t xml:space="preserve">414 </w:t>
+        </w:r>
+      </w:ins>
+      <w:r>
+        <w:t xml:space="preserve">are non-blank, non-comment lines and the constraint-evaluation logic proper occupies approximately one hundred. It depends only on the Python standard library: hashlib for commitments and the audit log, json for log entries, random for seeded generation, and itertools for the exhaustive cross-check. The checker uses no cryptographic library, no solver, and no zero-knowledge proof system, consistent with the scope commitments of Chapter 1, Section 1.5; the optional envelope-encryption module below is the only component that imports </w:t>
+      </w:r>
+      <w:del w:id="235" w:author="Arshad Akhtar Abbasia" w:date="2026-10-04T12:00:00Z">
+        <w:r>
+          <w:delText xml:space="preserve">one.</w:delText>
+        </w:r>
+      </w:del>
+      <w:ins w:id="236" w:author="Arshad Akhtar Abbasia" w:date="2026-10-04T12:00:00Z">
+        <w:r>
+          <w:t xml:space="preserve">a cryptographic library.</w:t>
+        </w:r>
+      </w:ins>
+    </w:p>
+    <w:p>
+      <w:pPr>
+        <w:pStyle w:val="BodyText"/>
+      </w:pPr>
+      <w:del w:id="237" w:author="Arshad Akhtar Abbasia" w:date="2026-10-04T12:00:00Z">
+        <w:r>
+          <w:delText xml:space="preserve">Four </w:delText>
+        </w:r>
+      </w:del>
+      <w:ins w:id="238" w:author="Arshad Akhtar Abbasia" w:date="2026-10-04T12:00:00Z">
+        <w:r>
+          <w:t xml:space="preserve">Six </w:t>
+        </w:r>
+      </w:ins>
+      <w:r>
+        <w:t xml:space="preserve">further modules accompany it, none of which alters anything the checker reports. Their line counts, and the full source of each, are given in Appendix </w:t>
+      </w:r>
+      <w:del w:id="239" w:author="Arshad Akhtar Abbasia" w:date="2026-10-04T12:00:00Z">
+        <w:r>
+          <w:delText xml:space="preserve">A.</w:delText>
+        </w:r>
+      </w:del>
+      <w:ins w:id="240" w:author="Arshad Akhtar Abbasia" w:date="2026-10-04T12:00:00Z">
+        <w:r>
+          <w:t xml:space="preserve">A. Figure 5.1 maps the modules and the path a record takes through them.</w:t>
+        </w:r>
+      </w:ins>
+    </w:p>
+    <w:p>
+      <w:pPr>
+        <w:pStyle w:val="BodyText"/>
+        <w:rPr>
+          <w:ins w:id="241" w:author="Arshad Akhtar Abbasia" w:date="2026-10-04T12:00:00Z"/>
+        </w:rPr>
+      </w:pPr>
+      <w:ins w:id="242" w:author="Arshad Akhtar Abbasia" w:date="2026-10-04T12:00:00Z">
+        <w:r>
+          <w:t xml:space="preserve">[Figure 5.1. The artefact’s modules and data path. Records enter from the generator or one of the optional layers, are invalidated on schedule, and are checked under both semantics; the optional cryptographic module and the bounded SMT check sit beside the checker and report separately.]</w:t>
+        </w:r>
+      </w:ins>
+    </w:p>
+    <w:p>
+      <w:pPr>
+        <w:pStyle w:val="BodyText"/>
+        <w:rPr>
+          <w:ins w:id="243" w:author="Arshad Akhtar Abbasia" w:date="2026-10-04T12:00:00Z"/>
+        </w:rPr>
+      </w:pPr>
+      <w:ins w:id="244" w:author="Arshad Akhtar Abbasia" w:date="2026-10-04T12:00:00Z">
+        <w:r>
+          <w:t xml:space="preserve">Figure 5.1. The artefact’s modules and data path. Records enter from the generator or one of the optional layers, are invalidated on schedule, and are checked under both semantics; the optional cryptographic module and the bounded SMT check sit beside the checker and report separately.</w:t>
+        </w:r>
+      </w:ins>
+    </w:p>
+    <w:p>
+      <w:pPr>
+        <w:pStyle w:val="BodyText"/>
+      </w:pPr>
+      <w:r>
+        <w:t xml:space="preserve">Table 5.1. The artefact as published</w:t>
+      </w:r>
+    </w:p>
+    <w:p>
+      <w:pPr>
+        <w:pStyle w:val="BodyText"/>
+      </w:pPr>
+      <w:del w:id="245" w:author="Arshad Akhtar Abbasia" w:date="2026-10-04T12:00:00Z">
+        <w:r>
+          <w:delText xml:space="preserve">-------------------------------------------------------------------------------------------------------------------------------------------------------------------------------------------------- </w:delText>
+        </w:r>
+      </w:del>
+      <w:ins w:id="246" w:author="Arshad Akhtar Abbasia" w:date="2026-10-04T12:00:00Z">
+        <w:r>
+          <w:t xml:space="preserve">--------------------------------------------------------------------------------------------------------------------------------------------------------------------------------------------------- </w:t>
+        </w:r>
+      </w:ins>
+      <w:r>
+        <w:t xml:space="preserve">Module Lines What it does Reports a thesis figure? ----------------------- ----------------- </w:t>
+      </w:r>
+      <w:del w:id="247" w:author="Arshad Akhtar Abbasia" w:date="2026-10-04T12:00:00Z">
+        <w:r>
+          <w:delText xml:space="preserve">--------------------------------------------------------------------------------------------------------------------------- </w:delText>
+        </w:r>
+      </w:del>
+      <w:ins w:id="248" w:author="Arshad Akhtar Abbasia" w:date="2026-10-04T12:00:00Z">
+        <w:r>
+          <w:t xml:space="preserve">---------------------------------------------------------------------------------------------------------------------------- </w:t>
+        </w:r>
+      </w:ins>
+      <w:r>
+        <w:t xml:space="preserve">---------------------------- trf_checker.py </w:t>
+      </w:r>
+      <w:del w:id="249" w:author="Arshad Akhtar Abbasia" w:date="2026-10-04T12:00:00Z">
+        <w:r>
+          <w:delText xml:space="preserve">533 </w:delText>
+        </w:r>
+      </w:del>
+      <w:ins w:id="250" w:author="Arshad Akhtar Abbasia" w:date="2026-10-04T12:00:00Z">
+        <w:r>
+          <w:t xml:space="preserve">534 </w:t>
+        </w:r>
+      </w:ins>
+      <w:r>
+        <w:t xml:space="preserve">Constraint evaluation under both semantics, plus the independent exhaustive cross-check and the audit-log integrity check Yes — Tables 5.3, 5.5, 5.6</w:t>
+      </w:r>
+    </w:p>
+    <w:p>
+      <w:pPr>
+        <w:pStyle w:val="BodyText"/>
+      </w:pPr>
+      <w:r>
+        <w:t xml:space="preserve">synthea_layer.py 152 Substitutes real FHIR R4 payloads and compares every figure against the constructed-payload run Yes — Table 5.7</w:t>
+      </w:r>
+    </w:p>
+    <w:p>
+      <w:pPr>
+        <w:pStyle w:val="BodyText"/>
+      </w:pPr>
+      <w:r>
+        <w:t xml:space="preserve">norwegian_layer.py 135 Three Norwegian record classes, varying only the floor, the pathway and the arrival of requests No</w:t>
+      </w:r>
+    </w:p>
+    <w:p>
+      <w:pPr>
+        <w:pStyle w:val="BodyText"/>
+      </w:pPr>
+      <w:r>
+        <w:t xml:space="preserve">cross_sector_check.py 110 The politiregisterloven § 17 instance discussed in Chapter 6, Section 6.10 No</w:t>
+      </w:r>
+    </w:p>
+    <w:p>
+      <w:pPr>
+        <w:pStyle w:val="BodyText"/>
+      </w:pPr>
+      <w:del w:id="251" w:author="Arshad Akhtar Abbasia" w:date="2026-10-04T12:00:00Z">
+        <w:r>
+          <w:delText xml:space="preserve">app.py 671 Six-tab </w:delText>
+        </w:r>
+      </w:del>
+      <w:ins w:id="252" w:author="Arshad Akhtar Abbasia" w:date="2026-10-04T12:00:00Z">
+        <w:r>
+          <w:t xml:space="preserve">app.py, ui.py 804 + 133 Eight-page </w:t>
+        </w:r>
+      </w:ins>
+      <w:r>
+        <w:t xml:space="preserve">viewer over the </w:t>
+      </w:r>
+      <w:del w:id="253" w:author="Arshad Akhtar Abbasia" w:date="2026-10-04T12:00:00Z">
+        <w:r>
+          <w:delText xml:space="preserve">artefact; </w:delText>
+        </w:r>
+      </w:del>
+      <w:ins w:id="254" w:author="Arshad Akhtar Abbasia" w:date="2026-10-04T12:00:00Z">
+        <w:r>
+          <w:t xml:space="preserve">artefact, with the live architecture diagrams of Figures 4.1 and 5.1; </w:t>
+        </w:r>
+      </w:ins>
+      <w:r>
+        <w:t xml:space="preserve">never a source of results No</w:t>
+      </w:r>
+    </w:p>
+    <w:p>
+      <w:pPr>
+        <w:pStyle w:val="BodyText"/>
+      </w:pPr>
+      <w:r>
+        <w:t xml:space="preserve">crypto_envelope.py 118 Optional: the same lifecycle with real AES-256-GCM envelope encryption (needs cryptography) No</w:t>
+      </w:r>
+    </w:p>
+    <w:p>
+      <w:pPr>
+        <w:pStyle w:val="BodyText"/>
+        <w:rPr>
+          <w:ins w:id="255" w:author="Arshad Akhtar Abbasia" w:date="2026-10-04T12:00:00Z"/>
+        </w:rPr>
+      </w:pPr>
+      <w:ins w:id="256" w:author="Arshad Akhtar Abbasia" w:date="2026-10-04T12:00:00Z">
+        <w:r>
+          <w:t xml:space="preserve">z3_check.py 153 Optional: bounded SMT check of Propositions 1–3 (needs z3-solver) No ---------------------------------------------------------------------------------------------------------------------------------------------------------------------------------------------------</w:t>
         </w:r>
       </w:ins>
     </w:p>
@@ -5504,7 +5770,7 @@
       <w:r>
         <w:t xml:space="preserve">The fifty per cent figure follows from the generator. The collision occurs when t_(π) + 6 ≤ t_(a) + 12, the condition of Proposition 3(ii) with F = 12, L = 6 and the ceiling anchored to permit expiry, and permit lengths were drawn uniformly from one to twelve months, so half fall at or below six. </w:t>
       </w:r>
-      <w:ins w:id="214" w:author="Arshad Akhtar Abbasia" w:date="2026-10-04T12:00:00Z">
+      <w:ins w:id="257" w:author="Arshad Akhtar Abbasia" w:date="2026-10-04T12:00:00Z">
         <w:r>
           <w:t xml:space="preserve">Article 68(12) allows permits of up to ten years; with the remaining duration drawn uniformly over a five-year permit, about one log in ten would fall in the window. </w:t>
         </w:r>
@@ -5592,7 +5858,7 @@
       <w:r>
         <w:t xml:space="preserve">The cross-border floor is scaled from one hundred and twenty months to twelve for this check, because exhaustive search over 2¹²⁰ assignments is not computable. The scaling does not affect the logic: Proposition 1’s argument depends on the deadline falling inside the window, not on the window’s length, and the scaled case preserves that relation. It is the one place in the </w:t>
       </w:r>
-      <w:ins w:id="215" w:author="Arshad Akhtar Abbasia" w:date="2026-10-04T12:00:00Z">
+      <w:ins w:id="258" w:author="Arshad Akhtar Abbasia" w:date="2026-10-04T12:00:00Z">
         <w:r>
           <w:t xml:space="preserve">checker’s </w:t>
         </w:r>
@@ -5605,10 +5871,10 @@
       <w:pPr>
         <w:pStyle w:val="BodyText"/>
         <w:rPr>
-          <w:ins w:id="216" w:author="Arshad Akhtar Abbasia" w:date="2026-10-04T12:00:00Z"/>
+          <w:ins w:id="259" w:author="Arshad Akhtar Abbasia" w:date="2026-10-04T12:00:00Z"/>
         </w:rPr>
       </w:pPr>
-      <w:ins w:id="217" w:author="Arshad Akhtar Abbasia" w:date="2026-10-04T12:00:00Z">
+      <w:ins w:id="260" w:author="Arshad Akhtar Abbasia" w:date="2026-10-04T12:00:00Z">
         <w:r>
           <w:t xml:space="preserve">A bounded check in a different formalism guards against error in the proofs. An optional module poses the propositions to the Z3 SMT solver as requests for a counterexample: a record with any parameter values inside stated bounds (creation month 0–12, floor 1–120 months, so the cross-border floor is covered, response period 1–3 months, request month and ceiling anchor anywhere up to a 140-month horizon, ceiling 1–120 months). It checks Proposition 1 and the converse Chapter 5 relies on (a record with no deadline inside its window is feasible), the constructive trajectory of Proposition 2 with the accountability state of Semantics II encoded (accessor fields, commitment, invalidation entry, subject link and its removal entry), and both directions of Proposition 3 with its two cases. The solver finds no counterexample in any of the nine checks. It does find counterexamples to deliberately broken versions: the Proposition 2 construction without its invalidation entry, without its commitment, or without the subject-link entry, and Proposition 3 shifted by one month, which shows the checks can fail (Appendix A, A.23 and A.24). The check covers every parameter combination within the bounds rather than a sample and shares no code with the checker. It was written in the same AI-assisted process and takes the constraint definitions from Section 4.4, so it checks that the propositions follow from the constraints as encoded, not that the constraints translate the law, and it is bounded rather than general.</w:t>
         </w:r>
@@ -5733,12 +5999,12 @@
       <w:r>
         <w:t xml:space="preserve">This is the state the mechanism is designed to produce, and it is worth reading against what Semantics I would have demanded. The access event is fully established: which researcher, under which permit, with what outcome. The link to the patient was removed at the ceiling, and its removal is itself a logged </w:t>
       </w:r>
-      <w:del w:id="218" w:author="Arshad Akhtar Abbasia" w:date="2026-10-04T12:00:00Z">
+      <w:del w:id="261" w:author="Arshad Akhtar Abbasia" w:date="2026-10-04T12:00:00Z">
         <w:r>
           <w:delText xml:space="preserve">entry. </w:delText>
         </w:r>
       </w:del>
-      <w:ins w:id="219" w:author="Arshad Akhtar Abbasia" w:date="2026-10-04T12:00:00Z">
+      <w:ins w:id="262" w:author="Arshad Akhtar Abbasia" w:date="2026-10-04T12:00:00Z">
         <w:r>
           <w:t xml:space="preserve">entry; a cross-border record keeps the link through the floor (Chapter 4, Section 4.2). </w:t>
         </w:r>
@@ -5746,12 +6012,12 @@
       <w:r>
         <w:t xml:space="preserve">The binding to a specific payload survives in the commitment. The invalidation is itself a logged, grounded, attributed event rather than a silent absence. And the payload is unreadable, at month nineteen as at month sixteen. An auditor examining this record learns </w:t>
       </w:r>
-      <w:del w:id="220" w:author="Arshad Akhtar Abbasia" w:date="2026-10-04T12:00:00Z">
+      <w:del w:id="263" w:author="Arshad Akhtar Abbasia" w:date="2026-10-04T12:00:00Z">
         <w:r>
           <w:delText xml:space="preserve">everything </w:delText>
         </w:r>
       </w:del>
-      <w:ins w:id="221" w:author="Arshad Akhtar Abbasia" w:date="2026-10-04T12:00:00Z">
+      <w:ins w:id="264" w:author="Arshad Akhtar Abbasia" w:date="2026-10-04T12:00:00Z">
         <w:r>
           <w:t xml:space="preserve">what the </w:t>
         </w:r>
@@ -5759,12 +6025,12 @@
       <w:r>
         <w:t xml:space="preserve">accountability </w:t>
       </w:r>
-      <w:del w:id="222" w:author="Arshad Akhtar Abbasia" w:date="2026-10-04T12:00:00Z">
+      <w:del w:id="265" w:author="Arshad Akhtar Abbasia" w:date="2026-10-04T12:00:00Z">
         <w:r>
           <w:delText xml:space="preserve">requires and nothing </w:delText>
         </w:r>
       </w:del>
-      <w:ins w:id="223" w:author="Arshad Akhtar Abbasia" w:date="2026-10-04T12:00:00Z">
+      <w:ins w:id="266" w:author="Arshad Akhtar Abbasia" w:date="2026-10-04T12:00:00Z">
         <w:r>
           <w:t xml:space="preserve">purpose is argued to require (Chapter 4, Section 4.2), while </w:t>
         </w:r>
@@ -5772,12 +6038,12 @@
       <w:r>
         <w:t xml:space="preserve">the </w:t>
       </w:r>
-      <w:del w:id="224" w:author="Arshad Akhtar Abbasia" w:date="2026-10-04T12:00:00Z">
+      <w:del w:id="267" w:author="Arshad Akhtar Abbasia" w:date="2026-10-04T12:00:00Z">
         <w:r>
           <w:delText xml:space="preserve">erasure obligation forbids.</w:delText>
         </w:r>
       </w:del>
-      <w:ins w:id="225" w:author="Arshad Akhtar Abbasia" w:date="2026-10-04T12:00:00Z">
+      <w:ins w:id="268" w:author="Arshad Akhtar Abbasia" w:date="2026-10-04T12:00:00Z">
         <w:r>
           <w:t xml:space="preserve">payload is unreadable.</w:t>
         </w:r>
@@ -5806,12 +6072,12 @@
       <w:r>
         <w:t xml:space="preserve">Established. Both propositions hold on all two hundred generated instances. Proposition 1’s conditional structure is reproduced exactly, including the boundary case of the request falling outside the window. Corollary 1.2 has thirty-nine witnesses in the model: records in which two provisions of one regulation collide over one environment with no data-subject action involved. The infeasibility results survive a separately written exhaustive search that considers every possible accessibility assignment rather than only the trajectory the main checker </w:t>
       </w:r>
-      <w:del w:id="226" w:author="Arshad Akhtar Abbasia" w:date="2026-10-04T12:00:00Z">
+      <w:del w:id="269" w:author="Arshad Akhtar Abbasia" w:date="2026-10-04T12:00:00Z">
         <w:r>
           <w:delText xml:space="preserve">examines. </w:delText>
         </w:r>
       </w:del>
-      <w:ins w:id="227" w:author="Arshad Akhtar Abbasia" w:date="2026-10-04T12:00:00Z">
+      <w:ins w:id="270" w:author="Arshad Akhtar Abbasia" w:date="2026-10-04T12:00:00Z">
         <w:r>
           <w:t xml:space="preserve">examines, and Propositions 1–3 survive a bounded SMT check over every parameter combination within its bounds. </w:t>
         </w:r>
@@ -5928,7 +6194,7 @@
       <w:pPr>
         <w:pStyle w:val="BodyText"/>
       </w:pPr>
-      <w:ins w:id="228" w:author="Arshad Akhtar Abbasia" w:date="2026-10-04T12:00:00Z">
+      <w:ins w:id="271" w:author="Arshad Akhtar Abbasia" w:date="2026-10-04T12:00:00Z">
         <w:r>
           <w:t xml:space="preserve">Read one way, three obligations cannot be met together. Read another, they can. </w:t>
         </w:r>
@@ -5944,7 +6210,7 @@
       <w:r>
         <w:t xml:space="preserve">The request-driven form of the conflict cannot be escaped by moving the record. A deletion ceiling anchored to a location yields to relocation, but the right to erasure attaches to whichever controller holds the data (Chapter 4, Section 4.10, Proposition 4). Cryptographic invalidation is therefore necessary where a data subject’s request meets a retention floor, and in the cross-border pathway that is every request arriving inside the floor, because the </w:t>
       </w:r>
-      <w:ins w:id="229" w:author="Arshad Akhtar Abbasia" w:date="2026-10-04T12:00:00Z">
+      <w:ins w:id="272" w:author="Arshad Akhtar Abbasia" w:date="2026-10-04T12:00:00Z">
         <w:r>
           <w:t xml:space="preserve">IHE </w:t>
         </w:r>
@@ -5952,12 +6218,12 @@
       <w:r>
         <w:t xml:space="preserve">patient-discovery </w:t>
       </w:r>
-      <w:del w:id="230" w:author="Arshad Akhtar Abbasia" w:date="2026-10-04T12:00:00Z">
+      <w:del w:id="273" w:author="Arshad Akhtar Abbasia" w:date="2026-10-04T12:00:00Z">
         <w:r>
           <w:delText xml:space="preserve">transaction puts </w:delText>
         </w:r>
       </w:del>
-      <w:ins w:id="231" w:author="Arshad Akhtar Abbasia" w:date="2026-10-04T12:00:00Z">
+      <w:ins w:id="274" w:author="Arshad Akhtar Abbasia" w:date="2026-10-04T12:00:00Z">
         <w:r>
           <w:t xml:space="preserve">profile requires </w:t>
         </w:r>
@@ -5965,12 +6231,12 @@
       <w:r>
         <w:t xml:space="preserve">the patient’s identifying query </w:t>
       </w:r>
-      <w:del w:id="232" w:author="Arshad Akhtar Abbasia" w:date="2026-10-04T12:00:00Z">
+      <w:del w:id="275" w:author="Arshad Akhtar Abbasia" w:date="2026-10-04T12:00:00Z">
         <w:r>
           <w:delText xml:space="preserve">into </w:delText>
         </w:r>
       </w:del>
-      <w:ins w:id="233" w:author="Arshad Akhtar Abbasia" w:date="2026-10-04T12:00:00Z">
+      <w:ins w:id="276" w:author="Arshad Akhtar Abbasia" w:date="2026-10-04T12:00:00Z">
         <w:r>
           <w:t xml:space="preserve">to be recorded in </w:t>
         </w:r>
@@ -5978,12 +6244,12 @@
       <w:r>
         <w:t xml:space="preserve">the audit </w:t>
       </w:r>
-      <w:del w:id="234" w:author="Arshad Akhtar Abbasia" w:date="2026-10-04T12:00:00Z">
+      <w:del w:id="277" w:author="Arshad Akhtar Abbasia" w:date="2026-10-04T12:00:00Z">
         <w:r>
           <w:delText xml:space="preserve">record by design.</w:delText>
         </w:r>
       </w:del>
-      <w:ins w:id="235" w:author="Arshad Akhtar Abbasia" w:date="2026-10-04T12:00:00Z">
+      <w:ins w:id="278" w:author="Arshad Akhtar Abbasia" w:date="2026-10-04T12:00:00Z">
         <w:r>
           <w:t xml:space="preserve">message.</w:t>
         </w:r>
@@ -5993,12 +6259,12 @@
       <w:pPr>
         <w:pStyle w:val="BodyText"/>
       </w:pPr>
-      <w:del w:id="236" w:author="Arshad Akhtar Abbasia" w:date="2026-10-04T12:00:00Z">
+      <w:del w:id="279" w:author="Arshad Akhtar Abbasia" w:date="2026-10-04T12:00:00Z">
         <w:r>
           <w:delText xml:space="preserve">The sharpest instance is narrower, and </w:delText>
         </w:r>
       </w:del>
-      <w:ins w:id="237" w:author="Arshad Akhtar Abbasia" w:date="2026-10-04T12:00:00Z">
+      <w:ins w:id="280" w:author="Arshad Akhtar Abbasia" w:date="2026-10-04T12:00:00Z">
         <w:r>
           <w:t xml:space="preserve">A conditional extension </w:t>
         </w:r>
@@ -6006,7 +6272,7 @@
       <w:r>
         <w:t xml:space="preserve">rests on one contestable interpretive step. Article 73(1)(e) requires identifiable logs of access to and activity in a Secure Processing Environment to be kept for at least one year. Article 68(12) requires “the electronic health data within the secure processing environment” to be deleted within six months of the expiry of the data permit. Where an environment logs access at patient-record granularity, those log entries are electronic health data within the environment on the broad reading, and where the remaining permit duration at the time a log is written is six months or less, the two requirements overlap with no data subject acting. Chapter 4, Section 4.6 sets out the grounds on both sides. Chapter 5 produced </w:t>
       </w:r>
-      <w:del w:id="238" w:author="Arshad Akhtar Abbasia" w:date="2026-10-04T12:00:00Z">
+      <w:del w:id="281" w:author="Arshad Akhtar Abbasia" w:date="2026-10-04T12:00:00Z">
         <w:r>
           <w:delText xml:space="preserve">thirty-nine </w:delText>
         </w:r>
@@ -6014,12 +6280,12 @@
       <w:r>
         <w:t xml:space="preserve">witnesses of this collision in the </w:t>
       </w:r>
-      <w:del w:id="239" w:author="Arshad Akhtar Abbasia" w:date="2026-10-04T12:00:00Z">
+      <w:del w:id="282" w:author="Arshad Akhtar Abbasia" w:date="2026-10-04T12:00:00Z">
         <w:r>
           <w:delText xml:space="preserve">model, in a population </w:delText>
         </w:r>
       </w:del>
-      <w:ins w:id="240" w:author="Arshad Akhtar Abbasia" w:date="2026-10-04T12:00:00Z">
+      <w:ins w:id="283" w:author="Arshad Akhtar Abbasia" w:date="2026-10-04T12:00:00Z">
         <w:r>
           <w:t xml:space="preserve">model; how many depends on the permit lengths the generator draws, and the count is not an estimate </w:t>
         </w:r>
@@ -6027,12 +6293,12 @@
       <w:r>
         <w:t xml:space="preserve">of </w:t>
       </w:r>
-      <w:del w:id="241" w:author="Arshad Akhtar Abbasia" w:date="2026-10-04T12:00:00Z">
+      <w:del w:id="284" w:author="Arshad Akhtar Abbasia" w:date="2026-10-04T12:00:00Z">
         <w:r>
           <w:delText xml:space="preserve">one hundred Secure Processing Environment records; across the full population of two hundred, cross-border records included, ninety records were infeasible under Semantics I, most of them through erasure requests </w:delText>
         </w:r>
       </w:del>
-      <w:ins w:id="242" w:author="Arshad Akhtar Abbasia" w:date="2026-10-04T12:00:00Z">
+      <w:ins w:id="285" w:author="Arshad Akhtar Abbasia" w:date="2026-10-04T12:00:00Z">
         <w:r>
           <w:t xml:space="preserve">real frequency </w:t>
         </w:r>
@@ -6040,12 +6306,12 @@
       <w:r>
         <w:t xml:space="preserve">(Chapter 5, </w:t>
       </w:r>
-      <w:del w:id="243" w:author="Arshad Akhtar Abbasia" w:date="2026-10-04T12:00:00Z">
+      <w:del w:id="286" w:author="Arshad Akhtar Abbasia" w:date="2026-10-04T12:00:00Z">
         <w:r>
           <w:delText xml:space="preserve">Table 5.3). </w:delText>
         </w:r>
       </w:del>
-      <w:ins w:id="244" w:author="Arshad Akhtar Abbasia" w:date="2026-10-04T12:00:00Z">
+      <w:ins w:id="287" w:author="Arshad Akhtar Abbasia" w:date="2026-10-04T12:00:00Z">
         <w:r>
           <w:t xml:space="preserve">Section 5.4). </w:t>
         </w:r>
@@ -6061,7 +6327,7 @@
       <w:r>
         <w:t xml:space="preserve">Finally, the thesis specifies the mechanism that the feasibility proof exhibits: per-record keys under a key-encrypting key, hiding commitments, deletion of the ciphertext with the key, removal of the subject link at the ceiling, invalidation entries carrying month, legal ground, and authorising actor, a tamper-evident log built never to hold what erasure reaches, and a terminal transition at floor expiry that discharges the storage-limitation obligation on the metadata itself. The artefact executes all of these but the terminal transition, which </w:t>
       </w:r>
-      <w:ins w:id="245" w:author="Arshad Akhtar Abbasia" w:date="2026-10-04T12:00:00Z">
+      <w:ins w:id="288" w:author="Arshad Akhtar Abbasia" w:date="2026-10-04T12:00:00Z">
         <w:r>
           <w:t xml:space="preserve">Chapter 4, </w:t>
         </w:r>
@@ -6069,12 +6335,12 @@
       <w:r>
         <w:t xml:space="preserve">Section 4.8 specifies and the checker does not implement; nor does it implement the per-entry nonce that keeps surviving leaf hashes from confirming </w:t>
       </w:r>
-      <w:del w:id="246" w:author="Arshad Akhtar Abbasia" w:date="2026-10-04T12:00:00Z">
+      <w:del w:id="289" w:author="Arshad Akhtar Abbasia" w:date="2026-10-04T12:00:00Z">
         <w:r>
           <w:delText xml:space="preserve">guesses </w:delText>
         </w:r>
       </w:del>
-      <w:ins w:id="247" w:author="Arshad Akhtar Abbasia" w:date="2026-10-04T12:00:00Z">
+      <w:ins w:id="290" w:author="Arshad Akhtar Abbasia" w:date="2026-10-04T12:00:00Z">
         <w:r>
           <w:t xml:space="preserve">guesses, or the consistency proofs between successive log roots </w:t>
         </w:r>
@@ -6162,7 +6428,7 @@
       <w:r>
         <w:t xml:space="preserve">A second authority question sits beside the first and is narrower. Whether Article 68(12) reaches the access logs is a question of statutory construction that a supervisory authority or, ultimately, a court will settle, and that this author cannot. The thesis states Corollary 1.2 conditionally rather than adopting the broad reading or the narrow one, on the grounds set out in Chapter 4, Section 4.6. What makes this tolerable rather than fatal is that the dependency is confined: Corollary 1.2 stands or falls with it, </w:t>
       </w:r>
-      <w:ins w:id="248" w:author="Arshad Akhtar Abbasia" w:date="2026-10-04T12:00:00Z">
+      <w:ins w:id="291" w:author="Arshad Akhtar Abbasia" w:date="2026-10-04T12:00:00Z">
         <w:r>
           <w:t xml:space="preserve">as does the conditional branch of Corollary 2.3, </w:t>
         </w:r>
@@ -6183,12 +6449,12 @@
       <w:pPr>
         <w:pStyle w:val="BodyText"/>
       </w:pPr>
-      <w:del w:id="249" w:author="Arshad Akhtar Abbasia" w:date="2026-10-04T12:00:00Z">
+      <w:del w:id="292" w:author="Arshad Akhtar Abbasia" w:date="2026-10-04T12:00:00Z">
         <w:r>
           <w:delText xml:space="preserve">The </w:delText>
         </w:r>
       </w:del>
-      <w:ins w:id="250" w:author="Arshad Akhtar Abbasia" w:date="2026-10-04T12:00:00Z">
+      <w:ins w:id="293" w:author="Arshad Akhtar Abbasia" w:date="2026-10-04T12:00:00Z">
         <w:r>
           <w:t xml:space="preserve">Nobody can watch a key being destroyed. That is the </w:t>
         </w:r>
@@ -6196,12 +6462,12 @@
       <w:r>
         <w:t xml:space="preserve">second </w:t>
       </w:r>
-      <w:del w:id="251" w:author="Arshad Akhtar Abbasia" w:date="2026-10-04T12:00:00Z">
+      <w:del w:id="294" w:author="Arshad Akhtar Abbasia" w:date="2026-10-04T12:00:00Z">
         <w:r>
           <w:delText xml:space="preserve">objection is </w:delText>
         </w:r>
       </w:del>
-      <w:ins w:id="252" w:author="Arshad Akhtar Abbasia" w:date="2026-10-04T12:00:00Z">
+      <w:ins w:id="295" w:author="Arshad Akhtar Abbasia" w:date="2026-10-04T12:00:00Z">
         <w:r>
           <w:t xml:space="preserve">objection, </w:t>
         </w:r>
@@ -6254,7 +6520,7 @@
       <w:pPr>
         <w:pStyle w:val="BodyText"/>
       </w:pPr>
-      <w:ins w:id="253" w:author="Arshad Akhtar Abbasia" w:date="2026-10-04T12:00:00Z">
+      <w:ins w:id="296" w:author="Arshad Akhtar Abbasia" w:date="2026-10-04T12:00:00Z">
         <w:r>
           <w:t xml:space="preserve">Per-record keys cost something, and the question is whether the cost is worth paying. </w:t>
         </w:r>
@@ -6363,7 +6629,7 @@
       <w:pPr>
         <w:pStyle w:val="BodyText"/>
       </w:pPr>
-      <w:ins w:id="254" w:author="Arshad Akhtar Abbasia" w:date="2026-10-04T12:00:00Z">
+      <w:ins w:id="297" w:author="Arshad Akhtar Abbasia" w:date="2026-10-04T12:00:00Z">
         <w:r>
           <w:t xml:space="preserve">A model can be right and still be refused by the people who would have to run it. </w:t>
         </w:r>
@@ -6408,7 +6674,7 @@
       <w:pPr>
         <w:pStyle w:val="BodyText"/>
       </w:pPr>
-      <w:ins w:id="255" w:author="Arshad Akhtar Abbasia" w:date="2026-10-04T12:00:00Z">
+      <w:ins w:id="298" w:author="Arshad Akhtar Abbasia" w:date="2026-10-04T12:00:00Z">
         <w:r>
           <w:t xml:space="preserve">The patients in this thesis do not exist, and no result depends on who they are. </w:t>
         </w:r>
@@ -6432,12 +6698,12 @@
       <w:r>
         <w:t xml:space="preserve">The deeper limitation is that a demonstration over generated instances is not a proof over all instances. The general claims rest on the arguments in Chapter 4, and those arguments are informal rather than machine-checked. The executable </w:t>
       </w:r>
-      <w:del w:id="256" w:author="Arshad Akhtar Abbasia" w:date="2026-10-04T12:00:00Z">
+      <w:del w:id="299" w:author="Arshad Akhtar Abbasia" w:date="2026-10-04T12:00:00Z">
         <w:r>
           <w:delText xml:space="preserve">check and </w:delText>
         </w:r>
       </w:del>
-      <w:ins w:id="257" w:author="Arshad Akhtar Abbasia" w:date="2026-10-04T12:00:00Z">
+      <w:ins w:id="300" w:author="Arshad Akhtar Abbasia" w:date="2026-10-04T12:00:00Z">
         <w:r>
           <w:t xml:space="preserve">check, </w:t>
         </w:r>
@@ -6445,7 +6711,7 @@
       <w:r>
         <w:t xml:space="preserve">the exhaustive cross-check </w:t>
       </w:r>
-      <w:ins w:id="258" w:author="Arshad Akhtar Abbasia" w:date="2026-10-04T12:00:00Z">
+      <w:ins w:id="301" w:author="Arshad Akhtar Abbasia" w:date="2026-10-04T12:00:00Z">
         <w:r>
           <w:t xml:space="preserve">and the bounded SMT check </w:t>
         </w:r>
@@ -6453,12 +6719,12 @@
       <w:r>
         <w:t xml:space="preserve">reduce the probability that an error in the proofs has gone unnoticed; they do not eliminate </w:t>
       </w:r>
-      <w:del w:id="259" w:author="Arshad Akhtar Abbasia" w:date="2026-10-04T12:00:00Z">
+      <w:del w:id="302" w:author="Arshad Akhtar Abbasia" w:date="2026-10-04T12:00:00Z">
         <w:r>
           <w:delText xml:space="preserve">it.</w:delText>
         </w:r>
       </w:del>
-      <w:ins w:id="260" w:author="Arshad Akhtar Abbasia" w:date="2026-10-04T12:00:00Z">
+      <w:ins w:id="303" w:author="Arshad Akhtar Abbasia" w:date="2026-10-04T12:00:00Z">
         <w:r>
           <w:t xml:space="preserve">it, and none of them can show that the constraints translate the law.</w:t>
         </w:r>
@@ -6475,15 +6741,28 @@
     <w:p>
       <w:pPr>
         <w:pStyle w:val="BodyText"/>
-      </w:pPr>
-      <w:ins w:id="261" w:author="Arshad Akhtar Abbasia" w:date="2026-10-04T12:00:00Z">
-        <w:r>
-          <w:t xml:space="preserve">The provisions that create this collision do not yet apply, and that is the opportunity. </w:t>
-        </w:r>
-      </w:ins>
-      <w:r>
-        <w:t xml:space="preserve">The timing argument is the strongest claim to practical relevance this thesis makes.</w:t>
-      </w:r>
+        <w:rPr>
+          <w:ins w:id="304" w:author="Arshad Akhtar Abbasia" w:date="2026-10-04T12:00:00Z"/>
+        </w:rPr>
+      </w:pPr>
+      <w:ins w:id="305" w:author="Arshad Akhtar Abbasia" w:date="2026-10-04T12:00:00Z">
+        <w:r>
+          <w:t xml:space="preserve">The EHDS provisions that create the collision in Secure Processing Environments do not apply until 26 March 2029, and that is the opportunity. The timing argument is the strongest claim to practical relevance this thesis makes.</w:t>
+        </w:r>
+      </w:ins>
+    </w:p>
+    <w:p>
+      <w:pPr>
+        <w:pStyle w:val="BodyText"/>
+        <w:rPr>
+          <w:del w:id="306" w:author="Arshad Akhtar Abbasia" w:date="2026-10-04T12:00:00Z"/>
+        </w:rPr>
+      </w:pPr>
+      <w:del w:id="307" w:author="Arshad Akhtar Abbasia" w:date="2026-10-04T12:00:00Z">
+        <w:r>
+          <w:delText xml:space="preserve">The timing argument is the strongest claim to practical relevance this thesis makes.</w:delText>
+        </w:r>
+      </w:del>
     </w:p>
     <w:p>
       <w:pPr>
@@ -6498,7 +6777,33 @@
         <w:pStyle w:val="BodyText"/>
       </w:pPr>
       <w:r>
-        <w:t xml:space="preserve">The collision this thesis characterises is therefore not yet operative, and the specifications that will determine how it is handled are not yet written. That is an unusually favourable position for a piece of academic work to occupy. A framework that arrives after infrastructure has hardened around a problem is archaeology; one that arrives while the specifications are being drafted can affect defaults. The Norwegian position sharpens this further: the national criteria for Secure Processing Environments went through a public hearing in the SPUHiN process from July to October 2025, and are positioned explicitly as a national reference basis pending the Union implementing act (SPUHiN, 2025). The compliance checklists, in the hearing version inspected, address information-security management, identity assurance, and access governance. They grade an information-security management system as mandatory and ISO 27001 certification as recommended, and require eID-based authentication at defined assurance levels. No requirement addressing the reconciliation of retention with erasure and deletion appears among them. The absence is observed in the hearing version of the checklists, not established against the deliverable as submitted.</w:t>
+        <w:t xml:space="preserve">The collision </w:t>
+      </w:r>
+      <w:del w:id="308" w:author="Arshad Akhtar Abbasia" w:date="2026-10-04T12:00:00Z">
+        <w:r>
+          <w:delText xml:space="preserve">this thesis characterises </w:delText>
+        </w:r>
+      </w:del>
+      <w:ins w:id="309" w:author="Arshad Akhtar Abbasia" w:date="2026-10-04T12:00:00Z">
+        <w:r>
+          <w:t xml:space="preserve">in Secure Processing Environments </w:t>
+        </w:r>
+      </w:ins>
+      <w:r>
+        <w:t xml:space="preserve">is therefore not yet operative, and the specifications that will determine how it is handled are not yet written. That is an unusually favourable position for a piece of academic work to occupy. A framework that arrives after infrastructure has hardened around a problem is archaeology; one that arrives while the specifications are being drafted can affect defaults. The Norwegian position sharpens this further: the national criteria for Secure Processing Environments went through a public hearing in the SPUHiN process from July to October 2025, and are positioned explicitly as a national reference basis pending the Union implementing act (SPUHiN, 2025). The compliance checklists, in the hearing version inspected, address information-security management, identity assurance, and access </w:t>
+      </w:r>
+      <w:del w:id="310" w:author="Arshad Akhtar Abbasia" w:date="2026-10-04T12:00:00Z">
+        <w:r>
+          <w:delText xml:space="preserve">governance. </w:delText>
+        </w:r>
+      </w:del>
+      <w:ins w:id="311" w:author="Arshad Akhtar Abbasia" w:date="2026-10-04T12:00:00Z">
+        <w:r>
+          <w:t xml:space="preserve">governance, and the 2024 draft makes identifiable access logs mandatory for at least one year (Chapter 4, Section 4.11). </w:t>
+        </w:r>
+      </w:ins>
+      <w:r>
+        <w:t xml:space="preserve">They grade an information-security management system as mandatory and ISO 27001 certification as recommended, and require eID-based authentication at defined assurance levels. No requirement addressing the reconciliation of retention with erasure and deletion appears among them. The absence is observed in the hearing version of the checklists, not established against the deliverable as submitted.</w:t>
       </w:r>
     </w:p>
     <w:p>
@@ -6665,10 +6970,10 @@
       <w:pPr>
         <w:pStyle w:val="BodyText"/>
         <w:rPr>
-          <w:ins w:id="262" w:author="Arshad Akhtar Abbasia" w:date="2026-10-04T12:00:00Z"/>
+          <w:ins w:id="312" w:author="Arshad Akhtar Abbasia" w:date="2026-10-04T12:00:00Z"/>
         </w:rPr>
       </w:pPr>
-      <w:ins w:id="263" w:author="Arshad Akhtar Abbasia" w:date="2026-10-04T12:00:00Z">
+      <w:ins w:id="313" w:author="Arshad Akhtar Abbasia" w:date="2026-10-04T12:00:00Z">
         <w:r>
           <w:t xml:space="preserve">The limitations that bound the claim are stated once, in Chapter 3, Section 3.7, and engaged where they bite. None of them was claimed, so none of them reduces what was: a contribution that states its boundaries can be checked at them.</w:t>
         </w:r>
@@ -6678,10 +6983,10 @@
       <w:pPr>
         <w:pStyle w:val="BodyText"/>
         <w:rPr>
-          <w:del w:id="264" w:author="Arshad Akhtar Abbasia" w:date="2026-10-04T12:00:00Z"/>
+          <w:del w:id="314" w:author="Arshad Akhtar Abbasia" w:date="2026-10-04T12:00:00Z"/>
         </w:rPr>
       </w:pPr>
-      <w:del w:id="265" w:author="Arshad Akhtar Abbasia" w:date="2026-10-04T12:00:00Z">
+      <w:del w:id="315" w:author="Arshad Akhtar Abbasia" w:date="2026-10-04T12:00:00Z">
         <w:r>
           <w:delText xml:space="preserve">The thesis makes one bounded claim and prices every limitation into it in advance. The proofs are informal, not machine-checked. The demonstration covers generated instances under one seed, not all instances. Key destruction is simulated in program state and says nothing about deployment assurance. The synthetic records carry US Core profiles, not Norwegian ones. The cryptographic primitives are established technique, not novel construction. The closest prior art is a patent claiming key-expiry selection for retention-purge conflicts, disclosed and distinguished (Chapter 2, Section 2.4; Chapter 4, Section 4.10). The interpretive move at the centre of the thesis is an argument without authority behind it. None of these was claimed, so none of them reduces what was: a contribution that states its boundaries can be checked at them.</w:delText>
         </w:r>
@@ -6702,12 +7007,12 @@
       <w:r>
         <w:t xml:space="preserve">The thesis establishes </w:t>
       </w:r>
-      <w:del w:id="266" w:author="Arshad Akhtar Abbasia" w:date="2026-10-04T12:00:00Z">
+      <w:del w:id="316" w:author="Arshad Akhtar Abbasia" w:date="2026-10-04T12:00:00Z">
         <w:r>
           <w:delText xml:space="preserve">that audit-retention </w:delText>
         </w:r>
       </w:del>
-      <w:ins w:id="267" w:author="Arshad Akhtar Abbasia" w:date="2026-10-04T12:00:00Z">
+      <w:ins w:id="317" w:author="Arshad Akhtar Abbasia" w:date="2026-10-04T12:00:00Z">
         <w:r>
           <w:t xml:space="preserve">four things. Audit-retention </w:t>
         </w:r>
@@ -6715,12 +7020,12 @@
       <w:r>
         <w:t xml:space="preserve">floors, the right to erasure and the deletion ceiling conflict only under an assumption about verifiability, and not because of the obligations </w:t>
       </w:r>
-      <w:del w:id="268" w:author="Arshad Akhtar Abbasia" w:date="2026-10-04T12:00:00Z">
+      <w:del w:id="318" w:author="Arshad Akhtar Abbasia" w:date="2026-10-04T12:00:00Z">
         <w:r>
           <w:delText xml:space="preserve">themselves; that, on </w:delText>
         </w:r>
       </w:del>
-      <w:ins w:id="269" w:author="Arshad Akhtar Abbasia" w:date="2026-10-04T12:00:00Z">
+      <w:ins w:id="319" w:author="Arshad Akhtar Abbasia" w:date="2026-10-04T12:00:00Z">
         <w:r>
           <w:t xml:space="preserve">themselves. On </w:t>
         </w:r>
@@ -6728,12 +7033,12 @@
       <w:r>
         <w:t xml:space="preserve">the broad reading of Article 68(12) and for logs kept at patient-record granularity, the conflict arises inside the European Health Data Space Regulation with no data subject </w:t>
       </w:r>
-      <w:del w:id="270" w:author="Arshad Akhtar Abbasia" w:date="2026-10-04T12:00:00Z">
+      <w:del w:id="320" w:author="Arshad Akhtar Abbasia" w:date="2026-10-04T12:00:00Z">
         <w:r>
           <w:delText xml:space="preserve">acting; that a </w:delText>
         </w:r>
       </w:del>
-      <w:ins w:id="271" w:author="Arshad Akhtar Abbasia" w:date="2026-10-04T12:00:00Z">
+      <w:ins w:id="321" w:author="Arshad Akhtar Abbasia" w:date="2026-10-04T12:00:00Z">
         <w:r>
           <w:t xml:space="preserve">acting. A </w:t>
         </w:r>
@@ -6741,12 +7046,12 @@
       <w:r>
         <w:t xml:space="preserve">ceiling collides with a floor exactly when Proposition 3 </w:t>
       </w:r>
-      <w:del w:id="272" w:author="Arshad Akhtar Abbasia" w:date="2026-10-04T12:00:00Z">
+      <w:del w:id="322" w:author="Arshad Akhtar Abbasia" w:date="2026-10-04T12:00:00Z">
         <w:r>
           <w:delText xml:space="preserve">says, and that </w:delText>
         </w:r>
       </w:del>
-      <w:ins w:id="273" w:author="Arshad Akhtar Abbasia" w:date="2026-10-04T12:00:00Z">
+      <w:ins w:id="323" w:author="Arshad Akhtar Abbasia" w:date="2026-10-04T12:00:00Z">
         <w:r>
           <w:t xml:space="preserve">says. And </w:t>
         </w:r>
@@ -6754,12 +7059,12 @@
       <w:r>
         <w:t xml:space="preserve">relocation escapes the ceiling but not the right (Proposition 4). It exhibits the mechanism that dissolves the conflict and </w:t>
       </w:r>
-      <w:del w:id="274" w:author="Arshad Akhtar Abbasia" w:date="2026-10-04T12:00:00Z">
+      <w:del w:id="324" w:author="Arshad Akhtar Abbasia" w:date="2026-10-04T12:00:00Z">
         <w:r>
           <w:delText xml:space="preserve">demonstrates </w:delText>
         </w:r>
       </w:del>
-      <w:ins w:id="275" w:author="Arshad Akhtar Abbasia" w:date="2026-10-04T12:00:00Z">
+      <w:ins w:id="325" w:author="Arshad Akhtar Abbasia" w:date="2026-10-04T12:00:00Z">
         <w:r>
           <w:t xml:space="preserve">checks </w:t>
         </w:r>
@@ -6767,12 +7072,12 @@
       <w:r>
         <w:t xml:space="preserve">Propositions 1 and 2 </w:t>
       </w:r>
-      <w:del w:id="276" w:author="Arshad Akhtar Abbasia" w:date="2026-10-04T12:00:00Z">
+      <w:del w:id="326" w:author="Arshad Akhtar Abbasia" w:date="2026-10-04T12:00:00Z">
         <w:r>
           <w:delText xml:space="preserve">executably </w:delText>
         </w:r>
       </w:del>
-      <w:ins w:id="277" w:author="Arshad Akhtar Abbasia" w:date="2026-10-04T12:00:00Z">
+      <w:ins w:id="327" w:author="Arshad Akhtar Abbasia" w:date="2026-10-04T12:00:00Z">
         <w:r>
           <w:t xml:space="preserve">executably, </w:t>
         </w:r>
@@ -6780,12 +7085,12 @@
       <w:r>
         <w:t xml:space="preserve">with </w:t>
       </w:r>
-      <w:del w:id="278" w:author="Arshad Akhtar Abbasia" w:date="2026-10-04T12:00:00Z">
+      <w:del w:id="328" w:author="Arshad Akhtar Abbasia" w:date="2026-10-04T12:00:00Z">
         <w:r>
           <w:delText xml:space="preserve">an independent cross-check.</w:delText>
         </w:r>
       </w:del>
-      <w:ins w:id="279" w:author="Arshad Akhtar Abbasia" w:date="2026-10-04T12:00:00Z">
+      <w:ins w:id="329" w:author="Arshad Akhtar Abbasia" w:date="2026-10-04T12:00:00Z">
         <w:r>
           <w:t xml:space="preserve">a separately written cross-check and a bounded SMT check.</w:t>
         </w:r>
@@ -6846,7 +7151,7 @@
       <w:r>
         <w:t xml:space="preserve">It formalised the conflict as the Tri-Lateral Retention Feasibility Model, a constraint-satisfaction problem over a single binary variable per record: the accessibility of its </w:t>
       </w:r>
-      <w:del w:id="280" w:author="Arshad Akhtar Abbasia" w:date="2026-10-04T12:00:00Z">
+      <w:del w:id="330" w:author="Arshad Akhtar Abbasia" w:date="2026-10-04T12:00:00Z">
         <w:r>
           <w:delText xml:space="preserve">personal-data </w:delText>
         </w:r>
@@ -6862,12 +7167,12 @@
       <w:r>
         <w:t xml:space="preserve">It proved four results within that model. Under plaintext-verifiability semantics, in which a record is verifiable while its payload remains readable, the constraint system is infeasible whenever an erasure deadline or a ceiling deadline falls inside a retention window. Under accountability-preserving semantics, in which a record is verifiable while its metadata is intact, its commitment survives, and any loss of payload accessibility is itself logged and attributed, the system is jointly satisfiable for every arrival pattern of erasure requests and permit expiries and for every floor parameter. A deletion ceiling </w:t>
       </w:r>
-      <w:del w:id="281" w:author="Arshad Akhtar Abbasia" w:date="2026-10-04T12:00:00Z">
+      <w:del w:id="331" w:author="Arshad Akhtar Abbasia" w:date="2026-10-04T12:00:00Z">
         <w:r>
           <w:delText xml:space="preserve">collides </w:delText>
         </w:r>
       </w:del>
-      <w:ins w:id="282" w:author="Arshad Akhtar Abbasia" w:date="2026-10-04T12:00:00Z">
+      <w:ins w:id="332" w:author="Arshad Akhtar Abbasia" w:date="2026-10-04T12:00:00Z">
         <w:r>
           <w:t xml:space="preserve">can collide </w:t>
         </w:r>
@@ -6875,12 +7180,12 @@
       <w:r>
         <w:t xml:space="preserve">with a retention floor </w:t>
       </w:r>
-      <w:del w:id="283" w:author="Arshad Akhtar Abbasia" w:date="2026-10-04T12:00:00Z">
+      <w:del w:id="333" w:author="Arshad Akhtar Abbasia" w:date="2026-10-04T12:00:00Z">
         <w:r>
           <w:delText xml:space="preserve">exactly when </w:delText>
         </w:r>
       </w:del>
-      <w:ins w:id="284" w:author="Arshad Akhtar Abbasia" w:date="2026-10-04T12:00:00Z">
+      <w:ins w:id="334" w:author="Arshad Akhtar Abbasia" w:date="2026-10-04T12:00:00Z">
         <w:r>
           <w:t xml:space="preserve">only if </w:t>
         </w:r>
@@ -6896,12 +7201,12 @@
       <w:r>
         <w:t xml:space="preserve">It specified the mechanism that the second proof exhibits. Crypto-Erasure by Invalidation retains the accessor fields of each record and a hiding commitment, and destroys the per-record payload key, with the salt and the ciphertext, at the earlier of the erasure deadline and the deletion ceiling; for logs kept at patient-record granularity it removes the subject link at the </w:t>
       </w:r>
-      <w:del w:id="285" w:author="Arshad Akhtar Abbasia" w:date="2026-10-04T12:00:00Z">
+      <w:del w:id="335" w:author="Arshad Akhtar Abbasia" w:date="2026-10-04T12:00:00Z">
         <w:r>
           <w:delText xml:space="preserve">ceiling. </w:delText>
         </w:r>
       </w:del>
-      <w:ins w:id="286" w:author="Arshad Akhtar Abbasia" w:date="2026-10-04T12:00:00Z">
+      <w:ins w:id="336" w:author="Arshad Akhtar Abbasia" w:date="2026-10-04T12:00:00Z">
         <w:r>
           <w:t xml:space="preserve">ceiling, while cross-border records keep it, for at least the period the person’s right to learn who accessed their data requires and, on the deployment binding, for the rest of the floor. </w:t>
         </w:r>
@@ -6909,12 +7214,12 @@
       <w:r>
         <w:t xml:space="preserve">It appends each invalidation to a tamper-evident audit log as a first-class event carrying its month, legal ground, and authorising actor, in a log whose entries never hold what erasure reaches. At floor expiry it performs a terminal transition that destroys the identifying metadata and leaves a non-identifiable statistical </w:t>
       </w:r>
-      <w:del w:id="287" w:author="Arshad Akhtar Abbasia" w:date="2026-10-04T12:00:00Z">
+      <w:del w:id="337" w:author="Arshad Akhtar Abbasia" w:date="2026-10-04T12:00:00Z">
         <w:r>
           <w:delText xml:space="preserve">residue.</w:delText>
         </w:r>
       </w:del>
-      <w:ins w:id="288" w:author="Arshad Akhtar Abbasia" w:date="2026-10-04T12:00:00Z">
+      <w:ins w:id="338" w:author="Arshad Akhtar Abbasia" w:date="2026-10-04T12:00:00Z">
         <w:r>
           <w:t xml:space="preserve">residue; that transition, the per-entry nonce, consistency proofs and the accumulator layer are specified, not implemented.</w:t>
         </w:r>
@@ -6959,12 +7264,12 @@
       <w:r>
         <w:t xml:space="preserve">Feasibility results with an executable witness. Proposition 1 establishes infeasibility under plaintext-verifiability semantics; Proposition 2 establishes satisfiability under the alternative and exhibits the trajectory that achieves it. Proposition 3 gives the condition under which a ceiling and a floor collide, which the cross-sector test of Chapter 6, Section 6.10 </w:t>
       </w:r>
-      <w:del w:id="289" w:author="Arshad Akhtar Abbasia" w:date="2026-10-04T12:00:00Z">
+      <w:del w:id="339" w:author="Arshad Akhtar Abbasia" w:date="2026-10-04T12:00:00Z">
         <w:r>
           <w:delText xml:space="preserve">confirmed </w:delText>
         </w:r>
       </w:del>
-      <w:ins w:id="290" w:author="Arshad Akhtar Abbasia" w:date="2026-10-04T12:00:00Z">
+      <w:ins w:id="340" w:author="Arshad Akhtar Abbasia" w:date="2026-10-04T12:00:00Z">
         <w:r>
           <w:t xml:space="preserve">illustrated </w:t>
         </w:r>
@@ -6972,12 +7277,12 @@
       <w:r>
         <w:t xml:space="preserve">on a statute outside </w:t>
       </w:r>
-      <w:del w:id="291" w:author="Arshad Akhtar Abbasia" w:date="2026-10-04T12:00:00Z">
+      <w:del w:id="341" w:author="Arshad Akhtar Abbasia" w:date="2026-10-04T12:00:00Z">
         <w:r>
           <w:delText xml:space="preserve">health; </w:delText>
         </w:r>
       </w:del>
-      <w:ins w:id="292" w:author="Arshad Akhtar Abbasia" w:date="2026-10-04T12:00:00Z">
+      <w:ins w:id="342" w:author="Arshad Akhtar Abbasia" w:date="2026-10-04T12:00:00Z">
         <w:r>
           <w:t xml:space="preserve">health (an instance generated by the thesis’s own code, which checks the code rather than independently confirming the proposition); </w:t>
         </w:r>
@@ -6985,12 +7290,12 @@
       <w:r>
         <w:t xml:space="preserve">Proposition 4 shows why relocation answers the ceiling and not the right. Both were </w:t>
       </w:r>
-      <w:del w:id="293" w:author="Arshad Akhtar Abbasia" w:date="2026-10-04T12:00:00Z">
+      <w:del w:id="343" w:author="Arshad Akhtar Abbasia" w:date="2026-10-04T12:00:00Z">
         <w:r>
           <w:delText xml:space="preserve">demonstrated </w:delText>
         </w:r>
       </w:del>
-      <w:ins w:id="294" w:author="Arshad Akhtar Abbasia" w:date="2026-10-04T12:00:00Z">
+      <w:ins w:id="344" w:author="Arshad Akhtar Abbasia" w:date="2026-10-04T12:00:00Z">
         <w:r>
           <w:t xml:space="preserve">checked </w:t>
         </w:r>
@@ -6998,7 +7303,7 @@
       <w:r>
         <w:t xml:space="preserve">over two hundred </w:t>
       </w:r>
-      <w:ins w:id="295" w:author="Arshad Akhtar Abbasia" w:date="2026-10-04T12:00:00Z">
+      <w:ins w:id="345" w:author="Arshad Akhtar Abbasia" w:date="2026-10-04T12:00:00Z">
         <w:r>
           <w:t xml:space="preserve">generated </w:t>
         </w:r>
@@ -7006,12 +7311,12 @@
       <w:r>
         <w:t xml:space="preserve">records, </w:t>
       </w:r>
-      <w:del w:id="296" w:author="Arshad Akhtar Abbasia" w:date="2026-10-04T12:00:00Z">
+      <w:del w:id="346" w:author="Arshad Akhtar Abbasia" w:date="2026-10-04T12:00:00Z">
         <w:r>
           <w:delText xml:space="preserve">producing ninety infeasible records and ninety-five </w:delText>
         </w:r>
       </w:del>
-      <w:ins w:id="297" w:author="Arshad Akhtar Abbasia" w:date="2026-10-04T12:00:00Z">
+      <w:ins w:id="347" w:author="Arshad Akhtar Abbasia" w:date="2026-10-04T12:00:00Z">
         <w:r>
           <w:t xml:space="preserve">with </w:t>
         </w:r>
@@ -7019,12 +7324,12 @@
       <w:r>
         <w:t xml:space="preserve">violations under the first semantics and none under the </w:t>
       </w:r>
-      <w:del w:id="298" w:author="Arshad Akhtar Abbasia" w:date="2026-10-04T12:00:00Z">
+      <w:del w:id="348" w:author="Arshad Akhtar Abbasia" w:date="2026-10-04T12:00:00Z">
         <w:r>
           <w:delText xml:space="preserve">second, with </w:delText>
         </w:r>
       </w:del>
-      <w:ins w:id="299" w:author="Arshad Akhtar Abbasia" w:date="2026-10-04T12:00:00Z">
+      <w:ins w:id="349" w:author="Arshad Akhtar Abbasia" w:date="2026-10-04T12:00:00Z">
         <w:r>
           <w:t xml:space="preserve">second (their number is set by the generator), </w:t>
         </w:r>
@@ -7032,12 +7337,12 @@
       <w:r>
         <w:t xml:space="preserve">a separately written exhaustive search </w:t>
       </w:r>
-      <w:del w:id="300" w:author="Arshad Akhtar Abbasia" w:date="2026-10-04T12:00:00Z">
+      <w:del w:id="350" w:author="Arshad Akhtar Abbasia" w:date="2026-10-04T12:00:00Z">
         <w:r>
           <w:delText xml:space="preserve">confirming </w:delText>
         </w:r>
       </w:del>
-      <w:ins w:id="301" w:author="Arshad Akhtar Abbasia" w:date="2026-10-04T12:00:00Z">
+      <w:ins w:id="351" w:author="Arshad Akhtar Abbasia" w:date="2026-10-04T12:00:00Z">
         <w:r>
           <w:t xml:space="preserve">confirmed </w:t>
         </w:r>
@@ -7045,12 +7350,12 @@
       <w:r>
         <w:t xml:space="preserve">that under the first semantics no assignment of payload accessibility </w:t>
       </w:r>
-      <w:del w:id="302" w:author="Arshad Akhtar Abbasia" w:date="2026-10-04T12:00:00Z">
+      <w:del w:id="352" w:author="Arshad Akhtar Abbasia" w:date="2026-10-04T12:00:00Z">
         <w:r>
           <w:delText xml:space="preserve">whatsoever succeeds. </w:delText>
         </w:r>
       </w:del>
-      <w:ins w:id="303" w:author="Arshad Akhtar Abbasia" w:date="2026-10-04T12:00:00Z">
+      <w:ins w:id="353" w:author="Arshad Akhtar Abbasia" w:date="2026-10-04T12:00:00Z">
         <w:r>
           <w:t xml:space="preserve">succeeds in the cases it covers, and a bounded SMT check found no counterexample to Propositions 1–3 within its bounds. </w:t>
         </w:r>
@@ -7130,12 +7435,12 @@
       <w:r>
         <w:t xml:space="preserve">The second concerns scope: whether Article 68(12), which requires “the electronic health data within the secure processing environment” to be deleted within six months of permit expiry, reaches, on the broad reading, access logs kept at patient-record granularity (Chapter 4, Section 4.6). Corollary 1.2 stands or falls with this question, </w:t>
       </w:r>
-      <w:del w:id="304" w:author="Arshad Akhtar Abbasia" w:date="2026-10-04T12:00:00Z">
+      <w:del w:id="354" w:author="Arshad Akhtar Abbasia" w:date="2026-10-04T12:00:00Z">
         <w:r>
           <w:delText xml:space="preserve">and </w:delText>
         </w:r>
       </w:del>
-      <w:ins w:id="305" w:author="Arshad Akhtar Abbasia" w:date="2026-10-04T12:00:00Z">
+      <w:ins w:id="355" w:author="Arshad Akhtar Abbasia" w:date="2026-10-04T12:00:00Z">
         <w:r>
           <w:t xml:space="preserve">as does the conditional branch of Corollary 2.3; </w:t>
         </w:r>
@@ -7183,12 +7488,12 @@
       <w:r>
         <w:t xml:space="preserve">Selective disclosure of invalidation completeness. The mechanism creates a problem it does not solve. When a data subject exercises Article 17, every record relating to them is invalidated, and an auditor should be able to confirm that all of them were. But identifying which records those are </w:t>
       </w:r>
-      <w:del w:id="306" w:author="Arshad Akhtar Abbasia" w:date="2026-10-04T12:00:00Z">
+      <w:del w:id="356" w:author="Arshad Akhtar Abbasia" w:date="2026-10-04T12:00:00Z">
         <w:r>
           <w:delText xml:space="preserve">reveals </w:delText>
         </w:r>
       </w:del>
-      <w:ins w:id="307" w:author="Arshad Akhtar Abbasia" w:date="2026-10-04T12:00:00Z">
+      <w:ins w:id="357" w:author="Arshad Akhtar Abbasia" w:date="2026-10-04T12:00:00Z">
         <w:r>
           <w:t xml:space="preserve">would show the auditor </w:t>
         </w:r>
@@ -7196,12 +7501,12 @@
       <w:r>
         <w:t xml:space="preserve">the subject’s cross-border care </w:t>
       </w:r>
-      <w:del w:id="308" w:author="Arshad Akhtar Abbasia" w:date="2026-10-04T12:00:00Z">
+      <w:del w:id="358" w:author="Arshad Akhtar Abbasia" w:date="2026-10-04T12:00:00Z">
         <w:r>
           <w:delText xml:space="preserve">history, which </w:delText>
         </w:r>
       </w:del>
-      <w:ins w:id="309" w:author="Arshad Akhtar Abbasia" w:date="2026-10-04T12:00:00Z">
+      <w:ins w:id="359" w:author="Arshad Akhtar Abbasia" w:date="2026-10-04T12:00:00Z">
         <w:r>
           <w:t xml:space="preserve">history. The controller keeps the link to those records (Chapter 4, Section 4.2); the problem </w:t>
         </w:r>
@@ -7209,12 +7514,12 @@
       <w:r>
         <w:t xml:space="preserve">is </w:t>
       </w:r>
-      <w:del w:id="310" w:author="Arshad Akhtar Abbasia" w:date="2026-10-04T12:00:00Z">
+      <w:del w:id="360" w:author="Arshad Akhtar Abbasia" w:date="2026-10-04T12:00:00Z">
         <w:r>
           <w:delText xml:space="preserve">precisely what the erasure was meant </w:delText>
         </w:r>
       </w:del>
-      <w:ins w:id="311" w:author="Arshad Akhtar Abbasia" w:date="2026-10-04T12:00:00Z">
+      <w:ins w:id="361" w:author="Arshad Akhtar Abbasia" w:date="2026-10-04T12:00:00Z">
         <w:r>
           <w:t xml:space="preserve">disclosing it </w:t>
         </w:r>
@@ -7222,12 +7527,12 @@
       <w:r>
         <w:t xml:space="preserve">to </w:t>
       </w:r>
-      <w:del w:id="312" w:author="Arshad Akhtar Abbasia" w:date="2026-10-04T12:00:00Z">
+      <w:del w:id="362" w:author="Arshad Akhtar Abbasia" w:date="2026-10-04T12:00:00Z">
         <w:r>
           <w:delText xml:space="preserve">protect. </w:delText>
         </w:r>
       </w:del>
-      <w:ins w:id="313" w:author="Arshad Akhtar Abbasia" w:date="2026-10-04T12:00:00Z">
+      <w:ins w:id="363" w:author="Arshad Akhtar Abbasia" w:date="2026-10-04T12:00:00Z">
         <w:r>
           <w:t xml:space="preserve">a third party in order to prove completeness. </w:t>
         </w:r>
@@ -7235,7 +7540,7 @@
       <w:r>
         <w:t xml:space="preserve">Proving completeness of invalidation without revealing the invalidated set is a zero-knowledge problem, and it corresponds to the fourth of the five open problems identified by Aikebaier (2026), composition with zero-knowledge selective disclosure. This is where succinct arguments </w:t>
       </w:r>
-      <w:ins w:id="314" w:author="Arshad Akhtar Abbasia" w:date="2026-10-04T12:00:00Z">
+      <w:ins w:id="364" w:author="Arshad Akhtar Abbasia" w:date="2026-10-04T12:00:00Z">
         <w:r>
           <w:t xml:space="preserve">may </w:t>
         </w:r>
@@ -7243,12 +7548,12 @@
       <w:r>
         <w:t xml:space="preserve">become necessary rather than decorative, and the audit log of Chapter 4, Section 4.8 gives the problem a concrete form. If each leaf also carried a hiding commitment to its record’s subject link, a circuit taking the published root as its public input could prove that every leaf committed to a given subject is matched by an invalidation leaf, while revealing neither the leaves nor their number. Pairing-based arguments give proofs of constant size (Groth, 2016), and universal-setup systems avoid a trusted setup per circuit (Gabizon, Williamson, &amp; Ciobotaru, 2019); which suits a regulator who must verify without trusting the controller is a design question for that work. The project name carried by this work originates in an earlier design that assumed zero-knowledge machinery would enforce the retention conflict; the analysis showed it unnecessary there, and </w:t>
       </w:r>
-      <w:del w:id="315" w:author="Arshad Akhtar Abbasia" w:date="2026-10-04T12:00:00Z">
+      <w:del w:id="365" w:author="Arshad Akhtar Abbasia" w:date="2026-10-04T12:00:00Z">
         <w:r>
           <w:delText xml:space="preserve">shows </w:delText>
         </w:r>
       </w:del>
-      <w:ins w:id="316" w:author="Arshad Akhtar Abbasia" w:date="2026-10-04T12:00:00Z">
+      <w:ins w:id="366" w:author="Arshad Akhtar Abbasia" w:date="2026-10-04T12:00:00Z">
         <w:r>
           <w:t xml:space="preserve">suggests </w:t>
         </w:r>
@@ -7256,12 +7561,12 @@
       <w:r>
         <w:t xml:space="preserve">it </w:t>
       </w:r>
-      <w:del w:id="317" w:author="Arshad Akhtar Abbasia" w:date="2026-10-04T12:00:00Z">
+      <w:del w:id="367" w:author="Arshad Akhtar Abbasia" w:date="2026-10-04T12:00:00Z">
         <w:r>
           <w:delText xml:space="preserve">unavoidable here.</w:delText>
         </w:r>
       </w:del>
-      <w:ins w:id="318" w:author="Arshad Akhtar Abbasia" w:date="2026-10-04T12:00:00Z">
+      <w:ins w:id="368" w:author="Arshad Akhtar Abbasia" w:date="2026-10-04T12:00:00Z">
         <w:r>
           <w:t xml:space="preserve">may be necessary here, though alternatives are not excluded.</w:t>
         </w:r>

</xml_diff>